<commit_message>
By search type: show the core searched location, actual town in brackets
Searches auto-expand to nearby towns, so a lead found under "Wolverhampton"
can sit in Dudley/Bilston. Store the core location you typed (searchLoc)
on each new mockup and show it as the row's location, with the lead's
actual town in brackets when it differs, so it is clear what you searched.

Applies to mockups generated from here on (existing leads have no stored
core location and keep showing just their town).

Co-Authored-By: Claude Opus 4.8 <noreply@anthropic.com>
</commit_message>
<xml_diff>
--- a/DOCS.docx
+++ b/DOCS.docx
@@ -5045,10 +5045,30 @@
           <w:rFonts w:ascii="Consolas" w:hAnsi="Consolas"/>
           <w:color w:val="9C2D41"/>
         </w:rPr>
-        <w:t xml:space="preserve">{ name, loc, who, cta, img, phone, category }</w:t>
-      </w:r>
-      <w:r>
-        <w:t xml:space="preserve">.</w:t>
+        <w:t xml:space="preserve">{ name, loc, searchLoc, who, cta, img, phone, category }</w:t>
+      </w:r>
+      <w:r>
+        <w:t xml:space="preserve"> (</w:t>
+      </w:r>
+      <w:r>
+        <w:rPr>
+          <w:rFonts w:ascii="Consolas" w:hAnsi="Consolas"/>
+          <w:color w:val="9C2D41"/>
+        </w:rPr>
+        <w:t xml:space="preserve">searchLoc</w:t>
+      </w:r>
+      <w:r>
+        <w:t xml:space="preserve"> = the core location you typed; </w:t>
+      </w:r>
+      <w:r>
+        <w:rPr>
+          <w:rFonts w:ascii="Consolas" w:hAnsi="Consolas"/>
+          <w:color w:val="9C2D41"/>
+        </w:rPr>
+        <w:t xml:space="preserve">loc</w:t>
+      </w:r>
+      <w:r>
+        <w:t xml:space="preserve"> may be an auto-expanded nearby town).</w:t>
       </w:r>
     </w:p>
     <w:p>

</xml_diff>

<commit_message>
Rename tabs: Hot Leads -> Warm Leads, Leads -> All Leads
"Hot" reads as booked/committed; the demo-clickers tab is really warm
leads, so rename it (🌡️) including the nav badge, heading, empty state
and tab-title alert. Rename the full-list tab to "All Leads". Internal
ids/functions (hotleads, loadHotLeads, view-leads) unchanged. Docs +
Word copy updated; also fixed lingering "Messages" doc refs (now
Templates).

Co-Authored-By: Claude Opus 4.8 <noreply@anthropic.com>
</commit_message>
<xml_diff>
--- a/DOCS.docx
+++ b/DOCS.docx
@@ -59,7 +59,7 @@
         <w:rPr>
           <w:b/>
         </w:rPr>
-        <w:t xml:space="preserve">hot leads</w:t>
+        <w:t xml:space="preserve">warm leads</w:t>
       </w:r>
       <w:r>
         <w:t xml:space="preserve">, and builds a </w:t>
@@ -503,17 +503,17 @@
               <w:rPr>
                 <w:b/>
               </w:rPr>
-              <w:t xml:space="preserve">💬 Messages</w:t>
-            </w:r>
-          </w:p>
-        </w:tc>
-        <w:tc>
-          <w:tcPr>
-            <w:tcW w:w="0" w:type="auto"/>
-          </w:tcPr>
-          <w:p>
-            <w:r>
-              <w:t xml:space="preserve">Edit the first-message / follow-up / CTA wording (saved per device)</w:t>
+              <w:t xml:space="preserve">💬 Templates</w:t>
+            </w:r>
+          </w:p>
+        </w:tc>
+        <w:tc>
+          <w:tcPr>
+            <w:tcW w:w="0" w:type="auto"/>
+          </w:tcPr>
+          <w:p>
+            <w:r>
+              <w:t xml:space="preserve">Edit the first-message / follow-up / CTA wording (saved per device) + Blocked contacts</w:t>
             </w:r>
           </w:p>
         </w:tc>
@@ -553,7 +553,7 @@
               <w:rPr>
                 <w:b/>
               </w:rPr>
-              <w:t xml:space="preserve">🔥 Hot Leads</w:t>
+              <w:t xml:space="preserve">🌡️ Warm Leads</w:t>
             </w:r>
           </w:p>
         </w:tc>
@@ -578,7 +578,7 @@
               <w:rPr>
                 <w:b/>
               </w:rPr>
-              <w:t xml:space="preserve">👤 Leads</w:t>
+              <w:t xml:space="preserve">👤 All Leads</w:t>
             </w:r>
           </w:p>
         </w:tc>
@@ -603,7 +603,7 @@
         <w:t xml:space="preserve">Lead Profile popup:</w:t>
       </w:r>
       <w:r>
-        <w:t xml:space="preserve"> click any business name (Leads, Hot Leads, dashboard activity, Recent mockups) to open a profile with contact details + one-tap </w:t>
+        <w:t xml:space="preserve"> click any business name (Leads, Warm Leads, dashboard activity, Recent mockups) to open a profile with contact details + one-tap </w:t>
       </w:r>
       <w:r>
         <w:rPr>
@@ -1286,7 +1286,7 @@
         <w:t xml:space="preserve">🚫 Block (do-not-contact):</w:t>
       </w:r>
       <w:r>
-        <w:t xml:space="preserve"> a Block button on search-result cards, Hot Lead cards and</w:t>
+        <w:t xml:space="preserve"> a Block button on search-result cards, Warm Lead cards and</w:t>
       </w:r>
     </w:p>
     <w:p>
@@ -1319,13 +1319,13 @@
         <w:t xml:space="preserve">outreach buttons are removed</w:t>
       </w:r>
       <w:r>
-        <w:t xml:space="preserve"> (Blocked state + Unblock shown in Hot Leads / Recent). Managed in </w:t>
-      </w:r>
-      <w:r>
-        <w:rPr>
-          <w:b/>
-        </w:rPr>
-        <w:t xml:space="preserve">Messages → 🚫 Blocked contacts</w:t>
+        <w:t xml:space="preserve"> (Blocked state + Unblock shown in Warm Leads / Recent). Managed in </w:t>
+      </w:r>
+      <w:r>
+        <w:rPr>
+          <w:b/>
+        </w:rPr>
+        <w:t xml:space="preserve">Templates → 🚫 Blocked contacts</w:t>
       </w:r>
       <w:r>
         <w:t xml:space="preserve"> (list + Unblock). Per device (</w:t>
@@ -1559,7 +1559,7 @@
         <w:pStyle w:val="Heading3"/>
       </w:pPr>
       <w:r>
-        <w:t xml:space="preserve">🔥 Hot Leads</w:t>
+        <w:t xml:space="preserve">🌡️ Warm Leads</w:t>
       </w:r>
     </w:p>
     <w:p>
@@ -1637,7 +1637,7 @@
         <w:t xml:space="preserve">flashes</w:t>
       </w:r>
       <w:r>
-        <w:t xml:space="preserve"> "🔥 (N) hot leads!" when you're on another tab; 3-min poll keeps it fresh.</w:t>
+        <w:t xml:space="preserve"> "🌡️ (N) warm leads!" when you're on another tab; 3-min poll keeps it fresh.</w:t>
       </w:r>
     </w:p>
     <w:p>
@@ -1788,7 +1788,7 @@
         <w:t xml:space="preserve">Available from anywhere a business appears:</w:t>
       </w:r>
       <w:r>
-        <w:t xml:space="preserve"> Hot Lead cards, the </w:t>
+        <w:t xml:space="preserve"> Warm Lead cards, the </w:t>
       </w:r>
       <w:r>
         <w:rPr>
@@ -2144,7 +2144,7 @@
         <w:t xml:space="preserve">signup</w:t>
       </w:r>
       <w:r>
-        <w:t xml:space="preserve">** tracking event (the hottest signal) which is surfaced in Hot Leads (pinned, green badge, tab-title alert) and the Performance dashboard (🤑 Sign-ups stat + conversion rate + CSV).</w:t>
+        <w:t xml:space="preserve">** tracking event (the hottest signal) which is surfaced in Warm Leads (pinned, green badge, tab-title alert) and the Performance dashboard (🤑 Sign-ups stat + conversion rate + CSV).</w:t>
       </w:r>
     </w:p>
     <w:p>
@@ -2706,7 +2706,7 @@
         <w:pStyle w:val="Heading3"/>
       </w:pPr>
       <w:r>
-        <w:t xml:space="preserve">👤 Leads, CRM status &amp; CSV exports</w:t>
+        <w:t xml:space="preserve">👤 All Leads, CRM status &amp; CSV exports</w:t>
       </w:r>
     </w:p>
     <w:p>
@@ -2723,7 +2723,7 @@
         <w:t xml:space="preserve">Lead Profile popup</w:t>
       </w:r>
       <w:r>
-        <w:t xml:space="preserve"> (click any business name in Leads / Hot Leads / dashboard / Recent</w:t>
+        <w:t xml:space="preserve"> (click any business name in Leads / Warm Leads / dashboard / Recent</w:t>
       </w:r>
     </w:p>
     <w:p>
@@ -2776,7 +2776,7 @@
         <w:t xml:space="preserve">notes/&lt;slug&gt;.json</w:t>
       </w:r>
       <w:r>
-        <w:t xml:space="preserve">, so it persists and is shared across devices, unlike the per-device messaged/blocked flags). Status shows as a colour chip in the Leads table, the dashboard activity table, and Hot Lead cards (which dim for not-interested / not-interested-via-mockup / lost / invalid-phone). A lightweight </w:t>
+        <w:t xml:space="preserve">, so it persists and is shared across devices, unlike the per-device messaged/blocked flags). Status shows as a colour chip in the Leads table, the dashboard activity table, and Warm Lead cards (which dim for not-interested / not-interested-via-mockup / lost / invalid-phone). A lightweight </w:t>
       </w:r>
       <w:r>
         <w:rPr>
@@ -3322,7 +3322,7 @@
         <w:rPr>
           <w:b/>
         </w:rPr>
-        <w:t xml:space="preserve">👤 Leads view:</w:t>
+        <w:t xml:space="preserve">👤 All Leads view:</w:t>
       </w:r>
       <w:r>
         <w:t xml:space="preserve"> searchable, filterable table of every business worked (All / Prowled /</w:t>
@@ -6575,7 +6575,7 @@
         <w:rPr>
           <w:b/>
         </w:rPr>
-        <w:t xml:space="preserve">Hot Leads</w:t>
+        <w:t xml:space="preserve">Warm Leads</w:t>
       </w:r>
       <w:r>
         <w:t xml:space="preserve"> + tab alert + signup-clicker surfacing, </w:t>
@@ -6606,7 +6606,7 @@
         <w:t xml:space="preserve">signup</w:t>
       </w:r>
       <w:r>
-        <w:t xml:space="preserve"> tracking, auto-runs Prowl, noindex previews + tidy-up registry). Prowl/Pounce reachable from Hot Leads, Recent mockups, and search results.</w:t>
+        <w:t xml:space="preserve"> tracking, auto-runs Prowl, noindex previews + tidy-up registry). Prowl/Pounce reachable from Warm Leads, Recent mockups, and search results.</w:t>
       </w:r>
     </w:p>
     <w:p>
@@ -6751,7 +6751,7 @@
         <w:t xml:space="preserve">client_reference_id</w:t>
       </w:r>
       <w:r>
-        <w:t xml:space="preserve"> for attribution; Stripe promotion codes for discounts). Bar already points there. Optional later: Stripe webhook → flag a lead as "paying customer" in Hot Leads.</w:t>
+        <w:t xml:space="preserve"> for attribution; Stripe promotion codes for discounts). Bar already points there. Optional later: Stripe webhook → flag a lead as "paying customer" in Warm Leads.</w:t>
       </w:r>
     </w:p>
     <w:p>
@@ -7020,7 +7020,7 @@
           <w:rFonts w:ascii="Consolas" w:hAnsi="Consolas"/>
           <w:sz w:val="18"/>
         </w:rPr>
-        <w:t xml:space="preserve">  app.js       all UI logic (search, generate, send, tracking, dashboard, hot leads, prowl, pounce)</w:t>
+        <w:t xml:space="preserve">  app.js       all UI logic (search, generate, send, tracking, dashboard, warm leads, prowl, pounce)</w:t>
       </w:r>
     </w:p>
     <w:p>

</xml_diff>

<commit_message>
Docs: document {business} name humanising in messages
Co-Authored-By: Claude Opus 4.8 <noreply@anthropic.com>
</commit_message>
<xml_diff>
--- a/DOCS.docx
+++ b/DOCS.docx
@@ -1248,6 +1248,88 @@
       </w:r>
       <w:r>
         <w:t xml:space="preserve"> is title-cased with acronyms (Dog Groomers / MOT).</w:t>
+      </w:r>
+    </w:p>
+    <w:p>
+      <w:pPr>
+        <w:numPr>
+          <w:ilvl w:val="0"/>
+          <w:numId w:val="1"/>
+        </w:numPr>
+      </w:pPr>
+      <w:r>
+        <w:rPr>
+          <w:b/>
+        </w:rPr>
+        <w:t xml:space="preserve">`{business}` is humanised in the message</w:t>
+      </w:r>
+      <w:r>
+        <w:t xml:space="preserve"> (</w:t>
+      </w:r>
+      <w:r>
+        <w:rPr>
+          <w:rFonts w:ascii="Consolas" w:hAnsi="Consolas"/>
+          <w:color w:val="9C2D41"/>
+        </w:rPr>
+        <w:t xml:space="preserve">humaniseBusinessName</w:t>
+      </w:r>
+      <w:r>
+        <w:t xml:space="preserve"> in </w:t>
+      </w:r>
+      <w:r>
+        <w:rPr>
+          <w:rFonts w:ascii="Consolas" w:hAnsi="Consolas"/>
+          <w:color w:val="9C2D41"/>
+        </w:rPr>
+        <w:t xml:space="preserve">app.js</w:t>
+      </w:r>
+      <w:r>
+        <w:t xml:space="preserve">): a</w:t>
+      </w:r>
+    </w:p>
+    <w:p>
+      <w:r>
+        <w:t xml:space="preserve">keyword-stuffed name reads as fake in "I came across &lt;name&gt;", so an *overlong* name (&gt;34 chars with </w:t>
+      </w:r>
+      <w:r>
+        <w:rPr>
+          <w:rFonts w:ascii="Consolas" w:hAnsi="Consolas"/>
+          <w:color w:val="9C2D41"/>
+        </w:rPr>
+        <w:t xml:space="preserve">,</w:t>
+      </w:r>
+      <w:r>
+        <w:t xml:space="preserve">/</w:t>
+      </w:r>
+      <w:r>
+        <w:rPr>
+          <w:rFonts w:ascii="Consolas" w:hAnsi="Consolas"/>
+          <w:color w:val="9C2D41"/>
+        </w:rPr>
+        <w:t xml:space="preserve">&amp;</w:t>
+      </w:r>
+      <w:r>
+        <w:t xml:space="preserve">/</w:t>
+      </w:r>
+      <w:r>
+        <w:rPr>
+          <w:rFonts w:ascii="Consolas" w:hAnsi="Consolas"/>
+          <w:color w:val="9C2D41"/>
+        </w:rPr>
+        <w:t xml:space="preserve">/</w:t>
+      </w:r>
+      <w:r>
+        <w:t xml:space="preserve">/</w:t>
+      </w:r>
+      <w:r>
+        <w:rPr>
+          <w:rFonts w:ascii="Consolas" w:hAnsi="Consolas"/>
+          <w:color w:val="9C2D41"/>
+        </w:rPr>
+        <w:t xml:space="preserve">+</w:t>
+      </w:r>
+      <w:r>
+        <w:t xml:space="preserve">/"and" separators) is trimmed to its first one or two phrases, e.g. "JJG Home Car Wash, Mobile Valeting &amp; Alloy Wheel Refurbishment" → "JJG Home Car Wash &amp; Mobile Valeting". Short/normal names are left untouched. Only the message text is affected, the mockup image and preview page keep the full real name.</w:t>
       </w:r>
     </w:p>
     <w:p>

</xml_diff>

<commit_message>
Messages: split run-together business names (PerformanceCarValeting)
humaniseBusinessName now also inserts spaces at camelCase boundaries so
"PerformanceCarValeting" reads "Performance Car Valeting" and
"JJGHomeCarWash" reads "JJG Home Car Wash". Acronyms (MOT) and names that
already have spaces are left intact. Runs before the keyword-stuffing
trim. Docs + Word copy updated.

Co-Authored-By: Claude Opus 4.8 <noreply@anthropic.com>
</commit_message>
<xml_diff>
--- a/DOCS.docx
+++ b/DOCS.docx
@@ -1284,12 +1284,30 @@
         <w:t xml:space="preserve">app.js</w:t>
       </w:r>
       <w:r>
-        <w:t xml:space="preserve">): a</w:t>
-      </w:r>
-    </w:p>
-    <w:p>
-      <w:r>
-        <w:t xml:space="preserve">keyword-stuffed name reads as fake in "I came across &lt;name&gt;", so an *overlong* name (&gt;34 chars with </w:t>
+        <w:t xml:space="preserve">), two passes:</w:t>
+      </w:r>
+    </w:p>
+    <w:p>
+      <w:r>
+        <w:t xml:space="preserve">(1) </w:t>
+      </w:r>
+      <w:r>
+        <w:rPr>
+          <w:b/>
+        </w:rPr>
+        <w:t xml:space="preserve">run-together names</w:t>
+      </w:r>
+      <w:r>
+        <w:t xml:space="preserve"> are split on camelCase, e.g. "PerformanceCarValeting" → "Performance Car Valeting", "JJGHomeCarWash" → "JJG Home Car Wash" (acronyms like MOT and already-spaced names stay intact); (2) </w:t>
+      </w:r>
+      <w:r>
+        <w:rPr>
+          <w:b/>
+        </w:rPr>
+        <w:t xml:space="preserve">keyword-stuffed overlong names</w:t>
+      </w:r>
+      <w:r>
+        <w:t xml:space="preserve"> (&gt;34 chars with </w:t>
       </w:r>
       <w:r>
         <w:rPr>
@@ -1329,7 +1347,7 @@
         <w:t xml:space="preserve">+</w:t>
       </w:r>
       <w:r>
-        <w:t xml:space="preserve">/"and" separators) is trimmed to its first one or two phrases, e.g. "JJG Home Car Wash, Mobile Valeting &amp; Alloy Wheel Refurbishment" → "JJG Home Car Wash &amp; Mobile Valeting". Short/normal names are left untouched. Only the message text is affected, the mockup image and preview page keep the full real name.</w:t>
+        <w:t xml:space="preserve">/"and" separators) are trimmed to their first one or two phrases, e.g. "JJG Home Car Wash, Mobile Valeting &amp; Alloy Wheel Refurbishment" → "JJG Home Car Wash &amp; Mobile Valeting". Short/normal names are left untouched. Message text only, the mockup image and preview page keep the full real name.</w:t>
       </w:r>
     </w:p>
     <w:p>

</xml_diff>

<commit_message>
Humanise business names on the mockup image + preview page too
Share humaniseBusinessName as lib/names.js and apply it to the mockup
logo initials/wordmark/headline (generate.js) and the preview page
heading + personalised CTA (view.js), so "PerformanceCarValeting" shows
as "Performance Car Valeting" everywhere a human reads it. The slug and
the stored name field stay raw so tracking and name/location matching are
unaffected. Docs + Word copy + memory updated.

Co-Authored-By: Claude Opus 4.8 <noreply@anthropic.com>
</commit_message>
<xml_diff>
--- a/DOCS.docx
+++ b/DOCS.docx
@@ -1261,10 +1261,10 @@
         <w:rPr>
           <w:b/>
         </w:rPr>
-        <w:t xml:space="preserve">`{business}` is humanised in the message</w:t>
-      </w:r>
-      <w:r>
-        <w:t xml:space="preserve"> (</w:t>
+        <w:t xml:space="preserve">Business names are humanised for display</w:t>
+      </w:r>
+      <w:r>
+        <w:t xml:space="preserve"> by </w:t>
       </w:r>
       <w:r>
         <w:rPr>
@@ -1274,22 +1274,29 @@
         <w:t xml:space="preserve">humaniseBusinessName</w:t>
       </w:r>
       <w:r>
-        <w:t xml:space="preserve"> in </w:t>
-      </w:r>
-      <w:r>
-        <w:rPr>
-          <w:rFonts w:ascii="Consolas" w:hAnsi="Consolas"/>
-          <w:color w:val="9C2D41"/>
-        </w:rPr>
-        <w:t xml:space="preserve">app.js</w:t>
-      </w:r>
-      <w:r>
-        <w:t xml:space="preserve">), two passes:</w:t>
-      </w:r>
-    </w:p>
-    <w:p>
-      <w:r>
-        <w:t xml:space="preserve">(1) </w:t>
+        <w:t xml:space="preserve"> (shared as</w:t>
+      </w:r>
+    </w:p>
+    <w:p>
+      <w:r>
+        <w:rPr>
+          <w:rFonts w:ascii="Consolas" w:hAnsi="Consolas"/>
+          <w:color w:val="9C2D41"/>
+        </w:rPr>
+        <w:t xml:space="preserve">lib/names.js</w:t>
+      </w:r>
+      <w:r>
+        <w:t xml:space="preserve"> on the server + a matching copy in </w:t>
+      </w:r>
+      <w:r>
+        <w:rPr>
+          <w:rFonts w:ascii="Consolas" w:hAnsi="Consolas"/>
+          <w:color w:val="9C2D41"/>
+        </w:rPr>
+        <w:t xml:space="preserve">public/app.js</w:t>
+      </w:r>
+      <w:r>
+        <w:t xml:space="preserve">), two passes: (1) </w:t>
       </w:r>
       <w:r>
         <w:rPr>
@@ -1347,7 +1354,62 @@
         <w:t xml:space="preserve">+</w:t>
       </w:r>
       <w:r>
-        <w:t xml:space="preserve">/"and" separators) are trimmed to their first one or two phrases, e.g. "JJG Home Car Wash, Mobile Valeting &amp; Alloy Wheel Refurbishment" → "JJG Home Car Wash &amp; Mobile Valeting". Short/normal names are left untouched. Message text only, the mockup image and preview page keep the full real name.</w:t>
+        <w:t xml:space="preserve">/"and" separators) are trimmed to their first one or two phrases, e.g. "JJG Home Car Wash, Mobile Valeting &amp; Alloy Wheel Refurbishment" → "JJG Home Car Wash &amp; Mobile Valeting". Short/normal names are left untouched. Applied to the </w:t>
+      </w:r>
+      <w:r>
+        <w:rPr>
+          <w:b/>
+        </w:rPr>
+        <w:t xml:space="preserve">sent message</w:t>
+      </w:r>
+      <w:r>
+        <w:t xml:space="preserve"> </w:t>
+      </w:r>
+      <w:r>
+        <w:rPr>
+          <w:rFonts w:ascii="Consolas" w:hAnsi="Consolas"/>
+          <w:color w:val="9C2D41"/>
+        </w:rPr>
+        <w:t xml:space="preserve">{business}</w:t>
+      </w:r>
+      <w:r>
+        <w:t xml:space="preserve">, the </w:t>
+      </w:r>
+      <w:r>
+        <w:rPr>
+          <w:b/>
+        </w:rPr>
+        <w:t xml:space="preserve">mockup image</w:t>
+      </w:r>
+      <w:r>
+        <w:t xml:space="preserve"> (logo initials, wordmark, headline) and the </w:t>
+      </w:r>
+      <w:r>
+        <w:rPr>
+          <w:b/>
+        </w:rPr>
+        <w:t xml:space="preserve">preview page</w:t>
+      </w:r>
+      <w:r>
+        <w:t xml:space="preserve"> heading/CTA. NOT applied to the </w:t>
+      </w:r>
+      <w:r>
+        <w:rPr>
+          <w:b/>
+        </w:rPr>
+        <w:t xml:space="preserve">slug</w:t>
+      </w:r>
+      <w:r>
+        <w:t xml:space="preserve"> or the </w:t>
+      </w:r>
+      <w:r>
+        <w:rPr>
+          <w:b/>
+        </w:rPr>
+        <w:t xml:space="preserve">stored `name`</w:t>
+      </w:r>
+      <w:r>
+        <w:t xml:space="preserve"> (those stay raw so tracking + name/location matching for messaged/blocked keep working).</w:t>
       </w:r>
     </w:p>
     <w:p>

</xml_diff>

<commit_message>
Fix mockup limit: only count successful generations, not failures
generate.js recorded a usage slot BEFORE the OpenAI call, so every failed
or retried mockup burned quota (hit the cap after ~6 real mockups because
transient image failures each consumed a slot). Split ratelimit into
check() up front + record() only after the image succeeds. Bump generate
cap 30->50 for headroom (phantom slots from the old behaviour age out over
the 20h window). Fix the stale "per 12 hours" 429 text everywhere to use
the real window.

Co-Authored-By: Claude Opus 4.8 <noreply@anthropic.com>
</commit_message>
<xml_diff>
--- a/DOCS.docx
+++ b/DOCS.docx
@@ -1925,7 +1925,7 @@
         <w:t xml:space="preserve">LIMIT_PROWL</w:t>
       </w:r>
       <w:r>
-        <w:t xml:space="preserve">, default 20/12h).</w:t>
+        <w:t xml:space="preserve">, default 30 per 20h).</w:t>
       </w:r>
     </w:p>
     <w:p>
@@ -2724,7 +2724,7 @@
         <w:t xml:space="preserve">LIMIT_POUNCE</w:t>
       </w:r>
       <w:r>
-        <w:t xml:space="preserve">, default 30/12h). Footer: "Powered by</w:t>
+        <w:t xml:space="preserve">, default 30 per 20h). Footer: "Powered by</w:t>
       </w:r>
     </w:p>
     <w:p>
@@ -3640,18 +3640,27 @@
         <w:t xml:space="preserve">lib/ratelimit.js</w:t>
       </w:r>
       <w:r>
-        <w:t xml:space="preserve">): 30 searches / 30 generations / 30 prowls / 30 pounces per </w:t>
-      </w:r>
+        <w:t xml:space="preserve">): 30 searches / </w:t>
+      </w:r>
+      <w:r>
+        <w:rPr>
+          <w:b/>
+        </w:rPr>
+        <w:t xml:space="preserve">50</w:t>
+      </w:r>
+      <w:r>
+        <w:t xml:space="preserve"> generations / 30 prowls / 30 pounces per</w:t>
+      </w:r>
+    </w:p>
+    <w:p>
       <w:r>
         <w:rPr>
           <w:b/>
         </w:rPr>
         <w:t xml:space="preserve">20h</w:t>
       </w:r>
-    </w:p>
-    <w:p>
-      <w:r>
-        <w:t xml:space="preserve">window (env </w:t>
+      <w:r>
+        <w:t xml:space="preserve"> rolling window (env </w:t>
       </w:r>
       <w:r>
         <w:rPr>
@@ -3671,17 +3680,56 @@
         <w:t xml:space="preserve">RATE_WINDOW_HOURS</w:t>
       </w:r>
       <w:r>
-        <w:t xml:space="preserve">). Caps generation/search COST, not WhatsApp sending. (env-overridable </w:t>
-      </w:r>
-      <w:r>
-        <w:rPr>
-          <w:rFonts w:ascii="Consolas" w:hAnsi="Consolas"/>
-          <w:color w:val="9C2D41"/>
-        </w:rPr>
-        <w:t xml:space="preserve">LIMIT_*</w:t>
-      </w:r>
-      <w:r>
-        <w:t xml:space="preserve">).</w:t>
+        <w:t xml:space="preserve">). Caps generation/search COST, not WhatsApp sending. </w:t>
+      </w:r>
+      <w:r>
+        <w:rPr>
+          <w:b/>
+        </w:rPr>
+        <w:t xml:space="preserve">Generation records a usage slot only AFTER it succeeds</w:t>
+      </w:r>
+      <w:r>
+        <w:t xml:space="preserve"> (</w:t>
+      </w:r>
+      <w:r>
+        <w:rPr>
+          <w:rFonts w:ascii="Consolas" w:hAnsi="Consolas"/>
+          <w:color w:val="9C2D41"/>
+        </w:rPr>
+        <w:t xml:space="preserve">check()</w:t>
+      </w:r>
+      <w:r>
+        <w:t xml:space="preserve"> up front, </w:t>
+      </w:r>
+      <w:r>
+        <w:rPr>
+          <w:rFonts w:ascii="Consolas" w:hAnsi="Consolas"/>
+          <w:color w:val="9C2D41"/>
+        </w:rPr>
+        <w:t xml:space="preserve">record()</w:t>
+      </w:r>
+      <w:r>
+        <w:t xml:space="preserve"> on success) so a failed/retried mockup never burns quota; </w:t>
+      </w:r>
+      <w:r>
+        <w:rPr>
+          <w:rFonts w:ascii="Consolas" w:hAnsi="Consolas"/>
+          <w:color w:val="9C2D41"/>
+        </w:rPr>
+        <w:t xml:space="preserve">checkAndRecord()</w:t>
+      </w:r>
+      <w:r>
+        <w:t xml:space="preserve"> (record on attempt) is still used by search/prowl/pounce. Counted via one tiny blob per event under </w:t>
+      </w:r>
+      <w:r>
+        <w:rPr>
+          <w:rFonts w:ascii="Consolas" w:hAnsi="Consolas"/>
+          <w:color w:val="9C2D41"/>
+        </w:rPr>
+        <w:t xml:space="preserve">usage/</w:t>
+      </w:r>
+      <w:r>
+        <w:t xml:space="preserve">, pruned once older than the window.</w:t>
       </w:r>
     </w:p>
     <w:p>
@@ -3862,7 +3910,7 @@
           <w:rFonts w:ascii="Consolas" w:hAnsi="Consolas"/>
           <w:sz w:val="18"/>
         </w:rPr>
-        <w:t xml:space="preserve">ratelimit.js 12h usage caps            hotleads.js  demo-clickers + contact details</w:t>
+        <w:t xml:space="preserve">ratelimit.js 20h usage caps            hotleads.js  demo-clickers + contact details</w:t>
       </w:r>
     </w:p>
     <w:p>
@@ -5345,7 +5393,7 @@
         <w:t xml:space="preserve">usage/...</w:t>
       </w:r>
       <w:r>
-        <w:t xml:space="preserve">, rate-limit counters (pruned after 12h).</w:t>
+        <w:t xml:space="preserve">, rate-limit counters (pruned after the 20h window).</w:t>
       </w:r>
     </w:p>
     <w:p>
@@ -6005,17 +6053,17 @@
               <w:t xml:space="preserve">LIMIT_PROWL</w:t>
             </w:r>
             <w:r>
-              <w:t xml:space="preserve"> (default 20)</w:t>
-            </w:r>
-          </w:p>
-        </w:tc>
-        <w:tc>
-          <w:tcPr>
-            <w:tcW w:w="0" w:type="auto"/>
-          </w:tcPr>
-          <w:p>
-            <w:r>
-              <w:t xml:space="preserve">Per 12h.</w:t>
+              <w:t xml:space="preserve"> (default 30, generate 50)</w:t>
+            </w:r>
+          </w:p>
+        </w:tc>
+        <w:tc>
+          <w:tcPr>
+            <w:tcW w:w="0" w:type="auto"/>
+          </w:tcPr>
+          <w:p>
+            <w:r>
+              <w:t xml:space="preserve">Per 20h (RATE_WINDOW_HOURS). Generation counts only on success.</w:t>
             </w:r>
           </w:p>
         </w:tc>

</xml_diff>

<commit_message>
Performance: add daily activity table for tracking daily targets
One row per day (UK time, newest first, last 30 days) with columns for
Mockups / Messaged / Mockup viewed / Demo / Sign-up / Not interested, and
Today highlighted. Backed by a new per-day byDay query (distinct
businesses per event) plus mockups bucketed by blob date.

Co-Authored-By: Claude Opus 4.8 <noreply@anthropic.com>
</commit_message>
<xml_diff>
--- a/DOCS.docx
+++ b/DOCS.docx
@@ -1671,6 +1671,48 @@
     <w:p>
       <w:r>
         <w:t xml:space="preserve">caption noting how many marked themselves not interested via the mockup.</w:t>
+      </w:r>
+    </w:p>
+    <w:p>
+      <w:pPr>
+        <w:numPr>
+          <w:ilvl w:val="0"/>
+          <w:numId w:val="1"/>
+        </w:numPr>
+      </w:pPr>
+      <w:r>
+        <w:rPr>
+          <w:b/>
+        </w:rPr>
+        <w:t xml:space="preserve">🎯 Daily activity table:</w:t>
+      </w:r>
+      <w:r>
+        <w:t xml:space="preserve"> one row per day (UK time, newest first, last 30 days), columns =</w:t>
+      </w:r>
+    </w:p>
+    <w:p>
+      <w:r>
+        <w:t xml:space="preserve">Mockups / Messaged / Mockup viewed / Demo clicks / Sign-up clicks / Not interested, with Today highlighted, so you can track daily targets. Built from a per-day </w:t>
+      </w:r>
+      <w:r>
+        <w:rPr>
+          <w:rFonts w:ascii="Consolas" w:hAnsi="Consolas"/>
+          <w:color w:val="9C2D41"/>
+        </w:rPr>
+        <w:t xml:space="preserve">byDay</w:t>
+      </w:r>
+      <w:r>
+        <w:t xml:space="preserve"> query (</w:t>
+      </w:r>
+      <w:r>
+        <w:rPr>
+          <w:rFonts w:ascii="Consolas" w:hAnsi="Consolas"/>
+          <w:color w:val="9C2D41"/>
+        </w:rPr>
+        <w:t xml:space="preserve">lib/db.js</w:t>
+      </w:r>
+      <w:r>
+        <w:t xml:space="preserve">, distinct businesses per event) + mockups bucketed by blob date; independent of the 7/30/all range.</w:t>
       </w:r>
     </w:p>
     <w:p>

</xml_diff>

<commit_message>
Docs: add Email enrichment as a future phase + v1 spec
Park the "Find email" idea in the Roadmap with sources ranked for the
no-website segment, a cheapest-first pipeline spec, verification +
deliverability + UK PECR/GDPR caveats, and a build-vs-buy note.

Co-Authored-By: Claude Opus 4.8 <noreply@anthropic.com>
</commit_message>
<xml_diff>
--- a/DOCS.docx
+++ b/DOCS.docx
@@ -7021,6 +7021,285 @@
       </w:r>
       <w:r>
         <w:t xml:space="preserve">, add the free key to enrich Prowl (established/director/type).</w:t>
+      </w:r>
+    </w:p>
+    <w:p>
+      <w:pPr>
+        <w:numPr>
+          <w:ilvl w:val="0"/>
+          <w:numId w:val="1"/>
+        </w:numPr>
+      </w:pPr>
+      <w:r>
+        <w:rPr>
+          <w:b/>
+        </w:rPr>
+        <w:t xml:space="preserve">🔮 Future phase, Email enrichment ("Find email"):</w:t>
+      </w:r>
+      <w:r>
+        <w:t xml:space="preserve"> find an email for a lead so email becomes</w:t>
+      </w:r>
+    </w:p>
+    <w:p>
+      <w:r>
+        <w:t xml:space="preserve">a fallback channel alongside WhatsApp/SMS. Google Places never returns email, and the hard part is that our core targets (</w:t>
+      </w:r>
+      <w:r>
+        <w:rPr>
+          <w:b/>
+        </w:rPr>
+        <w:t xml:space="preserve">no-website micro-businesses</w:t>
+      </w:r>
+      <w:r>
+        <w:t xml:space="preserve">) defeat most email-finder tools, which are </w:t>
+      </w:r>
+      <w:r>
+        <w:rPr>
+          <w:b/>
+        </w:rPr>
+        <w:t xml:space="preserve">domain-centric</w:t>
+      </w:r>
+      <w:r>
+        <w:t xml:space="preserve"> (Hunter/Snov/Apollo/Clearbit/RocketReach) and skewed to larger firms.</w:t>
+      </w:r>
+    </w:p>
+    <w:p>
+      <w:pPr>
+        <w:numPr>
+          <w:ilvl w:val="0"/>
+          <w:numId w:val="1"/>
+        </w:numPr>
+      </w:pPr>
+      <w:r>
+        <w:rPr>
+          <w:b/>
+        </w:rPr>
+        <w:t xml:space="preserve">Sources, ranked by yield for website-less UK sole traders:</w:t>
+      </w:r>
+      <w:r>
+        <w:t xml:space="preserve"> (1) </w:t>
+      </w:r>
+      <w:r>
+        <w:rPr>
+          <w:b/>
+        </w:rPr>
+        <w:t xml:space="preserve">Facebook / Instagram page</w:t>
+      </w:r>
+    </w:p>
+    <w:p>
+      <w:r>
+        <w:t xml:space="preserve">"About"/contact, the best source, since these businesses usually have a FB page instead of a site; (2) </w:t>
+      </w:r>
+      <w:r>
+        <w:rPr>
+          <w:b/>
+        </w:rPr>
+        <w:t xml:space="preserve">directories</w:t>
+      </w:r>
+      <w:r>
+        <w:t xml:space="preserve"> (Yell, FreeIndex, Cylex, Scoot, Thomson Local, Bark, Checkatrade, Trustpilot), patchy + often a contact form not a raw email; (3) </w:t>
+      </w:r>
+      <w:r>
+        <w:rPr>
+          <w:b/>
+        </w:rPr>
+        <w:t xml:space="preserve">Companies House</w:t>
+      </w:r>
+      <w:r>
+        <w:t xml:space="preserve"> (Ltd only, gives director name not email, but sharpens the FB/LinkedIn search); (4) </w:t>
+      </w:r>
+      <w:r>
+        <w:rPr>
+          <w:b/>
+        </w:rPr>
+        <w:t xml:space="preserve">web-search + read pass</w:t>
+      </w:r>
+      <w:r>
+        <w:t xml:space="preserve"> (agent-style, e.g. Manus, reads top results); (5) </w:t>
+      </w:r>
+      <w:r>
+        <w:rPr>
+          <w:b/>
+        </w:rPr>
+        <w:t xml:space="preserve">paid B2B enrichment APIs</w:t>
+      </w:r>
+      <w:r>
+        <w:t xml:space="preserve">, low yield for this segment; (6) </w:t>
+      </w:r>
+      <w:r>
+        <w:rPr>
+          <w:b/>
+        </w:rPr>
+        <w:t xml:space="preserve">website scrape + WHOIS</w:t>
+      </w:r>
+      <w:r>
+        <w:t xml:space="preserve"> when a site exists.</w:t>
+      </w:r>
+    </w:p>
+    <w:p>
+      <w:pPr>
+        <w:numPr>
+          <w:ilvl w:val="0"/>
+          <w:numId w:val="1"/>
+        </w:numPr>
+      </w:pPr>
+      <w:r>
+        <w:rPr>
+          <w:b/>
+        </w:rPr>
+        <w:t xml:space="preserve">Spec, v1:</w:t>
+      </w:r>
+      <w:r>
+        <w:t xml:space="preserve"> a per-lead </w:t>
+      </w:r>
+      <w:r>
+        <w:rPr>
+          <w:b/>
+        </w:rPr>
+        <w:t xml:space="preserve">"Find email"</w:t>
+      </w:r>
+      <w:r>
+        <w:t xml:space="preserve"> action (and a batch enrich), mirroring Prowl. Server</w:t>
+      </w:r>
+    </w:p>
+    <w:p>
+      <w:r>
+        <w:t xml:space="preserve">pipeline, </w:t>
+      </w:r>
+      <w:r>
+        <w:rPr>
+          <w:b/>
+        </w:rPr>
+        <w:t xml:space="preserve">cheapest-first</w:t>
+      </w:r>
+      <w:r>
+        <w:t xml:space="preserve"> so expensive steps only run on misses: (a) if website exists → scrape </w:t>
+      </w:r>
+      <w:r>
+        <w:rPr>
+          <w:rFonts w:ascii="Consolas" w:hAnsi="Consolas"/>
+          <w:color w:val="9C2D41"/>
+        </w:rPr>
+        <w:t xml:space="preserve">mailto:</w:t>
+      </w:r>
+      <w:r>
+        <w:t xml:space="preserve">/contact; (b) Facebook page lookup by name+location → read About; (c) a couple of directories; (d) fallback to an </w:t>
+      </w:r>
+      <w:r>
+        <w:rPr>
+          <w:b/>
+        </w:rPr>
+        <w:t xml:space="preserve">agent (Manus) or paid API</w:t>
+      </w:r>
+      <w:r>
+        <w:t xml:space="preserve">; (e) </w:t>
+      </w:r>
+      <w:r>
+        <w:rPr>
+          <w:b/>
+        </w:rPr>
+        <w:t xml:space="preserve">verify</w:t>
+      </w:r>
+      <w:r>
+        <w:t xml:space="preserve"> every hit (MX + SMTP, or NeverBounce/ZeroBounce) before it's usable, to protect sender reputation; (f) cache in Blob (like dossiers), rate-limit + cost-cap like generate/prowl. Surface the found + verified email on the lead card/profile, CSV, and an email send template.</w:t>
+      </w:r>
+    </w:p>
+    <w:p>
+      <w:pPr>
+        <w:numPr>
+          <w:ilvl w:val="0"/>
+          <w:numId w:val="1"/>
+        </w:numPr>
+      </w:pPr>
+      <w:r>
+        <w:rPr>
+          <w:b/>
+        </w:rPr>
+        <w:t xml:space="preserve">Caveats to decide on first:</w:t>
+      </w:r>
+      <w:r>
+        <w:t xml:space="preserve"> </w:t>
+      </w:r>
+      <w:r>
+        <w:rPr>
+          <w:b/>
+        </w:rPr>
+        <w:t xml:space="preserve">deliverability</w:t>
+      </w:r>
+      <w:r>
+        <w:t xml:space="preserve">, send cold email from a **separate, warmed</w:t>
+      </w:r>
+    </w:p>
+    <w:p>
+      <w:r>
+        <w:t xml:space="preserve">domain</w:t>
+      </w:r>
+      <w:r>
+        <w:rPr>
+          <w:b/>
+        </w:rPr>
+        <w:t xml:space="preserve">, verify addresses, keep volume low (same discipline as the WhatsApp-ban risk). </w:t>
+      </w:r>
+      <w:r>
+        <w:t xml:space="preserve">UK compliance (not legal advice)</w:t>
+      </w:r>
+      <w:r>
+        <w:rPr>
+          <w:b/>
+        </w:rPr>
+        <w:t xml:space="preserve">, PECR + UK GDPR: cold B2B email to a </w:t>
+      </w:r>
+      <w:r>
+        <w:t xml:space="preserve">limited company</w:t>
+      </w:r>
+      <w:r>
+        <w:rPr>
+          <w:b/>
+        </w:rPr>
+        <w:t xml:space="preserve"> with clear opt-out + identification is lower-risk, but </w:t>
+      </w:r>
+      <w:r>
+        <w:t xml:space="preserve">sole traders/partnerships are treated like individuals</w:t>
+      </w:r>
+      <w:r>
+        <w:rPr>
+          <w:b/>
+        </w:rPr>
+        <w:t xml:space="preserve"> (riskier), and scraping some sources breaches their ToS. Email is likely a </w:t>
+      </w:r>
+      <w:r>
+        <w:t xml:space="preserve">secondary** channel, phone/WhatsApp probably still out-converts cold email for this segment.</w:t>
+      </w:r>
+    </w:p>
+    <w:p>
+      <w:pPr>
+        <w:numPr>
+          <w:ilvl w:val="0"/>
+          <w:numId w:val="1"/>
+        </w:numPr>
+      </w:pPr>
+      <w:r>
+        <w:rPr>
+          <w:b/>
+        </w:rPr>
+        <w:t xml:space="preserve">Build vs buy:</w:t>
+      </w:r>
+      <w:r>
+        <w:t xml:space="preserve"> an agent like </w:t>
+      </w:r>
+      <w:r>
+        <w:rPr>
+          <w:b/>
+        </w:rPr>
+        <w:t xml:space="preserve">Manus</w:t>
+      </w:r>
+      <w:r>
+        <w:t xml:space="preserve"> fed the lead list is likely less work than rebuilding</w:t>
+      </w:r>
+    </w:p>
+    <w:p>
+      <w:r>
+        <w:t xml:space="preserve">multi-source scraping in-app (sites change and fight scrapers); in-app gives more control but a real maintenance burden. Recommend hybrid: cheap deterministic checks in-app, agent/API fallback.</w:t>
       </w:r>
     </w:p>
     <w:p>

</xml_diff>

<commit_message>
Docs: plan publish / host / edit live Pounce websites as a future phase
Capture the go-live spec: publish toggle (renderer already honours
mode:published), domain options (subpath/subdomain/custom domain via
Vercel + host->slug map), the Websites admin screen (data already in
/api/sites), and a JSON field-editor for live edits. Note the /v/ mockup
vs /s/ site distinction.

Co-Authored-By: Claude Opus 4.8 <noreply@anthropic.com>
</commit_message>
<xml_diff>
--- a/DOCS.docx
+++ b/DOCS.docx
@@ -7300,6 +7300,395 @@
     <w:p>
       <w:r>
         <w:t xml:space="preserve">multi-source scraping in-app (sites change and fight scrapers); in-app gives more control but a real maintenance burden. Recommend hybrid: cheap deterministic checks in-app, agent/API fallback.</w:t>
+      </w:r>
+    </w:p>
+    <w:p>
+      <w:pPr>
+        <w:numPr>
+          <w:ilvl w:val="0"/>
+          <w:numId w:val="1"/>
+        </w:numPr>
+      </w:pPr>
+      <w:r>
+        <w:rPr>
+          <w:b/>
+        </w:rPr>
+        <w:t xml:space="preserve">🔮 Future phase, Publish / host / edit live websites (Pounce go-live):</w:t>
+      </w:r>
+      <w:r>
+        <w:t xml:space="preserve"> turn a Pounce</w:t>
+      </w:r>
+    </w:p>
+    <w:p>
+      <w:r>
+        <w:rPr>
+          <w:rFonts w:ascii="Consolas" w:hAnsi="Consolas"/>
+          <w:color w:val="9C2D41"/>
+        </w:rPr>
+        <w:t xml:space="preserve">/s/&lt;slug&gt;</w:t>
+      </w:r>
+      <w:r>
+        <w:t xml:space="preserve"> preview into a real live site a paying client can use. Three parts:</w:t>
+      </w:r>
+    </w:p>
+    <w:p>
+      <w:pPr>
+        <w:numPr>
+          <w:ilvl w:val="0"/>
+          <w:numId w:val="1"/>
+        </w:numPr>
+      </w:pPr>
+      <w:r>
+        <w:rPr>
+          <w:b/>
+        </w:rPr>
+        <w:t xml:space="preserve">Publish toggle (mostly built):</w:t>
+      </w:r>
+      <w:r>
+        <w:t xml:space="preserve"> </w:t>
+      </w:r>
+      <w:r>
+        <w:rPr>
+          <w:rFonts w:ascii="Consolas" w:hAnsi="Consolas"/>
+          <w:color w:val="9C2D41"/>
+        </w:rPr>
+        <w:t xml:space="preserve">api/site.js</w:t>
+      </w:r>
+      <w:r>
+        <w:t xml:space="preserve"> already renders </w:t>
+      </w:r>
+      <w:r>
+        <w:rPr>
+          <w:rFonts w:ascii="Consolas" w:hAnsi="Consolas"/>
+          <w:color w:val="9C2D41"/>
+        </w:rPr>
+        <w:t xml:space="preserve">mode:'published'</w:t>
+      </w:r>
+      <w:r>
+        <w:t xml:space="preserve"> (drops the</w:t>
+      </w:r>
+    </w:p>
+    <w:p>
+      <w:r>
+        <w:t xml:space="preserve">noindex + the "Yes, sign me up" preview bar). Just needs a gated </w:t>
+      </w:r>
+      <w:r>
+        <w:rPr>
+          <w:rFonts w:ascii="Consolas" w:hAnsi="Consolas"/>
+          <w:color w:val="9C2D41"/>
+        </w:rPr>
+        <w:t xml:space="preserve">POST /api/publish</w:t>
+      </w:r>
+      <w:r>
+        <w:t xml:space="preserve"> that flips </w:t>
+      </w:r>
+      <w:r>
+        <w:rPr>
+          <w:rFonts w:ascii="Consolas" w:hAnsi="Consolas"/>
+          <w:color w:val="9C2D41"/>
+        </w:rPr>
+        <w:t xml:space="preserve">sites/&lt;slug&gt;.json</w:t>
+      </w:r>
+      <w:r>
+        <w:t xml:space="preserve"> </w:t>
+      </w:r>
+      <w:r>
+        <w:rPr>
+          <w:rFonts w:ascii="Consolas" w:hAnsi="Consolas"/>
+          <w:color w:val="9C2D41"/>
+        </w:rPr>
+        <w:t xml:space="preserve">mode</w:t>
+      </w:r>
+      <w:r>
+        <w:t xml:space="preserve"> and a Publish/Unpublish button. Because the page renders from the JSON on every request, this is instant, no redeploy.</w:t>
+      </w:r>
+    </w:p>
+    <w:p>
+      <w:pPr>
+        <w:numPr>
+          <w:ilvl w:val="0"/>
+          <w:numId w:val="1"/>
+        </w:numPr>
+      </w:pPr>
+      <w:r>
+        <w:rPr>
+          <w:b/>
+        </w:rPr>
+        <w:t xml:space="preserve">Domain options (low→high effort):</w:t>
+      </w:r>
+      <w:r>
+        <w:t xml:space="preserve"> (a) </w:t>
+      </w:r>
+      <w:r>
+        <w:rPr>
+          <w:b/>
+        </w:rPr>
+        <w:t xml:space="preserve">subpath now</w:t>
+      </w:r>
+      <w:r>
+        <w:t xml:space="preserve">, </w:t>
+      </w:r>
+      <w:r>
+        <w:rPr>
+          <w:rFonts w:ascii="Consolas" w:hAnsi="Consolas"/>
+          <w:color w:val="9C2D41"/>
+        </w:rPr>
+        <w:t xml:space="preserve">sitepounce.com/s/&lt;slug&gt;</w:t>
+      </w:r>
+      <w:r>
+        <w:t xml:space="preserve"> (free,</w:t>
+      </w:r>
+    </w:p>
+    <w:p>
+      <w:r>
+        <w:t xml:space="preserve">instant) or a tidier </w:t>
+      </w:r>
+      <w:r>
+        <w:rPr>
+          <w:rFonts w:ascii="Consolas" w:hAnsi="Consolas"/>
+          <w:color w:val="9C2D41"/>
+        </w:rPr>
+        <w:t xml:space="preserve">aiwebpoint.com/s/&lt;slug&gt;</w:t>
+      </w:r>
+      <w:r>
+        <w:t xml:space="preserve">; (b) </w:t>
+      </w:r>
+      <w:r>
+        <w:rPr>
+          <w:b/>
+        </w:rPr>
+        <w:t xml:space="preserve">per-client subdomain</w:t>
+      </w:r>
+      <w:r>
+        <w:t xml:space="preserve"> </w:t>
+      </w:r>
+      <w:r>
+        <w:rPr>
+          <w:rFonts w:ascii="Consolas" w:hAnsi="Consolas"/>
+          <w:color w:val="9C2D41"/>
+        </w:rPr>
+        <w:t xml:space="preserve">client.aiwebpoint.com</w:t>
+      </w:r>
+      <w:r>
+        <w:t xml:space="preserve"> via a wildcard domain + host→slug routing; (c) </w:t>
+      </w:r>
+      <w:r>
+        <w:rPr>
+          <w:b/>
+        </w:rPr>
+        <w:t xml:space="preserve">client's own custom domain</w:t>
+      </w:r>
+      <w:r>
+        <w:t xml:space="preserve"> (</w:t>
+      </w:r>
+      <w:r>
+        <w:rPr>
+          <w:rFonts w:ascii="Consolas" w:hAnsi="Consolas"/>
+          <w:color w:val="9C2D41"/>
+        </w:rPr>
+        <w:t xml:space="preserve">theirbiz.co.uk</w:t>
+      </w:r>
+      <w:r>
+        <w:t xml:space="preserve">), the real "live website", needs: client owns/buys the domain → add it to the Vercel project (dashboard or Vercel Domains API) → DNS A/CNAME at their registrar → a </w:t>
+      </w:r>
+      <w:r>
+        <w:rPr>
+          <w:rFonts w:ascii="Consolas" w:hAnsi="Consolas"/>
+          <w:color w:val="9C2D41"/>
+        </w:rPr>
+        <w:t xml:space="preserve">host → slug</w:t>
+      </w:r>
+      <w:r>
+        <w:t xml:space="preserve"> map (store </w:t>
+      </w:r>
+      <w:r>
+        <w:rPr>
+          <w:rFonts w:ascii="Consolas" w:hAnsi="Consolas"/>
+          <w:color w:val="9C2D41"/>
+        </w:rPr>
+        <w:t xml:space="preserve">customDomain</w:t>
+      </w:r>
+      <w:r>
+        <w:t xml:space="preserve"> on the site JSON or a </w:t>
+      </w:r>
+      <w:r>
+        <w:rPr>
+          <w:rFonts w:ascii="Consolas" w:hAnsi="Consolas"/>
+          <w:color w:val="9C2D41"/>
+        </w:rPr>
+        <w:t xml:space="preserve">domains/&lt;host&gt;.json</w:t>
+      </w:r>
+      <w:r>
+        <w:t xml:space="preserve">) resolved by </w:t>
+      </w:r>
+      <w:r>
+        <w:rPr>
+          <w:rFonts w:ascii="Consolas" w:hAnsi="Consolas"/>
+          <w:color w:val="9C2D41"/>
+        </w:rPr>
+        <w:t xml:space="preserve">middleware.js</w:t>
+      </w:r>
+      <w:r>
+        <w:t xml:space="preserve">/</w:t>
+      </w:r>
+      <w:r>
+        <w:rPr>
+          <w:rFonts w:ascii="Consolas" w:hAnsi="Consolas"/>
+          <w:color w:val="9C2D41"/>
+        </w:rPr>
+        <w:t xml:space="preserve">api/site.js</w:t>
+      </w:r>
+      <w:r>
+        <w:t xml:space="preserve"> from the Host header. SSL is automatic. Per-domain DNS/add is manual ops (scriptable via Vercel API at scale).</w:t>
+      </w:r>
+    </w:p>
+    <w:p>
+      <w:pPr>
+        <w:numPr>
+          <w:ilvl w:val="0"/>
+          <w:numId w:val="1"/>
+        </w:numPr>
+      </w:pPr>
+      <w:r>
+        <w:rPr>
+          <w:b/>
+        </w:rPr>
+        <w:t xml:space="preserve">Websites list (data already exists):</w:t>
+      </w:r>
+      <w:r>
+        <w:t xml:space="preserve"> </w:t>
+      </w:r>
+      <w:r>
+        <w:rPr>
+          <w:rFonts w:ascii="Consolas" w:hAnsi="Consolas"/>
+          <w:color w:val="9C2D41"/>
+        </w:rPr>
+        <w:t xml:space="preserve">GET /api/sites</w:t>
+      </w:r>
+      <w:r>
+        <w:t xml:space="preserve"> already returns every site</w:t>
+      </w:r>
+    </w:p>
+    <w:p>
+      <w:r>
+        <w:t xml:space="preserve">(slug, name, mode, createdAt, </w:t>
+      </w:r>
+      <w:r>
+        <w:rPr>
+          <w:rFonts w:ascii="Consolas" w:hAnsi="Consolas"/>
+          <w:color w:val="9C2D41"/>
+        </w:rPr>
+        <w:t xml:space="preserve">/s/</w:t>
+      </w:r>
+      <w:r>
+        <w:t xml:space="preserve"> url). Missing only an in-app </w:t>
+      </w:r>
+      <w:r>
+        <w:rPr>
+          <w:b/>
+        </w:rPr>
+        <w:t xml:space="preserve">🌐 Websites</w:t>
+      </w:r>
+      <w:r>
+        <w:t xml:space="preserve"> screen: a table with Status (Preview/Published), clickable URL, Created, and Open / Publish / Edit / Rebuild / Set-domain actions. This is the parked "tidy-up admin UI".</w:t>
+      </w:r>
+    </w:p>
+    <w:p>
+      <w:pPr>
+        <w:numPr>
+          <w:ilvl w:val="0"/>
+          <w:numId w:val="1"/>
+        </w:numPr>
+      </w:pPr>
+      <w:r>
+        <w:rPr>
+          <w:b/>
+        </w:rPr>
+        <w:t xml:space="preserve">Edit a live site (client change requests):</w:t>
+      </w:r>
+      <w:r>
+        <w:t xml:space="preserve"> the whole page is structured JSON</w:t>
+      </w:r>
+    </w:p>
+    <w:p>
+      <w:r>
+        <w:t xml:space="preserve">(</w:t>
+      </w:r>
+      <w:r>
+        <w:rPr>
+          <w:rFonts w:ascii="Consolas" w:hAnsi="Consolas"/>
+          <w:color w:val="9C2D41"/>
+        </w:rPr>
+        <w:t xml:space="preserve">sites/&lt;slug&gt;.json</w:t>
+      </w:r>
+      <w:r>
+        <w:t xml:space="preserve">: hero, services, about, reviews, faq, accreditations, areas, phone…), so </w:t>
+      </w:r>
+      <w:r>
+        <w:rPr>
+          <w:b/>
+        </w:rPr>
+        <w:t xml:space="preserve">any edit to the JSON is live immediately</w:t>
+      </w:r>
+      <w:r>
+        <w:t xml:space="preserve">. v1 = a </w:t>
+      </w:r>
+      <w:r>
+        <w:rPr>
+          <w:b/>
+        </w:rPr>
+        <w:t xml:space="preserve">field editor</w:t>
+      </w:r>
+      <w:r>
+        <w:t xml:space="preserve"> (form that loads the JSON, edits headline/services/about/phone/offer/FAQ etc., saves via a gated </w:t>
+      </w:r>
+      <w:r>
+        <w:rPr>
+          <w:rFonts w:ascii="Consolas" w:hAnsi="Consolas"/>
+          <w:color w:val="9C2D41"/>
+        </w:rPr>
+        <w:t xml:space="preserve">POST</w:t>
+      </w:r>
+      <w:r>
+        <w:t xml:space="preserve"> that writes the JSON back). Later = an </w:t>
+      </w:r>
+      <w:r>
+        <w:rPr>
+          <w:b/>
+        </w:rPr>
+        <w:t xml:space="preserve">AI "tell me what to change"</w:t>
+      </w:r>
+      <w:r>
+        <w:t xml:space="preserve"> patcher (targeted, unlike the blunt </w:t>
+      </w:r>
+      <w:r>
+        <w:rPr>
+          <w:b/>
+        </w:rPr>
+        <w:t xml:space="preserve">Rebuild</w:t>
+      </w:r>
+      <w:r>
+        <w:t xml:space="preserve"> which regenerates from scratch and loses manual tweaks). Photos tie into the planned client-photo-upload. Caveat: only Pounce </w:t>
+      </w:r>
+      <w:r>
+        <w:rPr>
+          <w:rFonts w:ascii="Consolas" w:hAnsi="Consolas"/>
+          <w:color w:val="9C2D41"/>
+        </w:rPr>
+        <w:t xml:space="preserve">/s/</w:t>
+      </w:r>
+      <w:r>
+        <w:t xml:space="preserve"> sites are editable; a </w:t>
+      </w:r>
+      <w:r>
+        <w:rPr>
+          <w:rFonts w:ascii="Consolas" w:hAnsi="Consolas"/>
+          <w:color w:val="9C2D41"/>
+        </w:rPr>
+        <w:t xml:space="preserve">/v/</w:t>
+      </w:r>
+      <w:r>
+        <w:t xml:space="preserve"> mockup is an image (regenerate, don't edit), so a lead needs a Pounce build first.</w:t>
       </w:r>
     </w:p>
     <w:p>

</xml_diff>

<commit_message>
Docs: refine live-website phase per user decisions
Websites tab lists mockups + sites; Make Live offers a subdomain or
add-your-own-domain (with DNS + Vercel API verification); editing is an
AI box + file upload that returns a minimal patch, shows a diff, and only
applies on confirm (with a JSON backup for revert). Records the agreed
build order.

Co-Authored-By: Claude Opus 4.8 <noreply@anthropic.com>
</commit_message>
<xml_diff>
--- a/DOCS.docx
+++ b/DOCS.docx
@@ -7631,35 +7631,62 @@
         <w:t xml:space="preserve">any edit to the JSON is live immediately</w:t>
       </w:r>
       <w:r>
-        <w:t xml:space="preserve">. v1 = a </w:t>
-      </w:r>
-      <w:r>
-        <w:rPr>
-          <w:b/>
-        </w:rPr>
-        <w:t xml:space="preserve">field editor</w:t>
-      </w:r>
-      <w:r>
-        <w:t xml:space="preserve"> (form that loads the JSON, edits headline/services/about/phone/offer/FAQ etc., saves via a gated </w:t>
-      </w:r>
-      <w:r>
-        <w:rPr>
-          <w:rFonts w:ascii="Consolas" w:hAnsi="Consolas"/>
-          <w:color w:val="9C2D41"/>
-        </w:rPr>
-        <w:t xml:space="preserve">POST</w:t>
-      </w:r>
-      <w:r>
-        <w:t xml:space="preserve"> that writes the JSON back). Later = an </w:t>
-      </w:r>
-      <w:r>
-        <w:rPr>
-          <w:b/>
-        </w:rPr>
-        <w:t xml:space="preserve">AI "tell me what to change"</w:t>
-      </w:r>
-      <w:r>
-        <w:t xml:space="preserve"> patcher (targeted, unlike the blunt </w:t>
+        <w:t xml:space="preserve">. </w:t>
+      </w:r>
+      <w:r>
+        <w:rPr>
+          <w:b/>
+        </w:rPr>
+        <w:t xml:space="preserve">User decision (2026-06-11): an AI edit box, not a field editor.</w:t>
+      </w:r>
+      <w:r>
+        <w:t xml:space="preserve"> Flow that enforces "only change what was asked": (1) AI gets the current JSON + the instruction (+ optional uploaded files) and returns a </w:t>
+      </w:r>
+      <w:r>
+        <w:rPr>
+          <w:b/>
+        </w:rPr>
+        <w:t xml:space="preserve">minimal patch</w:t>
+      </w:r>
+      <w:r>
+        <w:t xml:space="preserve"> (only changed fields), never a full rebuild; (2) </w:t>
+      </w:r>
+      <w:r>
+        <w:rPr>
+          <w:b/>
+        </w:rPr>
+        <w:t xml:space="preserve">show a diff and require Apply/confirm</w:t>
+      </w:r>
+      <w:r>
+        <w:t xml:space="preserve"> before writing, never auto-apply; (3) </w:t>
+      </w:r>
+      <w:r>
+        <w:rPr>
+          <w:b/>
+        </w:rPr>
+        <w:t xml:space="preserve">back up the previous JSON</w:t>
+      </w:r>
+      <w:r>
+        <w:t xml:space="preserve"> each edit (one-click revert for live client sites); (4) the fixed template is a built-in guardrail, the AI can only touch content fields, not layout. </w:t>
+      </w:r>
+      <w:r>
+        <w:rPr>
+          <w:b/>
+        </w:rPr>
+        <w:t xml:space="preserve">File upload:</w:t>
+      </w:r>
+      <w:r>
+        <w:t xml:space="preserve"> 1+ images → Blob → added to </w:t>
+      </w:r>
+      <w:r>
+        <w:rPr>
+          <w:rFonts w:ascii="Consolas" w:hAnsi="Consolas"/>
+          <w:color w:val="9C2D41"/>
+        </w:rPr>
+        <w:t xml:space="preserve">gallery</w:t>
+      </w:r>
+      <w:r>
+        <w:t xml:space="preserve">/hero in the same preview step (doubles as the planned client-photo-upload). The blunt existing </w:t>
       </w:r>
       <w:r>
         <w:rPr>
@@ -7668,7 +7695,7 @@
         <w:t xml:space="preserve">Rebuild</w:t>
       </w:r>
       <w:r>
-        <w:t xml:space="preserve"> which regenerates from scratch and loses manual tweaks). Photos tie into the planned client-photo-upload. Caveat: only Pounce </w:t>
+        <w:t xml:space="preserve"> regenerates from scratch (loses tweaks) so it's not the edit path. Caveat: only Pounce </w:t>
       </w:r>
       <w:r>
         <w:rPr>
@@ -7689,6 +7716,112 @@
       </w:r>
       <w:r>
         <w:t xml:space="preserve"> mockup is an image (regenerate, don't edit), so a lead needs a Pounce build first.</w:t>
+      </w:r>
+    </w:p>
+    <w:p>
+      <w:pPr>
+        <w:numPr>
+          <w:ilvl w:val="0"/>
+          <w:numId w:val="1"/>
+        </w:numPr>
+      </w:pPr>
+      <w:r>
+        <w:rPr>
+          <w:b/>
+        </w:rPr>
+        <w:t xml:space="preserve">UI (user decision 2026-06-11): a 🌐 Websites tab</w:t>
+      </w:r>
+      <w:r>
+        <w:t xml:space="preserve"> with a </w:t>
+      </w:r>
+      <w:r>
+        <w:rPr>
+          <w:b/>
+        </w:rPr>
+        <w:t xml:space="preserve">Mockups (`/v/`)</w:t>
+      </w:r>
+      <w:r>
+        <w:t xml:space="preserve"> list and a</w:t>
+      </w:r>
+    </w:p>
+    <w:p>
+      <w:r>
+        <w:rPr>
+          <w:b/>
+        </w:rPr>
+        <w:t xml:space="preserve">Websites (`/s/`)</w:t>
+      </w:r>
+      <w:r>
+        <w:t xml:space="preserve"> list. Each site row has </w:t>
+      </w:r>
+      <w:r>
+        <w:rPr>
+          <w:b/>
+        </w:rPr>
+        <w:t xml:space="preserve">Make Live</w:t>
+      </w:r>
+      <w:r>
+        <w:t xml:space="preserve"> → choose a </w:t>
+      </w:r>
+      <w:r>
+        <w:rPr>
+          <w:b/>
+        </w:rPr>
+        <w:t xml:space="preserve">subdomain</w:t>
+      </w:r>
+      <w:r>
+        <w:t xml:space="preserve"> (</w:t>
+      </w:r>
+      <w:r>
+        <w:rPr>
+          <w:rFonts w:ascii="Consolas" w:hAnsi="Consolas"/>
+          <w:color w:val="9C2D41"/>
+        </w:rPr>
+        <w:t xml:space="preserve">name.aiwebpoint.com</w:t>
+      </w:r>
+      <w:r>
+        <w:t xml:space="preserve">, easy/self-serve, the recommended first path) </w:t>
+      </w:r>
+      <w:r>
+        <w:rPr>
+          <w:b/>
+        </w:rPr>
+        <w:t xml:space="preserve">or Add your own domain</w:t>
+      </w:r>
+      <w:r>
+        <w:t xml:space="preserve"> (shows the DNS records + must add the domain to Vercel via the Domains API + a verification poll).</w:t>
+      </w:r>
+    </w:p>
+    <w:p>
+      <w:pPr>
+        <w:numPr>
+          <w:ilvl w:val="0"/>
+          <w:numId w:val="1"/>
+        </w:numPr>
+      </w:pPr>
+      <w:r>
+        <w:rPr>
+          <w:b/>
+        </w:rPr>
+        <w:t xml:space="preserve">Build order (agreed):</w:t>
+      </w:r>
+      <w:r>
+        <w:t xml:space="preserve"> (1) Websites tab + lists; (2) Make Live via subdomain (publish flag +</w:t>
+      </w:r>
+    </w:p>
+    <w:p>
+      <w:r>
+        <w:t xml:space="preserve">wildcard </w:t>
+      </w:r>
+      <w:r>
+        <w:rPr>
+          <w:rFonts w:ascii="Consolas" w:hAnsi="Consolas"/>
+          <w:color w:val="9C2D41"/>
+        </w:rPr>
+        <w:t xml:space="preserve">*.aiwebpoint.com</w:t>
+      </w:r>
+      <w:r>
+        <w:t xml:space="preserve"> + subdomain→slug map + middleware); (3) AI edit box + file upload (patch → diff → confirm → backup); (4) custom domains (Vercel API + DNS + verification, most ops).</w:t>
       </w:r>
     </w:p>
     <w:p>

</xml_diff>

<commit_message>
Add Websites tab: mockups + preview/live sites, filterable
New 🌐 Websites tab lists every mockup (/v/) and Pounce site (/s/) in one
table with a type badge, link and Open, filterable by All / Mockups /
Preview sites / Live sites (counts shown) + name search. /api/sites now
returns an absolute branded URL. Phase 1 of the live-websites plan;
Make Live + AI editor come next.

Co-Authored-By: Claude Opus 4.8 <noreply@anthropic.com>
</commit_message>
<xml_diff>
--- a/DOCS.docx
+++ b/DOCS.docx
@@ -392,7 +392,7 @@
         <w:t xml:space="preserve">top navigation</w:t>
       </w:r>
       <w:r>
-        <w:t xml:space="preserve"> with four views (</w:t>
+        <w:t xml:space="preserve"> (</w:t>
       </w:r>
       <w:r>
         <w:rPr>
@@ -589,6 +589,51 @@
           <w:p>
             <w:r>
               <w:t xml:space="preserve">Every business worked: searchable/filterable table (Prowled / Website built / Messaged / Blocked); each row opens the Lead Profile</w:t>
+            </w:r>
+          </w:p>
+        </w:tc>
+      </w:tr>
+      <w:tr>
+        <w:tc>
+          <w:tcPr>
+            <w:tcW w:w="0" w:type="auto"/>
+          </w:tcPr>
+          <w:p>
+            <w:r>
+              <w:rPr>
+                <w:b/>
+              </w:rPr>
+              <w:t xml:space="preserve">🌐 Websites</w:t>
+            </w:r>
+          </w:p>
+        </w:tc>
+        <w:tc>
+          <w:tcPr>
+            <w:tcW w:w="0" w:type="auto"/>
+          </w:tcPr>
+          <w:p>
+            <w:r>
+              <w:t xml:space="preserve">Every mockup (</w:t>
+            </w:r>
+            <w:r>
+              <w:rPr>
+                <w:rFonts w:ascii="Consolas" w:hAnsi="Consolas"/>
+                <w:color w:val="9C2D41"/>
+              </w:rPr>
+              <w:t xml:space="preserve">/v/</w:t>
+            </w:r>
+            <w:r>
+              <w:t xml:space="preserve">) + Pounce site (</w:t>
+            </w:r>
+            <w:r>
+              <w:rPr>
+                <w:rFonts w:ascii="Consolas" w:hAnsi="Consolas"/>
+                <w:color w:val="9C2D41"/>
+              </w:rPr>
+              <w:t xml:space="preserve">/s/</w:t>
+            </w:r>
+            <w:r>
+              <w:t xml:space="preserve">) in one table, filterable by Mockup / Preview site / Live site, with the link + Open. (Make Live / AI editor are the next phases.)</w:t>
             </w:r>
           </w:p>
         </w:tc>

</xml_diff>

<commit_message>
Websites tab: rename "Preview site" -> "Draft site"
Label-only change (filter, badge, subtitle, docs). The /s/<slug> URL is
unchanged for both draft and live, "live" is just the mode flag, not a
different path, so shared links don't break on publish.

Co-Authored-By: Claude Opus 4.8 <noreply@anthropic.com>
</commit_message>
<xml_diff>
--- a/DOCS.docx
+++ b/DOCS.docx
@@ -633,7 +633,104 @@
               <w:t xml:space="preserve">/s/</w:t>
             </w:r>
             <w:r>
-              <w:t xml:space="preserve">) in one table, filterable by Mockup / Preview site / Live site, with the link + Open. (Make Live / AI editor are the next phases.)</w:t>
+              <w:t xml:space="preserve">) in one table, filterable by Mockup / Draft site / Live site, with the link + Open. Terminology: </w:t>
+            </w:r>
+            <w:r>
+              <w:rPr>
+                <w:b/>
+              </w:rPr>
+              <w:t xml:space="preserve">Mockup</w:t>
+            </w:r>
+            <w:r>
+              <w:t xml:space="preserve"> = image preview (</w:t>
+            </w:r>
+            <w:r>
+              <w:rPr>
+                <w:rFonts w:ascii="Consolas" w:hAnsi="Consolas"/>
+                <w:color w:val="9C2D41"/>
+              </w:rPr>
+              <w:t xml:space="preserve">/v/</w:t>
+            </w:r>
+            <w:r>
+              <w:t xml:space="preserve">); </w:t>
+            </w:r>
+            <w:r>
+              <w:rPr>
+                <w:b/>
+              </w:rPr>
+              <w:t xml:space="preserve">Draft site</w:t>
+            </w:r>
+            <w:r>
+              <w:t xml:space="preserve"> = built but unpublished (</w:t>
+            </w:r>
+            <w:r>
+              <w:rPr>
+                <w:rFonts w:ascii="Consolas" w:hAnsi="Consolas"/>
+                <w:color w:val="9C2D41"/>
+              </w:rPr>
+              <w:t xml:space="preserve">/s/</w:t>
+            </w:r>
+            <w:r>
+              <w:t xml:space="preserve">, </w:t>
+            </w:r>
+            <w:r>
+              <w:rPr>
+                <w:rFonts w:ascii="Consolas" w:hAnsi="Consolas"/>
+                <w:color w:val="9C2D41"/>
+              </w:rPr>
+              <w:t xml:space="preserve">mode:preview</w:t>
+            </w:r>
+            <w:r>
+              <w:t xml:space="preserve">); </w:t>
+            </w:r>
+            <w:r>
+              <w:rPr>
+                <w:b/>
+              </w:rPr>
+              <w:t xml:space="preserve">Live site</w:t>
+            </w:r>
+            <w:r>
+              <w:t xml:space="preserve"> = published (</w:t>
+            </w:r>
+            <w:r>
+              <w:rPr>
+                <w:rFonts w:ascii="Consolas" w:hAnsi="Consolas"/>
+                <w:color w:val="9C2D41"/>
+              </w:rPr>
+              <w:t xml:space="preserve">/s/</w:t>
+            </w:r>
+            <w:r>
+              <w:t xml:space="preserve">, </w:t>
+            </w:r>
+            <w:r>
+              <w:rPr>
+                <w:rFonts w:ascii="Consolas" w:hAnsi="Consolas"/>
+                <w:color w:val="9C2D41"/>
+              </w:rPr>
+              <w:t xml:space="preserve">mode:published</w:t>
+            </w:r>
+            <w:r>
+              <w:t xml:space="preserve">). Draft and Live share the same </w:t>
+            </w:r>
+            <w:r>
+              <w:rPr>
+                <w:rFonts w:ascii="Consolas" w:hAnsi="Consolas"/>
+                <w:color w:val="9C2D41"/>
+              </w:rPr>
+              <w:t xml:space="preserve">/s/&lt;slug&gt;</w:t>
+            </w:r>
+            <w:r>
+              <w:t xml:space="preserve"> URL, "live" is just the </w:t>
+            </w:r>
+            <w:r>
+              <w:rPr>
+                <w:rFonts w:ascii="Consolas" w:hAnsi="Consolas"/>
+                <w:color w:val="9C2D41"/>
+              </w:rPr>
+              <w:t xml:space="preserve">mode</w:t>
+            </w:r>
+            <w:r>
+              <w:t xml:space="preserve"> flag, not a different path. (Make Live / AI editor are the next phases.)</w:t>
             </w:r>
           </w:p>
         </w:tc>

</xml_diff>

<commit_message>
Docs: full pass + change log; document Websites tab, daily table, by-search-type
Bump date to 2026-06-11, document the By Search Type table (niche grouping,
hover names, searchLoc) and the daily activity table (hover validation +
percentages + what "messaged" counts), and add a consolidated change log
(2026-06-09..11). Regenerate the Word copy.

Co-Authored-By: Claude Opus 4.8 <noreply@anthropic.com>
</commit_message>
<xml_diff>
--- a/DOCS.docx
+++ b/DOCS.docx
@@ -12,7 +12,7 @@
     </w:p>
     <w:p>
       <w:r>
-        <w:t xml:space="preserve">_Last updated: 2026-06-10_</w:t>
+        <w:t xml:space="preserve">_Last updated: 2026-06-11_</w:t>
       </w:r>
     </w:p>
     <w:p>
@@ -1826,6 +1826,71 @@
         <w:rPr>
           <w:b/>
         </w:rPr>
+        <w:t xml:space="preserve">🔎 By Search Type table:</w:t>
+      </w:r>
+      <w:r>
+        <w:t xml:space="preserve"> every mockup grouped by </w:t>
+      </w:r>
+      <w:r>
+        <w:rPr>
+          <w:b/>
+        </w:rPr>
+        <w:t xml:space="preserve">niche + area</w:t>
+      </w:r>
+      <w:r>
+        <w:t xml:space="preserve">, then </w:t>
+      </w:r>
+      <w:r>
+        <w:rPr>
+          <w:b/>
+        </w:rPr>
+        <w:t xml:space="preserve">grouped by niche</w:t>
+      </w:r>
+    </w:p>
+    <w:p>
+      <w:r>
+        <w:t xml:space="preserve">(busiest niche first, separator line between niches). Columns = Mockups / Messaged / Mockup viewed (% of messaged) / Demo clicks / Sign-up clicks / Not interested. The 🔥/🤑/🙅 counts </w:t>
+      </w:r>
+      <w:r>
+        <w:rPr>
+          <w:b/>
+        </w:rPr>
+        <w:t xml:space="preserve">hover to show the business names</w:t>
+      </w:r>
+      <w:r>
+        <w:t xml:space="preserve">. Location shows the </w:t>
+      </w:r>
+      <w:r>
+        <w:rPr>
+          <w:b/>
+        </w:rPr>
+        <w:t xml:space="preserve">core town you searched</w:t>
+      </w:r>
+      <w:r>
+        <w:t xml:space="preserve"> with the lead's actual (auto-expanded) town in brackets, e.g. "Wolverhampton (Dudley)", from the stored </w:t>
+      </w:r>
+      <w:r>
+        <w:rPr>
+          <w:rFonts w:ascii="Consolas" w:hAnsi="Consolas"/>
+          <w:color w:val="9C2D41"/>
+        </w:rPr>
+        <w:t xml:space="preserve">searchLoc</w:t>
+      </w:r>
+      <w:r>
+        <w:t xml:space="preserve">.</w:t>
+      </w:r>
+    </w:p>
+    <w:p>
+      <w:pPr>
+        <w:numPr>
+          <w:ilvl w:val="0"/>
+          <w:numId w:val="1"/>
+        </w:numPr>
+      </w:pPr>
+      <w:r>
+        <w:rPr>
+          <w:b/>
+        </w:rPr>
         <w:t xml:space="preserve">🎯 Daily activity table:</w:t>
       </w:r>
       <w:r>
@@ -1834,7 +1899,43 @@
     </w:p>
     <w:p>
       <w:r>
-        <w:t xml:space="preserve">Mockups / Messaged / Mockup viewed / Demo clicks / Sign-up clicks / Not interested, with Today highlighted, so you can track daily targets. Built from a per-day </w:t>
+        <w:t xml:space="preserve">Mockups / Messaged / Mockup viewed / Demo clicks / Sign-up clicks / Not interested, </w:t>
+      </w:r>
+      <w:r>
+        <w:rPr>
+          <w:b/>
+        </w:rPr>
+        <w:t xml:space="preserve">Today highlighted</w:t>
+      </w:r>
+      <w:r>
+        <w:t xml:space="preserve">. </w:t>
+      </w:r>
+      <w:r>
+        <w:rPr>
+          <w:b/>
+        </w:rPr>
+        <w:t xml:space="preserve">Every number hovers to show the businesses behind it</w:t>
+      </w:r>
+      <w:r>
+        <w:t xml:space="preserve"> (validation), and shows a </w:t>
+      </w:r>
+      <w:r>
+        <w:rPr>
+          <w:b/>
+        </w:rPr>
+        <w:t xml:space="preserve">percentage</w:t>
+      </w:r>
+      <w:r>
+        <w:t xml:space="preserve"> (Messaged vs that day's Mockups; the rest vs that day's Messaged). NB "Messaged" is counted when the WhatsApp/SMS </w:t>
+      </w:r>
+      <w:r>
+        <w:rPr>
+          <w:b/>
+        </w:rPr>
+        <w:t xml:space="preserve">send flow is opened</w:t>
+      </w:r>
+      <w:r>
+        <w:t xml:space="preserve"> (the app can't see if Send was actually pressed in WhatsApp). Built from a per-day </w:t>
       </w:r>
       <w:r>
         <w:rPr>
@@ -1854,7 +1955,7 @@
         <w:t xml:space="preserve">lib/db.js</w:t>
       </w:r>
       <w:r>
-        <w:t xml:space="preserve">, distinct businesses per event) + mockups bucketed by blob date; independent of the 7/30/all range.</w:t>
+        <w:t xml:space="preserve">, distinct businesses per event, with slug→name) + mockups bucketed by blob date; independent of the 7/30/all range.</w:t>
       </w:r>
     </w:p>
     <w:p>
@@ -7986,6 +8087,507 @@
     <w:p>
       <w:r>
         <w:t xml:space="preserve">tidy-up admin UI (bulk-delete stale previews), per-keyword dashboard breakdowns, multi-user accounts + billing (SaaS), Pounce FAQ/Book-a-Demo/"Not sure yet?" sections on the subscribe page.</w:t>
+      </w:r>
+    </w:p>
+    <w:p>
+      <w:pPr>
+        <w:pStyle w:val="Heading2"/>
+      </w:pPr>
+      <w:r>
+        <w:t xml:space="preserve">11b. Change log (recent sessions)</w:t>
+      </w:r>
+    </w:p>
+    <w:p>
+      <w:r>
+        <w:t xml:space="preserve">Newest first. Reference sections above are the source of truth; this is a quick history.</w:t>
+      </w:r>
+    </w:p>
+    <w:p>
+      <w:r>
+        <w:rPr>
+          <w:b/>
+        </w:rPr>
+        <w:t xml:space="preserve">2026-06-11</w:t>
+      </w:r>
+    </w:p>
+    <w:p>
+      <w:pPr>
+        <w:numPr>
+          <w:ilvl w:val="0"/>
+          <w:numId w:val="1"/>
+        </w:numPr>
+      </w:pPr>
+      <w:r>
+        <w:rPr>
+          <w:b/>
+        </w:rPr>
+        <w:t xml:space="preserve">🌐 Websites tab (new):</w:t>
+      </w:r>
+      <w:r>
+        <w:t xml:space="preserve"> lists every mockup (</w:t>
+      </w:r>
+      <w:r>
+        <w:rPr>
+          <w:rFonts w:ascii="Consolas" w:hAnsi="Consolas"/>
+          <w:color w:val="9C2D41"/>
+        </w:rPr>
+        <w:t xml:space="preserve">/v/</w:t>
+      </w:r>
+      <w:r>
+        <w:t xml:space="preserve">) + Pounce site (</w:t>
+      </w:r>
+      <w:r>
+        <w:rPr>
+          <w:rFonts w:ascii="Consolas" w:hAnsi="Consolas"/>
+          <w:color w:val="9C2D41"/>
+        </w:rPr>
+        <w:t xml:space="preserve">/s/</w:t>
+      </w:r>
+      <w:r>
+        <w:t xml:space="preserve">) in one table,</w:t>
+      </w:r>
+    </w:p>
+    <w:p>
+      <w:r>
+        <w:t xml:space="preserve">filter chips with counts (All / 🖼️ Mockups / 🛠️ Draft sites / 🟢 Live sites) + name search. Terminology fixed: Mockup / </w:t>
+      </w:r>
+      <w:r>
+        <w:rPr>
+          <w:b/>
+        </w:rPr>
+        <w:t xml:space="preserve">Draft site</w:t>
+      </w:r>
+      <w:r>
+        <w:t xml:space="preserve"> (built, unpublished) / </w:t>
+      </w:r>
+      <w:r>
+        <w:rPr>
+          <w:b/>
+        </w:rPr>
+        <w:t xml:space="preserve">Live site</w:t>
+      </w:r>
+      <w:r>
+        <w:t xml:space="preserve"> (published); draft &amp; live share the same </w:t>
+      </w:r>
+      <w:r>
+        <w:rPr>
+          <w:rFonts w:ascii="Consolas" w:hAnsi="Consolas"/>
+          <w:color w:val="9C2D41"/>
+        </w:rPr>
+        <w:t xml:space="preserve">/s/&lt;slug&gt;</w:t>
+      </w:r>
+      <w:r>
+        <w:t xml:space="preserve"> URL (live = the </w:t>
+      </w:r>
+      <w:r>
+        <w:rPr>
+          <w:rFonts w:ascii="Consolas" w:hAnsi="Consolas"/>
+          <w:color w:val="9C2D41"/>
+        </w:rPr>
+        <w:t xml:space="preserve">mode</w:t>
+      </w:r>
+      <w:r>
+        <w:t xml:space="preserve"> flag, not a new path). The raw URL column was removed (Open button only) so prospects can't read the link off-screen. </w:t>
+      </w:r>
+      <w:r>
+        <w:rPr>
+          <w:rFonts w:ascii="Consolas" w:hAnsi="Consolas"/>
+          <w:color w:val="9C2D41"/>
+        </w:rPr>
+        <w:t xml:space="preserve">/api/sites</w:t>
+      </w:r>
+      <w:r>
+        <w:t xml:space="preserve"> now returns an absolute branded URL. (Phase 1 of the live-websites plan.)</w:t>
+      </w:r>
+    </w:p>
+    <w:p>
+      <w:pPr>
+        <w:numPr>
+          <w:ilvl w:val="0"/>
+          <w:numId w:val="1"/>
+        </w:numPr>
+      </w:pPr>
+      <w:r>
+        <w:rPr>
+          <w:b/>
+        </w:rPr>
+        <w:t xml:space="preserve">🎯 Daily activity table (new)</w:t>
+      </w:r>
+      <w:r>
+        <w:t xml:space="preserve"> on Performance, with hover-names + per-day percentages (see §3).</w:t>
+      </w:r>
+    </w:p>
+    <w:p>
+      <w:pPr>
+        <w:numPr>
+          <w:ilvl w:val="0"/>
+          <w:numId w:val="1"/>
+        </w:numPr>
+      </w:pPr>
+      <w:r>
+        <w:rPr>
+          <w:b/>
+        </w:rPr>
+        <w:t xml:space="preserve">By Search Type:</w:t>
+      </w:r>
+      <w:r>
+        <w:t xml:space="preserve"> grouped by niche, hover-names on 🔥/🤑/🙅, core-search town shown with the</w:t>
+      </w:r>
+    </w:p>
+    <w:p>
+      <w:r>
+        <w:t xml:space="preserve">auto-expanded town in brackets via the new </w:t>
+      </w:r>
+      <w:r>
+        <w:rPr>
+          <w:rFonts w:ascii="Consolas" w:hAnsi="Consolas"/>
+          <w:color w:val="9C2D41"/>
+        </w:rPr>
+        <w:t xml:space="preserve">searchLoc</w:t>
+      </w:r>
+      <w:r>
+        <w:t xml:space="preserve"> field, "Not interested" column added.</w:t>
+      </w:r>
+    </w:p>
+    <w:p>
+      <w:pPr>
+        <w:numPr>
+          <w:ilvl w:val="0"/>
+          <w:numId w:val="1"/>
+        </w:numPr>
+      </w:pPr>
+      <w:r>
+        <w:rPr>
+          <w:b/>
+        </w:rPr>
+        <w:t xml:space="preserve">Mockup limit bug fixed:</w:t>
+      </w:r>
+      <w:r>
+        <w:t xml:space="preserve"> generation recorded a usage slot *before* the OpenAI call, so failed/</w:t>
+      </w:r>
+    </w:p>
+    <w:p>
+      <w:r>
+        <w:t xml:space="preserve">retried mockups burned quota (hit the cap after ~6 real ones). Now </w:t>
+      </w:r>
+      <w:r>
+        <w:rPr>
+          <w:rFonts w:ascii="Consolas" w:hAnsi="Consolas"/>
+          <w:color w:val="9C2D41"/>
+        </w:rPr>
+        <w:t xml:space="preserve">check()</w:t>
+      </w:r>
+      <w:r>
+        <w:t xml:space="preserve"> up front + </w:t>
+      </w:r>
+      <w:r>
+        <w:rPr>
+          <w:rFonts w:ascii="Consolas" w:hAnsi="Consolas"/>
+          <w:color w:val="9C2D41"/>
+        </w:rPr>
+        <w:t xml:space="preserve">record()</w:t>
+      </w:r>
+      <w:r>
+        <w:t xml:space="preserve"> only on success; generate cap bumped 30→50; stale "12 hours" 429 text fixed everywhere.</w:t>
+      </w:r>
+    </w:p>
+    <w:p>
+      <w:pPr>
+        <w:numPr>
+          <w:ilvl w:val="0"/>
+          <w:numId w:val="1"/>
+        </w:numPr>
+      </w:pPr>
+      <w:r>
+        <w:rPr>
+          <w:b/>
+        </w:rPr>
+        <w:t xml:space="preserve">Business-name humanising</w:t>
+      </w:r>
+      <w:r>
+        <w:t xml:space="preserve"> extended to the mockup image + preview page (shared </w:t>
+      </w:r>
+      <w:r>
+        <w:rPr>
+          <w:rFonts w:ascii="Consolas" w:hAnsi="Consolas"/>
+          <w:color w:val="9C2D41"/>
+        </w:rPr>
+        <w:t xml:space="preserve">lib/names.js</w:t>
+      </w:r>
+      <w:r>
+        <w:t xml:space="preserve">),</w:t>
+      </w:r>
+    </w:p>
+    <w:p>
+      <w:r>
+        <w:t xml:space="preserve">and run-together names (</w:t>
+      </w:r>
+      <w:r>
+        <w:rPr>
+          <w:rFonts w:ascii="Consolas" w:hAnsi="Consolas"/>
+          <w:color w:val="9C2D41"/>
+        </w:rPr>
+        <w:t xml:space="preserve">PerformanceCarValeting</w:t>
+      </w:r>
+      <w:r>
+        <w:t xml:space="preserve"> → </w:t>
+      </w:r>
+      <w:r>
+        <w:rPr>
+          <w:rFonts w:ascii="Consolas" w:hAnsi="Consolas"/>
+          <w:color w:val="9C2D41"/>
+        </w:rPr>
+        <w:t xml:space="preserve">Performance Car Valeting</w:t>
+      </w:r>
+      <w:r>
+        <w:t xml:space="preserve">) now split too.</w:t>
+      </w:r>
+    </w:p>
+    <w:p>
+      <w:pPr>
+        <w:numPr>
+          <w:ilvl w:val="0"/>
+          <w:numId w:val="1"/>
+        </w:numPr>
+      </w:pPr>
+      <w:r>
+        <w:rPr>
+          <w:b/>
+        </w:rPr>
+        <w:t xml:space="preserve">Email enrichment</w:t>
+      </w:r>
+      <w:r>
+        <w:t xml:space="preserve"> + </w:t>
+      </w:r>
+      <w:r>
+        <w:rPr>
+          <w:b/>
+        </w:rPr>
+        <w:t xml:space="preserve">Publish/host/edit live websites</w:t>
+      </w:r>
+      <w:r>
+        <w:t xml:space="preserve"> captured as future phases (see §11).</w:t>
+      </w:r>
+    </w:p>
+    <w:p>
+      <w:r>
+        <w:rPr>
+          <w:b/>
+        </w:rPr>
+        <w:t xml:space="preserve">2026-06-10</w:t>
+      </w:r>
+    </w:p>
+    <w:p>
+      <w:pPr>
+        <w:numPr>
+          <w:ilvl w:val="0"/>
+          <w:numId w:val="1"/>
+        </w:numPr>
+      </w:pPr>
+      <w:r>
+        <w:rPr>
+          <w:b/>
+        </w:rPr>
+        <w:t xml:space="preserve">"No thanks" decline flow</w:t>
+      </w:r>
+      <w:r>
+        <w:t xml:space="preserve"> + </w:t>
+      </w:r>
+      <w:r>
+        <w:rPr>
+          <w:b/>
+        </w:rPr>
+        <w:t xml:space="preserve">Not interested (via mockup)</w:t>
+      </w:r>
+      <w:r>
+        <w:t xml:space="preserve"> status + Performance card/funnel.</w:t>
+      </w:r>
+    </w:p>
+    <w:p>
+      <w:pPr>
+        <w:numPr>
+          <w:ilvl w:val="0"/>
+          <w:numId w:val="1"/>
+        </w:numPr>
+      </w:pPr>
+      <w:r>
+        <w:rPr>
+          <w:b/>
+        </w:rPr>
+        <w:t xml:space="preserve">Tab renames:</w:t>
+      </w:r>
+      <w:r>
+        <w:t xml:space="preserve"> Messages→</w:t>
+      </w:r>
+      <w:r>
+        <w:rPr>
+          <w:b/>
+        </w:rPr>
+        <w:t xml:space="preserve">Templates</w:t>
+      </w:r>
+      <w:r>
+        <w:t xml:space="preserve">, Hot Leads→</w:t>
+      </w:r>
+      <w:r>
+        <w:rPr>
+          <w:b/>
+        </w:rPr>
+        <w:t xml:space="preserve">🌡️ Warm Leads</w:t>
+      </w:r>
+      <w:r>
+        <w:t xml:space="preserve">, Leads→</w:t>
+      </w:r>
+      <w:r>
+        <w:rPr>
+          <w:b/>
+        </w:rPr>
+        <w:t xml:space="preserve">👤 All Leads</w:t>
+      </w:r>
+      <w:r>
+        <w:t xml:space="preserve">.</w:t>
+      </w:r>
+    </w:p>
+    <w:p>
+      <w:pPr>
+        <w:numPr>
+          <w:ilvl w:val="0"/>
+          <w:numId w:val="1"/>
+        </w:numPr>
+      </w:pPr>
+      <w:r>
+        <w:rPr>
+          <w:b/>
+        </w:rPr>
+        <w:t xml:space="preserve">DOCS.docx</w:t>
+      </w:r>
+      <w:r>
+        <w:t xml:space="preserve"> Word export added (generated from DOCS.md by </w:t>
+      </w:r>
+      <w:r>
+        <w:rPr>
+          <w:rFonts w:ascii="Consolas" w:hAnsi="Consolas"/>
+          <w:color w:val="9C2D41"/>
+        </w:rPr>
+        <w:t xml:space="preserve">scripts/md_to_docx.py</w:t>
+      </w:r>
+      <w:r>
+        <w:t xml:space="preserve">, no deps).</w:t>
+      </w:r>
+    </w:p>
+    <w:p>
+      <w:pPr>
+        <w:numPr>
+          <w:ilvl w:val="0"/>
+          <w:numId w:val="1"/>
+        </w:numPr>
+      </w:pPr>
+      <w:r>
+        <w:t xml:space="preserve">"Opened" renamed </w:t>
+      </w:r>
+      <w:r>
+        <w:rPr>
+          <w:b/>
+        </w:rPr>
+        <w:t xml:space="preserve">"Mockup viewed"</w:t>
+      </w:r>
+      <w:r>
+        <w:t xml:space="preserve"> everywhere; By-channel rows reworded to "% viewed (x of y)".</w:t>
+      </w:r>
+    </w:p>
+    <w:p>
+      <w:r>
+        <w:rPr>
+          <w:b/>
+        </w:rPr>
+        <w:t xml:space="preserve">2026-06-09</w:t>
+      </w:r>
+    </w:p>
+    <w:p>
+      <w:pPr>
+        <w:numPr>
+          <w:ilvl w:val="0"/>
+          <w:numId w:val="1"/>
+        </w:numPr>
+      </w:pPr>
+      <w:r>
+        <w:t xml:space="preserve">Search </w:t>
+      </w:r>
+      <w:r>
+        <w:rPr>
+          <w:b/>
+        </w:rPr>
+        <w:t xml:space="preserve">Load more</w:t>
+      </w:r>
+      <w:r>
+        <w:t xml:space="preserve"> + </w:t>
+      </w:r>
+      <w:r>
+        <w:rPr>
+          <w:b/>
+        </w:rPr>
+        <w:t xml:space="preserve">sort order</w:t>
+      </w:r>
+      <w:r>
+        <w:t xml:space="preserve"> + </w:t>
+      </w:r>
+      <w:r>
+        <w:rPr>
+          <w:b/>
+        </w:rPr>
+        <w:t xml:space="preserve">follow-up</w:t>
+      </w:r>
+      <w:r>
+        <w:t xml:space="preserve"> button; results-bar layout fix.</w:t>
+      </w:r>
+    </w:p>
+    <w:p>
+      <w:pPr>
+        <w:numPr>
+          <w:ilvl w:val="0"/>
+          <w:numId w:val="1"/>
+        </w:numPr>
+      </w:pPr>
+      <w:r>
+        <w:t xml:space="preserve">Usage caps moved to </w:t>
+      </w:r>
+      <w:r>
+        <w:rPr>
+          <w:b/>
+        </w:rPr>
+        <w:t xml:space="preserve">20h</w:t>
+      </w:r>
+      <w:r>
+        <w:t xml:space="preserve"> window, generate/search </w:t>
+      </w:r>
+      <w:r>
+        <w:rPr>
+          <w:b/>
+        </w:rPr>
+        <w:t xml:space="preserve">30</w:t>
+      </w:r>
+      <w:r>
+        <w:t xml:space="preserve">; markSent records sends from all surfaces.</w:t>
+      </w:r>
+    </w:p>
+    <w:p>
+      <w:pPr>
+        <w:numPr>
+          <w:ilvl w:val="0"/>
+          <w:numId w:val="1"/>
+        </w:numPr>
+      </w:pPr>
+      <w:r>
+        <w:t xml:space="preserve">Deploy lessons (gentle verification; </w:t>
+      </w:r>
+      <w:r>
+        <w:rPr>
+          <w:rFonts w:ascii="Consolas" w:hAnsi="Consolas"/>
+          <w:color w:val="9C2D41"/>
+        </w:rPr>
+        <w:t xml:space="preserve">vercel.json</w:t>
+      </w:r>
+      <w:r>
+        <w:t xml:space="preserve"> rewrite+functions gotcha), see standing rules.</w:t>
       </w:r>
     </w:p>
     <w:p>

</xml_diff>

<commit_message>
Phase 2a: Make live / Unpublish a Pounce site
Gated POST /api/publish flips sites/<slug>.json mode between
published/preview (+ publishedAt); the renderer already honours it, so
it's instant with no redeploy. Websites tab gets a 🚀 Make live /
Unpublish button per draft/live row with a confirm. Publishing drops the
noindex + the "Yes, sign me up" preview bar.

Co-Authored-By: Claude Opus 4.8 <noreply@anthropic.com>
</commit_message>
<xml_diff>
--- a/DOCS.docx
+++ b/DOCS.docx
@@ -7585,7 +7585,29 @@
         <w:rPr>
           <w:b/>
         </w:rPr>
-        <w:t xml:space="preserve">Publish toggle (mostly built):</w:t>
+        <w:t xml:space="preserve">✅ Publish toggle (BUILT 2026-06-11):</w:t>
+      </w:r>
+      <w:r>
+        <w:t xml:space="preserve"> gated </w:t>
+      </w:r>
+      <w:r>
+        <w:rPr>
+          <w:rFonts w:ascii="Consolas" w:hAnsi="Consolas"/>
+          <w:color w:val="9C2D41"/>
+        </w:rPr>
+        <w:t xml:space="preserve">POST /api/publish {slug, publish}</w:t>
+      </w:r>
+      <w:r>
+        <w:t xml:space="preserve"> flips</w:t>
+      </w:r>
+    </w:p>
+    <w:p>
+      <w:r>
+        <w:rPr>
+          <w:rFonts w:ascii="Consolas" w:hAnsi="Consolas"/>
+          <w:color w:val="9C2D41"/>
+        </w:rPr>
+        <w:t xml:space="preserve">sites/&lt;slug&gt;.json</w:t>
       </w:r>
       <w:r>
         <w:t xml:space="preserve"> </w:t>
@@ -7595,25 +7617,540 @@
           <w:rFonts w:ascii="Consolas" w:hAnsi="Consolas"/>
           <w:color w:val="9C2D41"/>
         </w:rPr>
+        <w:t xml:space="preserve">mode</w:t>
+      </w:r>
+      <w:r>
+        <w:t xml:space="preserve"> to </w:t>
+      </w:r>
+      <w:r>
+        <w:rPr>
+          <w:rFonts w:ascii="Consolas" w:hAnsi="Consolas"/>
+          <w:color w:val="9C2D41"/>
+        </w:rPr>
+        <w:t xml:space="preserve">published</w:t>
+      </w:r>
+      <w:r>
+        <w:t xml:space="preserve">/</w:t>
+      </w:r>
+      <w:r>
+        <w:rPr>
+          <w:rFonts w:ascii="Consolas" w:hAnsi="Consolas"/>
+          <w:color w:val="9C2D41"/>
+        </w:rPr>
+        <w:t xml:space="preserve">preview</w:t>
+      </w:r>
+      <w:r>
+        <w:t xml:space="preserve"> (+ </w:t>
+      </w:r>
+      <w:r>
+        <w:rPr>
+          <w:rFonts w:ascii="Consolas" w:hAnsi="Consolas"/>
+          <w:color w:val="9C2D41"/>
+        </w:rPr>
+        <w:t xml:space="preserve">publishedAt</w:t>
+      </w:r>
+      <w:r>
+        <w:t xml:space="preserve">); the Websites tab has a </w:t>
+      </w:r>
+      <w:r>
+        <w:rPr>
+          <w:b/>
+        </w:rPr>
+        <w:t xml:space="preserve">🚀 Make live / Unpublish</w:t>
+      </w:r>
+      <w:r>
+        <w:t xml:space="preserve"> button per draft/live row (with a confirm). Instant, no redeploy (the page renders from the JSON each request). Live site is at </w:t>
+      </w:r>
+      <w:r>
+        <w:rPr>
+          <w:rFonts w:ascii="Consolas" w:hAnsi="Consolas"/>
+          <w:color w:val="9C2D41"/>
+        </w:rPr>
+        <w:t xml:space="preserve">/s/&lt;slug&gt;</w:t>
+      </w:r>
+      <w:r>
+        <w:t xml:space="preserve"> on the current LINK_DOMAIN until subdomains are wired.</w:t>
+      </w:r>
+    </w:p>
+    <w:p>
+      <w:pPr>
+        <w:numPr>
+          <w:ilvl w:val="0"/>
+          <w:numId w:val="1"/>
+        </w:numPr>
+      </w:pPr>
+      <w:r>
+        <w:rPr>
+          <w:b/>
+        </w:rPr>
+        <w:t xml:space="preserve">Domain options (low→high effort):</w:t>
+      </w:r>
+      <w:r>
+        <w:t xml:space="preserve"> (a) </w:t>
+      </w:r>
+      <w:r>
+        <w:rPr>
+          <w:b/>
+        </w:rPr>
+        <w:t xml:space="preserve">subpath now</w:t>
+      </w:r>
+      <w:r>
+        <w:t xml:space="preserve">, </w:t>
+      </w:r>
+      <w:r>
+        <w:rPr>
+          <w:rFonts w:ascii="Consolas" w:hAnsi="Consolas"/>
+          <w:color w:val="9C2D41"/>
+        </w:rPr>
+        <w:t xml:space="preserve">sitepounce.com/s/&lt;slug&gt;</w:t>
+      </w:r>
+      <w:r>
+        <w:t xml:space="preserve"> (free,</w:t>
+      </w:r>
+    </w:p>
+    <w:p>
+      <w:r>
+        <w:t xml:space="preserve">instant) or a tidier </w:t>
+      </w:r>
+      <w:r>
+        <w:rPr>
+          <w:rFonts w:ascii="Consolas" w:hAnsi="Consolas"/>
+          <w:color w:val="9C2D41"/>
+        </w:rPr>
+        <w:t xml:space="preserve">aiwebpoint.com/s/&lt;slug&gt;</w:t>
+      </w:r>
+      <w:r>
+        <w:t xml:space="preserve">; (b) </w:t>
+      </w:r>
+      <w:r>
+        <w:rPr>
+          <w:b/>
+        </w:rPr>
+        <w:t xml:space="preserve">per-client subdomain</w:t>
+      </w:r>
+      <w:r>
+        <w:t xml:space="preserve"> </w:t>
+      </w:r>
+      <w:r>
+        <w:rPr>
+          <w:rFonts w:ascii="Consolas" w:hAnsi="Consolas"/>
+          <w:color w:val="9C2D41"/>
+        </w:rPr>
+        <w:t xml:space="preserve">client.aiwebpoint.com</w:t>
+      </w:r>
+      <w:r>
+        <w:t xml:space="preserve"> via a wildcard domain + host→slug routing; (c) </w:t>
+      </w:r>
+      <w:r>
+        <w:rPr>
+          <w:b/>
+        </w:rPr>
+        <w:t xml:space="preserve">client's own custom domain</w:t>
+      </w:r>
+      <w:r>
+        <w:t xml:space="preserve"> (</w:t>
+      </w:r>
+      <w:r>
+        <w:rPr>
+          <w:rFonts w:ascii="Consolas" w:hAnsi="Consolas"/>
+          <w:color w:val="9C2D41"/>
+        </w:rPr>
+        <w:t xml:space="preserve">theirbiz.co.uk</w:t>
+      </w:r>
+      <w:r>
+        <w:t xml:space="preserve">), the real "live website", needs: client owns/buys the domain → add it to the Vercel project (dashboard or Vercel Domains API) → DNS A/CNAME at their registrar → a </w:t>
+      </w:r>
+      <w:r>
+        <w:rPr>
+          <w:rFonts w:ascii="Consolas" w:hAnsi="Consolas"/>
+          <w:color w:val="9C2D41"/>
+        </w:rPr>
+        <w:t xml:space="preserve">host → slug</w:t>
+      </w:r>
+      <w:r>
+        <w:t xml:space="preserve"> map (store </w:t>
+      </w:r>
+      <w:r>
+        <w:rPr>
+          <w:rFonts w:ascii="Consolas" w:hAnsi="Consolas"/>
+          <w:color w:val="9C2D41"/>
+        </w:rPr>
+        <w:t xml:space="preserve">customDomain</w:t>
+      </w:r>
+      <w:r>
+        <w:t xml:space="preserve"> on the site JSON or a </w:t>
+      </w:r>
+      <w:r>
+        <w:rPr>
+          <w:rFonts w:ascii="Consolas" w:hAnsi="Consolas"/>
+          <w:color w:val="9C2D41"/>
+        </w:rPr>
+        <w:t xml:space="preserve">domains/&lt;host&gt;.json</w:t>
+      </w:r>
+      <w:r>
+        <w:t xml:space="preserve">) resolved by </w:t>
+      </w:r>
+      <w:r>
+        <w:rPr>
+          <w:rFonts w:ascii="Consolas" w:hAnsi="Consolas"/>
+          <w:color w:val="9C2D41"/>
+        </w:rPr>
+        <w:t xml:space="preserve">middleware.js</w:t>
+      </w:r>
+      <w:r>
+        <w:t xml:space="preserve">/</w:t>
+      </w:r>
+      <w:r>
+        <w:rPr>
+          <w:rFonts w:ascii="Consolas" w:hAnsi="Consolas"/>
+          <w:color w:val="9C2D41"/>
+        </w:rPr>
         <w:t xml:space="preserve">api/site.js</w:t>
       </w:r>
       <w:r>
-        <w:t xml:space="preserve"> already renders </w:t>
-      </w:r>
-      <w:r>
-        <w:rPr>
-          <w:rFonts w:ascii="Consolas" w:hAnsi="Consolas"/>
-          <w:color w:val="9C2D41"/>
-        </w:rPr>
-        <w:t xml:space="preserve">mode:'published'</w:t>
-      </w:r>
-      <w:r>
-        <w:t xml:space="preserve"> (drops the</w:t>
-      </w:r>
-    </w:p>
-    <w:p>
-      <w:r>
-        <w:t xml:space="preserve">noindex + the "Yes, sign me up" preview bar). Just needs a gated </w:t>
+        <w:t xml:space="preserve"> from the Host header. SSL is automatic. Per-domain DNS/add is manual ops (scriptable via Vercel API at scale).</w:t>
+      </w:r>
+    </w:p>
+    <w:p>
+      <w:pPr>
+        <w:numPr>
+          <w:ilvl w:val="0"/>
+          <w:numId w:val="1"/>
+        </w:numPr>
+      </w:pPr>
+      <w:r>
+        <w:rPr>
+          <w:b/>
+        </w:rPr>
+        <w:t xml:space="preserve">Websites list (data already exists):</w:t>
+      </w:r>
+      <w:r>
+        <w:t xml:space="preserve"> </w:t>
+      </w:r>
+      <w:r>
+        <w:rPr>
+          <w:rFonts w:ascii="Consolas" w:hAnsi="Consolas"/>
+          <w:color w:val="9C2D41"/>
+        </w:rPr>
+        <w:t xml:space="preserve">GET /api/sites</w:t>
+      </w:r>
+      <w:r>
+        <w:t xml:space="preserve"> already returns every site</w:t>
+      </w:r>
+    </w:p>
+    <w:p>
+      <w:r>
+        <w:t xml:space="preserve">(slug, name, mode, createdAt, </w:t>
+      </w:r>
+      <w:r>
+        <w:rPr>
+          <w:rFonts w:ascii="Consolas" w:hAnsi="Consolas"/>
+          <w:color w:val="9C2D41"/>
+        </w:rPr>
+        <w:t xml:space="preserve">/s/</w:t>
+      </w:r>
+      <w:r>
+        <w:t xml:space="preserve"> url). Missing only an in-app </w:t>
+      </w:r>
+      <w:r>
+        <w:rPr>
+          <w:b/>
+        </w:rPr>
+        <w:t xml:space="preserve">🌐 Websites</w:t>
+      </w:r>
+      <w:r>
+        <w:t xml:space="preserve"> screen: a table with Status (Preview/Published), clickable URL, Created, and Open / Publish / Edit / Rebuild / Set-domain actions. This is the parked "tidy-up admin UI".</w:t>
+      </w:r>
+    </w:p>
+    <w:p>
+      <w:pPr>
+        <w:numPr>
+          <w:ilvl w:val="0"/>
+          <w:numId w:val="1"/>
+        </w:numPr>
+      </w:pPr>
+      <w:r>
+        <w:rPr>
+          <w:b/>
+        </w:rPr>
+        <w:t xml:space="preserve">Edit a live site (client change requests):</w:t>
+      </w:r>
+      <w:r>
+        <w:t xml:space="preserve"> the whole page is structured JSON</w:t>
+      </w:r>
+    </w:p>
+    <w:p>
+      <w:r>
+        <w:t xml:space="preserve">(</w:t>
+      </w:r>
+      <w:r>
+        <w:rPr>
+          <w:rFonts w:ascii="Consolas" w:hAnsi="Consolas"/>
+          <w:color w:val="9C2D41"/>
+        </w:rPr>
+        <w:t xml:space="preserve">sites/&lt;slug&gt;.json</w:t>
+      </w:r>
+      <w:r>
+        <w:t xml:space="preserve">: hero, services, about, reviews, faq, accreditations, areas, phone…), so </w:t>
+      </w:r>
+      <w:r>
+        <w:rPr>
+          <w:b/>
+        </w:rPr>
+        <w:t xml:space="preserve">any edit to the JSON is live immediately</w:t>
+      </w:r>
+      <w:r>
+        <w:t xml:space="preserve">. </w:t>
+      </w:r>
+      <w:r>
+        <w:rPr>
+          <w:b/>
+        </w:rPr>
+        <w:t xml:space="preserve">User decision (2026-06-11): an AI edit box, not a field editor.</w:t>
+      </w:r>
+      <w:r>
+        <w:t xml:space="preserve"> Flow that enforces "only change what was asked": (1) AI gets the current JSON + the instruction (+ optional uploaded files) and returns a </w:t>
+      </w:r>
+      <w:r>
+        <w:rPr>
+          <w:b/>
+        </w:rPr>
+        <w:t xml:space="preserve">minimal patch</w:t>
+      </w:r>
+      <w:r>
+        <w:t xml:space="preserve"> (only changed fields), never a full rebuild; (2) </w:t>
+      </w:r>
+      <w:r>
+        <w:rPr>
+          <w:b/>
+        </w:rPr>
+        <w:t xml:space="preserve">show a diff and require Apply/confirm</w:t>
+      </w:r>
+      <w:r>
+        <w:t xml:space="preserve"> before writing, never auto-apply; (3) </w:t>
+      </w:r>
+      <w:r>
+        <w:rPr>
+          <w:b/>
+        </w:rPr>
+        <w:t xml:space="preserve">back up the previous JSON</w:t>
+      </w:r>
+      <w:r>
+        <w:t xml:space="preserve"> each edit (one-click revert for live client sites); (4) the fixed template is a built-in guardrail, the AI can only touch content fields, not layout. </w:t>
+      </w:r>
+      <w:r>
+        <w:rPr>
+          <w:b/>
+        </w:rPr>
+        <w:t xml:space="preserve">File upload:</w:t>
+      </w:r>
+      <w:r>
+        <w:t xml:space="preserve"> 1+ images → Blob → added to </w:t>
+      </w:r>
+      <w:r>
+        <w:rPr>
+          <w:rFonts w:ascii="Consolas" w:hAnsi="Consolas"/>
+          <w:color w:val="9C2D41"/>
+        </w:rPr>
+        <w:t xml:space="preserve">gallery</w:t>
+      </w:r>
+      <w:r>
+        <w:t xml:space="preserve">/hero in the same preview step (doubles as the planned client-photo-upload). The blunt existing </w:t>
+      </w:r>
+      <w:r>
+        <w:rPr>
+          <w:b/>
+        </w:rPr>
+        <w:t xml:space="preserve">Rebuild</w:t>
+      </w:r>
+      <w:r>
+        <w:t xml:space="preserve"> regenerates from scratch (loses tweaks) so it's not the edit path. Caveat: only Pounce </w:t>
+      </w:r>
+      <w:r>
+        <w:rPr>
+          <w:rFonts w:ascii="Consolas" w:hAnsi="Consolas"/>
+          <w:color w:val="9C2D41"/>
+        </w:rPr>
+        <w:t xml:space="preserve">/s/</w:t>
+      </w:r>
+      <w:r>
+        <w:t xml:space="preserve"> sites are editable; a </w:t>
+      </w:r>
+      <w:r>
+        <w:rPr>
+          <w:rFonts w:ascii="Consolas" w:hAnsi="Consolas"/>
+          <w:color w:val="9C2D41"/>
+        </w:rPr>
+        <w:t xml:space="preserve">/v/</w:t>
+      </w:r>
+      <w:r>
+        <w:t xml:space="preserve"> mockup is an image (regenerate, don't edit), so a lead needs a Pounce build first.</w:t>
+      </w:r>
+    </w:p>
+    <w:p>
+      <w:pPr>
+        <w:numPr>
+          <w:ilvl w:val="0"/>
+          <w:numId w:val="1"/>
+        </w:numPr>
+      </w:pPr>
+      <w:r>
+        <w:rPr>
+          <w:b/>
+        </w:rPr>
+        <w:t xml:space="preserve">UI (user decision 2026-06-11): a 🌐 Websites tab</w:t>
+      </w:r>
+      <w:r>
+        <w:t xml:space="preserve"> with a </w:t>
+      </w:r>
+      <w:r>
+        <w:rPr>
+          <w:b/>
+        </w:rPr>
+        <w:t xml:space="preserve">Mockups (`/v/`)</w:t>
+      </w:r>
+      <w:r>
+        <w:t xml:space="preserve"> list and a</w:t>
+      </w:r>
+    </w:p>
+    <w:p>
+      <w:r>
+        <w:rPr>
+          <w:b/>
+        </w:rPr>
+        <w:t xml:space="preserve">Websites (`/s/`)</w:t>
+      </w:r>
+      <w:r>
+        <w:t xml:space="preserve"> list. Each site row has </w:t>
+      </w:r>
+      <w:r>
+        <w:rPr>
+          <w:b/>
+        </w:rPr>
+        <w:t xml:space="preserve">Make Live</w:t>
+      </w:r>
+      <w:r>
+        <w:t xml:space="preserve"> → choose a </w:t>
+      </w:r>
+      <w:r>
+        <w:rPr>
+          <w:b/>
+        </w:rPr>
+        <w:t xml:space="preserve">subdomain</w:t>
+      </w:r>
+      <w:r>
+        <w:t xml:space="preserve"> (</w:t>
+      </w:r>
+      <w:r>
+        <w:rPr>
+          <w:rFonts w:ascii="Consolas" w:hAnsi="Consolas"/>
+          <w:color w:val="9C2D41"/>
+        </w:rPr>
+        <w:t xml:space="preserve">name.aiwebpoint.com</w:t>
+      </w:r>
+      <w:r>
+        <w:t xml:space="preserve">, easy/self-serve, the recommended first path) </w:t>
+      </w:r>
+      <w:r>
+        <w:rPr>
+          <w:b/>
+        </w:rPr>
+        <w:t xml:space="preserve">or Add your own domain</w:t>
+      </w:r>
+      <w:r>
+        <w:t xml:space="preserve"> (shows the DNS records + must add the domain to Vercel via the Domains API + a verification poll).</w:t>
+      </w:r>
+    </w:p>
+    <w:p>
+      <w:pPr>
+        <w:numPr>
+          <w:ilvl w:val="0"/>
+          <w:numId w:val="1"/>
+        </w:numPr>
+      </w:pPr>
+      <w:r>
+        <w:rPr>
+          <w:b/>
+        </w:rPr>
+        <w:t xml:space="preserve">Build order (agreed):</w:t>
+      </w:r>
+      <w:r>
+        <w:t xml:space="preserve"> (1) Websites tab + lists; (2) Make Live via subdomain (publish flag +</w:t>
+      </w:r>
+    </w:p>
+    <w:p>
+      <w:r>
+        <w:t xml:space="preserve">wildcard </w:t>
+      </w:r>
+      <w:r>
+        <w:rPr>
+          <w:rFonts w:ascii="Consolas" w:hAnsi="Consolas"/>
+          <w:color w:val="9C2D41"/>
+        </w:rPr>
+        <w:t xml:space="preserve">*.aiwebpoint.com</w:t>
+      </w:r>
+      <w:r>
+        <w:t xml:space="preserve"> + subdomain→slug map + middleware); (3) AI edit box + file upload (patch → diff → confirm → backup); (4) custom domains (Vercel API + DNS + verification, most ops).</w:t>
+      </w:r>
+    </w:p>
+    <w:p>
+      <w:pPr>
+        <w:numPr>
+          <w:ilvl w:val="0"/>
+          <w:numId w:val="1"/>
+        </w:numPr>
+      </w:pPr>
+      <w:r>
+        <w:rPr>
+          <w:b/>
+        </w:rPr>
+        <w:t xml:space="preserve">🔮 Later:</w:t>
+      </w:r>
+      <w:r>
+        <w:t xml:space="preserve"> Prowl Phase B (Trustpilot/Facebook/competitor-gap web search),</w:t>
+      </w:r>
+    </w:p>
+    <w:p>
+      <w:r>
+        <w:t xml:space="preserve">tidy-up admin UI (bulk-delete stale previews), per-keyword dashboard breakdowns, multi-user accounts + billing (SaaS), Pounce FAQ/Book-a-Demo/"Not sure yet?" sections on the subscribe page.</w:t>
+      </w:r>
+    </w:p>
+    <w:p>
+      <w:pPr>
+        <w:pStyle w:val="Heading2"/>
+      </w:pPr>
+      <w:r>
+        <w:t xml:space="preserve">11b. Change log (recent sessions)</w:t>
+      </w:r>
+    </w:p>
+    <w:p>
+      <w:r>
+        <w:t xml:space="preserve">Newest first. Reference sections above are the source of truth; this is a quick history.</w:t>
+      </w:r>
+    </w:p>
+    <w:p>
+      <w:r>
+        <w:rPr>
+          <w:b/>
+        </w:rPr>
+        <w:t xml:space="preserve">2026-06-11</w:t>
+      </w:r>
+    </w:p>
+    <w:p>
+      <w:pPr>
+        <w:numPr>
+          <w:ilvl w:val="0"/>
+          <w:numId w:val="1"/>
+        </w:numPr>
+      </w:pPr>
+      <w:r>
+        <w:rPr>
+          <w:b/>
+        </w:rPr>
+        <w:t xml:space="preserve">🚀 Make live / Unpublish (new):</w:t>
+      </w:r>
+      <w:r>
+        <w:t xml:space="preserve"> </w:t>
       </w:r>
       <w:r>
         <w:rPr>
@@ -7623,17 +8160,7 @@
         <w:t xml:space="preserve">POST /api/publish</w:t>
       </w:r>
       <w:r>
-        <w:t xml:space="preserve"> that flips </w:t>
-      </w:r>
-      <w:r>
-        <w:rPr>
-          <w:rFonts w:ascii="Consolas" w:hAnsi="Consolas"/>
-          <w:color w:val="9C2D41"/>
-        </w:rPr>
-        <w:t xml:space="preserve">sites/&lt;slug&gt;.json</w:t>
-      </w:r>
-      <w:r>
-        <w:t xml:space="preserve"> </w:t>
+        <w:t xml:space="preserve"> flips a Pounce site </w:t>
       </w:r>
       <w:r>
         <w:rPr>
@@ -7643,471 +8170,22 @@
         <w:t xml:space="preserve">mode</w:t>
       </w:r>
       <w:r>
-        <w:t xml:space="preserve"> and a Publish/Unpublish button. Because the page renders from the JSON on every request, this is instant, no redeploy.</w:t>
-      </w:r>
-    </w:p>
-    <w:p>
-      <w:pPr>
-        <w:numPr>
-          <w:ilvl w:val="0"/>
-          <w:numId w:val="1"/>
-        </w:numPr>
-      </w:pPr>
-      <w:r>
-        <w:rPr>
-          <w:b/>
-        </w:rPr>
-        <w:t xml:space="preserve">Domain options (low→high effort):</w:t>
-      </w:r>
-      <w:r>
-        <w:t xml:space="preserve"> (a) </w:t>
-      </w:r>
-      <w:r>
-        <w:rPr>
-          <w:b/>
-        </w:rPr>
-        <w:t xml:space="preserve">subpath now</w:t>
-      </w:r>
-      <w:r>
-        <w:t xml:space="preserve">, </w:t>
-      </w:r>
-      <w:r>
-        <w:rPr>
-          <w:rFonts w:ascii="Consolas" w:hAnsi="Consolas"/>
-          <w:color w:val="9C2D41"/>
-        </w:rPr>
-        <w:t xml:space="preserve">sitepounce.com/s/&lt;slug&gt;</w:t>
-      </w:r>
-      <w:r>
-        <w:t xml:space="preserve"> (free,</w:t>
-      </w:r>
-    </w:p>
-    <w:p>
-      <w:r>
-        <w:t xml:space="preserve">instant) or a tidier </w:t>
-      </w:r>
-      <w:r>
-        <w:rPr>
-          <w:rFonts w:ascii="Consolas" w:hAnsi="Consolas"/>
-          <w:color w:val="9C2D41"/>
-        </w:rPr>
-        <w:t xml:space="preserve">aiwebpoint.com/s/&lt;slug&gt;</w:t>
-      </w:r>
-      <w:r>
-        <w:t xml:space="preserve">; (b) </w:t>
-      </w:r>
-      <w:r>
-        <w:rPr>
-          <w:b/>
-        </w:rPr>
-        <w:t xml:space="preserve">per-client subdomain</w:t>
-      </w:r>
-      <w:r>
-        <w:t xml:space="preserve"> </w:t>
-      </w:r>
-      <w:r>
-        <w:rPr>
-          <w:rFonts w:ascii="Consolas" w:hAnsi="Consolas"/>
-          <w:color w:val="9C2D41"/>
-        </w:rPr>
-        <w:t xml:space="preserve">client.aiwebpoint.com</w:t>
-      </w:r>
-      <w:r>
-        <w:t xml:space="preserve"> via a wildcard domain + host→slug routing; (c) </w:t>
-      </w:r>
-      <w:r>
-        <w:rPr>
-          <w:b/>
-        </w:rPr>
-        <w:t xml:space="preserve">client's own custom domain</w:t>
-      </w:r>
-      <w:r>
-        <w:t xml:space="preserve"> (</w:t>
-      </w:r>
-      <w:r>
-        <w:rPr>
-          <w:rFonts w:ascii="Consolas" w:hAnsi="Consolas"/>
-          <w:color w:val="9C2D41"/>
-        </w:rPr>
-        <w:t xml:space="preserve">theirbiz.co.uk</w:t>
-      </w:r>
-      <w:r>
-        <w:t xml:space="preserve">), the real "live website", needs: client owns/buys the domain → add it to the Vercel project (dashboard or Vercel Domains API) → DNS A/CNAME at their registrar → a </w:t>
-      </w:r>
-      <w:r>
-        <w:rPr>
-          <w:rFonts w:ascii="Consolas" w:hAnsi="Consolas"/>
-          <w:color w:val="9C2D41"/>
-        </w:rPr>
-        <w:t xml:space="preserve">host → slug</w:t>
-      </w:r>
-      <w:r>
-        <w:t xml:space="preserve"> map (store </w:t>
-      </w:r>
-      <w:r>
-        <w:rPr>
-          <w:rFonts w:ascii="Consolas" w:hAnsi="Consolas"/>
-          <w:color w:val="9C2D41"/>
-        </w:rPr>
-        <w:t xml:space="preserve">customDomain</w:t>
-      </w:r>
-      <w:r>
-        <w:t xml:space="preserve"> on the site JSON or a </w:t>
-      </w:r>
-      <w:r>
-        <w:rPr>
-          <w:rFonts w:ascii="Consolas" w:hAnsi="Consolas"/>
-          <w:color w:val="9C2D41"/>
-        </w:rPr>
-        <w:t xml:space="preserve">domains/&lt;host&gt;.json</w:t>
-      </w:r>
-      <w:r>
-        <w:t xml:space="preserve">) resolved by </w:t>
-      </w:r>
-      <w:r>
-        <w:rPr>
-          <w:rFonts w:ascii="Consolas" w:hAnsi="Consolas"/>
-          <w:color w:val="9C2D41"/>
-        </w:rPr>
-        <w:t xml:space="preserve">middleware.js</w:t>
-      </w:r>
-      <w:r>
-        <w:t xml:space="preserve">/</w:t>
-      </w:r>
-      <w:r>
-        <w:rPr>
-          <w:rFonts w:ascii="Consolas" w:hAnsi="Consolas"/>
-          <w:color w:val="9C2D41"/>
-        </w:rPr>
-        <w:t xml:space="preserve">api/site.js</w:t>
-      </w:r>
-      <w:r>
-        <w:t xml:space="preserve"> from the Host header. SSL is automatic. Per-domain DNS/add is manual ops (scriptable via Vercel API at scale).</w:t>
-      </w:r>
-    </w:p>
-    <w:p>
-      <w:pPr>
-        <w:numPr>
-          <w:ilvl w:val="0"/>
-          <w:numId w:val="1"/>
-        </w:numPr>
-      </w:pPr>
-      <w:r>
-        <w:rPr>
-          <w:b/>
-        </w:rPr>
-        <w:t xml:space="preserve">Websites list (data already exists):</w:t>
-      </w:r>
-      <w:r>
-        <w:t xml:space="preserve"> </w:t>
-      </w:r>
-      <w:r>
-        <w:rPr>
-          <w:rFonts w:ascii="Consolas" w:hAnsi="Consolas"/>
-          <w:color w:val="9C2D41"/>
-        </w:rPr>
-        <w:t xml:space="preserve">GET /api/sites</w:t>
-      </w:r>
-      <w:r>
-        <w:t xml:space="preserve"> already returns every site</w:t>
-      </w:r>
-    </w:p>
-    <w:p>
-      <w:r>
-        <w:t xml:space="preserve">(slug, name, mode, createdAt, </w:t>
-      </w:r>
-      <w:r>
-        <w:rPr>
-          <w:rFonts w:ascii="Consolas" w:hAnsi="Consolas"/>
-          <w:color w:val="9C2D41"/>
-        </w:rPr>
-        <w:t xml:space="preserve">/s/</w:t>
-      </w:r>
-      <w:r>
-        <w:t xml:space="preserve"> url). Missing only an in-app </w:t>
-      </w:r>
-      <w:r>
-        <w:rPr>
-          <w:b/>
-        </w:rPr>
-        <w:t xml:space="preserve">🌐 Websites</w:t>
-      </w:r>
-      <w:r>
-        <w:t xml:space="preserve"> screen: a table with Status (Preview/Published), clickable URL, Created, and Open / Publish / Edit / Rebuild / Set-domain actions. This is the parked "tidy-up admin UI".</w:t>
-      </w:r>
-    </w:p>
-    <w:p>
-      <w:pPr>
-        <w:numPr>
-          <w:ilvl w:val="0"/>
-          <w:numId w:val="1"/>
-        </w:numPr>
-      </w:pPr>
-      <w:r>
-        <w:rPr>
-          <w:b/>
-        </w:rPr>
-        <w:t xml:space="preserve">Edit a live site (client change requests):</w:t>
-      </w:r>
-      <w:r>
-        <w:t xml:space="preserve"> the whole page is structured JSON</w:t>
-      </w:r>
-    </w:p>
-    <w:p>
-      <w:r>
-        <w:t xml:space="preserve">(</w:t>
-      </w:r>
-      <w:r>
-        <w:rPr>
-          <w:rFonts w:ascii="Consolas" w:hAnsi="Consolas"/>
-          <w:color w:val="9C2D41"/>
-        </w:rPr>
-        <w:t xml:space="preserve">sites/&lt;slug&gt;.json</w:t>
-      </w:r>
-      <w:r>
-        <w:t xml:space="preserve">: hero, services, about, reviews, faq, accreditations, areas, phone…), so </w:t>
-      </w:r>
-      <w:r>
-        <w:rPr>
-          <w:b/>
-        </w:rPr>
-        <w:t xml:space="preserve">any edit to the JSON is live immediately</w:t>
-      </w:r>
-      <w:r>
-        <w:t xml:space="preserve">. </w:t>
-      </w:r>
-      <w:r>
-        <w:rPr>
-          <w:b/>
-        </w:rPr>
-        <w:t xml:space="preserve">User decision (2026-06-11): an AI edit box, not a field editor.</w:t>
-      </w:r>
-      <w:r>
-        <w:t xml:space="preserve"> Flow that enforces "only change what was asked": (1) AI gets the current JSON + the instruction (+ optional uploaded files) and returns a </w:t>
-      </w:r>
-      <w:r>
-        <w:rPr>
-          <w:b/>
-        </w:rPr>
-        <w:t xml:space="preserve">minimal patch</w:t>
-      </w:r>
-      <w:r>
-        <w:t xml:space="preserve"> (only changed fields), never a full rebuild; (2) </w:t>
-      </w:r>
-      <w:r>
-        <w:rPr>
-          <w:b/>
-        </w:rPr>
-        <w:t xml:space="preserve">show a diff and require Apply/confirm</w:t>
-      </w:r>
-      <w:r>
-        <w:t xml:space="preserve"> before writing, never auto-apply; (3) </w:t>
-      </w:r>
-      <w:r>
-        <w:rPr>
-          <w:b/>
-        </w:rPr>
-        <w:t xml:space="preserve">back up the previous JSON</w:t>
-      </w:r>
-      <w:r>
-        <w:t xml:space="preserve"> each edit (one-click revert for live client sites); (4) the fixed template is a built-in guardrail, the AI can only touch content fields, not layout. </w:t>
-      </w:r>
-      <w:r>
-        <w:rPr>
-          <w:b/>
-        </w:rPr>
-        <w:t xml:space="preserve">File upload:</w:t>
-      </w:r>
-      <w:r>
-        <w:t xml:space="preserve"> 1+ images → Blob → added to </w:t>
-      </w:r>
-      <w:r>
-        <w:rPr>
-          <w:rFonts w:ascii="Consolas" w:hAnsi="Consolas"/>
-          <w:color w:val="9C2D41"/>
-        </w:rPr>
-        <w:t xml:space="preserve">gallery</w:t>
-      </w:r>
-      <w:r>
-        <w:t xml:space="preserve">/hero in the same preview step (doubles as the planned client-photo-upload). The blunt existing </w:t>
-      </w:r>
-      <w:r>
-        <w:rPr>
-          <w:b/>
-        </w:rPr>
-        <w:t xml:space="preserve">Rebuild</w:t>
-      </w:r>
-      <w:r>
-        <w:t xml:space="preserve"> regenerates from scratch (loses tweaks) so it's not the edit path. Caveat: only Pounce </w:t>
-      </w:r>
-      <w:r>
-        <w:rPr>
-          <w:rFonts w:ascii="Consolas" w:hAnsi="Consolas"/>
-          <w:color w:val="9C2D41"/>
-        </w:rPr>
-        <w:t xml:space="preserve">/s/</w:t>
-      </w:r>
-      <w:r>
-        <w:t xml:space="preserve"> sites are editable; a </w:t>
-      </w:r>
-      <w:r>
-        <w:rPr>
-          <w:rFonts w:ascii="Consolas" w:hAnsi="Consolas"/>
-          <w:color w:val="9C2D41"/>
-        </w:rPr>
-        <w:t xml:space="preserve">/v/</w:t>
-      </w:r>
-      <w:r>
-        <w:t xml:space="preserve"> mockup is an image (regenerate, don't edit), so a lead needs a Pounce build first.</w:t>
-      </w:r>
-    </w:p>
-    <w:p>
-      <w:pPr>
-        <w:numPr>
-          <w:ilvl w:val="0"/>
-          <w:numId w:val="1"/>
-        </w:numPr>
-      </w:pPr>
-      <w:r>
-        <w:rPr>
-          <w:b/>
-        </w:rPr>
-        <w:t xml:space="preserve">UI (user decision 2026-06-11): a 🌐 Websites tab</w:t>
-      </w:r>
-      <w:r>
-        <w:t xml:space="preserve"> with a </w:t>
-      </w:r>
-      <w:r>
-        <w:rPr>
-          <w:b/>
-        </w:rPr>
-        <w:t xml:space="preserve">Mockups (`/v/`)</w:t>
-      </w:r>
-      <w:r>
-        <w:t xml:space="preserve"> list and a</w:t>
-      </w:r>
-    </w:p>
-    <w:p>
-      <w:r>
-        <w:rPr>
-          <w:b/>
-        </w:rPr>
-        <w:t xml:space="preserve">Websites (`/s/`)</w:t>
-      </w:r>
-      <w:r>
-        <w:t xml:space="preserve"> list. Each site row has </w:t>
-      </w:r>
-      <w:r>
-        <w:rPr>
-          <w:b/>
-        </w:rPr>
-        <w:t xml:space="preserve">Make Live</w:t>
-      </w:r>
-      <w:r>
-        <w:t xml:space="preserve"> → choose a </w:t>
-      </w:r>
-      <w:r>
-        <w:rPr>
-          <w:b/>
-        </w:rPr>
-        <w:t xml:space="preserve">subdomain</w:t>
-      </w:r>
-      <w:r>
-        <w:t xml:space="preserve"> (</w:t>
-      </w:r>
-      <w:r>
-        <w:rPr>
-          <w:rFonts w:ascii="Consolas" w:hAnsi="Consolas"/>
-          <w:color w:val="9C2D41"/>
-        </w:rPr>
-        <w:t xml:space="preserve">name.aiwebpoint.com</w:t>
-      </w:r>
-      <w:r>
-        <w:t xml:space="preserve">, easy/self-serve, the recommended first path) </w:t>
-      </w:r>
-      <w:r>
-        <w:rPr>
-          <w:b/>
-        </w:rPr>
-        <w:t xml:space="preserve">or Add your own domain</w:t>
-      </w:r>
-      <w:r>
-        <w:t xml:space="preserve"> (shows the DNS records + must add the domain to Vercel via the Domains API + a verification poll).</w:t>
-      </w:r>
-    </w:p>
-    <w:p>
-      <w:pPr>
-        <w:numPr>
-          <w:ilvl w:val="0"/>
-          <w:numId w:val="1"/>
-        </w:numPr>
-      </w:pPr>
-      <w:r>
-        <w:rPr>
-          <w:b/>
-        </w:rPr>
-        <w:t xml:space="preserve">Build order (agreed):</w:t>
-      </w:r>
-      <w:r>
-        <w:t xml:space="preserve"> (1) Websites tab + lists; (2) Make Live via subdomain (publish flag +</w:t>
-      </w:r>
-    </w:p>
-    <w:p>
-      <w:r>
-        <w:t xml:space="preserve">wildcard </w:t>
-      </w:r>
-      <w:r>
-        <w:rPr>
-          <w:rFonts w:ascii="Consolas" w:hAnsi="Consolas"/>
-          <w:color w:val="9C2D41"/>
-        </w:rPr>
-        <w:t xml:space="preserve">*.aiwebpoint.com</w:t>
-      </w:r>
-      <w:r>
-        <w:t xml:space="preserve"> + subdomain→slug map + middleware); (3) AI edit box + file upload (patch → diff → confirm → backup); (4) custom domains (Vercel API + DNS + verification, most ops).</w:t>
-      </w:r>
-    </w:p>
-    <w:p>
-      <w:pPr>
-        <w:numPr>
-          <w:ilvl w:val="0"/>
-          <w:numId w:val="1"/>
-        </w:numPr>
-      </w:pPr>
-      <w:r>
-        <w:rPr>
-          <w:b/>
-        </w:rPr>
-        <w:t xml:space="preserve">🔮 Later:</w:t>
-      </w:r>
-      <w:r>
-        <w:t xml:space="preserve"> Prowl Phase B (Trustpilot/Facebook/competitor-gap web search),</w:t>
-      </w:r>
-    </w:p>
-    <w:p>
-      <w:r>
-        <w:t xml:space="preserve">tidy-up admin UI (bulk-delete stale previews), per-keyword dashboard breakdowns, multi-user accounts + billing (SaaS), Pounce FAQ/Book-a-Demo/"Not sure yet?" sections on the subscribe page.</w:t>
-      </w:r>
-    </w:p>
-    <w:p>
-      <w:pPr>
-        <w:pStyle w:val="Heading2"/>
-      </w:pPr>
-      <w:r>
-        <w:t xml:space="preserve">11b. Change log (recent sessions)</w:t>
-      </w:r>
-    </w:p>
-    <w:p>
-      <w:r>
-        <w:t xml:space="preserve">Newest first. Reference sections above are the source of truth; this is a quick history.</w:t>
-      </w:r>
-    </w:p>
-    <w:p>
-      <w:r>
-        <w:rPr>
-          <w:b/>
-        </w:rPr>
-        <w:t xml:space="preserve">2026-06-11</w:t>
+        <w:t xml:space="preserve"> between</w:t>
+      </w:r>
+    </w:p>
+    <w:p>
+      <w:r>
+        <w:t xml:space="preserve">published/preview; button on the Websites tab. Publishing drops noindex + the preview bar so the </w:t>
+      </w:r>
+      <w:r>
+        <w:rPr>
+          <w:rFonts w:ascii="Consolas" w:hAnsi="Consolas"/>
+          <w:color w:val="9C2D41"/>
+        </w:rPr>
+        <w:t xml:space="preserve">/s/&lt;slug&gt;</w:t>
+      </w:r>
+      <w:r>
+        <w:t xml:space="preserve"> page is a clean public site (Phase 2a; subdomains still pending the wildcard setup).</w:t>
       </w:r>
     </w:p>
     <w:p>

</xml_diff>

<commit_message>
Docs: record wildcard subdomain setup (Vercel connect done, Cloudflare pending)
Document the *.aiwebpoint.com setup for Pounce Make-Live subdomains:
Vercel connect of the wildcard (done), Cloudflare CNAME * -> the
account's vercel-dns target (DNS only, pending). Use the same target as
the proven preview/sitepounce records.

Co-Authored-By: Claude Opus 4.8 <noreply@anthropic.com>
</commit_message>
<xml_diff>
--- a/DOCS.docx
+++ b/DOCS.docx
@@ -7809,6 +7809,198 @@
       </w:r>
       <w:r>
         <w:t xml:space="preserve"> from the Host header. SSL is automatic. Per-domain DNS/add is manual ops (scriptable via Vercel API at scale).</w:t>
+      </w:r>
+    </w:p>
+    <w:p>
+      <w:pPr>
+        <w:numPr>
+          <w:ilvl w:val="0"/>
+          <w:numId w:val="1"/>
+        </w:numPr>
+      </w:pPr>
+      <w:r>
+        <w:rPr>
+          <w:b/>
+        </w:rPr>
+        <w:t xml:space="preserve">Wildcard subdomain setup (the actual infra, recorded 2026-06-11):</w:t>
+      </w:r>
+      <w:r>
+        <w:t xml:space="preserve"> DNS for </w:t>
+      </w:r>
+      <w:r>
+        <w:rPr>
+          <w:rFonts w:ascii="Consolas" w:hAnsi="Consolas"/>
+          <w:color w:val="9C2D41"/>
+        </w:rPr>
+        <w:t xml:space="preserve">aiwebpoint.com</w:t>
+      </w:r>
+    </w:p>
+    <w:p>
+      <w:r>
+        <w:t xml:space="preserve">is on </w:t>
+      </w:r>
+      <w:r>
+        <w:rPr>
+          <w:b/>
+        </w:rPr>
+        <w:t xml:space="preserve">Cloudflare</w:t>
+      </w:r>
+      <w:r>
+        <w:t xml:space="preserve"> (nameservers </w:t>
+      </w:r>
+      <w:r>
+        <w:rPr>
+          <w:rFonts w:ascii="Consolas" w:hAnsi="Consolas"/>
+          <w:color w:val="9C2D41"/>
+        </w:rPr>
+        <w:t xml:space="preserve">aida</w:t>
+      </w:r>
+      <w:r>
+        <w:t xml:space="preserve">/</w:t>
+      </w:r>
+      <w:r>
+        <w:rPr>
+          <w:rFonts w:ascii="Consolas" w:hAnsi="Consolas"/>
+          <w:color w:val="9C2D41"/>
+        </w:rPr>
+        <w:t xml:space="preserve">amit.ns.cloudflare.com</w:t>
+      </w:r>
+      <w:r>
+        <w:t xml:space="preserve">, "Third Party" in Vercel — do NOT enable Vercel DNS or change nameservers). The apex </w:t>
+      </w:r>
+      <w:r>
+        <w:rPr>
+          <w:rFonts w:ascii="Consolas" w:hAnsi="Consolas"/>
+          <w:color w:val="9C2D41"/>
+        </w:rPr>
+        <w:t xml:space="preserve">aiwebpoint.com</w:t>
+      </w:r>
+      <w:r>
+        <w:t xml:space="preserve"> is on a different host (the agency's main site); leave it. </w:t>
+      </w:r>
+      <w:r>
+        <w:rPr>
+          <w:rFonts w:ascii="Consolas" w:hAnsi="Consolas"/>
+          <w:color w:val="9C2D41"/>
+        </w:rPr>
+        <w:t xml:space="preserve">preview.aiwebpoint.com</w:t>
+      </w:r>
+      <w:r>
+        <w:t xml:space="preserve"> is the existing model: a CNAME to Vercel, </w:t>
+      </w:r>
+      <w:r>
+        <w:rPr>
+          <w:b/>
+        </w:rPr>
+        <w:t xml:space="preserve">DNS only / grey cloud</w:t>
+      </w:r>
+      <w:r>
+        <w:t xml:space="preserve"> (Vercel auto-issued its cert). To enable </w:t>
+      </w:r>
+      <w:r>
+        <w:rPr>
+          <w:rFonts w:ascii="Consolas" w:hAnsi="Consolas"/>
+          <w:color w:val="9C2D41"/>
+        </w:rPr>
+        <w:t xml:space="preserve">*.aiwebpoint.com</w:t>
+      </w:r>
+      <w:r>
+        <w:t xml:space="preserve">: </w:t>
+      </w:r>
+      <w:r>
+        <w:rPr>
+          <w:b/>
+        </w:rPr>
+        <w:t xml:space="preserve">(1) Vercel</w:t>
+      </w:r>
+      <w:r>
+        <w:t xml:space="preserve"> → domain </w:t>
+      </w:r>
+      <w:r>
+        <w:rPr>
+          <w:rFonts w:ascii="Consolas" w:hAnsi="Consolas"/>
+          <w:color w:val="9C2D41"/>
+        </w:rPr>
+        <w:t xml:space="preserve">aiwebpoint.com</w:t>
+      </w:r>
+      <w:r>
+        <w:t xml:space="preserve"> → Connected Projects → </w:t>
+      </w:r>
+      <w:r>
+        <w:rPr>
+          <w:b/>
+        </w:rPr>
+        <w:t xml:space="preserve">Connect</w:t>
+      </w:r>
+      <w:r>
+        <w:t xml:space="preserve"> </w:t>
+      </w:r>
+      <w:r>
+        <w:rPr>
+          <w:rFonts w:ascii="Consolas" w:hAnsi="Consolas"/>
+          <w:color w:val="9C2D41"/>
+        </w:rPr>
+        <w:t xml:space="preserve">*.aiwebpoint.com</w:t>
+      </w:r>
+      <w:r>
+        <w:t xml:space="preserve"> to the </w:t>
+      </w:r>
+      <w:r>
+        <w:rPr>
+          <w:rFonts w:ascii="Consolas" w:hAnsi="Consolas"/>
+          <w:color w:val="9C2D41"/>
+        </w:rPr>
+        <w:t xml:space="preserve">ai-web-point</w:t>
+      </w:r>
+      <w:r>
+        <w:t xml:space="preserve"> project (DONE 2026-06-11). </w:t>
+      </w:r>
+      <w:r>
+        <w:rPr>
+          <w:b/>
+        </w:rPr>
+        <w:t xml:space="preserve">(2) Cloudflare</w:t>
+      </w:r>
+      <w:r>
+        <w:t xml:space="preserve"> → aiwebpoint.com → DNS → add </w:t>
+      </w:r>
+      <w:r>
+        <w:rPr>
+          <w:b/>
+        </w:rPr>
+        <w:t xml:space="preserve">CNAME, Name `*`, Target `7f856d7d334ceb4c.vercel-dns-017.com`</w:t>
+      </w:r>
+      <w:r>
+        <w:t xml:space="preserve"> (the same target preview/ sitepounce already use, to match proven records; </w:t>
+      </w:r>
+      <w:r>
+        <w:rPr>
+          <w:rFonts w:ascii="Consolas" w:hAnsi="Consolas"/>
+          <w:color w:val="9C2D41"/>
+        </w:rPr>
+        <w:t xml:space="preserve">cname.vercel-dns.com</w:t>
+      </w:r>
+      <w:r>
+        <w:t xml:space="preserve"> also works), </w:t>
+      </w:r>
+      <w:r>
+        <w:rPr>
+          <w:b/>
+        </w:rPr>
+        <w:t xml:space="preserve">DNS only (grey cloud, proxy OFF, critical else SSL loops)</w:t>
+      </w:r>
+      <w:r>
+        <w:t xml:space="preserve"> (PENDING). Then a subdomain test (e.g. </w:t>
+      </w:r>
+      <w:r>
+        <w:rPr>
+          <w:rFonts w:ascii="Consolas" w:hAnsi="Consolas"/>
+          <w:color w:val="9C2D41"/>
+        </w:rPr>
+        <w:t xml:space="preserve">https://test.aiwebpoint.com</w:t>
+      </w:r>
+      <w:r>
+        <w:t xml:space="preserve">) should return a Vercel 404 with valid SSL. Existing records (apex, www, preview, MX/email) are safe, specific records win over the wildcard.</w:t>
       </w:r>
     </w:p>
     <w:p>

</xml_diff>

<commit_message>
Docs: wildcard SSL limitation on Cloudflare NS; per-subdomain + Vercel API plan
Co-Authored-By: Claude Opus 4.8 <noreply@anthropic.com>
</commit_message>
<xml_diff>
--- a/DOCS.docx
+++ b/DOCS.docx
@@ -7987,10 +7987,19 @@
         <w:rPr>
           <w:b/>
         </w:rPr>
-        <w:t xml:space="preserve">DNS only (grey cloud, proxy OFF, critical else SSL loops)</w:t>
-      </w:r>
-      <w:r>
-        <w:t xml:space="preserve"> (PENDING). Then a subdomain test (e.g. </w:t>
+        <w:t xml:space="preserve">DNS only (grey cloud, proxy OFF)</w:t>
+      </w:r>
+      <w:r>
+        <w:t xml:space="preserve"> (DONE). DNS now resolves. </w:t>
+      </w:r>
+      <w:r>
+        <w:rPr>
+          <w:b/>
+        </w:rPr>
+        <w:t xml:space="preserve">BUT</w:t>
+      </w:r>
+      <w:r>
+        <w:t xml:space="preserve"> </w:t>
       </w:r>
       <w:r>
         <w:rPr>
@@ -8000,7 +8009,63 @@
         <w:t xml:space="preserve">https://test.aiwebpoint.com</w:t>
       </w:r>
       <w:r>
-        <w:t xml:space="preserve">) should return a Vercel 404 with valid SSL. Existing records (apex, www, preview, MX/email) are safe, specific records win over the wildcard.</w:t>
+        <w:t xml:space="preserve"> fails the TLS handshake: </w:t>
+      </w:r>
+      <w:r>
+        <w:rPr>
+          <w:b/>
+        </w:rPr>
+        <w:t xml:space="preserve">Vercel does not auto-issue a `*` wildcard certificate on third-party nameservers (Cloudflare)</w:t>
+      </w:r>
+      <w:r>
+        <w:t xml:space="preserve"> — wildcard certs need Vercel's own nameservers. Vercel DOES issue certs for *specific* subdomains (HTTP-01), which is why </w:t>
+      </w:r>
+      <w:r>
+        <w:rPr>
+          <w:rFonts w:ascii="Consolas" w:hAnsi="Consolas"/>
+          <w:color w:val="9C2D41"/>
+        </w:rPr>
+        <w:t xml:space="preserve">preview</w:t>
+      </w:r>
+      <w:r>
+        <w:t xml:space="preserve"> works. </w:t>
+      </w:r>
+      <w:r>
+        <w:rPr>
+          <w:b/>
+        </w:rPr>
+        <w:t xml:space="preserve">So the resolved plan:</w:t>
+      </w:r>
+      <w:r>
+        <w:t xml:space="preserve"> keep the wildcard CNAME (it provides DNS for every subdomain, no per-client Cloudflare edit), and </w:t>
+      </w:r>
+      <w:r>
+        <w:rPr>
+          <w:b/>
+        </w:rPr>
+        <w:t xml:space="preserve">add each going-live client subdomain to the Vercel project individually</w:t>
+      </w:r>
+      <w:r>
+        <w:t xml:space="preserve"> (gets its HTTPS), automated via the </w:t>
+      </w:r>
+      <w:r>
+        <w:rPr>
+          <w:b/>
+        </w:rPr>
+        <w:t xml:space="preserve">Vercel REST API</w:t>
+      </w:r>
+      <w:r>
+        <w:t xml:space="preserve"> + an API token when the user picks a subdomain in Make Live; </w:t>
+      </w:r>
+      <w:r>
+        <w:rPr>
+          <w:rFonts w:ascii="Consolas" w:hAnsi="Consolas"/>
+          <w:color w:val="9C2D41"/>
+        </w:rPr>
+        <w:t xml:space="preserve">middleware.js</w:t>
+      </w:r>
+      <w:r>
+        <w:t xml:space="preserve"> then maps host→slug. Moving nameservers to Vercel is rejected (apex on Lovable + email TXTs in Cloudflare). Existing records (apex, www, preview, MX) are safe, specific records beat the wildcard.</w:t>
       </w:r>
     </w:p>
     <w:p>

</xml_diff>

<commit_message>
Docs: Phase 2b subdomain Make-Live built (changelog + roadmap)
Co-Authored-By: Claude Opus 4.8 <noreply@anthropic.com>
</commit_message>
<xml_diff>
--- a/DOCS.docx
+++ b/DOCS.docx
@@ -8391,6 +8391,115 @@
           <w:b/>
         </w:rPr>
         <w:t xml:space="preserve">2026-06-11</w:t>
+      </w:r>
+    </w:p>
+    <w:p>
+      <w:pPr>
+        <w:numPr>
+          <w:ilvl w:val="0"/>
+          <w:numId w:val="1"/>
+        </w:numPr>
+      </w:pPr>
+      <w:r>
+        <w:rPr>
+          <w:b/>
+        </w:rPr>
+        <w:t xml:space="preserve">Make live on a subdomain (Phase 2b, new):</w:t>
+      </w:r>
+      <w:r>
+        <w:t xml:space="preserve"> one-click publish to</w:t>
+      </w:r>
+    </w:p>
+    <w:p>
+      <w:r>
+        <w:rPr>
+          <w:rFonts w:ascii="Consolas" w:hAnsi="Consolas"/>
+          <w:color w:val="9C2D41"/>
+        </w:rPr>
+        <w:t xml:space="preserve">&lt;sub&gt;.aiwebpoint.com</w:t>
+      </w:r>
+      <w:r>
+        <w:t xml:space="preserve">. </w:t>
+      </w:r>
+      <w:r>
+        <w:rPr>
+          <w:rFonts w:ascii="Consolas" w:hAnsi="Consolas"/>
+          <w:color w:val="9C2D41"/>
+        </w:rPr>
+        <w:t xml:space="preserve">middleware.js</w:t>
+      </w:r>
+      <w:r>
+        <w:t xml:space="preserve"> routes the subdomain root to the site renderer, </w:t>
+      </w:r>
+      <w:r>
+        <w:rPr>
+          <w:rFonts w:ascii="Consolas" w:hAnsi="Consolas"/>
+          <w:color w:val="9C2D41"/>
+        </w:rPr>
+        <w:t xml:space="preserve">api/publish.js</w:t>
+      </w:r>
+      <w:r>
+        <w:t xml:space="preserve"> registers the domain on Vercel via the API (</w:t>
+      </w:r>
+      <w:r>
+        <w:rPr>
+          <w:rFonts w:ascii="Consolas" w:hAnsi="Consolas"/>
+          <w:color w:val="9C2D41"/>
+        </w:rPr>
+        <w:t xml:space="preserve">lib/vercel.js</w:t>
+      </w:r>
+      <w:r>
+        <w:t xml:space="preserve">, auto SSL) and maps </w:t>
+      </w:r>
+      <w:r>
+        <w:rPr>
+          <w:rFonts w:ascii="Consolas" w:hAnsi="Consolas"/>
+          <w:color w:val="9C2D41"/>
+        </w:rPr>
+        <w:t xml:space="preserve">domains/_index.json</w:t>
+      </w:r>
+      <w:r>
+        <w:t xml:space="preserve"> (sub→slug). Needs env </w:t>
+      </w:r>
+      <w:r>
+        <w:rPr>
+          <w:rFonts w:ascii="Consolas" w:hAnsi="Consolas"/>
+          <w:color w:val="9C2D41"/>
+        </w:rPr>
+        <w:t xml:space="preserve">VERCEL_TOKEN</w:t>
+      </w:r>
+      <w:r>
+        <w:t xml:space="preserve">/</w:t>
+      </w:r>
+      <w:r>
+        <w:rPr>
+          <w:rFonts w:ascii="Consolas" w:hAnsi="Consolas"/>
+          <w:color w:val="9C2D41"/>
+        </w:rPr>
+        <w:t xml:space="preserve">VERCEL_PROJECT_ID</w:t>
+      </w:r>
+      <w:r>
+        <w:t xml:space="preserve">/</w:t>
+      </w:r>
+      <w:r>
+        <w:rPr>
+          <w:rFonts w:ascii="Consolas" w:hAnsi="Consolas"/>
+          <w:color w:val="9C2D41"/>
+        </w:rPr>
+        <w:t xml:space="preserve">VERCEL_TEAM_ID</w:t>
+      </w:r>
+      <w:r>
+        <w:t xml:space="preserve">. Wildcard </w:t>
+      </w:r>
+      <w:r>
+        <w:rPr>
+          <w:rFonts w:ascii="Consolas" w:hAnsi="Consolas"/>
+          <w:color w:val="9C2D41"/>
+        </w:rPr>
+        <w:t xml:space="preserve">*.aiwebpoint.com</w:t>
+      </w:r>
+      <w:r>
+        <w:t xml:space="preserve"> provides the DNS; per-subdomain add to Vercel provides the cert.</w:t>
       </w:r>
     </w:p>
     <w:p>

</xml_diff>

<commit_message>
Docs: §7b one-time client-subdomain setup guide (white-label); Phase 2 done
Reproducible operator setup for the subdomain feature (wildcard DNS +
Vercel connect + the 3 Vercel API env vars), so it's easy for future
self-host/white-label users. Mark Phase 2b verified live.

Co-Authored-By: Claude Opus 4.8 <noreply@anthropic.com>
</commit_message>
<xml_diff>
--- a/DOCS.docx
+++ b/DOCS.docx
@@ -6353,8 +6353,526 @@
           </w:p>
         </w:tc>
       </w:tr>
+      <w:tr>
+        <w:tc>
+          <w:tcPr>
+            <w:tcW w:w="0" w:type="auto"/>
+          </w:tcPr>
+          <w:p>
+            <w:r>
+              <w:t xml:space="preserve">Client subdomains</w:t>
+            </w:r>
+          </w:p>
+        </w:tc>
+        <w:tc>
+          <w:tcPr>
+            <w:tcW w:w="0" w:type="auto"/>
+          </w:tcPr>
+          <w:p>
+            <w:r>
+              <w:rPr>
+                <w:rFonts w:ascii="Consolas" w:hAnsi="Consolas"/>
+                <w:color w:val="9C2D41"/>
+              </w:rPr>
+              <w:t xml:space="preserve">VERCEL_TOKEN</w:t>
+            </w:r>
+            <w:r>
+              <w:t xml:space="preserve">, </w:t>
+            </w:r>
+            <w:r>
+              <w:rPr>
+                <w:rFonts w:ascii="Consolas" w:hAnsi="Consolas"/>
+                <w:color w:val="9C2D41"/>
+              </w:rPr>
+              <w:t xml:space="preserve">VERCEL_PROJECT_ID</w:t>
+            </w:r>
+            <w:r>
+              <w:t xml:space="preserve">, </w:t>
+            </w:r>
+            <w:r>
+              <w:rPr>
+                <w:rFonts w:ascii="Consolas" w:hAnsi="Consolas"/>
+                <w:color w:val="9C2D41"/>
+              </w:rPr>
+              <w:t xml:space="preserve">VERCEL_TEAM_ID</w:t>
+            </w:r>
+          </w:p>
+        </w:tc>
+        <w:tc>
+          <w:tcPr>
+            <w:tcW w:w="0" w:type="auto"/>
+          </w:tcPr>
+          <w:p>
+            <w:r>
+              <w:t xml:space="preserve">Let "Make live" register </w:t>
+            </w:r>
+            <w:r>
+              <w:rPr>
+                <w:rFonts w:ascii="Consolas" w:hAnsi="Consolas"/>
+                <w:color w:val="9C2D41"/>
+              </w:rPr>
+              <w:t xml:space="preserve">&lt;sub&gt;.&lt;domain&gt;</w:t>
+            </w:r>
+            <w:r>
+              <w:t xml:space="preserve"> on the Vercel project (auto SSL). </w:t>
+            </w:r>
+            <w:r>
+              <w:rPr>
+                <w:rFonts w:ascii="Consolas" w:hAnsi="Consolas"/>
+                <w:color w:val="9C2D41"/>
+              </w:rPr>
+              <w:t xml:space="preserve">PROJECT_ID</w:t>
+            </w:r>
+            <w:r>
+              <w:t xml:space="preserve"> = project name or </w:t>
+            </w:r>
+            <w:r>
+              <w:rPr>
+                <w:rFonts w:ascii="Consolas" w:hAnsi="Consolas"/>
+                <w:color w:val="9C2D41"/>
+              </w:rPr>
+              <w:t xml:space="preserve">prj_…</w:t>
+            </w:r>
+            <w:r>
+              <w:t xml:space="preserve">; </w:t>
+            </w:r>
+            <w:r>
+              <w:rPr>
+                <w:rFonts w:ascii="Consolas" w:hAnsi="Consolas"/>
+                <w:color w:val="9C2D41"/>
+              </w:rPr>
+              <w:t xml:space="preserve">TEAM_ID</w:t>
+            </w:r>
+            <w:r>
+              <w:t xml:space="preserve"> = team slug or </w:t>
+            </w:r>
+            <w:r>
+              <w:rPr>
+                <w:rFonts w:ascii="Consolas" w:hAnsi="Consolas"/>
+                <w:color w:val="9C2D41"/>
+              </w:rPr>
+              <w:t xml:space="preserve">team_…</w:t>
+            </w:r>
+            <w:r>
+              <w:t xml:space="preserve">. See §7b.</w:t>
+            </w:r>
+          </w:p>
+        </w:tc>
+      </w:tr>
     </w:tbl>
     <w:p/>
+    <w:p>
+      <w:pPr>
+        <w:pStyle w:val="Heading2"/>
+      </w:pPr>
+      <w:r>
+        <w:t xml:space="preserve">7b. One-time setup: client subdomains (operator / white-label)</w:t>
+      </w:r>
+    </w:p>
+    <w:p>
+      <w:r>
+        <w:t xml:space="preserve">So </w:t>
+      </w:r>
+      <w:r>
+        <w:rPr>
+          <w:b/>
+        </w:rPr>
+        <w:t xml:space="preserve">"Make live → choose a subdomain"</w:t>
+      </w:r>
+      <w:r>
+        <w:t xml:space="preserve"> works (a Pounce site goes live at </w:t>
+      </w:r>
+      <w:r>
+        <w:rPr>
+          <w:rFonts w:ascii="Consolas" w:hAnsi="Consolas"/>
+          <w:color w:val="9C2D41"/>
+        </w:rPr>
+        <w:t xml:space="preserve">&lt;name&gt;.&lt;your-domain&gt;</w:t>
+      </w:r>
+      <w:r>
+        <w:t xml:space="preserve"> with auto HTTPS), the operator does this </w:t>
+      </w:r>
+      <w:r>
+        <w:rPr>
+          <w:b/>
+        </w:rPr>
+        <w:t xml:space="preserve">once</w:t>
+      </w:r>
+      <w:r>
+        <w:t xml:space="preserve">. (Done for </w:t>
+      </w:r>
+      <w:r>
+        <w:rPr>
+          <w:rFonts w:ascii="Consolas" w:hAnsi="Consolas"/>
+          <w:color w:val="9C2D41"/>
+        </w:rPr>
+        <w:t xml:space="preserve">aiwebpoint.com</w:t>
+      </w:r>
+      <w:r>
+        <w:t xml:space="preserve"> on 2026-06-11.) For a public/white-label release, this is the per-operator setup to hand users.</w:t>
+      </w:r>
+    </w:p>
+    <w:p>
+      <w:r>
+        <w:rPr>
+          <w:b/>
+        </w:rPr>
+        <w:t xml:space="preserve">A. Wildcard DNS + Vercel (provides routing for every subdomain):</w:t>
+      </w:r>
+    </w:p>
+    <w:p>
+      <w:pPr>
+        <w:numPr>
+          <w:ilvl w:val="0"/>
+          <w:numId w:val="1"/>
+        </w:numPr>
+      </w:pPr>
+      <w:r>
+        <w:rPr>
+          <w:b/>
+        </w:rPr>
+        <w:t xml:space="preserve">Vercel</w:t>
+      </w:r>
+      <w:r>
+        <w:t xml:space="preserve"> → </w:t>
+      </w:r>
+      <w:r>
+        <w:rPr>
+          <w:b/>
+        </w:rPr>
+        <w:t xml:space="preserve">Domains</w:t>
+      </w:r>
+      <w:r>
+        <w:t xml:space="preserve"> → your domain → </w:t>
+      </w:r>
+      <w:r>
+        <w:rPr>
+          <w:b/>
+        </w:rPr>
+        <w:t xml:space="preserve">Connected Projects</w:t>
+      </w:r>
+      <w:r>
+        <w:t xml:space="preserve"> → </w:t>
+      </w:r>
+      <w:r>
+        <w:rPr>
+          <w:b/>
+        </w:rPr>
+        <w:t xml:space="preserve">Connect</w:t>
+      </w:r>
+      <w:r>
+        <w:t xml:space="preserve"> → enter </w:t>
+      </w:r>
+      <w:r>
+        <w:rPr>
+          <w:rFonts w:ascii="Consolas" w:hAnsi="Consolas"/>
+          <w:color w:val="9C2D41"/>
+        </w:rPr>
+        <w:t xml:space="preserve">*</w:t>
+      </w:r>
+      <w:r>
+        <w:t xml:space="preserve"> (i.e.</w:t>
+      </w:r>
+    </w:p>
+    <w:p>
+      <w:r>
+        <w:rPr>
+          <w:rFonts w:ascii="Consolas" w:hAnsi="Consolas"/>
+          <w:color w:val="9C2D41"/>
+        </w:rPr>
+        <w:t xml:space="preserve">*.yourdomain.com</w:t>
+      </w:r>
+      <w:r>
+        <w:t xml:space="preserve">) → pick the project. (Do NOT "Enable Vercel DNS" or change nameservers if your DNS is elsewhere, e.g. Cloudflare.)</w:t>
+      </w:r>
+    </w:p>
+    <w:p>
+      <w:pPr>
+        <w:numPr>
+          <w:ilvl w:val="0"/>
+          <w:numId w:val="1"/>
+        </w:numPr>
+      </w:pPr>
+      <w:r>
+        <w:rPr>
+          <w:b/>
+        </w:rPr>
+        <w:t xml:space="preserve">Your DNS</w:t>
+      </w:r>
+      <w:r>
+        <w:t xml:space="preserve"> (e.g. Cloudflare) → add </w:t>
+      </w:r>
+      <w:r>
+        <w:rPr>
+          <w:b/>
+        </w:rPr>
+        <w:t xml:space="preserve">CNAME, Name `*`, Target `cname.vercel-dns.com`</w:t>
+      </w:r>
+      <w:r>
+        <w:t xml:space="preserve"> (or the</w:t>
+      </w:r>
+    </w:p>
+    <w:p>
+      <w:r>
+        <w:t xml:space="preserve">project's </w:t>
+      </w:r>
+      <w:r>
+        <w:rPr>
+          <w:rFonts w:ascii="Consolas" w:hAnsi="Consolas"/>
+          <w:color w:val="9C2D41"/>
+        </w:rPr>
+        <w:t xml:space="preserve">*.vercel-dns-NNN.com</w:t>
+      </w:r>
+      <w:r>
+        <w:t xml:space="preserve"> target), </w:t>
+      </w:r>
+      <w:r>
+        <w:rPr>
+          <w:b/>
+        </w:rPr>
+        <w:t xml:space="preserve">DNS only / proxy OFF</w:t>
+      </w:r>
+      <w:r>
+        <w:t xml:space="preserve">. Existing records (apex, www, MX/email) are safe, specific records beat the wildcard.</w:t>
+      </w:r>
+    </w:p>
+    <w:p>
+      <w:pPr>
+        <w:numPr>
+          <w:ilvl w:val="0"/>
+          <w:numId w:val="1"/>
+        </w:numPr>
+      </w:pPr>
+      <w:r>
+        <w:t xml:space="preserve">⚠️ </w:t>
+      </w:r>
+      <w:r>
+        <w:rPr>
+          <w:b/>
+        </w:rPr>
+        <w:t xml:space="preserve">Vercel will NOT auto-issue a `*` wildcard certificate on third-party nameservers.</w:t>
+      </w:r>
+      <w:r>
+        <w:t xml:space="preserve"> That's</w:t>
+      </w:r>
+    </w:p>
+    <w:p>
+      <w:r>
+        <w:t xml:space="preserve">expected and fine: the wildcard CNAME only provides DNS; each subdomain that goes live is added to the Vercel project individually by the app (step B), which gets its own cert (HTTP-01).</w:t>
+      </w:r>
+    </w:p>
+    <w:p>
+      <w:r>
+        <w:rPr>
+          <w:b/>
+        </w:rPr>
+        <w:t xml:space="preserve">B. Vercel API token + env vars (lets the app add each subdomain):</w:t>
+      </w:r>
+    </w:p>
+    <w:p>
+      <w:pPr>
+        <w:numPr>
+          <w:ilvl w:val="0"/>
+          <w:numId w:val="1"/>
+        </w:numPr>
+      </w:pPr>
+      <w:r>
+        <w:rPr>
+          <w:b/>
+        </w:rPr>
+        <w:t xml:space="preserve">Vercel</w:t>
+      </w:r>
+      <w:r>
+        <w:t xml:space="preserve"> → Account Settings → </w:t>
+      </w:r>
+      <w:r>
+        <w:rPr>
+          <w:b/>
+        </w:rPr>
+        <w:t xml:space="preserve">Tokens</w:t>
+      </w:r>
+      <w:r>
+        <w:t xml:space="preserve"> (</w:t>
+      </w:r>
+      <w:r>
+        <w:rPr>
+          <w:rFonts w:ascii="Consolas" w:hAnsi="Consolas"/>
+          <w:color w:val="9C2D41"/>
+        </w:rPr>
+        <w:t xml:space="preserve">vercel.com/account/tokens</w:t>
+      </w:r>
+      <w:r>
+        <w:t xml:space="preserve">) → </w:t>
+      </w:r>
+      <w:r>
+        <w:rPr>
+          <w:b/>
+        </w:rPr>
+        <w:t xml:space="preserve">Create Token</w:t>
+      </w:r>
+      <w:r>
+        <w:t xml:space="preserve">,</w:t>
+      </w:r>
+    </w:p>
+    <w:p>
+      <w:r>
+        <w:t xml:space="preserve">scoped to your team. Copy it.</w:t>
+      </w:r>
+    </w:p>
+    <w:p>
+      <w:pPr>
+        <w:numPr>
+          <w:ilvl w:val="0"/>
+          <w:numId w:val="1"/>
+        </w:numPr>
+      </w:pPr>
+      <w:r>
+        <w:t xml:space="preserve">Project → </w:t>
+      </w:r>
+      <w:r>
+        <w:rPr>
+          <w:b/>
+        </w:rPr>
+        <w:t xml:space="preserve">Settings → Environment Variables</w:t>
+      </w:r>
+      <w:r>
+        <w:t xml:space="preserve"> → add (Production): </w:t>
+      </w:r>
+      <w:r>
+        <w:rPr>
+          <w:rFonts w:ascii="Consolas" w:hAnsi="Consolas"/>
+          <w:color w:val="9C2D41"/>
+        </w:rPr>
+        <w:t xml:space="preserve">VERCEL_TOKEN</w:t>
+      </w:r>
+      <w:r>
+        <w:t xml:space="preserve"> = the token,</w:t>
+      </w:r>
+    </w:p>
+    <w:p>
+      <w:r>
+        <w:rPr>
+          <w:rFonts w:ascii="Consolas" w:hAnsi="Consolas"/>
+          <w:color w:val="9C2D41"/>
+        </w:rPr>
+        <w:t xml:space="preserve">VERCEL_PROJECT_ID</w:t>
+      </w:r>
+      <w:r>
+        <w:t xml:space="preserve"> = the project name (or </w:t>
+      </w:r>
+      <w:r>
+        <w:rPr>
+          <w:rFonts w:ascii="Consolas" w:hAnsi="Consolas"/>
+          <w:color w:val="9C2D41"/>
+        </w:rPr>
+        <w:t xml:space="preserve">prj_…</w:t>
+      </w:r>
+      <w:r>
+        <w:t xml:space="preserve">), </w:t>
+      </w:r>
+      <w:r>
+        <w:rPr>
+          <w:rFonts w:ascii="Consolas" w:hAnsi="Consolas"/>
+          <w:color w:val="9C2D41"/>
+        </w:rPr>
+        <w:t xml:space="preserve">VERCEL_TEAM_ID</w:t>
+      </w:r>
+      <w:r>
+        <w:t xml:space="preserve"> = the team slug (or </w:t>
+      </w:r>
+      <w:r>
+        <w:rPr>
+          <w:rFonts w:ascii="Consolas" w:hAnsi="Consolas"/>
+          <w:color w:val="9C2D41"/>
+        </w:rPr>
+        <w:t xml:space="preserve">team_…</w:t>
+      </w:r>
+      <w:r>
+        <w:t xml:space="preserve">).</w:t>
+      </w:r>
+    </w:p>
+    <w:p>
+      <w:pPr>
+        <w:numPr>
+          <w:ilvl w:val="0"/>
+          <w:numId w:val="1"/>
+        </w:numPr>
+      </w:pPr>
+      <w:r>
+        <w:t xml:space="preserve">Redeploy (any push picks them up).</w:t>
+      </w:r>
+    </w:p>
+    <w:p>
+      <w:r>
+        <w:rPr>
+          <w:b/>
+        </w:rPr>
+        <w:t xml:space="preserve">How it then works at runtime:</w:t>
+      </w:r>
+      <w:r>
+        <w:t xml:space="preserve"> </w:t>
+      </w:r>
+      <w:r>
+        <w:rPr>
+          <w:rFonts w:ascii="Consolas" w:hAnsi="Consolas"/>
+          <w:color w:val="9C2D41"/>
+        </w:rPr>
+        <w:t xml:space="preserve">Make live</w:t>
+      </w:r>
+      <w:r>
+        <w:t xml:space="preserve"> (api/publish.js) → </w:t>
+      </w:r>
+      <w:r>
+        <w:rPr>
+          <w:rFonts w:ascii="Consolas" w:hAnsi="Consolas"/>
+          <w:color w:val="9C2D41"/>
+        </w:rPr>
+        <w:t xml:space="preserve">lib/vercel.js</w:t>
+      </w:r>
+      <w:r>
+        <w:t xml:space="preserve"> calls the Vercel API to add </w:t>
+      </w:r>
+      <w:r>
+        <w:rPr>
+          <w:rFonts w:ascii="Consolas" w:hAnsi="Consolas"/>
+          <w:color w:val="9C2D41"/>
+        </w:rPr>
+        <w:t xml:space="preserve">&lt;sub&gt;.yourdomain.com</w:t>
+      </w:r>
+      <w:r>
+        <w:t xml:space="preserve"> to the project → records </w:t>
+      </w:r>
+      <w:r>
+        <w:rPr>
+          <w:rFonts w:ascii="Consolas" w:hAnsi="Consolas"/>
+          <w:color w:val="9C2D41"/>
+        </w:rPr>
+        <w:t xml:space="preserve">domains/_index.json</w:t>
+      </w:r>
+      <w:r>
+        <w:t xml:space="preserve"> (sub→slug) → </w:t>
+      </w:r>
+      <w:r>
+        <w:rPr>
+          <w:rFonts w:ascii="Consolas" w:hAnsi="Consolas"/>
+          <w:color w:val="9C2D41"/>
+        </w:rPr>
+        <w:t xml:space="preserve">middleware.js</w:t>
+      </w:r>
+      <w:r>
+        <w:t xml:space="preserve"> rewrites the subdomain's root to </w:t>
+      </w:r>
+      <w:r>
+        <w:rPr>
+          <w:rFonts w:ascii="Consolas" w:hAnsi="Consolas"/>
+          <w:color w:val="9C2D41"/>
+        </w:rPr>
+        <w:t xml:space="preserve">/api/site?sub=…</w:t>
+      </w:r>
+      <w:r>
+        <w:t xml:space="preserve"> which resolves the slug and renders. Unpublish frees the subdomain. ⚠️ A Vercel token controls the whole team account (no domains-only scope), stored encrypted in env, same as other secrets.</w:t>
+      </w:r>
+    </w:p>
     <w:p>
       <w:pPr>
         <w:pStyle w:val="Heading2"/>
@@ -8404,7 +8922,7 @@
         <w:rPr>
           <w:b/>
         </w:rPr>
-        <w:t xml:space="preserve">Make live on a subdomain (Phase 2b, new):</w:t>
+        <w:t xml:space="preserve">Make live on a subdomain (Phase 2b, ✅ DONE + verified live):</w:t>
       </w:r>
       <w:r>
         <w:t xml:space="preserve"> one-click publish to</w:t>
@@ -8419,7 +8937,17 @@
         <w:t xml:space="preserve">&lt;sub&gt;.aiwebpoint.com</w:t>
       </w:r>
       <w:r>
-        <w:t xml:space="preserve">. </w:t>
+        <w:t xml:space="preserve">. First live site confirmed: </w:t>
+      </w:r>
+      <w:r>
+        <w:rPr>
+          <w:rFonts w:ascii="Consolas" w:hAnsi="Consolas"/>
+          <w:color w:val="9C2D41"/>
+        </w:rPr>
+        <w:t xml:space="preserve">https://ashgardens.aiwebpoint.com</w:t>
+      </w:r>
+      <w:r>
+        <w:t xml:space="preserve"> (HTTPS, 200). </w:t>
       </w:r>
       <w:r>
         <w:rPr>
@@ -8489,7 +9017,7 @@
         <w:t xml:space="preserve">VERCEL_TEAM_ID</w:t>
       </w:r>
       <w:r>
-        <w:t xml:space="preserve">. Wildcard </w:t>
+        <w:t xml:space="preserve"> (one-time setup in §7b). Wildcard </w:t>
       </w:r>
       <w:r>
         <w:rPr>
@@ -8499,7 +9027,7 @@
         <w:t xml:space="preserve">*.aiwebpoint.com</w:t>
       </w:r>
       <w:r>
-        <w:t xml:space="preserve"> provides the DNS; per-subdomain add to Vercel provides the cert.</w:t>
+        <w:t xml:space="preserve"> provides DNS; per-subdomain add to Vercel provides the cert. Make-live popup has a clickable "🌐 Go to website" button.</w:t>
       </w:r>
     </w:p>
     <w:p>

</xml_diff>

<commit_message>
Docs: consolidated parked / on-hold quick-reference list
Co-Authored-By: Claude Opus 4.8 <noreply@anthropic.com>
</commit_message>
<xml_diff>
--- a/DOCS.docx
+++ b/DOCS.docx
@@ -7552,6 +7552,182 @@
       </w:pPr>
       <w:r>
         <w:t xml:space="preserve">11. Roadmap</w:t>
+      </w:r>
+    </w:p>
+    <w:p>
+      <w:pPr>
+        <w:pStyle w:val="Heading3"/>
+      </w:pPr>
+      <w:r>
+        <w:t xml:space="preserve">⏸️ Parked / on hold (quick reference, as of 2026-06-11)</w:t>
+      </w:r>
+    </w:p>
+    <w:p>
+      <w:r>
+        <w:t xml:space="preserve">Things we deliberately deferred, newest first. Details in the bullets below + the change log.</w:t>
+      </w:r>
+    </w:p>
+    <w:p>
+      <w:pPr>
+        <w:numPr>
+          <w:ilvl w:val="0"/>
+          <w:numId w:val="1"/>
+        </w:numPr>
+      </w:pPr>
+      <w:r>
+        <w:rPr>
+          <w:b/>
+        </w:rPr>
+        <w:t xml:space="preserve">Mockup IMAGE revamp</w:t>
+      </w:r>
+      <w:r>
+        <w:t xml:space="preserve"> (the picture itself, via </w:t>
+      </w:r>
+      <w:r>
+        <w:rPr>
+          <w:rFonts w:ascii="Consolas" w:hAnsi="Consolas"/>
+          <w:color w:val="9C2D41"/>
+        </w:rPr>
+        <w:t xml:space="preserve">generate.js</w:t>
+      </w:r>
+      <w:r>
+        <w:t xml:space="preserve">): brighter/positive hero photo,</w:t>
+      </w:r>
+    </w:p>
+    <w:p>
+      <w:r>
+        <w:t xml:space="preserve">fake nav menu (Home / About / Contact), bigger/bolder service chips, and remove or sentence-ify the composited blue "Let me show you the full website over a call" button. (The preview *page* around the image, nudge + green CTA, is already polished; only the baked-in image is pending.)</w:t>
+      </w:r>
+    </w:p>
+    <w:p>
+      <w:pPr>
+        <w:numPr>
+          <w:ilvl w:val="0"/>
+          <w:numId w:val="1"/>
+        </w:numPr>
+      </w:pPr>
+      <w:r>
+        <w:rPr>
+          <w:b/>
+        </w:rPr>
+        <w:t xml:space="preserve">Phase 3, AI edit box + file upload</w:t>
+      </w:r>
+      <w:r>
+        <w:t xml:space="preserve"> for live sites (the next build): type a change in plain</w:t>
+      </w:r>
+    </w:p>
+    <w:p>
+      <w:r>
+        <w:t xml:space="preserve">English (+ upload photos) → AI returns a minimal patch → shows a diff → apply on confirm only → backs up the previous version. Needs no new setup (uses the existing OpenAI key).</w:t>
+      </w:r>
+    </w:p>
+    <w:p>
+      <w:pPr>
+        <w:numPr>
+          <w:ilvl w:val="0"/>
+          <w:numId w:val="1"/>
+        </w:numPr>
+      </w:pPr>
+      <w:r>
+        <w:rPr>
+          <w:b/>
+        </w:rPr>
+        <w:t xml:space="preserve">Phase 4, custom domains</w:t>
+      </w:r>
+      <w:r>
+        <w:t xml:space="preserve"> (a client's own </w:t>
+      </w:r>
+      <w:r>
+        <w:rPr>
+          <w:rFonts w:ascii="Consolas" w:hAnsi="Consolas"/>
+          <w:color w:val="9C2D41"/>
+        </w:rPr>
+        <w:t xml:space="preserve">theirbiz.co.uk</w:t>
+      </w:r>
+      <w:r>
+        <w:t xml:space="preserve"> instead of a subdomain): Vercel</w:t>
+      </w:r>
+    </w:p>
+    <w:p>
+      <w:r>
+        <w:t xml:space="preserve">Domains API + DNS records + a verification poll. Most ops, saved for last.</w:t>
+      </w:r>
+    </w:p>
+    <w:p>
+      <w:pPr>
+        <w:numPr>
+          <w:ilvl w:val="0"/>
+          <w:numId w:val="1"/>
+        </w:numPr>
+      </w:pPr>
+      <w:r>
+        <w:rPr>
+          <w:b/>
+        </w:rPr>
+        <w:t xml:space="preserve">Email enrichment ("Find email")</w:t>
+      </w:r>
+      <w:r>
+        <w:t xml:space="preserve"> so email can be a fallback channel (Facebook/directories</w:t>
+      </w:r>
+    </w:p>
+    <w:p>
+      <w:r>
+        <w:t xml:space="preserve">first, verify before send). Full spec below.</w:t>
+      </w:r>
+    </w:p>
+    <w:p>
+      <w:pPr>
+        <w:numPr>
+          <w:ilvl w:val="0"/>
+          <w:numId w:val="1"/>
+        </w:numPr>
+      </w:pPr>
+      <w:r>
+        <w:rPr>
+          <w:b/>
+        </w:rPr>
+        <w:t xml:space="preserve">Earlier parked:</w:t>
+      </w:r>
+      <w:r>
+        <w:t xml:space="preserve"> Pounce v2 client photo upload (before/after), </w:t>
+      </w:r>
+      <w:r>
+        <w:rPr>
+          <w:b/>
+        </w:rPr>
+        <w:t xml:space="preserve">Payments</w:t>
+      </w:r>
+      <w:r>
+        <w:t xml:space="preserve"> (Stripe links),</w:t>
+      </w:r>
+    </w:p>
+    <w:p>
+      <w:r>
+        <w:rPr>
+          <w:b/>
+        </w:rPr>
+        <w:t xml:space="preserve">Companies House</w:t>
+      </w:r>
+      <w:r>
+        <w:t xml:space="preserve"> key for Prowl, </w:t>
+      </w:r>
+      <w:r>
+        <w:rPr>
+          <w:b/>
+        </w:rPr>
+        <w:t xml:space="preserve">Prowl Phase B</w:t>
+      </w:r>
+      <w:r>
+        <w:t xml:space="preserve"> (Trustpilot/Facebook web search), </w:t>
+      </w:r>
+      <w:r>
+        <w:rPr>
+          <w:b/>
+        </w:rPr>
+        <w:t xml:space="preserve">WhatsApp image-vs-link</w:t>
+      </w:r>
+      <w:r>
+        <w:t xml:space="preserve"> A/B test.</w:t>
       </w:r>
     </w:p>
     <w:p>

</xml_diff>

<commit_message>
Docs: add Technical architecture section (data-flow diagram + updated code map)
ASCII data-flow overview (external services / app / data stores / outputs)
plus the main flow narrative, and add the newer files (publish, decline,
middleware, lib/vercel, lib/names) to the code map.

Co-Authored-By: Claude Opus 4.8 <noreply@anthropic.com>
</commit_message>
<xml_diff>
--- a/DOCS.docx
+++ b/DOCS.docx
@@ -4044,6 +4044,46 @@
     </w:p>
     <w:p>
       <w:pPr>
+        <w:pStyle w:val="Heading3"/>
+      </w:pPr>
+      <w:r>
+        <w:t xml:space="preserve">4a. Technical architecture, data flows at a glance</w:t>
+      </w:r>
+    </w:p>
+    <w:p>
+      <w:r>
+        <w:t xml:space="preserve">The app is a thin front-end + Vercel serverless back-end. The back-end </w:t>
+      </w:r>
+      <w:r>
+        <w:rPr>
+          <w:b/>
+        </w:rPr>
+        <w:t xml:space="preserve">calls out</w:t>
+      </w:r>
+      <w:r>
+        <w:t xml:space="preserve"> to a few external services, </w:t>
+      </w:r>
+      <w:r>
+        <w:rPr>
+          <w:b/>
+        </w:rPr>
+        <w:t xml:space="preserve">stores</w:t>
+      </w:r>
+      <w:r>
+        <w:t xml:space="preserve"> in two databases, and </w:t>
+      </w:r>
+      <w:r>
+        <w:rPr>
+          <w:b/>
+        </w:rPr>
+        <w:t xml:space="preserve">produces</w:t>
+      </w:r>
+      <w:r>
+        <w:t xml:space="preserve"> outputs that reach the prospect.</w:t>
+      </w:r>
+    </w:p>
+    <w:p>
+      <w:pPr>
         <w:pStyle w:val="Code"/>
       </w:pPr>
       <w:r>
@@ -4051,6 +4091,329 @@
           <w:rFonts w:ascii="Consolas" w:hAnsi="Consolas"/>
           <w:sz w:val="18"/>
         </w:rPr>
+        <w:t xml:space="preserve">                 EXTERNAL SERVICES  (the back-end calls these)</w:t>
+      </w:r>
+    </w:p>
+    <w:p>
+      <w:pPr>
+        <w:pStyle w:val="Code"/>
+      </w:pPr>
+      <w:r>
+        <w:rPr>
+          <w:rFonts w:ascii="Consolas" w:hAnsi="Consolas"/>
+          <w:sz w:val="18"/>
+        </w:rPr>
+        <w:t xml:space="preserve">  Google Places       OpenAI          SendGrid      Vercel + Cloudflare</w:t>
+      </w:r>
+    </w:p>
+    <w:p>
+      <w:pPr>
+        <w:pStyle w:val="Code"/>
+      </w:pPr>
+      <w:r>
+        <w:rPr>
+          <w:rFonts w:ascii="Consolas" w:hAnsi="Consolas"/>
+          <w:sz w:val="18"/>
+        </w:rPr>
+        <w:t xml:space="preserve">  businesses/reviews   image + copy    emails        host / domains / DNS</w:t>
+      </w:r>
+    </w:p>
+    <w:p>
+      <w:pPr>
+        <w:pStyle w:val="Code"/>
+      </w:pPr>
+      <w:r>
+        <w:rPr>
+          <w:rFonts w:ascii="Consolas" w:hAnsi="Consolas"/>
+          <w:sz w:val="18"/>
+        </w:rPr>
+        <w:t xml:space="preserve">        |                  |              |                  |</w:t>
+      </w:r>
+    </w:p>
+    <w:p>
+      <w:pPr>
+        <w:pStyle w:val="Code"/>
+      </w:pPr>
+      <w:r>
+        <w:rPr>
+          <w:rFonts w:ascii="Consolas" w:hAnsi="Consolas"/>
+          <w:sz w:val="18"/>
+        </w:rPr>
+        <w:t xml:space="preserve">        +---------+--------+------+-------+---------+--------+</w:t>
+      </w:r>
+    </w:p>
+    <w:p>
+      <w:pPr>
+        <w:pStyle w:val="Code"/>
+      </w:pPr>
+      <w:r>
+        <w:rPr>
+          <w:rFonts w:ascii="Consolas" w:hAnsi="Consolas"/>
+          <w:sz w:val="18"/>
+        </w:rPr>
+        <w:t xml:space="preserve">                              v  (pulls data / sends email)</w:t>
+      </w:r>
+    </w:p>
+    <w:p>
+      <w:pPr>
+        <w:pStyle w:val="Code"/>
+      </w:pPr>
+      <w:r>
+        <w:rPr>
+          <w:rFonts w:ascii="Consolas" w:hAnsi="Consolas"/>
+          <w:sz w:val="18"/>
+        </w:rPr>
+        <w:t xml:space="preserve">  YOU   -----&gt;  FRONT-END  -----&gt;  BACK-END  -----&gt;  OUTPUTS  -----&gt;  PROSPECT</w:t>
+      </w:r>
+    </w:p>
+    <w:p>
+      <w:pPr>
+        <w:pStyle w:val="Code"/>
+      </w:pPr>
+      <w:r>
+        <w:rPr>
+          <w:rFonts w:ascii="Consolas" w:hAnsi="Consolas"/>
+          <w:sz w:val="18"/>
+        </w:rPr>
+        <w:t xml:space="preserve">  agency        browser app        Vercel /api       mockup, site,    local business</w:t>
+      </w:r>
+    </w:p>
+    <w:p>
+      <w:pPr>
+        <w:pStyle w:val="Code"/>
+      </w:pPr>
+      <w:r>
+        <w:rPr>
+          <w:rFonts w:ascii="Consolas" w:hAnsi="Consolas"/>
+          <w:sz w:val="18"/>
+        </w:rPr>
+        <w:t xml:space="preserve">                                                      dashboard</w:t>
+      </w:r>
+    </w:p>
+    <w:p>
+      <w:pPr>
+        <w:pStyle w:val="Code"/>
+      </w:pPr>
+      <w:r>
+        <w:rPr>
+          <w:rFonts w:ascii="Consolas" w:hAnsi="Consolas"/>
+          <w:sz w:val="18"/>
+        </w:rPr>
+        <w:t xml:space="preserve">                              |                                          |</w:t>
+      </w:r>
+    </w:p>
+    <w:p>
+      <w:pPr>
+        <w:pStyle w:val="Code"/>
+      </w:pPr>
+      <w:r>
+        <w:rPr>
+          <w:rFonts w:ascii="Consolas" w:hAnsi="Consolas"/>
+          <w:sz w:val="18"/>
+        </w:rPr>
+        <w:t xml:space="preserve">                  writes/reads v                          views/clicks   v  (tracked)</w:t>
+      </w:r>
+    </w:p>
+    <w:p>
+      <w:pPr>
+        <w:pStyle w:val="Code"/>
+      </w:pPr>
+      <w:r>
+        <w:rPr>
+          <w:rFonts w:ascii="Consolas" w:hAnsi="Consolas"/>
+          <w:sz w:val="18"/>
+        </w:rPr>
+        <w:t xml:space="preserve">                     +---------+------------------------------+----------+</w:t>
+      </w:r>
+    </w:p>
+    <w:p>
+      <w:pPr>
+        <w:pStyle w:val="Code"/>
+      </w:pPr>
+      <w:r>
+        <w:rPr>
+          <w:rFonts w:ascii="Consolas" w:hAnsi="Consolas"/>
+          <w:sz w:val="18"/>
+        </w:rPr>
+        <w:t xml:space="preserve">                     v                                        v</w:t>
+      </w:r>
+    </w:p>
+    <w:p>
+      <w:pPr>
+        <w:pStyle w:val="Code"/>
+      </w:pPr>
+      <w:r>
+        <w:rPr>
+          <w:rFonts w:ascii="Consolas" w:hAnsi="Consolas"/>
+          <w:sz w:val="18"/>
+        </w:rPr>
+        <w:t xml:space="preserve">               VERCEL BLOB                               NEON POSTGRES</w:t>
+      </w:r>
+    </w:p>
+    <w:p>
+      <w:pPr>
+        <w:pStyle w:val="Code"/>
+      </w:pPr>
+      <w:r>
+        <w:rPr>
+          <w:rFonts w:ascii="Consolas" w:hAnsi="Consolas"/>
+          <w:sz w:val="18"/>
+        </w:rPr>
+        <w:t xml:space="preserve">               mockups, sites, Prowl dossiers,           every send / view /</w:t>
+      </w:r>
+    </w:p>
+    <w:p>
+      <w:pPr>
+        <w:pStyle w:val="Code"/>
+      </w:pPr>
+      <w:r>
+        <w:rPr>
+          <w:rFonts w:ascii="Consolas" w:hAnsi="Consolas"/>
+          <w:sz w:val="18"/>
+        </w:rPr>
+        <w:t xml:space="preserve">               CRM notes, subdomain map, usage           click / decline event</w:t>
+      </w:r>
+    </w:p>
+    <w:p>
+      <w:r>
+        <w:rPr>
+          <w:b/>
+        </w:rPr>
+        <w:t xml:space="preserve">The main flow:</w:t>
+      </w:r>
+      <w:r>
+        <w:t xml:space="preserve"> you </w:t>
+      </w:r>
+      <w:r>
+        <w:rPr>
+          <w:b/>
+        </w:rPr>
+        <w:t xml:space="preserve">search</w:t>
+      </w:r>
+      <w:r>
+        <w:t xml:space="preserve"> (Google Places) → </w:t>
+      </w:r>
+      <w:r>
+        <w:rPr>
+          <w:b/>
+        </w:rPr>
+        <w:t xml:space="preserve">generate</w:t>
+      </w:r>
+      <w:r>
+        <w:t xml:space="preserve"> a mockup (OpenAI image + copy, composited and stored in Blob) → </w:t>
+      </w:r>
+      <w:r>
+        <w:rPr>
+          <w:b/>
+        </w:rPr>
+        <w:t xml:space="preserve">send</w:t>
+      </w:r>
+      <w:r>
+        <w:t xml:space="preserve"> the preview link by WhatsApp/SMS (manual) → the prospect </w:t>
+      </w:r>
+      <w:r>
+        <w:rPr>
+          <w:b/>
+        </w:rPr>
+        <w:t xml:space="preserve">views/clicks</w:t>
+      </w:r>
+      <w:r>
+        <w:t xml:space="preserve">, which the tracking beacon writes to Postgres → the </w:t>
+      </w:r>
+      <w:r>
+        <w:rPr>
+          <w:b/>
+        </w:rPr>
+        <w:t xml:space="preserve">Performance</w:t>
+      </w:r>
+      <w:r>
+        <w:t xml:space="preserve"> dashboard reads those events. Alongside: </w:t>
+      </w:r>
+      <w:r>
+        <w:rPr>
+          <w:b/>
+        </w:rPr>
+        <w:t xml:space="preserve">Prowl</w:t>
+      </w:r>
+      <w:r>
+        <w:t xml:space="preserve"> builds an intelligence dossier (Google + OpenAI → Blob), </w:t>
+      </w:r>
+      <w:r>
+        <w:rPr>
+          <w:b/>
+        </w:rPr>
+        <w:t xml:space="preserve">Pounce</w:t>
+      </w:r>
+      <w:r>
+        <w:t xml:space="preserve"> builds a 1-page website (Google Place Details + OpenAI → Blob, served at </w:t>
+      </w:r>
+      <w:r>
+        <w:rPr>
+          <w:rFonts w:ascii="Consolas" w:hAnsi="Consolas"/>
+          <w:color w:val="9C2D41"/>
+        </w:rPr>
+        <w:t xml:space="preserve">/s/&lt;slug&gt;</w:t>
+      </w:r>
+      <w:r>
+        <w:t xml:space="preserve">), and </w:t>
+      </w:r>
+      <w:r>
+        <w:rPr>
+          <w:b/>
+        </w:rPr>
+        <w:t xml:space="preserve">Make live</w:t>
+      </w:r>
+      <w:r>
+        <w:t xml:space="preserve"> publishes it to a subdomain (Vercel Domains API + a </w:t>
+      </w:r>
+      <w:r>
+        <w:rPr>
+          <w:rFonts w:ascii="Consolas" w:hAnsi="Consolas"/>
+          <w:color w:val="9C2D41"/>
+        </w:rPr>
+        <w:t xml:space="preserve">domains/_index.json</w:t>
+      </w:r>
+      <w:r>
+        <w:t xml:space="preserve"> map, routed by </w:t>
+      </w:r>
+      <w:r>
+        <w:rPr>
+          <w:rFonts w:ascii="Consolas" w:hAnsi="Consolas"/>
+          <w:color w:val="9C2D41"/>
+        </w:rPr>
+        <w:t xml:space="preserve">middleware.js</w:t>
+      </w:r>
+      <w:r>
+        <w:t xml:space="preserve">). CRM status + notes live in Blob; per-device flags (messaged, blocked) live in the browser's </w:t>
+      </w:r>
+      <w:r>
+        <w:rPr>
+          <w:rFonts w:ascii="Consolas" w:hAnsi="Consolas"/>
+          <w:color w:val="9C2D41"/>
+        </w:rPr>
+        <w:t xml:space="preserve">localStorage</w:t>
+      </w:r>
+      <w:r>
+        <w:t xml:space="preserve">.</w:t>
+      </w:r>
+    </w:p>
+    <w:p>
+      <w:pPr>
+        <w:pStyle w:val="Heading3"/>
+      </w:pPr>
+      <w:r>
+        <w:t xml:space="preserve">4b. Code map</w:t>
+      </w:r>
+    </w:p>
+    <w:p>
+      <w:pPr>
+        <w:pStyle w:val="Code"/>
+      </w:pPr>
+      <w:r>
+        <w:rPr>
+          <w:rFonts w:ascii="Consolas" w:hAnsi="Consolas"/>
+          <w:sz w:val="18"/>
+        </w:rPr>
         <w:t xml:space="preserve">Frontend (static, /public)            Backend (/api, Vercel serverless)</w:t>
       </w:r>
     </w:p>
@@ -4231,7 +4594,7 @@
           <w:rFonts w:ascii="Consolas" w:hAnsi="Consolas"/>
           <w:sz w:val="18"/>
         </w:rPr>
-        <w:t xml:space="preserve">                                       site.js      renders /s/&lt;slug&gt; (noindex preview)</w:t>
+        <w:t xml:space="preserve">names.js    humaniseBusinessName       site.js      renders /s/&lt;slug&gt; (+ ?sub= subdomain lookup)</w:t>
       </w:r>
     </w:p>
     <w:p>
@@ -4243,7 +4606,7 @@
           <w:rFonts w:ascii="Consolas" w:hAnsi="Consolas"/>
           <w:sz w:val="18"/>
         </w:rPr>
-        <w:t xml:space="preserve">                                       photo.js     Google-photo proxy (hides API key)</w:t>
+        <w:t xml:space="preserve">vercel.js   add/remove project domain   photo.js     Google-photo proxy (hides API key)</w:t>
       </w:r>
     </w:p>
     <w:p>
@@ -4255,7 +4618,43 @@
           <w:rFonts w:ascii="Consolas" w:hAnsi="Consolas"/>
           <w:sz w:val="18"/>
         </w:rPr>
-        <w:t xml:space="preserve">                                       sites.js     lists preview sites (tidy-up registry)</w:t>
+        <w:t xml:space="preserve">                                       sites.js     lists every Pounce site (Websites tab)</w:t>
+      </w:r>
+    </w:p>
+    <w:p>
+      <w:pPr>
+        <w:pStyle w:val="Code"/>
+      </w:pPr>
+      <w:r>
+        <w:rPr>
+          <w:rFonts w:ascii="Consolas" w:hAnsi="Consolas"/>
+          <w:sz w:val="18"/>
+        </w:rPr>
+        <w:t xml:space="preserve">                                       decline.js   "No thanks" → decline event + status</w:t>
+      </w:r>
+    </w:p>
+    <w:p>
+      <w:pPr>
+        <w:pStyle w:val="Code"/>
+      </w:pPr>
+      <w:r>
+        <w:rPr>
+          <w:rFonts w:ascii="Consolas" w:hAnsi="Consolas"/>
+          <w:sz w:val="18"/>
+        </w:rPr>
+        <w:t xml:space="preserve">                                       publish.js   Make live/unpublish + subdomain (Vercel API)</w:t>
+      </w:r>
+    </w:p>
+    <w:p>
+      <w:pPr>
+        <w:pStyle w:val="Code"/>
+      </w:pPr>
+      <w:r>
+        <w:rPr>
+          <w:rFonts w:ascii="Consolas" w:hAnsi="Consolas"/>
+          <w:sz w:val="18"/>
+        </w:rPr>
+        <w:t xml:space="preserve">middleware.js (root)  routes &lt;sub&gt;.aiwebpoint.com → /api/site?sub=</w:t>
       </w:r>
     </w:p>
     <w:p>

</xml_diff>

<commit_message>
Fix humaniseBusinessName for all-lowercase run-together names
"m1plumbing&heating" stayed unchanged in WhatsApp because the old logic
only split on capital-letter boundaries; an all-lowercase name had
nothing to split. Now: space out &/and/+//, split a known trade word off
a run-together token (SERVICE_WORDS, e.g. "m1plumbing" -> "m1 plumbing"),
and Title-Case an all-lowercase name (acronyms like MOT untouched). So
"m1plumbing&heating" -> "M1 Plumbing & Heating", "ashgardens" -> "Ash
Gardens". Server lib/names.js + client copy kept in sync.

Co-Authored-By: Claude Opus 4.8 <noreply@anthropic.com>
</commit_message>
<xml_diff>
--- a/DOCS.docx
+++ b/DOCS.docx
@@ -1438,55 +1438,45 @@
         <w:t xml:space="preserve">public/app.js</w:t>
       </w:r>
       <w:r>
-        <w:t xml:space="preserve">), two passes: (1) </w:t>
-      </w:r>
-      <w:r>
-        <w:rPr>
-          <w:b/>
-        </w:rPr>
-        <w:t xml:space="preserve">run-together names</w:t>
-      </w:r>
-      <w:r>
-        <w:t xml:space="preserve"> are split on camelCase, e.g. "PerformanceCarValeting" → "Performance Car Valeting", "JJGHomeCarWash" → "JJG Home Car Wash" (acronyms like MOT and already-spaced names stay intact); (2) </w:t>
-      </w:r>
-      <w:r>
-        <w:rPr>
-          <w:b/>
-        </w:rPr>
-        <w:t xml:space="preserve">keyword-stuffed overlong names</w:t>
-      </w:r>
-      <w:r>
-        <w:t xml:space="preserve"> (&gt;34 chars with </w:t>
-      </w:r>
-      <w:r>
-        <w:rPr>
-          <w:rFonts w:ascii="Consolas" w:hAnsi="Consolas"/>
-          <w:color w:val="9C2D41"/>
-        </w:rPr>
-        <w:t xml:space="preserve">,</w:t>
-      </w:r>
-      <w:r>
+        <w:t xml:space="preserve">, keep in sync incl. the trade-word list), in order: (1) </w:t>
+      </w:r>
+      <w:r>
+        <w:rPr>
+          <w:b/>
+        </w:rPr>
+        <w:t xml:space="preserve">camelCase split</w:t>
+      </w:r>
+      <w:r>
+        <w:t xml:space="preserve"> ("PerformanceCarValeting" → "Performance Car Valeting"); (2) </w:t>
+      </w:r>
+      <w:r>
+        <w:rPr>
+          <w:b/>
+        </w:rPr>
+        <w:t xml:space="preserve">space out</w:t>
+      </w:r>
+      <w:r>
+        <w:t xml:space="preserve"> </w:t>
+      </w:r>
+      <w:r>
+        <w:rPr>
+          <w:rFonts w:ascii="Consolas" w:hAnsi="Consolas"/>
+          <w:color w:val="9C2D41"/>
+        </w:rPr>
+        <w:t xml:space="preserve">&amp;</w:t>
+      </w:r>
+      <w:r>
+        <w:t xml:space="preserve"> </w:t>
+      </w:r>
+      <w:r>
+        <w:rPr>
+          <w:rFonts w:ascii="Consolas" w:hAnsi="Consolas"/>
+          <w:color w:val="9C2D41"/>
+        </w:rPr>
         <w:t xml:space="preserve">/</w:t>
       </w:r>
       <w:r>
-        <w:rPr>
-          <w:rFonts w:ascii="Consolas" w:hAnsi="Consolas"/>
-          <w:color w:val="9C2D41"/>
-        </w:rPr>
-        <w:t xml:space="preserve">&amp;</w:t>
-      </w:r>
-      <w:r>
-        <w:t xml:space="preserve">/</w:t>
-      </w:r>
-      <w:r>
-        <w:rPr>
-          <w:rFonts w:ascii="Consolas" w:hAnsi="Consolas"/>
-          <w:color w:val="9C2D41"/>
-        </w:rPr>
-        <w:t xml:space="preserve">/</w:t>
-      </w:r>
-      <w:r>
-        <w:t xml:space="preserve">/</w:t>
+        <w:t xml:space="preserve"> </w:t>
       </w:r>
       <w:r>
         <w:rPr>
@@ -1496,7 +1486,44 @@
         <w:t xml:space="preserve">+</w:t>
       </w:r>
       <w:r>
-        <w:t xml:space="preserve">/"and" separators) are trimmed to their first one or two phrases, e.g. "JJG Home Car Wash, Mobile Valeting &amp; Alloy Wheel Refurbishment" → "JJG Home Car Wash &amp; Mobile Valeting". Short/normal names are left untouched. Applied to the </w:t>
+        <w:t xml:space="preserve"> "and"; (3) </w:t>
+      </w:r>
+      <w:r>
+        <w:rPr>
+          <w:b/>
+        </w:rPr>
+        <w:t xml:space="preserve">split a known trade word</w:t>
+      </w:r>
+      <w:r>
+        <w:t xml:space="preserve"> off a run-together token via </w:t>
+      </w:r>
+      <w:r>
+        <w:rPr>
+          <w:rFonts w:ascii="Consolas" w:hAnsi="Consolas"/>
+          <w:color w:val="9C2D41"/>
+        </w:rPr>
+        <w:t xml:space="preserve">SERVICE_WORDS</w:t>
+      </w:r>
+      <w:r>
+        <w:t xml:space="preserve"> ("m1plumbing" → "m1 plumbing", "ashgardens" → "ash gardens"); (4) </w:t>
+      </w:r>
+      <w:r>
+        <w:rPr>
+          <w:b/>
+        </w:rPr>
+        <w:t xml:space="preserve">Title-Case an all-lowercase name only</w:t>
+      </w:r>
+      <w:r>
+        <w:t xml:space="preserve"> (so MOT / Marks &amp; Spencer / already capitalised names are left); (5) </w:t>
+      </w:r>
+      <w:r>
+        <w:rPr>
+          <w:b/>
+        </w:rPr>
+        <w:t xml:space="preserve">trim a keyword-stuffed overlong name</w:t>
+      </w:r>
+      <w:r>
+        <w:t xml:space="preserve"> (&gt;34 chars) to its first one or two phrases. So "m1plumbing&amp;heating" → "M1 Plumbing &amp; Heating", and "JJG Home Car Wash, Mobile Valeting &amp; Alloy Wheel Refurbishment" → "JJG Home Car Wash &amp; Mobile Valeting". Applied to the </w:t>
       </w:r>
       <w:r>
         <w:rPr>
@@ -1524,7 +1551,7 @@
         <w:t xml:space="preserve">mockup image</w:t>
       </w:r>
       <w:r>
-        <w:t xml:space="preserve"> (logo initials, wordmark, headline) and the </w:t>
+        <w:t xml:space="preserve"> and the </w:t>
       </w:r>
       <w:r>
         <w:rPr>
@@ -1533,7 +1560,7 @@
         <w:t xml:space="preserve">preview page</w:t>
       </w:r>
       <w:r>
-        <w:t xml:space="preserve"> heading/CTA. NOT applied to the </w:t>
+        <w:t xml:space="preserve">. NOT applied to the </w:t>
       </w:r>
       <w:r>
         <w:rPr>
@@ -1551,7 +1578,7 @@
         <w:t xml:space="preserve">stored `name`</w:t>
       </w:r>
       <w:r>
-        <w:t xml:space="preserve"> (those stay raw so tracking + name/location matching for messaged/blocked keep working).</w:t>
+        <w:t xml:space="preserve"> (those stay raw so tracking + name/location matching keep working).</w:t>
       </w:r>
     </w:p>
     <w:p>

</xml_diff>

<commit_message>
humaniseBusinessName: split run-together names with a word dictionary
Recognise common business words (home, car, wash, dog, grooming, the trades,
etc.) and word-segment all-lowercase run-together tokens via greedy
longest-match with an optional short brand prefix. So "jjhomecarwash" ->
"JJ Home Car Wash", "mobiledoggrooming" -> "Mobile Dog Grooming". Safe:
only splits when the result is clean (every chunk a known word after the
brand), else leaves the name untouched ("specialist" stays "Specialist").
Short all-consonant brands (jj, jjg) upper-case. Server + client in sync.

Co-Authored-By: Claude Opus 4.8 <noreply@anthropic.com>
</commit_message>
<xml_diff>
--- a/DOCS.docx
+++ b/DOCS.docx
@@ -1438,7 +1438,7 @@
         <w:t xml:space="preserve">public/app.js</w:t>
       </w:r>
       <w:r>
-        <w:t xml:space="preserve">, keep in sync incl. the trade-word list), in order: (1) </w:t>
+        <w:t xml:space="preserve">, keep in sync incl. the WORDS dictionary), in order: (1) </w:t>
       </w:r>
       <w:r>
         <w:rPr>
@@ -1492,20 +1492,20 @@
         <w:rPr>
           <w:b/>
         </w:rPr>
-        <w:t xml:space="preserve">split a known trade word</w:t>
-      </w:r>
-      <w:r>
-        <w:t xml:space="preserve"> off a run-together token via </w:t>
-      </w:r>
-      <w:r>
-        <w:rPr>
-          <w:rFonts w:ascii="Consolas" w:hAnsi="Consolas"/>
-          <w:color w:val="9C2D41"/>
-        </w:rPr>
-        <w:t xml:space="preserve">SERVICE_WORDS</w:t>
-      </w:r>
-      <w:r>
-        <w:t xml:space="preserve"> ("m1plumbing" → "m1 plumbing", "ashgardens" → "ash gardens"); (4) </w:t>
+        <w:t xml:space="preserve">word-segment</w:t>
+      </w:r>
+      <w:r>
+        <w:t xml:space="preserve"> an all-lowercase run-together token against a dictionary of common business words (</w:t>
+      </w:r>
+      <w:r>
+        <w:rPr>
+          <w:rFonts w:ascii="Consolas" w:hAnsi="Consolas"/>
+          <w:color w:val="9C2D41"/>
+        </w:rPr>
+        <w:t xml:space="preserve">WORDS</w:t>
+      </w:r>
+      <w:r>
+        <w:t xml:space="preserve">, greedy longest-match with an optional short brand), e.g. "jjhomecarwash" → "JJ Home Car Wash", "m1plumbing" → "M1 Plumbing", "mobiledoggrooming" → "Mobile Dog Grooming"; (4) </w:t>
       </w:r>
       <w:r>
         <w:rPr>
@@ -1514,7 +1514,7 @@
         <w:t xml:space="preserve">Title-Case an all-lowercase name only</w:t>
       </w:r>
       <w:r>
-        <w:t xml:space="preserve"> (so MOT / Marks &amp; Spencer / already capitalised names are left); (5) </w:t>
+        <w:t xml:space="preserve"> (MOT / Marks &amp; Spencer left; a short all-consonant brand like "jj" upper-cases to "JJ"); (5) </w:t>
       </w:r>
       <w:r>
         <w:rPr>
@@ -1523,7 +1523,7 @@
         <w:t xml:space="preserve">trim a keyword-stuffed overlong name</w:t>
       </w:r>
       <w:r>
-        <w:t xml:space="preserve"> (&gt;34 chars) to its first one or two phrases. So "m1plumbing&amp;heating" → "M1 Plumbing &amp; Heating", and "JJG Home Car Wash, Mobile Valeting &amp; Alloy Wheel Refurbishment" → "JJG Home Car Wash &amp; Mobile Valeting". Applied to the </w:t>
+        <w:t xml:space="preserve"> (&gt;34 chars). Safe by design: only splits when the result is clean, else leaves the name as-is ("specialist" stays "Specialist"). So "m1plumbing&amp;heating" → "M1 Plumbing &amp; Heating", and "JJG Home Car Wash, Mobile Valeting &amp; Alloy Wheel Refurbishment" → "JJG Home Car Wash &amp; Mobile Valeting". Applied to the </w:t>
       </w:r>
       <w:r>
         <w:rPr>

</xml_diff>

<commit_message>
humaniseBusinessName: strip legal suffixes (Ltd) + fluff adjectives
You wouldn't say "Ltd" or "Independent" on a call. Drop legal suffixes
(Ltd/Limited/LLP/PLC/Co...) always, and fluff adjectives
(Independent/Professional/Certified...) only when 2+ real words remain.
So "Turner's Independent Plumbing & Heating" -> "Turner's Plumbing &
Heating", "KWS Heating & Plumbing LTD" -> "KWS Heating & Plumbing", while
"Reliable Roofing" stays. Also kills the "LTD left uppercase" issue.
Server + client in sync.

Co-Authored-By: Claude Opus 4.8 <noreply@anthropic.com>
</commit_message>
<xml_diff>
--- a/DOCS.docx
+++ b/DOCS.docx
@@ -1515,6 +1515,25 @@
       </w:r>
       <w:r>
         <w:t xml:space="preserve"> (MOT / Marks &amp; Spencer left; a short all-consonant brand like "jj" upper-cases to "JJ"); (5) </w:t>
+      </w:r>
+      <w:r>
+        <w:rPr>
+          <w:b/>
+        </w:rPr>
+        <w:t xml:space="preserve">strip filler words</w:t>
+      </w:r>
+      <w:r>
+        <w:t xml:space="preserve"> (</w:t>
+      </w:r>
+      <w:r>
+        <w:rPr>
+          <w:rFonts w:ascii="Consolas" w:hAnsi="Consolas"/>
+          <w:color w:val="9C2D41"/>
+        </w:rPr>
+        <w:t xml:space="preserve">stripFiller</w:t>
+      </w:r>
+      <w:r>
+        <w:t xml:space="preserve">): legal suffixes (Ltd/Limited/Co...) always, and fluff adjectives (Independent/Professional...) only if 2+ real words remain, e.g. "Turner's Independent Plumbing &amp; Heating" → "Turner's Plumbing &amp; Heating", "KWS Heating &amp; Plumbing LTD" → "KWS Heating &amp; Plumbing" (but "Reliable Roofing" stays); (6) </w:t>
       </w:r>
       <w:r>
         <w:rPr>

</xml_diff>

<commit_message>
Search: animated stats banner instead of a paragraph summary
Turn the deep-search summary into a hero card with big count-up numbers
(leads ready / listings combed / areas searched) and area chips, so a
powerful search lands with impact instead of getting lost in prose.

Co-Authored-By: Claude Opus 4.8 <noreply@anthropic.com>
</commit_message>
<xml_diff>
--- a/DOCS.docx
+++ b/DOCS.docx
@@ -9522,6 +9522,68 @@
     <w:p>
       <w:r>
         <w:t xml:space="preserve">Newest first. Reference sections above are the source of truth; this is a quick history.</w:t>
+      </w:r>
+    </w:p>
+    <w:p>
+      <w:r>
+        <w:rPr>
+          <w:b/>
+        </w:rPr>
+        <w:t xml:space="preserve">2026-06-12</w:t>
+      </w:r>
+    </w:p>
+    <w:p>
+      <w:pPr>
+        <w:numPr>
+          <w:ilvl w:val="0"/>
+          <w:numId w:val="1"/>
+        </w:numPr>
+      </w:pPr>
+      <w:r>
+        <w:rPr>
+          <w:b/>
+        </w:rPr>
+        <w:t xml:space="preserve">Search results banner:</w:t>
+      </w:r>
+      <w:r>
+        <w:t xml:space="preserve"> the deep-search summary is now an animated stats hero (big count-up</w:t>
+      </w:r>
+    </w:p>
+    <w:p>
+      <w:r>
+        <w:t xml:space="preserve">numbers for leads / listings combed / areas searched, + area chips) instead of one paragraph.</w:t>
+      </w:r>
+    </w:p>
+    <w:p>
+      <w:pPr>
+        <w:numPr>
+          <w:ilvl w:val="0"/>
+          <w:numId w:val="1"/>
+        </w:numPr>
+      </w:pPr>
+      <w:r>
+        <w:rPr>
+          <w:b/>
+        </w:rPr>
+        <w:t xml:space="preserve">humaniseBusinessName</w:t>
+      </w:r>
+      <w:r>
+        <w:t xml:space="preserve"> upgraded: word-dictionary split for run-together names ("jjhomecarwash"</w:t>
+      </w:r>
+    </w:p>
+    <w:p>
+      <w:r>
+        <w:t xml:space="preserve">→ "JJ Home Car Wash"), and </w:t>
+      </w:r>
+      <w:r>
+        <w:rPr>
+          <w:rFonts w:ascii="Consolas" w:hAnsi="Consolas"/>
+          <w:color w:val="9C2D41"/>
+        </w:rPr>
+        <w:t xml:space="preserve">stripFiller</w:t>
+      </w:r>
+      <w:r>
+        <w:t xml:space="preserve"> drops legal suffixes (Ltd) + fluff adjectives so names read casually. Fixed the all-lowercase case ("m1plumbing&amp;heating" → "M1 Plumbing &amp; Heating").</w:t>
       </w:r>
     </w:p>
     <w:p>

</xml_diff>

<commit_message>
WhatsApp guardrails (hard 10/day cap) + 📞 Call List for phone-first outreach
Guardrails after the WhatsApp restriction: every wa.me click passes one
capture-phase guard (plus the follow-up window.open path) with a
once-a-day risk warning and a hard daily cap (default 10, adjustable in
a new Templates "WhatsApp safety" panel with a sends-today counter).

New 📞 Call List tab: "Add to call list" is the primary action on search
cards (above Generate) and in the Lead Profile. Rows have tap-to-call,
Prowl, the unified CRM status dropdown and expandable timestamped notes
(same /api/note), filter chips with counts and a nav badge. Stored
server-side (calls/_list.json via /api/calls) so it syncs to the phone.

Co-Authored-By: Claude Opus 4.8 <noreply@anthropic.com>
</commit_message>
<xml_diff>
--- a/DOCS.docx
+++ b/DOCS.docx
@@ -578,6 +578,31 @@
               <w:rPr>
                 <w:b/>
               </w:rPr>
+              <w:t xml:space="preserve">📞 Call List</w:t>
+            </w:r>
+          </w:p>
+        </w:tc>
+        <w:tc>
+          <w:tcPr>
+            <w:tcW w:w="0" w:type="auto"/>
+          </w:tcPr>
+          <w:p>
+            <w:r>
+              <w:t xml:space="preserve">Businesses queued for a phone call (the safe first touch): tap-to-dial, Prowl, unified CRM status + timestamped notes, filter chips, badge = leads waiting for a call</w:t>
+            </w:r>
+          </w:p>
+        </w:tc>
+      </w:tr>
+      <w:tr>
+        <w:tc>
+          <w:tcPr>
+            <w:tcW w:w="0" w:type="auto"/>
+          </w:tcPr>
+          <w:p>
+            <w:r>
+              <w:rPr>
+                <w:b/>
+              </w:rPr>
               <w:t xml:space="preserve">👤 All Leads</w:t>
             </w:r>
           </w:p>
@@ -1689,6 +1714,231 @@
       </w:r>
       <w:r>
         <w:t xml:space="preserve">).</w:t>
+      </w:r>
+    </w:p>
+    <w:p>
+      <w:pPr>
+        <w:pStyle w:val="Heading3"/>
+      </w:pPr>
+      <w:r>
+        <w:t xml:space="preserve">📞 Call List &amp; WhatsApp guardrails (added after the 2026-06-12 WhatsApp restriction)</w:t>
+      </w:r>
+    </w:p>
+    <w:p>
+      <w:pPr>
+        <w:numPr>
+          <w:ilvl w:val="0"/>
+          <w:numId w:val="1"/>
+        </w:numPr>
+      </w:pPr>
+      <w:r>
+        <w:rPr>
+          <w:b/>
+        </w:rPr>
+        <w:t xml:space="preserve">⚠️ The hard lesson:</w:t>
+      </w:r>
+      <w:r>
+        <w:t xml:space="preserve"> cold WhatsApp to people who never opted in violates WhatsApp policy and</w:t>
+      </w:r>
+    </w:p>
+    <w:p>
+      <w:r>
+        <w:t xml:space="preserve">gets numbers restricted at volume, </w:t>
+      </w:r>
+      <w:r>
+        <w:rPr>
+          <w:b/>
+        </w:rPr>
+        <w:t xml:space="preserve">manual sending or not</w:t>
+      </w:r>
+      <w:r>
+        <w:t xml:space="preserve"> (it only avoids the automation signal). The user's number was restricted on 2026-06-12. WhatsApp is now positioned as a </w:t>
+      </w:r>
+      <w:r>
+        <w:rPr>
+          <w:b/>
+        </w:rPr>
+        <w:t xml:space="preserve">follow-up channel</w:t>
+      </w:r>
+      <w:r>
+        <w:t xml:space="preserve"> for people who replied/clicked; </w:t>
+      </w:r>
+      <w:r>
+        <w:rPr>
+          <w:b/>
+        </w:rPr>
+        <w:t xml:space="preserve">first touch = phone call</w:t>
+      </w:r>
+      <w:r>
+        <w:t xml:space="preserve"> (or SMS/email).</w:t>
+      </w:r>
+    </w:p>
+    <w:p>
+      <w:pPr>
+        <w:numPr>
+          <w:ilvl w:val="0"/>
+          <w:numId w:val="1"/>
+        </w:numPr>
+      </w:pPr>
+      <w:r>
+        <w:rPr>
+          <w:b/>
+        </w:rPr>
+        <w:t xml:space="preserve">WhatsApp guardrails:</w:t>
+      </w:r>
+      <w:r>
+        <w:t xml:space="preserve"> ALL wa.me clicks in the app pass one capture-phase guard</w:t>
+      </w:r>
+    </w:p>
+    <w:p>
+      <w:r>
+        <w:t xml:space="preserve">(</w:t>
+      </w:r>
+      <w:r>
+        <w:rPr>
+          <w:rFonts w:ascii="Consolas" w:hAnsi="Consolas"/>
+          <w:color w:val="9C2D41"/>
+        </w:rPr>
+        <w:t xml:space="preserve">waGuardAllow</w:t>
+      </w:r>
+      <w:r>
+        <w:t xml:space="preserve"> in app.js, plus the follow-up </w:t>
+      </w:r>
+      <w:r>
+        <w:rPr>
+          <w:rFonts w:ascii="Consolas" w:hAnsi="Consolas"/>
+          <w:color w:val="9C2D41"/>
+        </w:rPr>
+        <w:t xml:space="preserve">window.open</w:t>
+      </w:r>
+      <w:r>
+        <w:t xml:space="preserve"> path): a once-a-day risk confirm on the first send, then a </w:t>
+      </w:r>
+      <w:r>
+        <w:rPr>
+          <w:b/>
+        </w:rPr>
+        <w:t xml:space="preserve">hard daily cap</w:t>
+      </w:r>
+      <w:r>
+        <w:t xml:space="preserve"> (default </w:t>
+      </w:r>
+      <w:r>
+        <w:rPr>
+          <w:b/>
+        </w:rPr>
+        <w:t xml:space="preserve">10</w:t>
+      </w:r>
+      <w:r>
+        <w:t xml:space="preserve">, per device, resets at midnight, counter </w:t>
+      </w:r>
+      <w:r>
+        <w:rPr>
+          <w:rFonts w:ascii="Consolas" w:hAnsi="Consolas"/>
+          <w:color w:val="9C2D41"/>
+        </w:rPr>
+        <w:t xml:space="preserve">aiwp_wa_log</w:t>
+      </w:r>
+      <w:r>
+        <w:t xml:space="preserve">). Cap is adjustable in </w:t>
+      </w:r>
+      <w:r>
+        <w:rPr>
+          <w:b/>
+        </w:rPr>
+        <w:t xml:space="preserve">Templates → ⚠️ WhatsApp safety</w:t>
+      </w:r>
+      <w:r>
+        <w:t xml:space="preserve"> (warns above 10), which also shows "Sends today: X of Y" and the policy explanation.</w:t>
+      </w:r>
+    </w:p>
+    <w:p>
+      <w:pPr>
+        <w:numPr>
+          <w:ilvl w:val="0"/>
+          <w:numId w:val="1"/>
+        </w:numPr>
+      </w:pPr>
+      <w:r>
+        <w:rPr>
+          <w:b/>
+        </w:rPr>
+        <w:t xml:space="preserve">📞 Call List:</w:t>
+      </w:r>
+      <w:r>
+        <w:t xml:space="preserve"> "📞 Add to call list" is the </w:t>
+      </w:r>
+      <w:r>
+        <w:rPr>
+          <w:b/>
+        </w:rPr>
+        <w:t xml:space="preserve">primary</w:t>
+      </w:r>
+      <w:r>
+        <w:t xml:space="preserve"> button on search-result cards (above</w:t>
+      </w:r>
+    </w:p>
+    <w:p>
+      <w:r>
+        <w:t xml:space="preserve">Generate mockup) + in the Lead Profile. The Call List tab shows rows with tap-to-call phone (</w:t>
+      </w:r>
+      <w:r>
+        <w:rPr>
+          <w:rFonts w:ascii="Consolas" w:hAnsi="Consolas"/>
+          <w:color w:val="9C2D41"/>
+        </w:rPr>
+        <w:t xml:space="preserve">tel:</w:t>
+      </w:r>
+      <w:r>
+        <w:t xml:space="preserve">), 🐾 Prowl per row, a </w:t>
+      </w:r>
+      <w:r>
+        <w:rPr>
+          <w:b/>
+        </w:rPr>
+        <w:t xml:space="preserve">status dropdown</w:t>
+      </w:r>
+      <w:r>
+        <w:t xml:space="preserve"> (the same unified CRM statuses, change here = changes everywhere), </w:t>
+      </w:r>
+      <w:r>
+        <w:rPr>
+          <w:b/>
+        </w:rPr>
+        <w:t xml:space="preserve">expandable timestamped notes</w:t>
+      </w:r>
+      <w:r>
+        <w:t xml:space="preserve"> (same </w:t>
+      </w:r>
+      <w:r>
+        <w:rPr>
+          <w:rFonts w:ascii="Consolas" w:hAnsi="Consolas"/>
+          <w:color w:val="9C2D41"/>
+        </w:rPr>
+        <w:t xml:space="preserve">/api/note</w:t>
+      </w:r>
+      <w:r>
+        <w:t xml:space="preserve"> CRM), filter chips (To call / Call back / Contacted / Interested / Not interested / All, with counts) and a nav badge counting leads still waiting for a call. Stored server-side (</w:t>
+      </w:r>
+      <w:r>
+        <w:rPr>
+          <w:rFonts w:ascii="Consolas" w:hAnsi="Consolas"/>
+          <w:color w:val="9C2D41"/>
+        </w:rPr>
+        <w:t xml:space="preserve">calls/_list.json</w:t>
+      </w:r>
+      <w:r>
+        <w:t xml:space="preserve">) so the list built on desktop is on the phone when out calling. Status/notes key = the lead's mockup slug when one exists, else a </w:t>
+      </w:r>
+      <w:r>
+        <w:rPr>
+          <w:rFonts w:ascii="Consolas" w:hAnsi="Consolas"/>
+          <w:color w:val="9C2D41"/>
+        </w:rPr>
+        <w:t xml:space="preserve">name-location</w:t>
+      </w:r>
+      <w:r>
+        <w:t xml:space="preserve"> slug (note: if a mockup is generated later the two keys can diverge; edge case, accepted).</w:t>
       </w:r>
     </w:p>
     <w:p>
@@ -5309,6 +5559,68 @@
           </w:tcPr>
           <w:p>
             <w:r>
+              <w:t xml:space="preserve">`GET\</w:t>
+            </w:r>
+          </w:p>
+        </w:tc>
+        <w:tc>
+          <w:tcPr>
+            <w:tcW w:w="0" w:type="auto"/>
+          </w:tcPr>
+          <w:p>
+            <w:r>
+              <w:t xml:space="preserve">POST /api/calls`</w:t>
+            </w:r>
+          </w:p>
+        </w:tc>
+        <w:tc>
+          <w:tcPr>
+            <w:tcW w:w="0" w:type="auto"/>
+          </w:tcPr>
+          <w:p>
+            <w:r>
+              <w:t xml:space="preserve">✅</w:t>
+            </w:r>
+          </w:p>
+        </w:tc>
+        <w:tc>
+          <w:tcPr>
+            <w:tcW w:w="0" w:type="auto"/>
+          </w:tcPr>
+          <w:p>
+            <w:r>
+              <w:t xml:space="preserve">Call List: list / add / remove queued businesses (</w:t>
+            </w:r>
+            <w:r>
+              <w:rPr>
+                <w:rFonts w:ascii="Consolas" w:hAnsi="Consolas"/>
+                <w:color w:val="9C2D41"/>
+              </w:rPr>
+              <w:t xml:space="preserve">calls/_list.json</w:t>
+            </w:r>
+            <w:r>
+              <w:t xml:space="preserve">). Status + notes reuse </w:t>
+            </w:r>
+            <w:r>
+              <w:rPr>
+                <w:rFonts w:ascii="Consolas" w:hAnsi="Consolas"/>
+                <w:color w:val="9C2D41"/>
+              </w:rPr>
+              <w:t xml:space="preserve">/api/note</w:t>
+            </w:r>
+            <w:r>
+              <w:t xml:space="preserve"> keyed by the same key.</w:t>
+            </w:r>
+          </w:p>
+        </w:tc>
+      </w:tr>
+      <w:tr>
+        <w:tc>
+          <w:tcPr>
+            <w:tcW w:w="0" w:type="auto"/>
+          </w:tcPr>
+          <w:p>
+            <w:r>
               <w:rPr>
                 <w:rFonts w:ascii="Consolas" w:hAnsi="Consolas"/>
                 <w:color w:val="9C2D41"/>
@@ -6009,6 +6321,34 @@
       </w:r>
       <w:r>
         <w:t xml:space="preserve"> may be an auto-expanded nearby town).</w:t>
+      </w:r>
+    </w:p>
+    <w:p>
+      <w:pPr>
+        <w:numPr>
+          <w:ilvl w:val="0"/>
+          <w:numId w:val="1"/>
+        </w:numPr>
+      </w:pPr>
+      <w:r>
+        <w:rPr>
+          <w:rFonts w:ascii="Consolas" w:hAnsi="Consolas"/>
+          <w:color w:val="9C2D41"/>
+        </w:rPr>
+        <w:t xml:space="preserve">calls/_list.json</w:t>
+      </w:r>
+      <w:r>
+        <w:t xml:space="preserve">, the 📞 Call List: map key → </w:t>
+      </w:r>
+      <w:r>
+        <w:rPr>
+          <w:rFonts w:ascii="Consolas" w:hAnsi="Consolas"/>
+          <w:color w:val="9C2D41"/>
+        </w:rPr>
+        <w:t xml:space="preserve">{ key, name, location, category, phone, placeId, slug, mapsUrl, addedAt }</w:t>
+      </w:r>
+      <w:r>
+        <w:t xml:space="preserve"> (status/notes live in the CRM under the same key).</w:t>
       </w:r>
     </w:p>
     <w:p>
@@ -9530,6 +9870,78 @@
           <w:b/>
         </w:rPr>
         <w:t xml:space="preserve">2026-06-12</w:t>
+      </w:r>
+    </w:p>
+    <w:p>
+      <w:pPr>
+        <w:numPr>
+          <w:ilvl w:val="0"/>
+          <w:numId w:val="1"/>
+        </w:numPr>
+      </w:pPr>
+      <w:r>
+        <w:rPr>
+          <w:b/>
+        </w:rPr>
+        <w:t xml:space="preserve">⚠️ WhatsApp restriction + response:</w:t>
+      </w:r>
+      <w:r>
+        <w:t xml:space="preserve"> the user's WhatsApp number was restricted for cold-send</w:t>
+      </w:r>
+    </w:p>
+    <w:p>
+      <w:r>
+        <w:t xml:space="preserve">volume. Built guardrails: a capture-phase guard on every wa.me click, once-a-day risk warning, </w:t>
+      </w:r>
+      <w:r>
+        <w:rPr>
+          <w:b/>
+        </w:rPr>
+        <w:t xml:space="preserve">hard daily cap (default 10)</w:t>
+      </w:r>
+      <w:r>
+        <w:t xml:space="preserve"> with a counter, a ⚠️ WhatsApp safety panel in Templates, and the strategy shift to </w:t>
+      </w:r>
+      <w:r>
+        <w:rPr>
+          <w:b/>
+        </w:rPr>
+        <w:t xml:space="preserve">phone-first</w:t>
+      </w:r>
+      <w:r>
+        <w:t xml:space="preserve"> outreach.</w:t>
+      </w:r>
+    </w:p>
+    <w:p>
+      <w:pPr>
+        <w:numPr>
+          <w:ilvl w:val="0"/>
+          <w:numId w:val="1"/>
+        </w:numPr>
+      </w:pPr>
+      <w:r>
+        <w:rPr>
+          <w:b/>
+        </w:rPr>
+        <w:t xml:space="preserve">📞 Call List (new tab):</w:t>
+      </w:r>
+      <w:r>
+        <w:t xml:space="preserve"> queue businesses for a call (primary button on search cards + Lead</w:t>
+      </w:r>
+    </w:p>
+    <w:p>
+      <w:r>
+        <w:t xml:space="preserve">Profile), tap-to-dial rows with Prowl, unified CRM status dropdown + timestamped notes, filter chips with counts, nav badge, stored server-side so it syncs to the phone. </w:t>
+      </w:r>
+      <w:r>
+        <w:rPr>
+          <w:rFonts w:ascii="Consolas" w:hAnsi="Consolas"/>
+          <w:color w:val="9C2D41"/>
+        </w:rPr>
+        <w:t xml:space="preserve">GET|POST /api/calls</w:t>
+      </w:r>
+      <w:r>
+        <w:t xml:space="preserve">.</w:t>
       </w:r>
     </w:p>
     <w:p>

</xml_diff>

<commit_message>
Docs: Call List Prowl states + in-dossier notes
Co-Authored-By: Claude Opus 4.8 <noreply@anthropic.com>
</commit_message>
<xml_diff>
--- a/DOCS.docx
+++ b/DOCS.docx
@@ -1918,7 +1918,16 @@
         <w:t xml:space="preserve">/api/note</w:t>
       </w:r>
       <w:r>
-        <w:t xml:space="preserve"> CRM), filter chips (To call / Call back / Contacted / Interested / Not interested / All, with counts) and a nav badge counting leads still waiting for a call. Stored server-side (</w:t>
+        <w:t xml:space="preserve"> CRM), filter chips (To call / Call back / Contacted / Interested / Not interested / All, with counts) and a nav badge counting leads still waiting for a call. The row's Prowl button shows its state: "🐾 Prowl" before gathering, a green "🐾 View intel ✓" once the dossier exists (list refreshes when the popup closes). The </w:t>
+      </w:r>
+      <w:r>
+        <w:rPr>
+          <w:b/>
+        </w:rPr>
+        <w:t xml:space="preserve">Prowl popup itself has a "📝 Status &amp; call notes" block</w:t>
+      </w:r>
+      <w:r>
+        <w:t xml:space="preserve"> (same unified CRM) so you can read the intel and take date/time-stamped notes mid-call. Stored server-side (</w:t>
       </w:r>
       <w:r>
         <w:rPr>

</xml_diff>

<commit_message>
Search results survive page reloads (free local restore)
Results only lived in memory, so a refresh/phone tab reclaim wiped them
and re-searching the same criteria burned a credit. Each search (incl.
load-more) is now cached in localStorage and restored on load for up to
48h, with an amber "Restored your last search... no credit used" banner
and a "Search again" button that re-runs the exact criteria + filters.
Restored stats banner shows final numbers without replaying the count-up.

Co-Authored-By: Claude Opus 4.8 <noreply@anthropic.com>
</commit_message>
<xml_diff>
--- a/DOCS.docx
+++ b/DOCS.docx
@@ -990,6 +990,57 @@
         </w:numPr>
       </w:pPr>
       <w:r>
+        <w:rPr>
+          <w:b/>
+        </w:rPr>
+        <w:t xml:space="preserve">Results survive a reload (free restore):</w:t>
+      </w:r>
+      <w:r>
+        <w:t xml:space="preserve"> each search is cached locally</w:t>
+      </w:r>
+    </w:p>
+    <w:p>
+      <w:r>
+        <w:t xml:space="preserve">(</w:t>
+      </w:r>
+      <w:r>
+        <w:rPr>
+          <w:rFonts w:ascii="Consolas" w:hAnsi="Consolas"/>
+          <w:color w:val="9C2D41"/>
+        </w:rPr>
+        <w:t xml:space="preserve">aiwp_last_results</w:t>
+      </w:r>
+      <w:r>
+        <w:t xml:space="preserve">: criteria + results + the stats banner + load-more state) and restored on page load for up to </w:t>
+      </w:r>
+      <w:r>
+        <w:rPr>
+          <w:b/>
+        </w:rPr>
+        <w:t xml:space="preserve">48h</w:t>
+      </w:r>
+      <w:r>
+        <w:t xml:space="preserve">, with an amber banner ("Restored your last search… no credit used") and a "↻ Search again" button that re-runs the exact criteria incl. filters (</w:t>
+      </w:r>
+      <w:r>
+        <w:rPr>
+          <w:rFonts w:ascii="Consolas" w:hAnsi="Consolas"/>
+          <w:color w:val="9C2D41"/>
+        </w:rPr>
+        <w:t xml:space="preserve">runRecentSearch</w:t>
+      </w:r>
+      <w:r>
+        <w:t xml:space="preserve">). Messaged/blocked/mockup chips recompute at render, so they stay current even on restored results. Older than 48h = not restored (nudges a fresh search).</w:t>
+      </w:r>
+    </w:p>
+    <w:p>
+      <w:pPr>
+        <w:numPr>
+          <w:ilvl w:val="0"/>
+          <w:numId w:val="1"/>
+        </w:numPr>
+      </w:pPr>
+      <w:r>
         <w:t xml:space="preserve">A </w:t>
       </w:r>
       <w:r>
@@ -9879,6 +9930,50 @@
           <w:b/>
         </w:rPr>
         <w:t xml:space="preserve">2026-06-12</w:t>
+      </w:r>
+    </w:p>
+    <w:p>
+      <w:pPr>
+        <w:numPr>
+          <w:ilvl w:val="0"/>
+          <w:numId w:val="1"/>
+        </w:numPr>
+      </w:pPr>
+      <w:r>
+        <w:rPr>
+          <w:b/>
+        </w:rPr>
+        <w:t xml:space="preserve">Search results survive reloads:</w:t>
+      </w:r>
+      <w:r>
+        <w:t xml:space="preserve"> cached locally + auto-restored for 48h with a banner and a</w:t>
+      </w:r>
+    </w:p>
+    <w:p>
+      <w:r>
+        <w:t xml:space="preserve">"Search again" re-run, so a refresh no longer wipes results or burns a credit.</w:t>
+      </w:r>
+    </w:p>
+    <w:p>
+      <w:pPr>
+        <w:numPr>
+          <w:ilvl w:val="0"/>
+          <w:numId w:val="1"/>
+        </w:numPr>
+      </w:pPr>
+      <w:r>
+        <w:rPr>
+          <w:b/>
+        </w:rPr>
+        <w:t xml:space="preserve">Call List polish:</w:t>
+      </w:r>
+      <w:r>
+        <w:t xml:space="preserve"> Prowl button states ("🐾 Prowl" → green "🐾 View intel ✓" + a "Prowled</w:t>
+      </w:r>
+    </w:p>
+    <w:p>
+      <w:r>
+        <w:t xml:space="preserve">12 Jun 2026" date stamp), and a "📝 Status &amp; call notes" block inside the Prowl popup.</w:t>
       </w:r>
     </w:p>
     <w:p>

</xml_diff>

<commit_message>
Docs: call-list write race fix in changelog
Co-Authored-By: Claude Opus 4.8 <noreply@anthropic.com>
</commit_message>
<xml_diff>
--- a/DOCS.docx
+++ b/DOCS.docx
@@ -9930,6 +9930,28 @@
           <w:b/>
         </w:rPr>
         <w:t xml:space="preserve">2026-06-12</w:t>
+      </w:r>
+    </w:p>
+    <w:p>
+      <w:pPr>
+        <w:numPr>
+          <w:ilvl w:val="0"/>
+          <w:numId w:val="1"/>
+        </w:numPr>
+      </w:pPr>
+      <w:r>
+        <w:rPr>
+          <w:b/>
+        </w:rPr>
+        <w:t xml:space="preserve">Fix: call-list adds raced each other.</w:t>
+      </w:r>
+      <w:r>
+        <w:t xml:space="preserve"> /api/calls is read-modify-write on one blob, so rapid</w:t>
+      </w:r>
+    </w:p>
+    <w:p>
+      <w:r>
+        <w:t xml:space="preserve">adds overwrote each other (6 ticked, 4 saved). All call-list writes are now serialized through a client promise chain, membership is verified against server entries by name+location, and search results re-render after the list loads so stale ticks self-correct. (Blob has no transactions, same pattern applies to any shared-json writer.)</w:t>
       </w:r>
     </w:p>
     <w:p>

</xml_diff>

<commit_message>
Docs: one-click call-list add fix
Co-Authored-By: Claude Opus 4.8 <noreply@anthropic.com>
</commit_message>
<xml_diff>
--- a/DOCS.docx
+++ b/DOCS.docx
@@ -9930,6 +9930,38 @@
           <w:b/>
         </w:rPr>
         <w:t xml:space="preserve">2026-06-12</w:t>
+      </w:r>
+    </w:p>
+    <w:p>
+      <w:pPr>
+        <w:numPr>
+          <w:ilvl w:val="0"/>
+          <w:numId w:val="1"/>
+        </w:numPr>
+      </w:pPr>
+      <w:r>
+        <w:rPr>
+          <w:b/>
+        </w:rPr>
+        <w:t xml:space="preserve">Fix: one click adds to the call list.</w:t>
+      </w:r>
+      <w:r>
+        <w:t xml:space="preserve"> Blob reads can lag a put by a moment, so the post-add</w:t>
+      </w:r>
+    </w:p>
+    <w:p>
+      <w:r>
+        <w:t xml:space="preserve">refresh sometimes got a stale list and flipped the just-added ✓ back to the button (looked like the click failed, invited 2-3 clicks). A session-local optimistic set (</w:t>
+      </w:r>
+      <w:r>
+        <w:rPr>
+          <w:rFonts w:ascii="Consolas" w:hAnsi="Consolas"/>
+          <w:color w:val="9C2D41"/>
+        </w:rPr>
+        <w:t xml:space="preserve">callOptimistic</w:t>
+      </w:r>
+      <w:r>
+        <w:t xml:space="preserve">) now keeps a just-added business ticked regardless of read lag.</w:t>
       </w:r>
     </w:p>
     <w:p>

</xml_diff>

<commit_message>
Docs: park multi-user SaaS + 3 membership tiers plan (roadmap item 5)
Co-Authored-By: Claude Opus 4.8 <noreply@anthropic.com>
</commit_message>
<xml_diff>
--- a/DOCS.docx
+++ b/DOCS.docx
@@ -8518,6 +8518,73 @@
     <w:p>
       <w:r>
         <w:t xml:space="preserve">first, verify before send). Full spec below.</w:t>
+      </w:r>
+    </w:p>
+    <w:p>
+      <w:pPr>
+        <w:numPr>
+          <w:ilvl w:val="0"/>
+          <w:numId w:val="1"/>
+        </w:numPr>
+      </w:pPr>
+      <w:r>
+        <w:rPr>
+          <w:b/>
+        </w:rPr>
+        <w:t xml:space="preserve">Multi-user SaaS with membership tiers (planned 2026-06-12, future):</w:t>
+      </w:r>
+      <w:r>
+        <w:t xml:space="preserve"> admin adds users, 3</w:t>
+      </w:r>
+    </w:p>
+    <w:p>
+      <w:r>
+        <w:t xml:space="preserve">tiers gate features/limits. Build order: (1) real accounts + roles (users table in Postgres, hashed passwords, sessions, an Admin area: invite user, set tier, suspend, usage view); (2) </w:t>
+      </w:r>
+      <w:r>
+        <w:rPr>
+          <w:b/>
+        </w:rPr>
+        <w:t xml:space="preserve">data separation per user</w:t>
+      </w:r>
+      <w:r>
+        <w:t xml:space="preserve"> (owner on every mockup/site/dossier/note/call entry, per-user blob prefixes, user_id on link_events; move shared indexes to Postgres, also kills the blob races); (3) tier enforcement (per-user tier-driven rate limits + "Upgrade to unlock" UI); (4) Stripe subscriptions ↔ tiers via webhook (launch can set tiers manually in admin). Suggested tiers: </w:t>
+      </w:r>
+      <w:r>
+        <w:rPr>
+          <w:b/>
+        </w:rPr>
+        <w:t xml:space="preserve">🐾 Scout</w:t>
+      </w:r>
+      <w:r>
+        <w:t xml:space="preserve"> (~£29/mo: 5 searches/day, 15 mockups/mo, Call List + CRM, basic dashboard, no Prowl/Pounce), </w:t>
+      </w:r>
+      <w:r>
+        <w:rPr>
+          <w:b/>
+        </w:rPr>
+        <w:t xml:space="preserve">🐆 Hunter</w:t>
+      </w:r>
+      <w:r>
+        <w:t xml:space="preserve"> (~£79/mo: 30/day, 60 mockups/mo, Prowl 30/mo, Pounce 10/mo, 1 live site, full dashboard), </w:t>
+      </w:r>
+      <w:r>
+        <w:rPr>
+          <w:b/>
+        </w:rPr>
+        <w:t xml:space="preserve">🦁 Apex</w:t>
+      </w:r>
+      <w:r>
+        <w:t xml:space="preserve"> (~£149-199/mo: fair-use unlimited searches/Prowl, 200 mockups/mo, 50 Pounce, 25 live sites, custom domains, </w:t>
+      </w:r>
+      <w:r>
+        <w:rPr>
+          <w:b/>
+        </w:rPr>
+        <w:t xml:space="preserve">white-label branding</w:t>
+      </w:r>
+      <w:r>
+        <w:t xml:space="preserve">, 3 team logins). WhatsApp guardrails always on for every tier. ⚠️ White-label makes the agency brand (AGENCY_NAME, LINK_DOMAIN, "Designed by" signature) per-account settings, avoid hard-wiring the brand deeper meanwhile. The biggest single build so far (~everything-Pounce-sized).</w:t>
       </w:r>
     </w:p>
     <w:p>

</xml_diff>

<commit_message>
Docs: founding-member pricing structure (first 20, locked for life) + admin area spec
Co-Authored-By: Claude Opus 4.8 <noreply@anthropic.com>
</commit_message>
<xml_diff>
--- a/DOCS.docx
+++ b/DOCS.docx
@@ -8548,7 +8548,80 @@
         <w:t xml:space="preserve">data separation per user</w:t>
       </w:r>
       <w:r>
-        <w:t xml:space="preserve"> (owner on every mockup/site/dossier/note/call entry, per-user blob prefixes, user_id on link_events; move shared indexes to Postgres, also kills the blob races); (3) tier enforcement (per-user tier-driven rate limits + "Upgrade to unlock" UI); (4) Stripe subscriptions ↔ tiers via webhook (launch can set tiers manually in admin). Suggested tiers (PRICING UNDER REVIEW 2026-06-12: user + Claude agree £29 entry is too cheap; revised thinking = Scout £49-59 or replace with a 14-day trial / one-off starter pack, Hunter ~£99, Apex ~£199-249; founding-member discount-for-life covers the early-proof gap): </w:t>
+        <w:t xml:space="preserve"> (owner on every mockup/site/dossier/note/call entry, per-user blob prefixes, user_id on link_events; move shared indexes to Postgres, also kills the blob races); (3) tier enforcement (per-user tier-driven rate limits + "Upgrade to unlock" UI); (4) Stripe subscriptions ↔ tiers via webhook (launch can set tiers manually in admin). </w:t>
+      </w:r>
+      <w:r>
+        <w:rPr>
+          <w:b/>
+        </w:rPr>
+        <w:t xml:space="preserve">Pricing model (decided direction 2026-06-12): founding-member structure.</w:t>
+      </w:r>
+      <w:r>
+        <w:t xml:space="preserve"> Standard list prices: Scout £49-59 / Hunter £99 / Apex £199-249. The </w:t>
+      </w:r>
+      <w:r>
+        <w:rPr>
+          <w:b/>
+        </w:rPr>
+        <w:t xml:space="preserve">first 20 founding members</w:t>
+      </w:r>
+      <w:r>
+        <w:t xml:space="preserve"> get ~40% off </w:t>
+      </w:r>
+      <w:r>
+        <w:rPr>
+          <w:b/>
+        </w:rPr>
+        <w:t xml:space="preserve">locked for life</w:t>
+      </w:r>
+      <w:r>
+        <w:t xml:space="preserve">: Scout £29 / Hunter £59 / Apex £119. Rules: (a) the exchange is explicit, founding members agree to be case studies/testimonials (in the founding terms); (b) "for life" = for the life of a CONTINUOUS subscription (cancel + return = standard rates); (c) the PRICE is locked, not the future feature set (later add-ons can be chargeable); (d) the founding discount follows the MEMBER across tiers (upgrades stay at founding rates). Number them publicly ("Founding member #7 of 20") + a remaining counter on the landing page (the </w:t>
+      </w:r>
+      <w:r>
+        <w:rPr>
+          <w:rFonts w:ascii="Consolas" w:hAnsi="Consolas"/>
+          <w:color w:val="9C2D41"/>
+        </w:rPr>
+        <w:t xml:space="preserve">/api/apply</w:t>
+      </w:r>
+      <w:r>
+        <w:t xml:space="preserve"> funnel already exists). </w:t>
+      </w:r>
+      <w:r>
+        <w:rPr>
+          <w:b/>
+        </w:rPr>
+        <w:t xml:space="preserve">Admin area requirements (user spec 2026-06-12):</w:t>
+      </w:r>
+      <w:r>
+        <w:t xml:space="preserve"> Admin → Members table, one row per customer: account (name/email, tier + founding # + locked price, signup, last active, trial/active/suspended, MRR), </w:t>
+      </w:r>
+      <w:r>
+        <w:rPr>
+          <w:b/>
+        </w:rPr>
+        <w:t xml:space="preserve">usage vs caps</w:t>
+      </w:r>
+      <w:r>
+        <w:t xml:space="preserve"> (searches/mockups/Prowls/Pounces/live sites/WhatsApp sends against tier limits), </w:t>
+      </w:r>
+      <w:r>
+        <w:rPr>
+          <w:b/>
+        </w:rPr>
+        <w:t xml:space="preserve">their funnel</w:t>
+      </w:r>
+      <w:r>
+        <w:t xml:space="preserve"> (messaged → viewed → demo → sign-ups), </w:t>
+      </w:r>
+      <w:r>
+        <w:rPr>
+          <w:b/>
+        </w:rPr>
+        <w:t xml:space="preserve">outcomes</w:t>
+      </w:r>
+      <w:r>
+        <w:t xml:space="preserve"> (aggregated CRM statuses, esp. clients WON → case-study candidates; lost/interested), alerts (inactive 14d = churn risk, at 100% caps = upsell, WhatsApp-risky behaviour), platform totals (active members, MRR, mockups, est. API spend per member). ⚠️ GDPR: admin visibility of customers' lead/CRM data must be stated in ToS/privacy policy. Suggested tiers: </w:t>
       </w:r>
       <w:r>
         <w:rPr>

</xml_diff>

<commit_message>
Call List: CSV export (a call sheet incl. latest note per lead)
Exports the visible rows (active filter chip + search box) with
business, location, category, phone, status, added date, prowled +
date, notes count, latest note (fetched from the CRM at export time)
and the Maps link. Shared filteredCalls() now drives both the table
and the export.

Co-Authored-By: Claude Opus 4.8 <noreply@anthropic.com>
</commit_message>
<xml_diff>
--- a/DOCS.docx
+++ b/DOCS.docx
@@ -1978,7 +1978,16 @@
         <w:t xml:space="preserve">Prowl popup itself has a "📝 Status &amp; call notes" block</w:t>
       </w:r>
       <w:r>
-        <w:t xml:space="preserve"> (same unified CRM) so you can read the intel and take date/time-stamped notes mid-call. Stored server-side (</w:t>
+        <w:t xml:space="preserve"> (same unified CRM) so you can read the intel and take date/time-stamped notes mid-call. </w:t>
+      </w:r>
+      <w:r>
+        <w:rPr>
+          <w:b/>
+        </w:rPr>
+        <w:t xml:space="preserve">⬇ Export CSV</w:t>
+      </w:r>
+      <w:r>
+        <w:t xml:space="preserve"> exports the visible rows (active filter + search) as a call sheet: business/location/category/phone/status/ added/prowled (+date)/notes count/latest note/Maps link (notes fetched from the CRM at export time). Stored server-side (</w:t>
       </w:r>
       <w:r>
         <w:rPr>

</xml_diff>

<commit_message>
Docs: Prowl call-screen redesign (strengths/weaknesses/objections, review bars)
Co-Authored-By: Claude Opus 4.8 <noreply@anthropic.com>
</commit_message>
<xml_diff>
--- a/DOCS.docx
+++ b/DOCS.docx
@@ -2505,12 +2505,43 @@
       </w:r>
       <w:r>
         <w:rPr>
-          <w:b/>
-        </w:rPr>
-        <w:t xml:space="preserve">🎯 ammunition</w:t>
-      </w:r>
-      <w:r>
-        <w:t xml:space="preserve"> (specific lines to say), suggested opener + </w:t>
+          <w:rFonts w:ascii="Consolas" w:hAnsi="Consolas"/>
+          <w:color w:val="9C2D41"/>
+        </w:rPr>
+        <w:t xml:space="preserve">strengths</w:t>
+      </w:r>
+      <w:r>
+        <w:t xml:space="preserve">, severity-tagged </w:t>
+      </w:r>
+      <w:r>
+        <w:rPr>
+          <w:rFonts w:ascii="Consolas" w:hAnsi="Consolas"/>
+          <w:color w:val="9C2D41"/>
+        </w:rPr>
+        <w:t xml:space="preserve">weaknesses</w:t>
+      </w:r>
+      <w:r>
+        <w:t xml:space="preserve">, </w:t>
+      </w:r>
+      <w:r>
+        <w:rPr>
+          <w:rFonts w:ascii="Consolas" w:hAnsi="Consolas"/>
+          <w:color w:val="9C2D41"/>
+        </w:rPr>
+        <w:t xml:space="preserve">ammunition</w:t>
+      </w:r>
+      <w:r>
+        <w:t xml:space="preserve"> (talking points), </w:t>
+      </w:r>
+      <w:r>
+        <w:rPr>
+          <w:rFonts w:ascii="Consolas" w:hAnsi="Consolas"/>
+          <w:color w:val="9C2D41"/>
+        </w:rPr>
+        <w:t xml:space="preserve">objections</w:t>
+      </w:r>
+      <w:r>
+        <w:t xml:space="preserve"> (brush-off + rebuttal), opener + </w:t>
       </w:r>
       <w:r>
         <w:rPr>
@@ -2530,12 +2561,82 @@
         </w:numPr>
       </w:pPr>
       <w:r>
-        <w:t xml:space="preserve">Output: competitor comparison table (you vs rivals: website / reviews / score), what-they-do</w:t>
-      </w:r>
-    </w:p>
-    <w:p>
-      <w:r>
-        <w:t xml:space="preserve">chips, ammunition, opener. </w:t>
+        <w:rPr>
+          <w:b/>
+        </w:rPr>
+        <w:t xml:space="preserve">The dossier popup is a live "call screen"</w:t>
+      </w:r>
+      <w:r>
+        <w:t xml:space="preserve"> (</w:t>
+      </w:r>
+      <w:r>
+        <w:rPr>
+          <w:rFonts w:ascii="Consolas" w:hAnsi="Consolas"/>
+          <w:color w:val="9C2D41"/>
+        </w:rPr>
+        <w:t xml:space="preserve">renderDossier</w:t>
+      </w:r>
+      <w:r>
+        <w:t xml:space="preserve">), in this order: contact +</w:t>
+      </w:r>
+    </w:p>
+    <w:p>
+      <w:r>
+        <w:t xml:space="preserve">call/WhatsApp/Maps → Google rep → </w:t>
+      </w:r>
+      <w:r>
+        <w:rPr>
+          <w:b/>
+        </w:rPr>
+        <w:t xml:space="preserve">☎️ Open with this</w:t>
+      </w:r>
+      <w:r>
+        <w:t xml:space="preserve"> → </w:t>
+      </w:r>
+      <w:r>
+        <w:rPr>
+          <w:b/>
+        </w:rPr>
+        <w:t xml:space="preserve">✅ Acknowledge first</w:t>
+      </w:r>
+      <w:r>
+        <w:t xml:space="preserve"> (strengths) → </w:t>
+      </w:r>
+      <w:r>
+        <w:rPr>
+          <w:b/>
+        </w:rPr>
+        <w:t xml:space="preserve">🎯 Where they're losing out</w:t>
+      </w:r>
+      <w:r>
+        <w:t xml:space="preserve"> (colour-coded red/amber weak spots) → </w:t>
+      </w:r>
+      <w:r>
+        <w:rPr>
+          <w:b/>
+        </w:rPr>
+        <w:t xml:space="preserve">💬 Personalised What to say</w:t>
+      </w:r>
+      <w:r>
+        <w:t xml:space="preserve"> (talking points) → </w:t>
+      </w:r>
+      <w:r>
+        <w:rPr>
+          <w:b/>
+        </w:rPr>
+        <w:t xml:space="preserve">🛡️ If they push back</w:t>
+      </w:r>
+      <w:r>
+        <w:t xml:space="preserve"> (objection rebuttals) → competitor table (website / </w:t>
+      </w:r>
+      <w:r>
+        <w:rPr>
+          <w:b/>
+        </w:rPr>
+        <w:t xml:space="preserve">review-gap bar</w:t>
+      </w:r>
+      <w:r>
+        <w:t xml:space="preserve"> / score, + a "they rank #N of M" line) → what-they-do chips → Companies House → 📝 Status &amp; call notes. </w:t>
       </w:r>
       <w:r>
         <w:rPr>
@@ -2554,7 +2655,7 @@
         <w:t xml:space="preserve">dossiers/&lt;slug&gt;.json</w:t>
       </w:r>
       <w:r>
-        <w:t xml:space="preserve"> (↩ Re-run to refresh).</w:t>
+        <w:t xml:space="preserve"> (↩ Re-run to refresh; old dossiers lack strengths/weaknesses/objections until re-run).</w:t>
       </w:r>
     </w:p>
     <w:p>
@@ -10071,6 +10172,110 @@
     <w:p>
       <w:r>
         <w:t xml:space="preserve">Newest first. Reference sections above are the source of truth; this is a quick history.</w:t>
+      </w:r>
+    </w:p>
+    <w:p>
+      <w:r>
+        <w:rPr>
+          <w:b/>
+        </w:rPr>
+        <w:t xml:space="preserve">2026-06-13</w:t>
+      </w:r>
+    </w:p>
+    <w:p>
+      <w:pPr>
+        <w:numPr>
+          <w:ilvl w:val="0"/>
+          <w:numId w:val="1"/>
+        </w:numPr>
+      </w:pPr>
+      <w:r>
+        <w:rPr>
+          <w:b/>
+        </w:rPr>
+        <w:t xml:space="preserve">🐾 Prowl is now a "call screen":</w:t>
+      </w:r>
+      <w:r>
+        <w:t xml:space="preserve"> the AI synthesis also returns </w:t>
+      </w:r>
+      <w:r>
+        <w:rPr>
+          <w:rFonts w:ascii="Consolas" w:hAnsi="Consolas"/>
+          <w:color w:val="9C2D41"/>
+        </w:rPr>
+        <w:t xml:space="preserve">strengths</w:t>
+      </w:r>
+      <w:r>
+        <w:t xml:space="preserve"> (acknowledge first),</w:t>
+      </w:r>
+    </w:p>
+    <w:p>
+      <w:r>
+        <w:t xml:space="preserve">severity-tagged </w:t>
+      </w:r>
+      <w:r>
+        <w:rPr>
+          <w:rFonts w:ascii="Consolas" w:hAnsi="Consolas"/>
+          <w:color w:val="9C2D41"/>
+        </w:rPr>
+        <w:t xml:space="preserve">weaknesses</w:t>
+      </w:r>
+      <w:r>
+        <w:t xml:space="preserve"> (colour-coded red/amber "where they're losing out") and </w:t>
+      </w:r>
+      <w:r>
+        <w:rPr>
+          <w:rFonts w:ascii="Consolas" w:hAnsi="Consolas"/>
+          <w:color w:val="9C2D41"/>
+        </w:rPr>
+        <w:t xml:space="preserve">objections</w:t>
+      </w:r>
+      <w:r>
+        <w:t xml:space="preserve"> (likely brush-offs + rebuttals). Dossier popup re-ordered for a live call: contact → Google rep → </w:t>
+      </w:r>
+      <w:r>
+        <w:rPr>
+          <w:b/>
+        </w:rPr>
+        <w:t xml:space="preserve">☎️ Open with this</w:t>
+      </w:r>
+      <w:r>
+        <w:t xml:space="preserve"> → ✅ strengths → 🎯 weak spots → </w:t>
+      </w:r>
+      <w:r>
+        <w:rPr>
+          <w:b/>
+        </w:rPr>
+        <w:t xml:space="preserve">💬 Personalised What to say</w:t>
+      </w:r>
+      <w:r>
+        <w:t xml:space="preserve"> (was "Your ammunition", bigger text) → 🛡️ If they push back → competitor table (now with </w:t>
+      </w:r>
+      <w:r>
+        <w:rPr>
+          <w:b/>
+        </w:rPr>
+        <w:t xml:space="preserve">review-gap bars + a rank line</w:t>
+      </w:r>
+      <w:r>
+        <w:t xml:space="preserve">) → services → Companies House. Old dossiers degrade gracefully (↻ Re-run to populate the new blocks, 1 credit). All from a richer gpt-4o-mini prompt + CSS, no new Google cost.</w:t>
+      </w:r>
+    </w:p>
+    <w:p>
+      <w:pPr>
+        <w:numPr>
+          <w:ilvl w:val="0"/>
+          <w:numId w:val="1"/>
+        </w:numPr>
+      </w:pPr>
+      <w:r>
+        <w:rPr>
+          <w:b/>
+        </w:rPr>
+        <w:t xml:space="preserve">📞 Call List CSV export</w:t>
+      </w:r>
+      <w:r>
+        <w:t xml:space="preserve"> (a call sheet incl. latest note per lead).</w:t>
       </w:r>
     </w:p>
     <w:p>

</xml_diff>

<commit_message>
Docs: personalised Pounce quote form (business name heading + service dropdown)
Co-Authored-By: Claude Opus 4.8 <noreply@anthropic.com>
</commit_message>
<xml_diff>
--- a/DOCS.docx
+++ b/DOCS.docx
@@ -10180,6 +10180,28 @@
           <w:b/>
         </w:rPr>
         <w:t xml:space="preserve">2026-06-13</w:t>
+      </w:r>
+    </w:p>
+    <w:p>
+      <w:pPr>
+        <w:numPr>
+          <w:ilvl w:val="0"/>
+          <w:numId w:val="1"/>
+        </w:numPr>
+      </w:pPr>
+      <w:r>
+        <w:rPr>
+          <w:b/>
+        </w:rPr>
+        <w:t xml:space="preserve">Pounce sites, personalised quote form:</w:t>
+      </w:r>
+      <w:r>
+        <w:t xml:space="preserve"> the form heading reads "Get a free quote from</w:t>
+      </w:r>
+    </w:p>
+    <w:p>
+      <w:r>
+        <w:t xml:space="preserve">&lt;business&gt;" and a "What do you need help with?" dropdown is built from that business's own services (+ "Something else"). Renders from the stored site JSON, so existing live sites get it instantly (no rebuild). (Form is still front-end-only, submissions show a thank-you, not yet emailed, see Known limitations.)</w:t>
       </w:r>
     </w:p>
     <w:p>

</xml_diff>

<commit_message>
Docs: Pounce form now delivers leads via /api/contact (store-first + SendGrid)
Co-Authored-By: Claude Opus 4.8 <noreply@anthropic.com>
</commit_message>
<xml_diff>
--- a/DOCS.docx
+++ b/DOCS.docx
@@ -5729,6 +5729,58 @@
           </w:tcPr>
           <w:p>
             <w:r>
+              <w:rPr>
+                <w:rFonts w:ascii="Consolas" w:hAnsi="Consolas"/>
+                <w:color w:val="9C2D41"/>
+              </w:rPr>
+              <w:t xml:space="preserve">POST /api/contact</w:t>
+            </w:r>
+          </w:p>
+        </w:tc>
+        <w:tc>
+          <w:tcPr>
+            <w:tcW w:w="0" w:type="auto"/>
+          </w:tcPr>
+          <w:p>
+            <w:r>
+              <w:t xml:space="preserve">,</w:t>
+            </w:r>
+          </w:p>
+        </w:tc>
+        <w:tc>
+          <w:tcPr>
+            <w:tcW w:w="0" w:type="auto"/>
+          </w:tcPr>
+          <w:p>
+            <w:r>
+              <w:rPr>
+                <w:b/>
+              </w:rPr>
+              <w:t xml:space="preserve">Public</w:t>
+            </w:r>
+            <w:r>
+              <w:t xml:space="preserve"> (no auth). A Pounce site's quote form: stores the lead to </w:t>
+            </w:r>
+            <w:r>
+              <w:rPr>
+                <w:rFonts w:ascii="Consolas" w:hAnsi="Consolas"/>
+                <w:color w:val="9C2D41"/>
+              </w:rPr>
+              <w:t xml:space="preserve">leads/&lt;slug&gt;/…</w:t>
+            </w:r>
+            <w:r>
+              <w:t xml:space="preserve"> (store-first) + best-effort SendGrid notify. Honeypot + slug-must-exist anti-spam.</w:t>
+            </w:r>
+          </w:p>
+        </w:tc>
+      </w:tr>
+      <w:tr>
+        <w:tc>
+          <w:tcPr>
+            <w:tcW w:w="0" w:type="auto"/>
+          </w:tcPr>
+          <w:p>
+            <w:r>
               <w:t xml:space="preserve">`GET\</w:t>
             </w:r>
           </w:p>
@@ -6519,6 +6571,34 @@
       </w:r>
       <w:r>
         <w:t xml:space="preserve"> (status/notes live in the CRM under the same key).</w:t>
+      </w:r>
+    </w:p>
+    <w:p>
+      <w:pPr>
+        <w:numPr>
+          <w:ilvl w:val="0"/>
+          <w:numId w:val="1"/>
+        </w:numPr>
+      </w:pPr>
+      <w:r>
+        <w:rPr>
+          <w:rFonts w:ascii="Consolas" w:hAnsi="Consolas"/>
+          <w:color w:val="9C2D41"/>
+        </w:rPr>
+        <w:t xml:space="preserve">leads/&lt;slug&gt;/&lt;ts&gt;.json</w:t>
+      </w:r>
+      <w:r>
+        <w:t xml:space="preserve">, a Pounce-site contact-form submission: </w:t>
+      </w:r>
+      <w:r>
+        <w:rPr>
+          <w:rFonts w:ascii="Consolas" w:hAnsi="Consolas"/>
+          <w:color w:val="9C2D41"/>
+        </w:rPr>
+        <w:t xml:space="preserve">{ slug, business, name, phone, email, service, message, receivedAt, ua }</w:t>
+      </w:r>
+      <w:r>
+        <w:t xml:space="preserve">.</w:t>
       </w:r>
     </w:p>
     <w:p>
@@ -10193,15 +10273,82 @@
         <w:rPr>
           <w:b/>
         </w:rPr>
-        <w:t xml:space="preserve">Pounce sites, personalised quote form:</w:t>
-      </w:r>
-      <w:r>
-        <w:t xml:space="preserve"> the form heading reads "Get a free quote from</w:t>
-      </w:r>
-    </w:p>
-    <w:p>
-      <w:r>
-        <w:t xml:space="preserve">&lt;business&gt;" and a "What do you need help with?" dropdown is built from that business's own services (+ "Something else"). Renders from the stored site JSON, so existing live sites get it instantly (no rebuild). (Form is still front-end-only, submissions show a thank-you, not yet emailed, see Known limitations.)</w:t>
+        <w:t xml:space="preserve">Pounce sites, personalised quote form + it now DELIVERS leads:</w:t>
+      </w:r>
+      <w:r>
+        <w:t xml:space="preserve"> the form heading reads "Get a</w:t>
+      </w:r>
+    </w:p>
+    <w:p>
+      <w:r>
+        <w:t xml:space="preserve">free quote from &lt;business&gt;" and a "What do you need help with?" dropdown is built from that business's own services (+ "Something else"). It now submits for real via </w:t>
+      </w:r>
+      <w:r>
+        <w:rPr>
+          <w:b/>
+        </w:rPr>
+        <w:t xml:space="preserve">`POST /api/contact`</w:t>
+      </w:r>
+      <w:r>
+        <w:t xml:space="preserve">, which </w:t>
+      </w:r>
+      <w:r>
+        <w:rPr>
+          <w:b/>
+        </w:rPr>
+        <w:t xml:space="preserve">stores every lead in Blob first</w:t>
+      </w:r>
+      <w:r>
+        <w:t xml:space="preserve"> (</w:t>
+      </w:r>
+      <w:r>
+        <w:rPr>
+          <w:rFonts w:ascii="Consolas" w:hAnsi="Consolas"/>
+          <w:color w:val="9C2D41"/>
+        </w:rPr>
+        <w:t xml:space="preserve">leads/&lt;slug&gt;/…</w:t>
+      </w:r>
+      <w:r>
+        <w:t xml:space="preserve">, durable + free) then sends a best-effort </w:t>
+      </w:r>
+      <w:r>
+        <w:rPr>
+          <w:b/>
+        </w:rPr>
+        <w:t xml:space="preserve">SendGrid</w:t>
+      </w:r>
+      <w:r>
+        <w:t xml:space="preserve"> notification (existing integration; recipient </w:t>
+      </w:r>
+      <w:r>
+        <w:rPr>
+          <w:rFonts w:ascii="Consolas" w:hAnsi="Consolas"/>
+          <w:color w:val="9C2D41"/>
+        </w:rPr>
+        <w:t xml:space="preserve">LEAD_EMAIL_TO</w:t>
+      </w:r>
+      <w:r>
+        <w:t xml:space="preserve"> || </w:t>
+      </w:r>
+      <w:r>
+        <w:rPr>
+          <w:rFonts w:ascii="Consolas" w:hAnsi="Consolas"/>
+          <w:color w:val="9C2D41"/>
+        </w:rPr>
+        <w:t xml:space="preserve">APPLY_EMAIL_TO</w:t>
+      </w:r>
+      <w:r>
+        <w:t xml:space="preserve"> || </w:t>
+      </w:r>
+      <w:r>
+        <w:rPr>
+          <w:rFonts w:ascii="Consolas" w:hAnsi="Consolas"/>
+          <w:color w:val="9C2D41"/>
+        </w:rPr>
+        <w:t xml:space="preserve">ERROR_EMAIL_TO</w:t>
+      </w:r>
+      <w:r>
+        <w:t xml:space="preserve">). Anti-spam: a hidden honeypot + the slug must map to a real site. Renders from stored JSON, so live sites get it with no rebuild. (Next: an in-app enquiries inbox + routing the email to the client's own address once accounts exist.)</w:t>
       </w:r>
     </w:p>
     <w:p>

</xml_diff>

<commit_message>
Docs: enquiry email loop (owner routing, signature, customer confirmation) + Enquiries inbox; new env vars; regenerate DOCS.docx
Co-Authored-By: Claude Fable 5 <noreply@anthropic.com>
</commit_message>
<xml_diff>
--- a/DOCS.docx
+++ b/DOCS.docx
@@ -4569,7 +4569,7 @@
           <w:rFonts w:ascii="Consolas" w:hAnsi="Consolas"/>
           <w:sz w:val="18"/>
         </w:rPr>
-        <w:t xml:space="preserve">  Google Places       OpenAI          SendGrid      Vercel + Cloudflare</w:t>
+        <w:t xml:space="preserve">  Google Places       OpenAI          SendGrid              Vercel + Cloudflare</w:t>
       </w:r>
     </w:p>
     <w:p>
@@ -4581,7 +4581,7 @@
           <w:rFonts w:ascii="Consolas" w:hAnsi="Consolas"/>
           <w:sz w:val="18"/>
         </w:rPr>
-        <w:t xml:space="preserve">  businesses/reviews   image + copy    emails        host / domains / DNS</w:t>
+        <w:t xml:space="preserve">  businesses/reviews   image + copy    emails (alerts,       host / domains / DNS</w:t>
       </w:r>
     </w:p>
     <w:p>
@@ -4593,7 +4593,7 @@
           <w:rFonts w:ascii="Consolas" w:hAnsi="Consolas"/>
           <w:sz w:val="18"/>
         </w:rPr>
-        <w:t xml:space="preserve">        |                  |              |                  |</w:t>
+        <w:t xml:space="preserve">                                       applications, ENQUIRIES)</w:t>
       </w:r>
     </w:p>
     <w:p>
@@ -4605,7 +4605,7 @@
           <w:rFonts w:ascii="Consolas" w:hAnsi="Consolas"/>
           <w:sz w:val="18"/>
         </w:rPr>
-        <w:t xml:space="preserve">        +---------+--------+------+-------+---------+--------+</w:t>
+        <w:t xml:space="preserve">        |                  |              |                          |</w:t>
       </w:r>
     </w:p>
     <w:p>
@@ -4617,6 +4617,18 @@
           <w:rFonts w:ascii="Consolas" w:hAnsi="Consolas"/>
           <w:sz w:val="18"/>
         </w:rPr>
+        <w:t xml:space="preserve">        +---------+--------+------+-------+--------------+-----------+</w:t>
+      </w:r>
+    </w:p>
+    <w:p>
+      <w:pPr>
+        <w:pStyle w:val="Code"/>
+      </w:pPr>
+      <w:r>
+        <w:rPr>
+          <w:rFonts w:ascii="Consolas" w:hAnsi="Consolas"/>
+          <w:sz w:val="18"/>
+        </w:rPr>
         <w:t xml:space="preserve">                              v  (pulls data / sends email)</w:t>
       </w:r>
     </w:p>
@@ -4725,7 +4737,7 @@
           <w:rFonts w:ascii="Consolas" w:hAnsi="Consolas"/>
           <w:sz w:val="18"/>
         </w:rPr>
-        <w:t xml:space="preserve">               mockups, sites, Prowl dossiers,           every send / view /</w:t>
+        <w:t xml:space="preserve">               mockups, sites, Prowl dossiers, LEADS,    every send / view /</w:t>
       </w:r>
     </w:p>
     <w:p>
@@ -4741,6 +4753,124 @@
       </w:r>
     </w:p>
     <w:p>
+      <w:pPr>
+        <w:pStyle w:val="Code"/>
+      </w:pPr>
+    </w:p>
+    <w:p>
+      <w:pPr>
+        <w:pStyle w:val="Code"/>
+      </w:pPr>
+    </w:p>
+    <w:p>
+      <w:pPr>
+        <w:pStyle w:val="Code"/>
+      </w:pPr>
+      <w:r>
+        <w:rPr>
+          <w:rFonts w:ascii="Consolas" w:hAnsi="Consolas"/>
+          <w:sz w:val="18"/>
+        </w:rPr>
+        <w:t xml:space="preserve">  THE ENQUIRY LOOP  (a Pounce website earning its keep)</w:t>
+      </w:r>
+    </w:p>
+    <w:p>
+      <w:pPr>
+        <w:pStyle w:val="Code"/>
+      </w:pPr>
+      <w:r>
+        <w:rPr>
+          <w:rFonts w:ascii="Consolas" w:hAnsi="Consolas"/>
+          <w:sz w:val="18"/>
+        </w:rPr>
+        <w:t xml:space="preserve">  ─────────────────────────────────────────────────────</w:t>
+      </w:r>
+    </w:p>
+    <w:p>
+      <w:pPr>
+        <w:pStyle w:val="Code"/>
+      </w:pPr>
+      <w:r>
+        <w:rPr>
+          <w:rFonts w:ascii="Consolas" w:hAnsi="Consolas"/>
+          <w:sz w:val="18"/>
+        </w:rPr>
+        <w:t xml:space="preserve">  CUSTOMER  --fills quote form--&gt;  /api/contact  --1--&gt;  VERCEL BLOB  leads/&lt;slug&gt;/  (store-first)</w:t>
+      </w:r>
+    </w:p>
+    <w:p>
+      <w:pPr>
+        <w:pStyle w:val="Code"/>
+      </w:pPr>
+      <w:r>
+        <w:rPr>
+          <w:rFonts w:ascii="Consolas" w:hAnsi="Consolas"/>
+          <w:sz w:val="18"/>
+        </w:rPr>
+        <w:t xml:space="preserve">  (visitor)                              |</w:t>
+      </w:r>
+    </w:p>
+    <w:p>
+      <w:pPr>
+        <w:pStyle w:val="Code"/>
+      </w:pPr>
+      <w:r>
+        <w:rPr>
+          <w:rFonts w:ascii="Consolas" w:hAnsi="Consolas"/>
+          <w:sz w:val="18"/>
+        </w:rPr>
+        <w:t xml:space="preserve">                                         +--2a--&gt;  SendGrid  --&gt;  BUSINESS OWNER  (reply-to = customer)</w:t>
+      </w:r>
+    </w:p>
+    <w:p>
+      <w:pPr>
+        <w:pStyle w:val="Code"/>
+      </w:pPr>
+      <w:r>
+        <w:rPr>
+          <w:rFonts w:ascii="Consolas" w:hAnsi="Consolas"/>
+          <w:sz w:val="18"/>
+        </w:rPr>
+        <w:t xml:space="preserve">                                         |                         + BCC you / LEAD_BCC_ALWAYS</w:t>
+      </w:r>
+    </w:p>
+    <w:p>
+      <w:pPr>
+        <w:pStyle w:val="Code"/>
+      </w:pPr>
+      <w:r>
+        <w:rPr>
+          <w:rFonts w:ascii="Consolas" w:hAnsi="Consolas"/>
+          <w:sz w:val="18"/>
+        </w:rPr>
+        <w:t xml:space="preserve">                                         +--2b--&gt;  SendGrid  --&gt;  CUSTOMER  ("Thanks for contacting ...")</w:t>
+      </w:r>
+    </w:p>
+    <w:p>
+      <w:pPr>
+        <w:pStyle w:val="Code"/>
+      </w:pPr>
+      <w:r>
+        <w:rPr>
+          <w:rFonts w:ascii="Consolas" w:hAnsi="Consolas"/>
+          <w:sz w:val="18"/>
+        </w:rPr>
+        <w:t xml:space="preserve">                                         |</w:t>
+      </w:r>
+    </w:p>
+    <w:p>
+      <w:pPr>
+        <w:pStyle w:val="Code"/>
+      </w:pPr>
+      <w:r>
+        <w:rPr>
+          <w:rFonts w:ascii="Consolas" w:hAnsi="Consolas"/>
+          <w:sz w:val="18"/>
+        </w:rPr>
+        <w:t xml:space="preserve">  YOU  &lt;--reads leads/ via /api/enquiries--+   the 📨 Enquiries inbox tab</w:t>
+      </w:r>
+    </w:p>
+    <w:p>
       <w:r>
         <w:rPr>
           <w:b/>
@@ -4864,6 +4994,111 @@
       </w:r>
     </w:p>
     <w:p>
+      <w:r>
+        <w:rPr>
+          <w:b/>
+        </w:rPr>
+        <w:t xml:space="preserve">The enquiry loop:</w:t>
+      </w:r>
+      <w:r>
+        <w:t xml:space="preserve"> once a Pounce site is live, a visitor's </w:t>
+      </w:r>
+      <w:r>
+        <w:rPr>
+          <w:b/>
+        </w:rPr>
+        <w:t xml:space="preserve">quote form</w:t>
+      </w:r>
+      <w:r>
+        <w:t xml:space="preserve"> posts to </w:t>
+      </w:r>
+      <w:r>
+        <w:rPr>
+          <w:rFonts w:ascii="Consolas" w:hAnsi="Consolas"/>
+          <w:color w:val="9C2D41"/>
+        </w:rPr>
+        <w:t xml:space="preserve">/api/contact</w:t>
+      </w:r>
+      <w:r>
+        <w:t xml:space="preserve">, which is </w:t>
+      </w:r>
+      <w:r>
+        <w:rPr>
+          <w:b/>
+        </w:rPr>
+        <w:t xml:space="preserve">store-first</w:t>
+      </w:r>
+      <w:r>
+        <w:t xml:space="preserve"> (the lead is written to Blob under </w:t>
+      </w:r>
+      <w:r>
+        <w:rPr>
+          <w:rFonts w:ascii="Consolas" w:hAnsi="Consolas"/>
+          <w:color w:val="9C2D41"/>
+        </w:rPr>
+        <w:t xml:space="preserve">leads/&lt;slug&gt;/</w:t>
+      </w:r>
+      <w:r>
+        <w:t xml:space="preserve"> so it is never lost and costs nothing) and then sends two best-effort SendGrid emails: a </w:t>
+      </w:r>
+      <w:r>
+        <w:rPr>
+          <w:b/>
+        </w:rPr>
+        <w:t xml:space="preserve">notification to the business owner</w:t>
+      </w:r>
+      <w:r>
+        <w:t xml:space="preserve"> (the email/name captured at build time, reply-to set to the customer so a reply reaches them, BCC to you and to any </w:t>
+      </w:r>
+      <w:r>
+        <w:rPr>
+          <w:rFonts w:ascii="Consolas" w:hAnsi="Consolas"/>
+          <w:color w:val="9C2D41"/>
+        </w:rPr>
+        <w:t xml:space="preserve">LEAD_BCC_ALWAYS</w:t>
+      </w:r>
+      <w:r>
+        <w:t xml:space="preserve"> address) and a </w:t>
+      </w:r>
+      <w:r>
+        <w:rPr>
+          <w:b/>
+        </w:rPr>
+        <w:t xml:space="preserve">confirmation back to the customer</w:t>
+      </w:r>
+      <w:r>
+        <w:t xml:space="preserve"> styled as if from the business. The </w:t>
+      </w:r>
+      <w:r>
+        <w:rPr>
+          <w:b/>
+        </w:rPr>
+        <w:t xml:space="preserve">📨 Enquiries</w:t>
+      </w:r>
+      <w:r>
+        <w:t xml:space="preserve"> tab reads every stored lead back via </w:t>
+      </w:r>
+      <w:r>
+        <w:rPr>
+          <w:rFonts w:ascii="Consolas" w:hAnsi="Consolas"/>
+          <w:color w:val="9C2D41"/>
+        </w:rPr>
+        <w:t xml:space="preserve">/api/enquiries</w:t>
+      </w:r>
+      <w:r>
+        <w:t xml:space="preserve">, so nothing is lost even if an email bounces. Anti-spam is a hidden </w:t>
+      </w:r>
+      <w:r>
+        <w:rPr>
+          <w:b/>
+        </w:rPr>
+        <w:t xml:space="preserve">honeypot</w:t>
+      </w:r>
+      <w:r>
+        <w:t xml:space="preserve"> field plus a check that the slug maps to a real site.</w:t>
+      </w:r>
+    </w:p>
+    <w:p>
       <w:pPr>
         <w:pStyle w:val="Heading3"/>
       </w:pPr>
@@ -5109,6 +5344,42 @@
           <w:sz w:val="18"/>
         </w:rPr>
         <w:t xml:space="preserve">                                       publish.js   Make live/unpublish + subdomain (Vercel API)</w:t>
+      </w:r>
+    </w:p>
+    <w:p>
+      <w:pPr>
+        <w:pStyle w:val="Code"/>
+      </w:pPr>
+      <w:r>
+        <w:rPr>
+          <w:rFonts w:ascii="Consolas" w:hAnsi="Consolas"/>
+          <w:sz w:val="18"/>
+        </w:rPr>
+        <w:t xml:space="preserve">                                       contact.js   PUBLIC quote-form intake: store lead + email</w:t>
+      </w:r>
+    </w:p>
+    <w:p>
+      <w:pPr>
+        <w:pStyle w:val="Code"/>
+      </w:pPr>
+      <w:r>
+        <w:rPr>
+          <w:rFonts w:ascii="Consolas" w:hAnsi="Consolas"/>
+          <w:sz w:val="18"/>
+        </w:rPr>
+        <w:t xml:space="preserve">                                                    owner (BCC you) + confirm to customer (honeypot)</w:t>
+      </w:r>
+    </w:p>
+    <w:p>
+      <w:pPr>
+        <w:pStyle w:val="Code"/>
+      </w:pPr>
+      <w:r>
+        <w:rPr>
+          <w:rFonts w:ascii="Consolas" w:hAnsi="Consolas"/>
+          <w:sz w:val="18"/>
+        </w:rPr>
+        <w:t xml:space="preserve">                                       enquiries.js Enquiries inbox: reads leads/ back for the app</w:t>
       </w:r>
     </w:p>
     <w:p>
@@ -7149,7 +7420,7 @@
           </w:tcPr>
           <w:p>
             <w:r>
-              <w:t xml:space="preserve">Companies House</w:t>
+              <w:t xml:space="preserve">Pounce enquiries</w:t>
             </w:r>
           </w:p>
         </w:tc>
@@ -7163,39 +7434,77 @@
                 <w:rFonts w:ascii="Consolas" w:hAnsi="Consolas"/>
                 <w:color w:val="9C2D41"/>
               </w:rPr>
-              <w:t xml:space="preserve">COMPANIES_HOUSE_API_KEY</w:t>
-            </w:r>
-            <w:r>
-              <w:t xml:space="preserve"> (</w:t>
-            </w:r>
-            <w:r>
-              <w:rPr>
-                <w:b/>
-              </w:rPr>
-              <w:t xml:space="preserve">PENDING</w:t>
-            </w:r>
-            <w:r>
-              <w:t xml:space="preserve">)</w:t>
-            </w:r>
-          </w:p>
-        </w:tc>
-        <w:tc>
-          <w:tcPr>
-            <w:tcW w:w="0" w:type="auto"/>
-          </w:tcPr>
-          <w:p>
-            <w:r>
-              <w:t xml:space="preserve">Free; unlocks the established/director/type part of Prowl. Auth = HTTP Basic </w:t>
+              <w:t xml:space="preserve">LEAD_EMAIL_TO?</w:t>
+            </w:r>
+            <w:r>
+              <w:t xml:space="preserve">, </w:t>
             </w:r>
             <w:r>
               <w:rPr>
                 <w:rFonts w:ascii="Consolas" w:hAnsi="Consolas"/>
                 <w:color w:val="9C2D41"/>
               </w:rPr>
-              <w:t xml:space="preserve">base64(key:)</w:t>
-            </w:r>
-            <w:r>
-              <w:t xml:space="preserve">.</w:t>
+              <w:t xml:space="preserve">LEAD_BCC_ALWAYS?</w:t>
+            </w:r>
+          </w:p>
+        </w:tc>
+        <w:tc>
+          <w:tcPr>
+            <w:tcW w:w="0" w:type="auto"/>
+          </w:tcPr>
+          <w:p>
+            <w:r>
+              <w:t xml:space="preserve">Quote-form intake (</w:t>
+            </w:r>
+            <w:r>
+              <w:rPr>
+                <w:rFonts w:ascii="Consolas" w:hAnsi="Consolas"/>
+                <w:color w:val="9C2D41"/>
+              </w:rPr>
+              <w:t xml:space="preserve">api/contact.js</w:t>
+            </w:r>
+            <w:r>
+              <w:t xml:space="preserve">). </w:t>
+            </w:r>
+            <w:r>
+              <w:rPr>
+                <w:rFonts w:ascii="Consolas" w:hAnsi="Consolas"/>
+                <w:color w:val="9C2D41"/>
+              </w:rPr>
+              <w:t xml:space="preserve">LEAD_EMAIL_TO</w:t>
+            </w:r>
+            <w:r>
+              <w:t xml:space="preserve"> = where enquiries go when a site has no owner email set, and the BCC when it does (falls back to </w:t>
+            </w:r>
+            <w:r>
+              <w:rPr>
+                <w:rFonts w:ascii="Consolas" w:hAnsi="Consolas"/>
+                <w:color w:val="9C2D41"/>
+              </w:rPr>
+              <w:t xml:space="preserve">APPLY_EMAIL_TO</w:t>
+            </w:r>
+            <w:r>
+              <w:t xml:space="preserve">/</w:t>
+            </w:r>
+            <w:r>
+              <w:rPr>
+                <w:rFonts w:ascii="Consolas" w:hAnsi="Consolas"/>
+                <w:color w:val="9C2D41"/>
+              </w:rPr>
+              <w:t xml:space="preserve">ERROR_EMAIL_TO</w:t>
+            </w:r>
+            <w:r>
+              <w:t xml:space="preserve">). </w:t>
+            </w:r>
+            <w:r>
+              <w:rPr>
+                <w:rFonts w:ascii="Consolas" w:hAnsi="Consolas"/>
+                <w:color w:val="9C2D41"/>
+              </w:rPr>
+              <w:t xml:space="preserve">LEAD_BCC_ALWAYS</w:t>
+            </w:r>
+            <w:r>
+              <w:t xml:space="preserve"> = optional address copied on every enquiry (testing/oversight).</w:t>
             </w:r>
           </w:p>
         </w:tc>
@@ -7207,7 +7516,7 @@
           </w:tcPr>
           <w:p>
             <w:r>
-              <w:t xml:space="preserve">Auth</w:t>
+              <w:t xml:space="preserve">Companies House</w:t>
             </w:r>
           </w:p>
         </w:tc>
@@ -7221,27 +7530,39 @@
                 <w:rFonts w:ascii="Consolas" w:hAnsi="Consolas"/>
                 <w:color w:val="9C2D41"/>
               </w:rPr>
-              <w:t xml:space="preserve">APP_USERNAME</w:t>
-            </w:r>
-            <w:r>
-              <w:t xml:space="preserve">, </w:t>
+              <w:t xml:space="preserve">COMPANIES_HOUSE_API_KEY</w:t>
+            </w:r>
+            <w:r>
+              <w:t xml:space="preserve"> (</w:t>
+            </w:r>
+            <w:r>
+              <w:rPr>
+                <w:b/>
+              </w:rPr>
+              <w:t xml:space="preserve">PENDING</w:t>
+            </w:r>
+            <w:r>
+              <w:t xml:space="preserve">)</w:t>
+            </w:r>
+          </w:p>
+        </w:tc>
+        <w:tc>
+          <w:tcPr>
+            <w:tcW w:w="0" w:type="auto"/>
+          </w:tcPr>
+          <w:p>
+            <w:r>
+              <w:t xml:space="preserve">Free; unlocks the established/director/type part of Prowl. Auth = HTTP Basic </w:t>
             </w:r>
             <w:r>
               <w:rPr>
                 <w:rFonts w:ascii="Consolas" w:hAnsi="Consolas"/>
                 <w:color w:val="9C2D41"/>
               </w:rPr>
-              <w:t xml:space="preserve">APP_PASSWORD</w:t>
-            </w:r>
-          </w:p>
-        </w:tc>
-        <w:tc>
-          <w:tcPr>
-            <w:tcW w:w="0" w:type="auto"/>
-          </w:tcPr>
-          <w:p>
-            <w:r>
-              <w:t xml:space="preserve">Login; cookie HMAC keyed by the password.</w:t>
+              <w:t xml:space="preserve">base64(key:)</w:t>
+            </w:r>
+            <w:r>
+              <w:t xml:space="preserve">.</w:t>
             </w:r>
           </w:p>
         </w:tc>
@@ -7253,7 +7574,7 @@
           </w:tcPr>
           <w:p>
             <w:r>
-              <w:t xml:space="preserve">Branding/links</w:t>
+              <w:t xml:space="preserve">Auth</w:t>
             </w:r>
           </w:p>
         </w:tc>
@@ -7267,7 +7588,7 @@
                 <w:rFonts w:ascii="Consolas" w:hAnsi="Consolas"/>
                 <w:color w:val="9C2D41"/>
               </w:rPr>
-              <w:t xml:space="preserve">AGENCY_NAME?</w:t>
+              <w:t xml:space="preserve">APP_USERNAME</w:t>
             </w:r>
             <w:r>
               <w:t xml:space="preserve">, </w:t>
@@ -7277,16 +7598,72 @@
                 <w:rFonts w:ascii="Consolas" w:hAnsi="Consolas"/>
                 <w:color w:val="9C2D41"/>
               </w:rPr>
-              <w:t xml:space="preserve">DEMO_URL</w:t>
-            </w:r>
-            <w:r>
-              <w:t xml:space="preserve">, </w:t>
-            </w:r>
+              <w:t xml:space="preserve">APP_PASSWORD</w:t>
+            </w:r>
+          </w:p>
+        </w:tc>
+        <w:tc>
+          <w:tcPr>
+            <w:tcW w:w="0" w:type="auto"/>
+          </w:tcPr>
+          <w:p>
+            <w:r>
+              <w:t xml:space="preserve">Login; cookie HMAC keyed by the password.</w:t>
+            </w:r>
+          </w:p>
+        </w:tc>
+      </w:tr>
+      <w:tr>
+        <w:tc>
+          <w:tcPr>
+            <w:tcW w:w="0" w:type="auto"/>
+          </w:tcPr>
+          <w:p>
+            <w:r>
+              <w:t xml:space="preserve">Branding/links</w:t>
+            </w:r>
+          </w:p>
+        </w:tc>
+        <w:tc>
+          <w:tcPr>
+            <w:tcW w:w="0" w:type="auto"/>
+          </w:tcPr>
+          <w:p>
             <w:r>
               <w:rPr>
                 <w:rFonts w:ascii="Consolas" w:hAnsi="Consolas"/>
                 <w:color w:val="9C2D41"/>
               </w:rPr>
+              <w:t xml:space="preserve">AGENCY_NAME?</w:t>
+            </w:r>
+            <w:r>
+              <w:t xml:space="preserve">, </w:t>
+            </w:r>
+            <w:r>
+              <w:rPr>
+                <w:rFonts w:ascii="Consolas" w:hAnsi="Consolas"/>
+                <w:color w:val="9C2D41"/>
+              </w:rPr>
+              <w:t xml:space="preserve">AGENCY_URL?</w:t>
+            </w:r>
+            <w:r>
+              <w:t xml:space="preserve">, </w:t>
+            </w:r>
+            <w:r>
+              <w:rPr>
+                <w:rFonts w:ascii="Consolas" w:hAnsi="Consolas"/>
+                <w:color w:val="9C2D41"/>
+              </w:rPr>
+              <w:t xml:space="preserve">DEMO_URL</w:t>
+            </w:r>
+            <w:r>
+              <w:t xml:space="preserve">, </w:t>
+            </w:r>
+            <w:r>
+              <w:rPr>
+                <w:rFonts w:ascii="Consolas" w:hAnsi="Consolas"/>
+                <w:color w:val="9C2D41"/>
+              </w:rPr>
               <w:t xml:space="preserve">LINK_DOMAIN</w:t>
             </w:r>
           </w:p>
@@ -7296,6 +7673,26 @@
             <w:tcW w:w="0" w:type="auto"/>
           </w:tcPr>
           <w:p>
+            <w:r>
+              <w:rPr>
+                <w:rFonts w:ascii="Consolas" w:hAnsi="Consolas"/>
+                <w:color w:val="9C2D41"/>
+              </w:rPr>
+              <w:t xml:space="preserve">AGENCY_NAME</w:t>
+            </w:r>
+            <w:r>
+              <w:t xml:space="preserve">/</w:t>
+            </w:r>
+            <w:r>
+              <w:rPr>
+                <w:rFonts w:ascii="Consolas" w:hAnsi="Consolas"/>
+                <w:color w:val="9C2D41"/>
+              </w:rPr>
+              <w:t xml:space="preserve">AGENCY_URL</w:t>
+            </w:r>
+            <w:r>
+              <w:t xml:space="preserve"> = the "Powered by Ai Web Point" email signature (defaulted if unset); </w:t>
+            </w:r>
             <w:r>
               <w:rPr>
                 <w:rFonts w:ascii="Consolas" w:hAnsi="Consolas"/>
@@ -10318,7 +10715,72 @@
         <w:t xml:space="preserve">SendGrid</w:t>
       </w:r>
       <w:r>
-        <w:t xml:space="preserve"> notification (existing integration; recipient </w:t>
+        <w:t xml:space="preserve"> notification. Anti-spam: a hidden honeypot + the slug must map to a real site. Renders from stored JSON, so live sites get it with no rebuild.</w:t>
+      </w:r>
+    </w:p>
+    <w:p>
+      <w:pPr>
+        <w:numPr>
+          <w:ilvl w:val="0"/>
+          <w:numId w:val="1"/>
+        </w:numPr>
+      </w:pPr>
+      <w:r>
+        <w:rPr>
+          <w:b/>
+        </w:rPr>
+        <w:t xml:space="preserve">Enquiry delivery, signature + customer confirmation (new):</w:t>
+      </w:r>
+      <w:r>
+        <w:t xml:space="preserve"> the Pounce build modal now captures</w:t>
+      </w:r>
+    </w:p>
+    <w:p>
+      <w:r>
+        <w:rPr>
+          <w:b/>
+        </w:rPr>
+        <w:t xml:space="preserve">who enquiries go to</w:t>
+      </w:r>
+      <w:r>
+        <w:t xml:space="preserve"> (the owner's email + contact name), stored on the site JSON and preserved on rebuild (a blank field never wipes an existing recipient). </w:t>
+      </w:r>
+      <w:r>
+        <w:rPr>
+          <w:rFonts w:ascii="Consolas" w:hAnsi="Consolas"/>
+          <w:color w:val="9C2D41"/>
+        </w:rPr>
+        <w:t xml:space="preserve">api/contact.js</w:t>
+      </w:r>
+      <w:r>
+        <w:t xml:space="preserve"> routes the notification </w:t>
+      </w:r>
+      <w:r>
+        <w:rPr>
+          <w:b/>
+        </w:rPr>
+        <w:t xml:space="preserve">to the business owner</w:t>
+      </w:r>
+      <w:r>
+        <w:t xml:space="preserve"> with </w:t>
+      </w:r>
+      <w:r>
+        <w:rPr>
+          <w:b/>
+        </w:rPr>
+        <w:t xml:space="preserve">reply-to set to the customer</w:t>
+      </w:r>
+      <w:r>
+        <w:t xml:space="preserve"> and a </w:t>
+      </w:r>
+      <w:r>
+        <w:rPr>
+          <w:b/>
+        </w:rPr>
+        <w:t xml:space="preserve">BCC to you</w:t>
+      </w:r>
+      <w:r>
+        <w:t xml:space="preserve"> (the </w:t>
       </w:r>
       <w:r>
         <w:rPr>
@@ -10328,27 +10790,77 @@
         <w:t xml:space="preserve">LEAD_EMAIL_TO</w:t>
       </w:r>
       <w:r>
-        <w:t xml:space="preserve"> || </w:t>
-      </w:r>
-      <w:r>
-        <w:rPr>
-          <w:rFonts w:ascii="Consolas" w:hAnsi="Consolas"/>
-          <w:color w:val="9C2D41"/>
-        </w:rPr>
-        <w:t xml:space="preserve">APPLY_EMAIL_TO</w:t>
-      </w:r>
-      <w:r>
-        <w:t xml:space="preserve"> || </w:t>
-      </w:r>
-      <w:r>
-        <w:rPr>
-          <w:rFonts w:ascii="Consolas" w:hAnsi="Consolas"/>
-          <w:color w:val="9C2D41"/>
-        </w:rPr>
-        <w:t xml:space="preserve">ERROR_EMAIL_TO</w:t>
-      </w:r>
-      <w:r>
-        <w:t xml:space="preserve">). Anti-spam: a hidden honeypot + the slug must map to a real site. Renders from stored JSON, so live sites get it with no rebuild. (Next: an in-app enquiries inbox + routing the email to the client's own address once accounts exist.)</w:t>
+        <w:t xml:space="preserve"> operator, plus an optional </w:t>
+      </w:r>
+      <w:r>
+        <w:rPr>
+          <w:rFonts w:ascii="Consolas" w:hAnsi="Consolas"/>
+          <w:color w:val="9C2D41"/>
+        </w:rPr>
+        <w:t xml:space="preserve">LEAD_BCC_ALWAYS</w:t>
+      </w:r>
+      <w:r>
+        <w:t xml:space="preserve"> address for testing/oversight), signs it </w:t>
+      </w:r>
+      <w:r>
+        <w:rPr>
+          <w:b/>
+        </w:rPr>
+        <w:t xml:space="preserve">"Powered by Ai Web Point"</w:t>
+      </w:r>
+      <w:r>
+        <w:t xml:space="preserve"> (</w:t>
+      </w:r>
+      <w:r>
+        <w:rPr>
+          <w:rFonts w:ascii="Consolas" w:hAnsi="Consolas"/>
+          <w:color w:val="9C2D41"/>
+        </w:rPr>
+        <w:t xml:space="preserve">AGENCY_NAME</w:t>
+      </w:r>
+      <w:r>
+        <w:t xml:space="preserve">/</w:t>
+      </w:r>
+      <w:r>
+        <w:rPr>
+          <w:rFonts w:ascii="Consolas" w:hAnsi="Consolas"/>
+          <w:color w:val="9C2D41"/>
+        </w:rPr>
+        <w:t xml:space="preserve">AGENCY_URL</w:t>
+      </w:r>
+      <w:r>
+        <w:t xml:space="preserve">, defaulted), and sends a separate </w:t>
+      </w:r>
+      <w:r>
+        <w:rPr>
+          <w:b/>
+        </w:rPr>
+        <w:t xml:space="preserve">confirmation email to the customer</w:t>
+      </w:r>
+      <w:r>
+        <w:t xml:space="preserve"> styled as if from the business. If no owner email is set the notification just comes to you.</w:t>
+      </w:r>
+    </w:p>
+    <w:p>
+      <w:pPr>
+        <w:numPr>
+          <w:ilvl w:val="0"/>
+          <w:numId w:val="1"/>
+        </w:numPr>
+      </w:pPr>
+      <w:r>
+        <w:rPr>
+          <w:b/>
+        </w:rPr>
+        <w:t xml:space="preserve">📨 Enquiries inbox (new tab + `GET /api/enquiries`):</w:t>
+      </w:r>
+      <w:r>
+        <w:t xml:space="preserve"> every stored form submission, newest first,</w:t>
+      </w:r>
+    </w:p>
+    <w:p>
+      <w:r>
+        <w:t xml:space="preserve">searchable, with tap-to-call/tap-to-email. Store-first means leads show here even if an email fails.</w:t>
       </w:r>
     </w:p>
     <w:p>

</xml_diff>

<commit_message>
Docs: enquiry-form abuse caps (per-IP + per-site) + env vars; regenerate DOCS.docx
Co-Authored-By: Claude Fable 5 <noreply@anthropic.com>
</commit_message>
<xml_diff>
--- a/DOCS.docx
+++ b/DOCS.docx
@@ -7446,65 +7446,105 @@
               </w:rPr>
               <w:t xml:space="preserve">LEAD_BCC_ALWAYS?</w:t>
             </w:r>
-          </w:p>
-        </w:tc>
-        <w:tc>
-          <w:tcPr>
-            <w:tcW w:w="0" w:type="auto"/>
-          </w:tcPr>
-          <w:p>
-            <w:r>
-              <w:t xml:space="preserve">Quote-form intake (</w:t>
+            <w:r>
+              <w:t xml:space="preserve">, </w:t>
             </w:r>
             <w:r>
               <w:rPr>
                 <w:rFonts w:ascii="Consolas" w:hAnsi="Consolas"/>
                 <w:color w:val="9C2D41"/>
               </w:rPr>
-              <w:t xml:space="preserve">api/contact.js</w:t>
-            </w:r>
-            <w:r>
-              <w:t xml:space="preserve">). </w:t>
+              <w:t xml:space="preserve">CONTACT_IP_HOURLY?</w:t>
+            </w:r>
+            <w:r>
+              <w:t xml:space="preserve">, </w:t>
             </w:r>
             <w:r>
               <w:rPr>
                 <w:rFonts w:ascii="Consolas" w:hAnsi="Consolas"/>
                 <w:color w:val="9C2D41"/>
               </w:rPr>
-              <w:t xml:space="preserve">LEAD_EMAIL_TO</w:t>
-            </w:r>
-            <w:r>
-              <w:t xml:space="preserve"> = where enquiries go when a site has no owner email set, and the BCC when it does (falls back to </w:t>
+              <w:t xml:space="preserve">CONTACT_SITE_DAILY?</w:t>
+            </w:r>
+          </w:p>
+        </w:tc>
+        <w:tc>
+          <w:tcPr>
+            <w:tcW w:w="0" w:type="auto"/>
+          </w:tcPr>
+          <w:p>
+            <w:r>
+              <w:t xml:space="preserve">Quote-form intake (</w:t>
             </w:r>
             <w:r>
               <w:rPr>
                 <w:rFonts w:ascii="Consolas" w:hAnsi="Consolas"/>
                 <w:color w:val="9C2D41"/>
               </w:rPr>
-              <w:t xml:space="preserve">APPLY_EMAIL_TO</w:t>
-            </w:r>
-            <w:r>
-              <w:t xml:space="preserve">/</w:t>
+              <w:t xml:space="preserve">api/contact.js</w:t>
+            </w:r>
+            <w:r>
+              <w:t xml:space="preserve">). </w:t>
             </w:r>
             <w:r>
               <w:rPr>
                 <w:rFonts w:ascii="Consolas" w:hAnsi="Consolas"/>
                 <w:color w:val="9C2D41"/>
               </w:rPr>
-              <w:t xml:space="preserve">ERROR_EMAIL_TO</w:t>
-            </w:r>
-            <w:r>
-              <w:t xml:space="preserve">). </w:t>
+              <w:t xml:space="preserve">LEAD_EMAIL_TO</w:t>
+            </w:r>
+            <w:r>
+              <w:t xml:space="preserve"> = where enquiries go when a site has no owner email set, and the BCC when it does (falls back to </w:t>
             </w:r>
             <w:r>
               <w:rPr>
                 <w:rFonts w:ascii="Consolas" w:hAnsi="Consolas"/>
                 <w:color w:val="9C2D41"/>
               </w:rPr>
+              <w:t xml:space="preserve">APPLY_EMAIL_TO</w:t>
+            </w:r>
+            <w:r>
+              <w:t xml:space="preserve">/</w:t>
+            </w:r>
+            <w:r>
+              <w:rPr>
+                <w:rFonts w:ascii="Consolas" w:hAnsi="Consolas"/>
+                <w:color w:val="9C2D41"/>
+              </w:rPr>
+              <w:t xml:space="preserve">ERROR_EMAIL_TO</w:t>
+            </w:r>
+            <w:r>
+              <w:t xml:space="preserve">). </w:t>
+            </w:r>
+            <w:r>
+              <w:rPr>
+                <w:rFonts w:ascii="Consolas" w:hAnsi="Consolas"/>
+                <w:color w:val="9C2D41"/>
+              </w:rPr>
               <w:t xml:space="preserve">LEAD_BCC_ALWAYS</w:t>
             </w:r>
             <w:r>
-              <w:t xml:space="preserve"> = optional address copied on every enquiry (testing/oversight).</w:t>
+              <w:t xml:space="preserve"> = optional address copied on every enquiry (testing/oversight). </w:t>
+            </w:r>
+            <w:r>
+              <w:rPr>
+                <w:rFonts w:ascii="Consolas" w:hAnsi="Consolas"/>
+                <w:color w:val="9C2D41"/>
+              </w:rPr>
+              <w:t xml:space="preserve">CONTACT_IP_HOURLY</w:t>
+            </w:r>
+            <w:r>
+              <w:t xml:space="preserve"> (default 5) = per-IP submissions/hour before silent drop. </w:t>
+            </w:r>
+            <w:r>
+              <w:rPr>
+                <w:rFonts w:ascii="Consolas" w:hAnsi="Consolas"/>
+                <w:color w:val="9C2D41"/>
+              </w:rPr>
+              <w:t xml:space="preserve">CONTACT_SITE_DAILY</w:t>
+            </w:r>
+            <w:r>
+              <w:t xml:space="preserve"> (default 50) = per-site email-sending enquiries/day before leads are stored-only.</w:t>
             </w:r>
           </w:p>
         </w:tc>
@@ -10861,6 +10901,102 @@
     <w:p>
       <w:r>
         <w:t xml:space="preserve">searchable, with tap-to-call/tap-to-email. Store-first means leads show here even if an email fails.</w:t>
+      </w:r>
+    </w:p>
+    <w:p>
+      <w:pPr>
+        <w:numPr>
+          <w:ilvl w:val="0"/>
+          <w:numId w:val="1"/>
+        </w:numPr>
+      </w:pPr>
+      <w:r>
+        <w:rPr>
+          <w:b/>
+        </w:rPr>
+        <w:t xml:space="preserve">Enquiry-form abuse caps (new):</w:t>
+      </w:r>
+      <w:r>
+        <w:t xml:space="preserve"> </w:t>
+      </w:r>
+      <w:r>
+        <w:rPr>
+          <w:rFonts w:ascii="Consolas" w:hAnsi="Consolas"/>
+          <w:color w:val="9C2D41"/>
+        </w:rPr>
+        <w:t xml:space="preserve">api/contact.js</w:t>
+      </w:r>
+      <w:r>
+        <w:t xml:space="preserve"> now has a </w:t>
+      </w:r>
+      <w:r>
+        <w:rPr>
+          <w:b/>
+        </w:rPr>
+        <w:t xml:space="preserve">per-IP throttle</w:t>
+      </w:r>
+      <w:r>
+        <w:t xml:space="preserve"> (default 5/hour,</w:t>
+      </w:r>
+    </w:p>
+    <w:p>
+      <w:r>
+        <w:rPr>
+          <w:rFonts w:ascii="Consolas" w:hAnsi="Consolas"/>
+          <w:color w:val="9C2D41"/>
+        </w:rPr>
+        <w:t xml:space="preserve">CONTACT_IP_HOURLY</w:t>
+      </w:r>
+      <w:r>
+        <w:t xml:space="preserve">) that silently drops bot floods, and a </w:t>
+      </w:r>
+      <w:r>
+        <w:rPr>
+          <w:b/>
+        </w:rPr>
+        <w:t xml:space="preserve">per-site daily cap</w:t>
+      </w:r>
+      <w:r>
+        <w:t xml:space="preserve"> (default 50/day, </w:t>
+      </w:r>
+      <w:r>
+        <w:rPr>
+          <w:rFonts w:ascii="Consolas" w:hAnsi="Consolas"/>
+          <w:color w:val="9C2D41"/>
+        </w:rPr>
+        <w:t xml:space="preserve">CONTACT_SITE_DAILY</w:t>
+      </w:r>
+      <w:r>
+        <w:t xml:space="preserve">) on email-sending enquiries. Over the per-site cap the lead is </w:t>
+      </w:r>
+      <w:r>
+        <w:rPr>
+          <w:b/>
+        </w:rPr>
+        <w:t xml:space="preserve">still stored</w:t>
+      </w:r>
+      <w:r>
+        <w:t xml:space="preserve"> (shows in the inbox) but no email is sent, so no single site can run away with the SendGrid quota or the sender reputation. Both use the race-safe append-and-count blob pattern (one tiny event blob under </w:t>
+      </w:r>
+      <w:r>
+        <w:rPr>
+          <w:rFonts w:ascii="Consolas" w:hAnsi="Consolas"/>
+          <w:color w:val="9C2D41"/>
+        </w:rPr>
+        <w:t xml:space="preserve">clrl/</w:t>
+      </w:r>
+      <w:r>
+        <w:t xml:space="preserve">, counted via </w:t>
+      </w:r>
+      <w:r>
+        <w:rPr>
+          <w:rFonts w:ascii="Consolas" w:hAnsi="Consolas"/>
+          <w:color w:val="9C2D41"/>
+        </w:rPr>
+        <w:t xml:space="preserve">list()</w:t>
+      </w:r>
+      <w:r>
+        <w:t xml:space="preserve">, pruned at 24h); the visitor IP is sha256-hashed (no raw IP stored). Rationale captured for the user: transactional email is ~£0.0004 each (Free 100/day, Essentials 50K ~£20/mo), so cost was never the risk; abuse + sender reputation is, hence the caps.</w:t>
       </w:r>
     </w:p>
     <w:p>

</xml_diff>

<commit_message>
Enquiry emails: remove temporary _debug instrumentation; docs + memory close-out
Delivery confirmed end to end (HTML signature, tracking off, business site link in the
customer email). Regenerate DOCS.docx.

Co-Authored-By: Claude Fable 5 <noreply@anthropic.com>
</commit_message>
<xml_diff>
--- a/DOCS.docx
+++ b/DOCS.docx
@@ -7544,7 +7544,27 @@
               <w:t xml:space="preserve">CONTACT_SITE_DAILY</w:t>
             </w:r>
             <w:r>
-              <w:t xml:space="preserve"> (default 50) = per-site email-sending enquiries/day before leads are stored-only.</w:t>
+              <w:t xml:space="preserve"> (default 50) = per-site email-sending enquiries/day before leads are stored-only. </w:t>
+            </w:r>
+            <w:r>
+              <w:rPr>
+                <w:rFonts w:ascii="Consolas" w:hAnsi="Consolas"/>
+                <w:color w:val="9C2D41"/>
+              </w:rPr>
+              <w:t xml:space="preserve">SUBDOMAIN_ROOT</w:t>
+            </w:r>
+            <w:r>
+              <w:t xml:space="preserve"> (default </w:t>
+            </w:r>
+            <w:r>
+              <w:rPr>
+                <w:rFonts w:ascii="Consolas" w:hAnsi="Consolas"/>
+                <w:color w:val="9C2D41"/>
+              </w:rPr>
+              <w:t xml:space="preserve">aiwebpoint.com</w:t>
+            </w:r>
+            <w:r>
+              <w:t xml:space="preserve">) = root used to build the business's live link in the customer email.</w:t>
             </w:r>
           </w:p>
         </w:tc>
@@ -10901,6 +10921,95 @@
     <w:p>
       <w:r>
         <w:t xml:space="preserve">searchable, with tap-to-call/tap-to-email. Store-first means leads show here even if an email fails.</w:t>
+      </w:r>
+    </w:p>
+    <w:p>
+      <w:pPr>
+        <w:numPr>
+          <w:ilvl w:val="0"/>
+          <w:numId w:val="1"/>
+        </w:numPr>
+      </w:pPr>
+      <w:r>
+        <w:rPr>
+          <w:b/>
+        </w:rPr>
+        <w:t xml:space="preserve">Enquiry emails polished + delivery confirmed (new):</w:t>
+      </w:r>
+      <w:r>
+        <w:t xml:space="preserve"> both emails are now </w:t>
+      </w:r>
+      <w:r>
+        <w:rPr>
+          <w:b/>
+        </w:rPr>
+        <w:t xml:space="preserve">HTML</w:t>
+      </w:r>
+      <w:r>
+        <w:t xml:space="preserve"> (with a</w:t>
+      </w:r>
+    </w:p>
+    <w:p>
+      <w:r>
+        <w:t xml:space="preserve">plain-text fallback) so the signature is a clean clickable "Powered by Ai Web Point" link with no raw URL; SendGrid </w:t>
+      </w:r>
+      <w:r>
+        <w:rPr>
+          <w:b/>
+        </w:rPr>
+        <w:t xml:space="preserve">click + open tracking is turned off</w:t>
+      </w:r>
+      <w:r>
+        <w:t xml:space="preserve"> (</w:t>
+      </w:r>
+      <w:r>
+        <w:rPr>
+          <w:rFonts w:ascii="Consolas" w:hAnsi="Consolas"/>
+          <w:color w:val="9C2D41"/>
+        </w:rPr>
+        <w:t xml:space="preserve">tracking_settings</w:t>
+      </w:r>
+      <w:r>
+        <w:t xml:space="preserve">) so links aren't rewritten to the phishing-looking </w:t>
+      </w:r>
+      <w:r>
+        <w:rPr>
+          <w:rFonts w:ascii="Consolas" w:hAnsi="Consolas"/>
+          <w:color w:val="9C2D41"/>
+        </w:rPr>
+        <w:t xml:space="preserve">ct.sendgrid.net/ls/click...</w:t>
+      </w:r>
+      <w:r>
+        <w:t xml:space="preserve">; user fields are HTML-escaped; and the </w:t>
+      </w:r>
+      <w:r>
+        <w:rPr>
+          <w:b/>
+        </w:rPr>
+        <w:t xml:space="preserve">customer confirmation links to the business's own live site</w:t>
+      </w:r>
+      <w:r>
+        <w:t xml:space="preserve"> ("Visit us at </w:t>
+      </w:r>
+      <w:r>
+        <w:rPr>
+          <w:rFonts w:ascii="Consolas" w:hAnsi="Consolas"/>
+          <w:color w:val="9C2D41"/>
+        </w:rPr>
+        <w:t xml:space="preserve">&lt;sub&gt;.aiwebpoint.com</w:t>
+      </w:r>
+      <w:r>
+        <w:t xml:space="preserve">"), built from the trusted </w:t>
+      </w:r>
+      <w:r>
+        <w:rPr>
+          <w:rFonts w:ascii="Consolas" w:hAnsi="Consolas"/>
+          <w:color w:val="9C2D41"/>
+        </w:rPr>
+        <w:t xml:space="preserve">site.subdomain</w:t>
+      </w:r>
+      <w:r>
+        <w:t xml:space="preserve"> (never from visitor input) and shown only when the site is live. SendGrid was found maxed out (trial credits) and upgraded to Essentials 50K; delivery verified end to end. Optional next step: SendGrid domain authentication (SPF/DKIM) for best inbox placement.</w:t>
       </w:r>
     </w:p>
     <w:p>

</xml_diff>

<commit_message>
Customer confirmation email: add business phone (clickable tel:) to the contact footer
Co-Authored-By: Claude Fable 5 <noreply@anthropic.com>
</commit_message>
<xml_diff>
--- a/DOCS.docx
+++ b/DOCS.docx
@@ -10986,10 +10986,38 @@
         <w:rPr>
           <w:b/>
         </w:rPr>
-        <w:t xml:space="preserve">customer confirmation links to the business's own live site</w:t>
-      </w:r>
-      <w:r>
-        <w:t xml:space="preserve"> ("Visit us at </w:t>
+        <w:t xml:space="preserve">customer confirmation has a contact footer</w:t>
+      </w:r>
+      <w:r>
+        <w:t xml:space="preserve"> with the business's </w:t>
+      </w:r>
+      <w:r>
+        <w:rPr>
+          <w:b/>
+        </w:rPr>
+        <w:t xml:space="preserve">phone</w:t>
+      </w:r>
+      <w:r>
+        <w:t xml:space="preserve"> (a clickable </w:t>
+      </w:r>
+      <w:r>
+        <w:rPr>
+          <w:rFonts w:ascii="Consolas" w:hAnsi="Consolas"/>
+          <w:color w:val="9C2D41"/>
+        </w:rPr>
+        <w:t xml:space="preserve">tel:</w:t>
+      </w:r>
+      <w:r>
+        <w:t xml:space="preserve"> link) and its </w:t>
+      </w:r>
+      <w:r>
+        <w:rPr>
+          <w:b/>
+        </w:rPr>
+        <w:t xml:space="preserve">own live site</w:t>
+      </w:r>
+      <w:r>
+        <w:t xml:space="preserve"> ("Call us… / Visit us at </w:t>
       </w:r>
       <w:r>
         <w:rPr>
@@ -10999,7 +11027,17 @@
         <w:t xml:space="preserve">&lt;sub&gt;.aiwebpoint.com</w:t>
       </w:r>
       <w:r>
-        <w:t xml:space="preserve">"), built from the trusted </w:t>
+        <w:t xml:space="preserve">"), both from trusted server data (</w:t>
+      </w:r>
+      <w:r>
+        <w:rPr>
+          <w:rFonts w:ascii="Consolas" w:hAnsi="Consolas"/>
+          <w:color w:val="9C2D41"/>
+        </w:rPr>
+        <w:t xml:space="preserve">site.business.phone</w:t>
+      </w:r>
+      <w:r>
+        <w:t xml:space="preserve">, </w:t>
       </w:r>
       <w:r>
         <w:rPr>
@@ -11009,7 +11047,7 @@
         <w:t xml:space="preserve">site.subdomain</w:t>
       </w:r>
       <w:r>
-        <w:t xml:space="preserve"> (never from visitor input) and shown only when the site is live. SendGrid was found maxed out (trial credits) and upgraded to Essentials 50K; delivery verified end to end. Optional next step: SendGrid domain authentication (SPF/DKIM) for best inbox placement.</w:t>
+        <w:t xml:space="preserve">) never from visitor input; the website line shows only when the site is live. SendGrid was found maxed out (trial credits) and upgraded to Essentials 50K; delivery verified end to end. Optional next step: SendGrid domain authentication (SPF/DKIM) for best inbox placement.</w:t>
       </w:r>
     </w:p>
     <w:p>

</xml_diff>

<commit_message>
Docs: add SendGrid SPF/DKIM domain authentication to the parked/to-do list (item 7); regenerate DOCS.docx
Co-Authored-By: Claude Fable 5 <noreply@anthropic.com>
</commit_message>
<xml_diff>
--- a/DOCS.docx
+++ b/DOCS.docx
@@ -9051,7 +9051,7 @@
         <w:pStyle w:val="Heading3"/>
       </w:pPr>
       <w:r>
-        <w:t xml:space="preserve">⏸️ Parked / on hold (quick reference, as of 2026-06-11)</w:t>
+        <w:t xml:space="preserve">⏸️ Parked / on hold (quick reference, as of 2026-06-13)</w:t>
       </w:r>
     </w:p>
     <w:p>
@@ -9360,6 +9360,62 @@
       </w:r>
       <w:r>
         <w:t xml:space="preserve"> A/B test.</w:t>
+      </w:r>
+    </w:p>
+    <w:p>
+      <w:pPr>
+        <w:numPr>
+          <w:ilvl w:val="0"/>
+          <w:numId w:val="1"/>
+        </w:numPr>
+      </w:pPr>
+      <w:r>
+        <w:rPr>
+          <w:b/>
+        </w:rPr>
+        <w:t xml:space="preserve">SendGrid domain authentication (SPF/DKIM)</w:t>
+      </w:r>
+      <w:r>
+        <w:t xml:space="preserve"> for the enquiry emails (</w:t>
+      </w:r>
+      <w:r>
+        <w:rPr>
+          <w:rFonts w:ascii="Consolas" w:hAnsi="Consolas"/>
+          <w:color w:val="9C2D41"/>
+        </w:rPr>
+        <w:t xml:space="preserve">api/contact.js</w:t>
+      </w:r>
+      <w:r>
+        <w:t xml:space="preserve">).</w:t>
+      </w:r>
+    </w:p>
+    <w:p>
+      <w:r>
+        <w:rPr>
+          <w:b/>
+        </w:rPr>
+        <w:t xml:space="preserve">What:</w:t>
+      </w:r>
+      <w:r>
+        <w:t xml:space="preserve"> in SendGrid → Settings → Sender Authentication → Authenticate Your Domain, then add the CNAME records it gives you at the DNS host for the sending domain. </w:t>
+      </w:r>
+      <w:r>
+        <w:rPr>
+          <w:b/>
+        </w:rPr>
+        <w:t xml:space="preserve">Why:</w:t>
+      </w:r>
+      <w:r>
+        <w:t xml:space="preserve"> mail currently sends and arrives, but authenticating the domain improves long-term inbox placement (less spam-foldering) and lets the "from" be a proper branded address on the agency's own domain. </w:t>
+      </w:r>
+      <w:r>
+        <w:rPr>
+          <w:b/>
+        </w:rPr>
+        <w:t xml:space="preserve">Effort:</w:t>
+      </w:r>
+      <w:r>
+        <w:t xml:space="preserve"> one-time, a few DNS records + a verify click; no code change. Not urgent (delivery already works); a quality step. Flagged to the user 2026-06-13.</w:t>
       </w:r>
     </w:p>
     <w:p>

</xml_diff>

<commit_message>
Embed "AI" wording on operator + landing surfaces (selling point, all true), keep prospect-facing copy personal
- Prowl: "Personalised AI talking points", "Your AI opener", "Gathering AI intel", AI tooltips
- Landing: "AI lead finder", "uses AI to build", "AI-generate a mockup", "AI builds them a homepage", page title
- Docs + memory (new ai-wording-strategy note); regenerate DOCS.docx

Co-Authored-By: Claude Fable 5 <noreply@anthropic.com>
</commit_message>
<xml_diff>
--- a/DOCS.docx
+++ b/DOCS.docx
@@ -10773,6 +10773,43 @@
           <w:b/>
         </w:rPr>
         <w:t xml:space="preserve">2026-06-13</w:t>
+      </w:r>
+    </w:p>
+    <w:p>
+      <w:pPr>
+        <w:numPr>
+          <w:ilvl w:val="0"/>
+          <w:numId w:val="1"/>
+        </w:numPr>
+      </w:pPr>
+      <w:r>
+        <w:rPr>
+          <w:b/>
+        </w:rPr>
+        <w:t xml:space="preserve">"AI" wording embedded as a selling point (operator + landing only, never prospect-facing):</w:t>
+      </w:r>
+    </w:p>
+    <w:p>
+      <w:r>
+        <w:t xml:space="preserve">ride the AI interest while it's genuinely true, but keep it off prospect-facing artifacts (mockups, outreach, live sites, emails) where the personal angle wins and "AI" can erode trust. Changes: Prowl dossier "💬 Personalised what to say" → </w:t>
+      </w:r>
+      <w:r>
+        <w:rPr>
+          <w:b/>
+        </w:rPr>
+        <w:t xml:space="preserve">"💬 Personalised AI talking points"</w:t>
+      </w:r>
+      <w:r>
+        <w:t xml:space="preserve">, "☎️ Open with this" → </w:t>
+      </w:r>
+      <w:r>
+        <w:rPr>
+          <w:b/>
+        </w:rPr>
+        <w:t xml:space="preserve">"☎️ Your AI opener"</w:t>
+      </w:r>
+      <w:r>
+        <w:t xml:space="preserve">, progress "Gathering AI intel…"; search-card tooltips "AI lead intelligence" / "Build them an AI website"; landing page subtitle "AI lead finder…", "uses AI to build…", "AI-generate a professional homepage mockup", "AI builds them a finished homepage", and the page title. All claims are true (OpenAI image + GPT copy/Prowl synthesis). Kept deliberately measured to avoid AI fatigue.</w:t>
       </w:r>
     </w:p>
     <w:p>

</xml_diff>

<commit_message>
Founding-member application email: subject "New SitePounce Lead from <Name>"
Storage (Postgres applications table) + operator-only email already existed; just the
subject/intro wording changed. Docs + DOCS.docx updated.

Co-Authored-By: Claude Fable 5 <noreply@anthropic.com>
</commit_message>
<xml_diff>
--- a/DOCS.docx
+++ b/DOCS.docx
@@ -10773,6 +10773,77 @@
           <w:b/>
         </w:rPr>
         <w:t xml:space="preserve">2026-06-13</w:t>
+      </w:r>
+    </w:p>
+    <w:p>
+      <w:pPr>
+        <w:numPr>
+          <w:ilvl w:val="0"/>
+          <w:numId w:val="1"/>
+        </w:numPr>
+      </w:pPr>
+      <w:r>
+        <w:rPr>
+          <w:b/>
+        </w:rPr>
+        <w:t xml:space="preserve">Founding-member application email:</w:t>
+      </w:r>
+      <w:r>
+        <w:t xml:space="preserve"> subject changed to </w:t>
+      </w:r>
+      <w:r>
+        <w:rPr>
+          <w:b/>
+        </w:rPr>
+        <w:t xml:space="preserve">"New SitePounce Lead from &lt;Name&gt;"</w:t>
+      </w:r>
+      <w:r>
+        <w:t xml:space="preserve"> (was</w:t>
+      </w:r>
+    </w:p>
+    <w:p>
+      <w:r>
+        <w:t xml:space="preserve">"Site Pounce, Founding Member Application: &lt;Name&gt;"). Storage + operator email already existed (</w:t>
+      </w:r>
+      <w:r>
+        <w:rPr>
+          <w:rFonts w:ascii="Consolas" w:hAnsi="Consolas"/>
+          <w:color w:val="9C2D41"/>
+        </w:rPr>
+        <w:t xml:space="preserve">api/apply.js</w:t>
+      </w:r>
+      <w:r>
+        <w:t xml:space="preserve"> → Postgres </w:t>
+      </w:r>
+      <w:r>
+        <w:rPr>
+          <w:rFonts w:ascii="Consolas" w:hAnsi="Consolas"/>
+          <w:color w:val="9C2D41"/>
+        </w:rPr>
+        <w:t xml:space="preserve">applications</w:t>
+      </w:r>
+      <w:r>
+        <w:t xml:space="preserve"> table + a single SendGrid email to you, no applicant confirmation); only the subject/intro wording changed. Recipient = </w:t>
+      </w:r>
+      <w:r>
+        <w:rPr>
+          <w:rFonts w:ascii="Consolas" w:hAnsi="Consolas"/>
+          <w:color w:val="9C2D41"/>
+        </w:rPr>
+        <w:t xml:space="preserve">APPLY_EMAIL_TO</w:t>
+      </w:r>
+      <w:r>
+        <w:t xml:space="preserve"> || </w:t>
+      </w:r>
+      <w:r>
+        <w:rPr>
+          <w:rFonts w:ascii="Consolas" w:hAnsi="Consolas"/>
+          <w:color w:val="9C2D41"/>
+        </w:rPr>
+        <w:t xml:space="preserve">ERROR_EMAIL_TO</w:t>
+      </w:r>
+      <w:r>
+        <w:t xml:space="preserve">.</w:t>
       </w:r>
     </w:p>
     <w:p>

</xml_diff>

<commit_message>
AI Grammar Fix: tidy the first message's {category} grammar on send (checkbox, default on)
- New api/grammar.js (gpt-4o-mini, operator-gated, LIMIT_GRAMMAR 300/20h)
- Templates checkbox "AI Grammar Fix" (setting grammarFix, default true)
- Applied in setupWhatsApp; URLs masked so the tracking link is never altered; one
  call serves wa+sms; session-cached; any failure falls back to the original text
- Docs + memory + DOCS.docx updated

Co-Authored-By: Claude Opus 4.8 <noreply@anthropic.com>
</commit_message>
<xml_diff>
--- a/DOCS.docx
+++ b/DOCS.docx
@@ -5391,6 +5391,18 @@
           <w:rFonts w:ascii="Consolas" w:hAnsi="Consolas"/>
           <w:sz w:val="18"/>
         </w:rPr>
+        <w:t xml:space="preserve">                                       grammar.js   AI Grammar Fix for the first message (gpt-4o-mini)</w:t>
+      </w:r>
+    </w:p>
+    <w:p>
+      <w:pPr>
+        <w:pStyle w:val="Code"/>
+      </w:pPr>
+      <w:r>
+        <w:rPr>
+          <w:rFonts w:ascii="Consolas" w:hAnsi="Consolas"/>
+          <w:sz w:val="18"/>
+        </w:rPr>
         <w:t xml:space="preserve">middleware.js (root)  routes &lt;sub&gt;.aiwebpoint.com → /api/site?sub=</w:t>
       </w:r>
     </w:p>
@@ -7830,17 +7842,47 @@
               <w:t xml:space="preserve">LIMIT_PROWL</w:t>
             </w:r>
             <w:r>
-              <w:t xml:space="preserve"> (default 30, generate 50)</w:t>
-            </w:r>
-          </w:p>
-        </w:tc>
-        <w:tc>
-          <w:tcPr>
-            <w:tcW w:w="0" w:type="auto"/>
-          </w:tcPr>
-          <w:p>
-            <w:r>
-              <w:t xml:space="preserve">Per 20h (RATE_WINDOW_HOURS). Generation counts only on success.</w:t>
+              <w:t xml:space="preserve">/</w:t>
+            </w:r>
+            <w:r>
+              <w:rPr>
+                <w:rFonts w:ascii="Consolas" w:hAnsi="Consolas"/>
+                <w:color w:val="9C2D41"/>
+              </w:rPr>
+              <w:t xml:space="preserve">LIMIT_GRAMMAR</w:t>
+            </w:r>
+            <w:r>
+              <w:t xml:space="preserve"> (default 30, generate 50, grammar 300)</w:t>
+            </w:r>
+          </w:p>
+        </w:tc>
+        <w:tc>
+          <w:tcPr>
+            <w:tcW w:w="0" w:type="auto"/>
+          </w:tcPr>
+          <w:p>
+            <w:r>
+              <w:t xml:space="preserve">Per 20h (RATE_WINDOW_HOURS). Generation counts only on success. </w:t>
+            </w:r>
+            <w:r>
+              <w:rPr>
+                <w:rFonts w:ascii="Consolas" w:hAnsi="Consolas"/>
+                <w:color w:val="9C2D41"/>
+              </w:rPr>
+              <w:t xml:space="preserve">LIMIT_GRAMMAR</w:t>
+            </w:r>
+            <w:r>
+              <w:t xml:space="preserve"> caps the AI Grammar Fix pass (</w:t>
+            </w:r>
+            <w:r>
+              <w:rPr>
+                <w:rFonts w:ascii="Consolas" w:hAnsi="Consolas"/>
+                <w:color w:val="9C2D41"/>
+              </w:rPr>
+              <w:t xml:space="preserve">api/grammar.js</w:t>
+            </w:r>
+            <w:r>
+              <w:t xml:space="preserve">).</w:t>
             </w:r>
           </w:p>
         </w:tc>
@@ -10765,6 +10807,95 @@
     <w:p>
       <w:r>
         <w:t xml:space="preserve">Newest first. Reference sections above are the source of truth; this is a quick history.</w:t>
+      </w:r>
+    </w:p>
+    <w:p>
+      <w:r>
+        <w:rPr>
+          <w:b/>
+        </w:rPr>
+        <w:t xml:space="preserve">2026-06-20</w:t>
+      </w:r>
+    </w:p>
+    <w:p>
+      <w:pPr>
+        <w:numPr>
+          <w:ilvl w:val="0"/>
+          <w:numId w:val="1"/>
+        </w:numPr>
+      </w:pPr>
+      <w:r>
+        <w:rPr>
+          <w:b/>
+        </w:rPr>
+        <w:t xml:space="preserve">✨ AI Grammar Fix (new, default ON):</w:t>
+      </w:r>
+      <w:r>
+        <w:t xml:space="preserve"> a checkbox in Templates. When the </w:t>
+      </w:r>
+      <w:r>
+        <w:rPr>
+          <w:b/>
+        </w:rPr>
+        <w:t xml:space="preserve">first message</w:t>
+      </w:r>
+      <w:r>
+        <w:t xml:space="preserve"> is sent,</w:t>
+      </w:r>
+    </w:p>
+    <w:p>
+      <w:r>
+        <w:t xml:space="preserve">the filled text is passed through </w:t>
+      </w:r>
+      <w:r>
+        <w:rPr>
+          <w:rFonts w:ascii="Consolas" w:hAnsi="Consolas"/>
+          <w:color w:val="9C2D41"/>
+        </w:rPr>
+        <w:t xml:space="preserve">POST /api/grammar</w:t>
+      </w:r>
+      <w:r>
+        <w:t xml:space="preserve"> (gpt-4o-mini) which lightly fixes articles and singular/plural so the </w:t>
+      </w:r>
+      <w:r>
+        <w:rPr>
+          <w:rFonts w:ascii="Consolas" w:hAnsi="Consolas"/>
+          <w:color w:val="9C2D41"/>
+        </w:rPr>
+        <w:t xml:space="preserve">{category}</w:t>
+      </w:r>
+      <w:r>
+        <w:t xml:space="preserve"> substitution reads naturally (e.g. "looking for Electrician" → "looking for an electrician", "a Lawn Mowers" → "a lawn mower company"). Only grammar changes; meaning, tone, links and sign-off are preserved (URLs are masked before the AI sees them, so the tracking link is never altered). Applied in </w:t>
+      </w:r>
+      <w:r>
+        <w:rPr>
+          <w:rFonts w:ascii="Consolas" w:hAnsi="Consolas"/>
+          <w:color w:val="9C2D41"/>
+        </w:rPr>
+        <w:t xml:space="preserve">setupWhatsApp</w:t>
+      </w:r>
+      <w:r>
+        <w:t xml:space="preserve"> (the post-generate send row, the only surface using the </w:t>
+      </w:r>
+      <w:r>
+        <w:rPr>
+          <w:rFonts w:ascii="Consolas" w:hAnsi="Consolas"/>
+          <w:color w:val="9C2D41"/>
+        </w:rPr>
+        <w:t xml:space="preserve">{category}</w:t>
+      </w:r>
+      <w:r>
+        <w:t xml:space="preserve"> first message; warm-leads/lead-profile/dossier use the follow-up template, no category). Raw hrefs are set instantly and swapped for the cleaned version a moment later; cached per message; any failure or an unticked box falls back to the original. Generous cap </w:t>
+      </w:r>
+      <w:r>
+        <w:rPr>
+          <w:rFonts w:ascii="Consolas" w:hAnsi="Consolas"/>
+          <w:color w:val="9C2D41"/>
+        </w:rPr>
+        <w:t xml:space="preserve">LIMIT_GRAMMAR</w:t>
+      </w:r>
+      <w:r>
+        <w:t xml:space="preserve"> (default 300/20h).</w:t>
       </w:r>
     </w:p>
     <w:p>

</xml_diff>

<commit_message>
First message: multiple named templates with a send-time picker (add/edit/delete, last-used default)
- Templates panel manages a list (waTemplates) instead of one waMsg; legacy waMsg auto-migrates
- Mockup send row gains a template picker, defaults to last-used, hidden when only one
- Merge-based patchSettings so template + field edits don't clobber each other
- Grammar Fix runs on the chosen template; follow-up stays single
- Docs + memory + DOCS.docx updated

Co-Authored-By: Claude Opus 4.8 <noreply@anthropic.com>
</commit_message>
<xml_diff>
--- a/DOCS.docx
+++ b/DOCS.docx
@@ -10815,6 +10815,87 @@
           <w:b/>
         </w:rPr>
         <w:t xml:space="preserve">2026-06-20</w:t>
+      </w:r>
+    </w:p>
+    <w:p>
+      <w:pPr>
+        <w:numPr>
+          <w:ilvl w:val="0"/>
+          <w:numId w:val="1"/>
+        </w:numPr>
+      </w:pPr>
+      <w:r>
+        <w:rPr>
+          <w:b/>
+        </w:rPr>
+        <w:t xml:space="preserve">Multiple first-message templates (new):</w:t>
+      </w:r>
+      <w:r>
+        <w:t xml:space="preserve"> Templates now manages a LIST of first-message templates</w:t>
+      </w:r>
+    </w:p>
+    <w:p>
+      <w:r>
+        <w:t xml:space="preserve">(add ➕ / rename / 🗑 delete, each with a name), instead of one fixed message. When you send from the post-generate row, a small picker lets you choose which template to send; it </w:t>
+      </w:r>
+      <w:r>
+        <w:rPr>
+          <w:b/>
+        </w:rPr>
+        <w:t xml:space="preserve">defaults to the last-used one</w:t>
+      </w:r>
+      <w:r>
+        <w:t xml:space="preserve"> and is hidden when there's only one. Stored per device as </w:t>
+      </w:r>
+      <w:r>
+        <w:rPr>
+          <w:rFonts w:ascii="Consolas" w:hAnsi="Consolas"/>
+          <w:color w:val="9C2D41"/>
+        </w:rPr>
+        <w:t xml:space="preserve">waTemplates</w:t>
+      </w:r>
+      <w:r>
+        <w:t xml:space="preserve"> (array of </w:t>
+      </w:r>
+      <w:r>
+        <w:rPr>
+          <w:rFonts w:ascii="Consolas" w:hAnsi="Consolas"/>
+          <w:color w:val="9C2D41"/>
+        </w:rPr>
+        <w:t xml:space="preserve">{id,name,body}</w:t>
+      </w:r>
+      <w:r>
+        <w:t xml:space="preserve">) + </w:t>
+      </w:r>
+      <w:r>
+        <w:rPr>
+          <w:rFonts w:ascii="Consolas" w:hAnsi="Consolas"/>
+          <w:color w:val="9C2D41"/>
+        </w:rPr>
+        <w:t xml:space="preserve">lastTemplateId</w:t>
+      </w:r>
+      <w:r>
+        <w:t xml:space="preserve">; the legacy single </w:t>
+      </w:r>
+      <w:r>
+        <w:rPr>
+          <w:rFonts w:ascii="Consolas" w:hAnsi="Consolas"/>
+          <w:color w:val="9C2D41"/>
+        </w:rPr>
+        <w:t xml:space="preserve">waMsg</w:t>
+      </w:r>
+      <w:r>
+        <w:t xml:space="preserve"> auto-migrates into a "Default" template. Settings persistence moved to a merge-based </w:t>
+      </w:r>
+      <w:r>
+        <w:rPr>
+          <w:rFonts w:ascii="Consolas" w:hAnsi="Consolas"/>
+          <w:color w:val="9C2D41"/>
+        </w:rPr>
+        <w:t xml:space="preserve">patchSettings</w:t>
+      </w:r>
+      <w:r>
+        <w:t xml:space="preserve"> so template edits and field edits don't clobber each other. Grammar Fix runs on whichever template is chosen. (Follow-up message stays a single template.)</w:t>
       </w:r>
     </w:p>
     <w:p>

</xml_diff>

<commit_message>
Templates: Save & lock (read-only message), Duplicate, rename-anytime, groundwork for per-template stats
- Each template has a locked flag; locking makes the message read-only (greyed, 🔒 in list)
- Rename stays allowed when locked; Duplicate makes a fresh editable copy to vary wording
- Stable ids + fixed wording are the foundation for future per-template performance stats
- Docs + memory + DOCS.docx updated

Co-Authored-By: Claude Opus 4.8 <noreply@anthropic.com>
</commit_message>
<xml_diff>
--- a/DOCS.docx
+++ b/DOCS.docx
@@ -10895,7 +10895,72 @@
         <w:t xml:space="preserve">patchSettings</w:t>
       </w:r>
       <w:r>
-        <w:t xml:space="preserve"> so template edits and field edits don't clobber each other. Grammar Fix runs on whichever template is chosen. (Follow-up message stays a single template.)</w:t>
+        <w:t xml:space="preserve"> so template edits and field edits don't clobber each other. Grammar Fix runs on whichever template is chosen. (Follow-up message stays a single template.) New templates start </w:t>
+      </w:r>
+      <w:r>
+        <w:rPr>
+          <w:b/>
+        </w:rPr>
+        <w:t xml:space="preserve">empty</w:t>
+      </w:r>
+      <w:r>
+        <w:t xml:space="preserve"> (placeholder prompts the wording). </w:t>
+      </w:r>
+      <w:r>
+        <w:rPr>
+          <w:b/>
+        </w:rPr>
+        <w:t xml:space="preserve">Save &amp; lock + Duplicate (for future per-template stats):</w:t>
+      </w:r>
+      <w:r>
+        <w:t xml:space="preserve"> each template has a </w:t>
+      </w:r>
+      <w:r>
+        <w:rPr>
+          <w:rFonts w:ascii="Consolas" w:hAnsi="Consolas"/>
+          <w:color w:val="9C2D41"/>
+        </w:rPr>
+        <w:t xml:space="preserve">locked</w:t>
+      </w:r>
+      <w:r>
+        <w:t xml:space="preserve"> flag. A draft is editable; </w:t>
+      </w:r>
+      <w:r>
+        <w:rPr>
+          <w:b/>
+        </w:rPr>
+        <w:t xml:space="preserve">Save &amp; lock</w:t>
+      </w:r>
+      <w:r>
+        <w:t xml:space="preserve"> makes the MESSAGE read-only (greyed, 🔒 in the list) so its wording is fixed and future performance stats stay attributable; you can still </w:t>
+      </w:r>
+      <w:r>
+        <w:rPr>
+          <w:b/>
+        </w:rPr>
+        <w:t xml:space="preserve">rename</w:t>
+      </w:r>
+      <w:r>
+        <w:t xml:space="preserve"> a locked template, and </w:t>
+      </w:r>
+      <w:r>
+        <w:rPr>
+          <w:b/>
+        </w:rPr>
+        <w:t xml:space="preserve">📋 Duplicate</w:t>
+      </w:r>
+      <w:r>
+        <w:t xml:space="preserve"> makes a fresh editable copy to create a variation. Stable template </w:t>
+      </w:r>
+      <w:r>
+        <w:rPr>
+          <w:rFonts w:ascii="Consolas" w:hAnsi="Consolas"/>
+          <w:color w:val="9C2D41"/>
+        </w:rPr>
+        <w:t xml:space="preserve">id</w:t>
+      </w:r>
+      <w:r>
+        <w:t xml:space="preserve">s are the groundwork; recording which template each send used (for the actual stats) is the next step when wanted.</w:t>
       </w:r>
     </w:p>
     <w:p>

</xml_diff>

<commit_message>
Per-template stats: tag sends/opens with the template id + "By message template" Performance table
- link_events.tpl column; link carries &t=<id>; sent/view/cta beacons attribute to the template
- dashboardData.byTemplate aggregation; Performance shows Sent / Viewed % / Demo % / Sign-up per template
- Names resolved locally; only the first-message send tags a template (follow-ups excluded)
- Data starts accumulating now; locking keeps a template's wording (and its numbers) stable
- Docs + memory + DOCS.docx updated

Co-Authored-By: Claude Opus 4.8 <noreply@anthropic.com>
</commit_message>
<xml_diff>
--- a/DOCS.docx
+++ b/DOCS.docx
@@ -10815,6 +10815,127 @@
           <w:b/>
         </w:rPr>
         <w:t xml:space="preserve">2026-06-20</w:t>
+      </w:r>
+    </w:p>
+    <w:p>
+      <w:pPr>
+        <w:numPr>
+          <w:ilvl w:val="0"/>
+          <w:numId w:val="1"/>
+        </w:numPr>
+      </w:pPr>
+      <w:r>
+        <w:rPr>
+          <w:b/>
+        </w:rPr>
+        <w:t xml:space="preserve">Per-template performance tracking (new):</w:t>
+      </w:r>
+      <w:r>
+        <w:t xml:space="preserve"> every send and engagement is now attributed to the</w:t>
+      </w:r>
+    </w:p>
+    <w:p>
+      <w:r>
+        <w:t xml:space="preserve">first-message template used. The preview link carries </w:t>
+      </w:r>
+      <w:r>
+        <w:rPr>
+          <w:rFonts w:ascii="Consolas" w:hAnsi="Consolas"/>
+          <w:color w:val="9C2D41"/>
+        </w:rPr>
+        <w:t xml:space="preserve">&amp;t=&lt;templateId&gt;</w:t>
+      </w:r>
+      <w:r>
+        <w:t xml:space="preserve"> and the </w:t>
+      </w:r>
+      <w:r>
+        <w:rPr>
+          <w:rFonts w:ascii="Consolas" w:hAnsi="Consolas"/>
+          <w:color w:val="9C2D41"/>
+        </w:rPr>
+        <w:t xml:space="preserve">sent</w:t>
+      </w:r>
+      <w:r>
+        <w:t xml:space="preserve"> beacon includes it, so opens (</w:t>
+      </w:r>
+      <w:r>
+        <w:rPr>
+          <w:rFonts w:ascii="Consolas" w:hAnsi="Consolas"/>
+          <w:color w:val="9C2D41"/>
+        </w:rPr>
+        <w:t xml:space="preserve">view</w:t>
+      </w:r>
+      <w:r>
+        <w:t xml:space="preserve">) and demo-clicks (</w:t>
+      </w:r>
+      <w:r>
+        <w:rPr>
+          <w:rFonts w:ascii="Consolas" w:hAnsi="Consolas"/>
+          <w:color w:val="9C2D41"/>
+        </w:rPr>
+        <w:t xml:space="preserve">cta</w:t>
+      </w:r>
+      <w:r>
+        <w:t xml:space="preserve">) attribute back to the template (</w:t>
+      </w:r>
+      <w:r>
+        <w:rPr>
+          <w:rFonts w:ascii="Consolas" w:hAnsi="Consolas"/>
+          <w:color w:val="9C2D41"/>
+        </w:rPr>
+        <w:t xml:space="preserve">link_events.tpl</w:t>
+      </w:r>
+      <w:r>
+        <w:t xml:space="preserve"> column, added via </w:t>
+      </w:r>
+      <w:r>
+        <w:rPr>
+          <w:rFonts w:ascii="Consolas" w:hAnsi="Consolas"/>
+          <w:color w:val="9C2D41"/>
+        </w:rPr>
+        <w:t xml:space="preserve">ALTER TABLE … IF NOT EXISTS</w:t>
+      </w:r>
+      <w:r>
+        <w:t xml:space="preserve">). </w:t>
+      </w:r>
+      <w:r>
+        <w:rPr>
+          <w:rFonts w:ascii="Consolas" w:hAnsi="Consolas"/>
+          <w:color w:val="9C2D41"/>
+        </w:rPr>
+        <w:t xml:space="preserve">api/track.js</w:t>
+      </w:r>
+      <w:r>
+        <w:t xml:space="preserve"> stores it, </w:t>
+      </w:r>
+      <w:r>
+        <w:rPr>
+          <w:rFonts w:ascii="Consolas" w:hAnsi="Consolas"/>
+          <w:color w:val="9C2D41"/>
+        </w:rPr>
+        <w:t xml:space="preserve">dashboardData</w:t>
+      </w:r>
+      <w:r>
+        <w:t xml:space="preserve"> aggregates a </w:t>
+      </w:r>
+      <w:r>
+        <w:rPr>
+          <w:rFonts w:ascii="Consolas" w:hAnsi="Consolas"/>
+          <w:color w:val="9C2D41"/>
+        </w:rPr>
+        <w:t xml:space="preserve">byTemplate</w:t>
+      </w:r>
+      <w:r>
+        <w:t xml:space="preserve"> breakdown (distinct businesses per stage), and Performance shows a </w:t>
+      </w:r>
+      <w:r>
+        <w:rPr>
+          <w:b/>
+        </w:rPr>
+        <w:t xml:space="preserve">🧪 By message template</w:t>
+      </w:r>
+      <w:r>
+        <w:t xml:space="preserve"> table (Sent / Mockup viewed % / Demo % / Sign-up), resolving template names locally from this device. Only the first-message send tags a template (follow-up sends don't). Data starts accumulating immediately; locking a template keeps its wording, and these numbers, stable.</w:t>
       </w:r>
     </w:p>
     <w:p>

</xml_diff>

<commit_message>
By-template stats: add Link? column + with-link vs no-link split (no-link can't track opens)
- Link? column flags whether each template contains {link}, derived locally
- Aggregate "with link" (sent/viewed%/demo%) vs "no link" (sent only, judge on replies)
- Percentages on both the table and the comparison cards
- Docs + memory + DOCS.docx updated

Co-Authored-By: Claude Opus 4.8 <noreply@anthropic.com>
</commit_message>
<xml_diff>
--- a/DOCS.docx
+++ b/DOCS.docx
@@ -10935,7 +10935,62 @@
         <w:t xml:space="preserve">🧪 By message template</w:t>
       </w:r>
       <w:r>
-        <w:t xml:space="preserve"> table (Sent / Mockup viewed % / Demo % / Sign-up), resolving template names locally from this device. Only the first-message send tags a template (follow-up sends don't). Data starts accumulating immediately; locking a template keeps its wording, and these numbers, stable.</w:t>
+        <w:t xml:space="preserve"> table (Template / </w:t>
+      </w:r>
+      <w:r>
+        <w:rPr>
+          <w:b/>
+        </w:rPr>
+        <w:t xml:space="preserve">Link?</w:t>
+      </w:r>
+      <w:r>
+        <w:t xml:space="preserve"> / Sent / Mockup viewed </w:t>
+      </w:r>
+      <w:r>
+        <w:rPr>
+          <w:b/>
+        </w:rPr>
+        <w:t xml:space="preserve">%</w:t>
+      </w:r>
+      <w:r>
+        <w:t xml:space="preserve"> / Demo </w:t>
+      </w:r>
+      <w:r>
+        <w:rPr>
+          <w:b/>
+        </w:rPr>
+        <w:t xml:space="preserve">%</w:t>
+      </w:r>
+      <w:r>
+        <w:t xml:space="preserve"> / Sign-up), resolving template names locally from this device. A </w:t>
+      </w:r>
+      <w:r>
+        <w:rPr>
+          <w:b/>
+        </w:rPr>
+        <w:t xml:space="preserve">Link?</w:t>
+      </w:r>
+      <w:r>
+        <w:t xml:space="preserve"> column flags whether each template contains </w:t>
+      </w:r>
+      <w:r>
+        <w:rPr>
+          <w:rFonts w:ascii="Consolas" w:hAnsi="Consolas"/>
+          <w:color w:val="9C2D41"/>
+        </w:rPr>
+        <w:t xml:space="preserve">{link}</w:t>
+      </w:r>
+      <w:r>
+        <w:t xml:space="preserve">: a template with no link can't track opens/demo-clicks (nothing to click), so the table also shows a </w:t>
+      </w:r>
+      <w:r>
+        <w:rPr>
+          <w:b/>
+        </w:rPr>
+        <w:t xml:space="preserve">with-link vs no-link</w:t>
+      </w:r>
+      <w:r>
+        <w:t xml:space="preserve"> split so those are compared fairly (no-link judged on replies). Only the first-message send tags a template (follow-up sends don't). Data accumulates immediately; locking a template keeps its wording, and these numbers, stable.</w:t>
       </w:r>
     </w:p>
     <w:p>

</xml_diff>

<commit_message>
Templates: automatic V1/V2… version numbers (incremental history, no manual typing)
- Each template gets an auto, never-reused version (v) + monotonic tplSeq; assigned to
  legacy templates and persisted on load
- Shown as a badge in the editor and "V{n} · name" in the edit dropdown, send picker, stats
- Duplicate keeps the name and takes the next version (clean version history); New = next version, empty name
- Docs + memory + DOCS.docx updated

Co-Authored-By: Claude Opus 4.8 <noreply@anthropic.com>
</commit_message>
<xml_diff>
--- a/DOCS.docx
+++ b/DOCS.docx
@@ -10815,6 +10815,95 @@
           <w:b/>
         </w:rPr>
         <w:t xml:space="preserve">2026-06-20</w:t>
+      </w:r>
+    </w:p>
+    <w:p>
+      <w:pPr>
+        <w:numPr>
+          <w:ilvl w:val="0"/>
+          <w:numId w:val="1"/>
+        </w:numPr>
+      </w:pPr>
+      <w:r>
+        <w:rPr>
+          <w:b/>
+        </w:rPr>
+        <w:t xml:space="preserve">Auto template versions (V1, V2…):</w:t>
+      </w:r>
+      <w:r>
+        <w:t xml:space="preserve"> every template gets an automatic, incremental version number</w:t>
+      </w:r>
+    </w:p>
+    <w:p>
+      <w:r>
+        <w:t xml:space="preserve">(no typing "V" yourself), shown as a badge in the editor and as a </w:t>
+      </w:r>
+      <w:r>
+        <w:rPr>
+          <w:rFonts w:ascii="Consolas" w:hAnsi="Consolas"/>
+          <w:color w:val="9C2D41"/>
+        </w:rPr>
+        <w:t xml:space="preserve">V{n} · {name}</w:t>
+      </w:r>
+      <w:r>
+        <w:t xml:space="preserve"> label in the edit dropdown, the send picker, and the By-template stats. Stored as </w:t>
+      </w:r>
+      <w:r>
+        <w:rPr>
+          <w:rFonts w:ascii="Consolas" w:hAnsi="Consolas"/>
+          <w:color w:val="9C2D41"/>
+        </w:rPr>
+        <w:t xml:space="preserve">v</w:t>
+      </w:r>
+      <w:r>
+        <w:t xml:space="preserve"> per template + a monotonic </w:t>
+      </w:r>
+      <w:r>
+        <w:rPr>
+          <w:rFonts w:ascii="Consolas" w:hAnsi="Consolas"/>
+          <w:color w:val="9C2D41"/>
+        </w:rPr>
+        <w:t xml:space="preserve">tplSeq</w:t>
+      </w:r>
+      <w:r>
+        <w:t xml:space="preserve"> counter (assigned/persisted on load via </w:t>
+      </w:r>
+      <w:r>
+        <w:rPr>
+          <w:rFonts w:ascii="Consolas" w:hAnsi="Consolas"/>
+          <w:color w:val="9C2D41"/>
+        </w:rPr>
+        <w:t xml:space="preserve">ensureTemplateVersions</w:t>
+      </w:r>
+      <w:r>
+        <w:t xml:space="preserve">; never reused, even after a delete). </w:t>
+      </w:r>
+      <w:r>
+        <w:rPr>
+          <w:b/>
+        </w:rPr>
+        <w:t xml:space="preserve">Duplicate</w:t>
+      </w:r>
+      <w:r>
+        <w:t xml:space="preserve"> now keeps the same name and takes the </w:t>
+      </w:r>
+      <w:r>
+        <w:rPr>
+          <w:b/>
+        </w:rPr>
+        <w:t xml:space="preserve">next</w:t>
+      </w:r>
+      <w:r>
+        <w:t xml:space="preserve"> version (so "V2 · Plumbers" → "V3 · Plumbers" is a clean version history); </w:t>
+      </w:r>
+      <w:r>
+        <w:rPr>
+          <w:b/>
+        </w:rPr>
+        <w:t xml:space="preserve">New</w:t>
+      </w:r>
+      <w:r>
+        <w:t xml:space="preserve"> starts empty as the next version.</w:t>
       </w:r>
     </w:p>
     <w:p>

</xml_diff>

<commit_message>
Performance: always show "Message template statistics" section with an empty-state (was hidden until data)
Co-Authored-By: Claude Opus 4.8 <noreply@anthropic.com>
</commit_message>
<xml_diff>
--- a/DOCS.docx
+++ b/DOCS.docx
@@ -11015,16 +11015,16 @@
         <w:t xml:space="preserve">byTemplate</w:t>
       </w:r>
       <w:r>
-        <w:t xml:space="preserve"> breakdown (distinct businesses per stage), and Performance shows a </w:t>
-      </w:r>
-      <w:r>
-        <w:rPr>
-          <w:b/>
-        </w:rPr>
-        <w:t xml:space="preserve">🧪 By message template</w:t>
-      </w:r>
-      <w:r>
-        <w:t xml:space="preserve"> table (Template / </w:t>
+        <w:t xml:space="preserve"> breakdown (distinct businesses per stage), and Performance has an always-visible </w:t>
+      </w:r>
+      <w:r>
+        <w:rPr>
+          <w:b/>
+        </w:rPr>
+        <w:t xml:space="preserve">🧪 Message template statistics</w:t>
+      </w:r>
+      <w:r>
+        <w:t xml:space="preserve"> section (empty-state until data lands) with a table (Template version / </w:t>
       </w:r>
       <w:r>
         <w:rPr>

</xml_diff>

<commit_message>
Message direct from search (no mockup) + tidier cards + WhatsApp cap 3
- Search cards rebuilt into a clean icon+label hierarchy: Call list / Message primary,
  Generate mockup marked "1 credit", Block as a small ghost
- New Message modal: send a first message (Call/SMS/WhatsApp, guarded) without a mockup,
  pick a template version; no-link send tracked as dm-<bizkey> with the template id
- dm- sends excluded from the mockup funnel queries, included in Message template stats
- WhatsApp daily cap default 10 -> 3 (warning now fires above 3)
- Docs + memory + DOCS.docx updated

Co-Authored-By: Claude Opus 4.8 <noreply@anthropic.com>
</commit_message>
<xml_diff>
--- a/DOCS.docx
+++ b/DOCS.docx
@@ -10815,6 +10815,111 @@
           <w:b/>
         </w:rPr>
         <w:t xml:space="preserve">2026-06-20</w:t>
+      </w:r>
+    </w:p>
+    <w:p>
+      <w:pPr>
+        <w:numPr>
+          <w:ilvl w:val="0"/>
+          <w:numId w:val="1"/>
+        </w:numPr>
+      </w:pPr>
+      <w:r>
+        <w:rPr>
+          <w:b/>
+        </w:rPr>
+        <w:t xml:space="preserve">💬 Message direct from search (no mockup) + tidier cards:</w:t>
+      </w:r>
+      <w:r>
+        <w:t xml:space="preserve"> search cards were rebuilt into a clean</w:t>
+      </w:r>
+    </w:p>
+    <w:p>
+      <w:r>
+        <w:t xml:space="preserve">hierarchy (icon + label): a primary row (📞 Add to call list · 💬 Message), then 🖼️ Generate mockup marked </w:t>
+      </w:r>
+      <w:r>
+        <w:rPr>
+          <w:b/>
+        </w:rPr>
+        <w:t xml:space="preserve">"1 credit"</w:t>
+      </w:r>
+      <w:r>
+        <w:t xml:space="preserve">, then a small ghost 🚫 Block. The new </w:t>
+      </w:r>
+      <w:r>
+        <w:rPr>
+          <w:b/>
+        </w:rPr>
+        <w:t xml:space="preserve">Message</w:t>
+      </w:r>
+      <w:r>
+        <w:t xml:space="preserve"> action opens a modal to send a first message </w:t>
+      </w:r>
+      <w:r>
+        <w:rPr>
+          <w:b/>
+        </w:rPr>
+        <w:t xml:space="preserve">without generating a mockup</w:t>
+      </w:r>
+      <w:r>
+        <w:t xml:space="preserve"> (saves a credit): pick a template version, then </w:t>
+      </w:r>
+      <w:r>
+        <w:rPr>
+          <w:b/>
+        </w:rPr>
+        <w:t xml:space="preserve">📞 Call / 💬 SMS / 🟢 WhatsApp</w:t>
+      </w:r>
+      <w:r>
+        <w:t xml:space="preserve">. WhatsApp routes through the existing daily-cap guard. No mockup means no link, so it's a </w:t>
+      </w:r>
+      <w:r>
+        <w:rPr>
+          <w:b/>
+        </w:rPr>
+        <w:t xml:space="preserve">no-link send</w:t>
+      </w:r>
+      <w:r>
+        <w:t xml:space="preserve">, recorded against a stable </w:t>
+      </w:r>
+      <w:r>
+        <w:rPr>
+          <w:rFonts w:ascii="Consolas" w:hAnsi="Consolas"/>
+          <w:color w:val="9C2D41"/>
+        </w:rPr>
+        <w:t xml:space="preserve">dm-&lt;bizkey&gt;</w:t>
+      </w:r>
+      <w:r>
+        <w:t xml:space="preserve"> slug so it appears in </w:t>
+      </w:r>
+      <w:r>
+        <w:rPr>
+          <w:b/>
+        </w:rPr>
+        <w:t xml:space="preserve">Message template statistics</w:t>
+      </w:r>
+      <w:r>
+        <w:t xml:space="preserve"> as a no-link send (excluded from the mockup-funnel tables via </w:t>
+      </w:r>
+      <w:r>
+        <w:rPr>
+          <w:rFonts w:ascii="Consolas" w:hAnsi="Consolas"/>
+          <w:color w:val="9C2D41"/>
+        </w:rPr>
+        <w:t xml:space="preserve">slug NOT LIKE 'dm-%'</w:t>
+      </w:r>
+      <w:r>
+        <w:t xml:space="preserve">). Grammar Fix applies to the message. </w:t>
+      </w:r>
+      <w:r>
+        <w:rPr>
+          <w:b/>
+        </w:rPr>
+        <w:t xml:space="preserve">WhatsApp daily cap default lowered 10 → 3</w:t>
+      </w:r>
+      <w:r>
+        <w:t xml:space="preserve"> (low by design for experimenting; the warning now triggers above 3).</w:t>
       </w:r>
     </w:p>
     <w:p>

</xml_diff>

<commit_message>
Prowl: sharper opener + transformation-led talking points (name a competitor), numbered; ban cliches
- Opener is spoken, leads with their situation, ends on a question
- Talking points are punchy/loss-focused, at least one names a real nearby competitor winning online
- Banned corporate cliche phrases in the prompt; talking points now a numbered list
- Old dossiers need Re-run to pick up the new style
- Docs + memory + DOCS.docx updated

Co-Authored-By: Claude Opus 4.8 <noreply@anthropic.com>
</commit_message>
<xml_diff>
--- a/DOCS.docx
+++ b/DOCS.docx
@@ -10815,6 +10815,84 @@
           <w:b/>
         </w:rPr>
         <w:t xml:space="preserve">2026-06-20</w:t>
+      </w:r>
+    </w:p>
+    <w:p>
+      <w:pPr>
+        <w:numPr>
+          <w:ilvl w:val="0"/>
+          <w:numId w:val="1"/>
+        </w:numPr>
+      </w:pPr>
+      <w:r>
+        <w:rPr>
+          <w:b/>
+        </w:rPr>
+        <w:t xml:space="preserve">Prowl opener + talking points, less generic (prompt rewrite):</w:t>
+      </w:r>
+      <w:r>
+        <w:t xml:space="preserve"> the AI opener and 💬 talking</w:t>
+      </w:r>
+    </w:p>
+    <w:p>
+      <w:r>
+        <w:t xml:space="preserve">points were too cheesy/about-us. New </w:t>
+      </w:r>
+      <w:r>
+        <w:rPr>
+          <w:rFonts w:ascii="Consolas" w:hAnsi="Consolas"/>
+          <w:color w:val="9C2D41"/>
+        </w:rPr>
+        <w:t xml:space="preserve">lib/intel.js</w:t>
+      </w:r>
+      <w:r>
+        <w:t xml:space="preserve"> prompt forces: the </w:t>
+      </w:r>
+      <w:r>
+        <w:rPr>
+          <w:b/>
+        </w:rPr>
+        <w:t xml:space="preserve">opener</w:t>
+      </w:r>
+      <w:r>
+        <w:t xml:space="preserve"> to be spoken English that leads with their situation and ends on a question (e.g. "you've got 26 five-star reviews but no website, is that on purpose or never got round to it?"), and the </w:t>
+      </w:r>
+      <w:r>
+        <w:rPr>
+          <w:b/>
+        </w:rPr>
+        <w:t xml:space="preserve">talking points</w:t>
+      </w:r>
+      <w:r>
+        <w:t xml:space="preserve"> to be punchy, transformation/loss focused ("so they think 'I need that'"), with </w:t>
+      </w:r>
+      <w:r>
+        <w:rPr>
+          <w:b/>
+        </w:rPr>
+        <w:t xml:space="preserve">at least one naming a real nearby competitor</w:t>
+      </w:r>
+      <w:r>
+        <w:t xml:space="preserve"> who has a website and is winning the work they're invisible for. Banned the cliché phrases ("reach out", "fantastic reviews", "connect with even more customers", etc.). Talking points are now a </w:t>
+      </w:r>
+      <w:r>
+        <w:rPr>
+          <w:b/>
+        </w:rPr>
+        <w:t xml:space="preserve">numbered</w:t>
+      </w:r>
+      <w:r>
+        <w:t xml:space="preserve"> list (</w:t>
+      </w:r>
+      <w:r>
+        <w:rPr>
+          <w:rFonts w:ascii="Consolas" w:hAnsi="Consolas"/>
+          <w:color w:val="9C2D41"/>
+        </w:rPr>
+        <w:t xml:space="preserve">&lt;ol&gt;</w:t>
+      </w:r>
+      <w:r>
+        <w:t xml:space="preserve">). Existing dossiers need a ↻ Re-run to pick up the new style.</w:t>
       </w:r>
     </w:p>
     <w:p>

</xml_diff>

<commit_message>
Prowl gap->pitch table + company-type filter (by name)
- Each weakness now pairs with a one-line solution (fix + the win); rendered as a 2-col table
- New "Company type" search filter: Any / Limited (Ltd in name) / No Ltd (name heuristic, not Companies House)
- Docs + memory + DOCS.docx updated

Co-Authored-By: Claude Opus 4.8 <noreply@anthropic.com>
</commit_message>
<xml_diff>
--- a/DOCS.docx
+++ b/DOCS.docx
@@ -10815,6 +10815,120 @@
           <w:b/>
         </w:rPr>
         <w:t xml:space="preserve">2026-06-20</w:t>
+      </w:r>
+    </w:p>
+    <w:p>
+      <w:pPr>
+        <w:numPr>
+          <w:ilvl w:val="0"/>
+          <w:numId w:val="1"/>
+        </w:numPr>
+      </w:pPr>
+      <w:r>
+        <w:rPr>
+          <w:b/>
+        </w:rPr>
+        <w:t xml:space="preserve">Prowl "losing out" is now a gap → pitch table:</w:t>
+      </w:r>
+      <w:r>
+        <w:t xml:space="preserve"> each weakness sits next to a one-line **solution</w:t>
+      </w:r>
+    </w:p>
+    <w:p>
+      <w:r>
+        <w:t xml:space="preserve">(the fix + the win)** the operator can say (e.g. "I can have a website live within 24 hours so you show up when locals Google a plumber, and those jobs come to you"). New </w:t>
+      </w:r>
+      <w:r>
+        <w:rPr>
+          <w:rFonts w:ascii="Consolas" w:hAnsi="Consolas"/>
+          <w:color w:val="9C2D41"/>
+        </w:rPr>
+        <w:t xml:space="preserve">solution</w:t>
+      </w:r>
+      <w:r>
+        <w:t xml:space="preserve"> field per weakness in </w:t>
+      </w:r>
+      <w:r>
+        <w:rPr>
+          <w:rFonts w:ascii="Consolas" w:hAnsi="Consolas"/>
+          <w:color w:val="9C2D41"/>
+        </w:rPr>
+        <w:t xml:space="preserve">lib/intel.js</w:t>
+      </w:r>
+      <w:r>
+        <w:t xml:space="preserve">, rendered as a 2-column </w:t>
+      </w:r>
+      <w:r>
+        <w:rPr>
+          <w:rFonts w:ascii="Consolas" w:hAnsi="Consolas"/>
+          <w:color w:val="9C2D41"/>
+        </w:rPr>
+        <w:t xml:space="preserve">.weak-table</w:t>
+      </w:r>
+      <w:r>
+        <w:t xml:space="preserve"> (gap in red/amber, pitch in green, stacks on mobile). Old dossiers show "Re-run to generate" in the pitch column until re-run.</w:t>
+      </w:r>
+    </w:p>
+    <w:p>
+      <w:pPr>
+        <w:numPr>
+          <w:ilvl w:val="0"/>
+          <w:numId w:val="1"/>
+        </w:numPr>
+      </w:pPr>
+      <w:r>
+        <w:rPr>
+          <w:b/>
+        </w:rPr>
+        <w:t xml:space="preserve">Company type filter (by name):</w:t>
+      </w:r>
+      <w:r>
+        <w:t xml:space="preserve"> a new search filter, **Any / Limited (Ltd in name) / No "Ltd" in</w:t>
+      </w:r>
+    </w:p>
+    <w:p>
+      <w:r>
+        <w:t xml:space="preserve">name** (</w:t>
+      </w:r>
+      <w:r>
+        <w:rPr>
+          <w:rFonts w:ascii="Consolas" w:hAnsi="Consolas"/>
+          <w:color w:val="9C2D41"/>
+        </w:rPr>
+        <w:t xml:space="preserve">f-company</w:t>
+      </w:r>
+      <w:r>
+        <w:t xml:space="preserve"> → </w:t>
+      </w:r>
+      <w:r>
+        <w:rPr>
+          <w:rFonts w:ascii="Consolas" w:hAnsi="Consolas"/>
+          <w:color w:val="9C2D41"/>
+        </w:rPr>
+        <w:t xml:space="preserve">filters.company</w:t>
+      </w:r>
+      <w:r>
+        <w:t xml:space="preserve"> → </w:t>
+      </w:r>
+      <w:r>
+        <w:rPr>
+          <w:rFonts w:ascii="Consolas" w:hAnsi="Consolas"/>
+          <w:color w:val="9C2D41"/>
+        </w:rPr>
+        <w:t xml:space="preserve">lib/filters.js</w:t>
+      </w:r>
+      <w:r>
+        <w:t xml:space="preserve"> </w:t>
+      </w:r>
+      <w:r>
+        <w:rPr>
+          <w:rFonts w:ascii="Consolas" w:hAnsi="Consolas"/>
+          <w:color w:val="9C2D41"/>
+        </w:rPr>
+        <w:t xml:space="preserve">matchCompany</w:t>
+      </w:r>
+      <w:r>
+        <w:t xml:space="preserve">). HEURISTIC ONLY: Google gives no company type, so it reads Ltd/Limited/PLC/LLP off the business name. Verified company type still needs Companies House (a per-business Prowl lookup, not feasible across a whole search).</w:t>
       </w:r>
     </w:p>
     <w:p>

</xml_diff>

<commit_message>
Add a rough daily API cost meter (estimate, bottom-right) tracking searches/mockups/prowls/websites
- recordSpend hooks on each paid action; click the pill for a per-action breakdown + disclaimer
- Estimates only (COST_EST constants); real spend is on Google Cloud + OpenAI dashboards
- Docs + memory + DOCS.docx updated

Co-Authored-By: Claude Opus 4.8 <noreply@anthropic.com>
</commit_message>
<xml_diff>
--- a/DOCS.docx
+++ b/DOCS.docx
@@ -10815,6 +10815,77 @@
           <w:b/>
         </w:rPr>
         <w:t xml:space="preserve">2026-06-20</w:t>
+      </w:r>
+    </w:p>
+    <w:p>
+      <w:pPr>
+        <w:numPr>
+          <w:ilvl w:val="0"/>
+          <w:numId w:val="1"/>
+        </w:numPr>
+      </w:pPr>
+      <w:r>
+        <w:rPr>
+          <w:b/>
+        </w:rPr>
+        <w:t xml:space="preserve">💷 Rough API cost meter (new):</w:t>
+      </w:r>
+      <w:r>
+        <w:t xml:space="preserve"> a small fixed pill bottom-right shows an </w:t>
+      </w:r>
+      <w:r>
+        <w:rPr>
+          <w:b/>
+        </w:rPr>
+        <w:t xml:space="preserve">estimated</w:t>
+      </w:r>
+      <w:r>
+        <w:t xml:space="preserve"> running daily</w:t>
+      </w:r>
+    </w:p>
+    <w:p>
+      <w:r>
+        <w:t xml:space="preserve">API spend; click it for a per-action breakdown (Searches / Mockups / Prowls / Websites) + a disclaimer. Client-side: </w:t>
+      </w:r>
+      <w:r>
+        <w:rPr>
+          <w:rFonts w:ascii="Consolas" w:hAnsi="Consolas"/>
+          <w:color w:val="9C2D41"/>
+        </w:rPr>
+        <w:t xml:space="preserve">recordSpend(kind)</w:t>
+      </w:r>
+      <w:r>
+        <w:t xml:space="preserve"> increments </w:t>
+      </w:r>
+      <w:r>
+        <w:rPr>
+          <w:rFonts w:ascii="Consolas" w:hAnsi="Consolas"/>
+          <w:color w:val="9C2D41"/>
+        </w:rPr>
+        <w:t xml:space="preserve">aiwp_spend</w:t>
+      </w:r>
+      <w:r>
+        <w:t xml:space="preserve"> (per-device, resets daily) on each PAID action (search hit, fresh mockup, fresh Prowl </w:t>
+      </w:r>
+      <w:r>
+        <w:rPr>
+          <w:rFonts w:ascii="Consolas" w:hAnsi="Consolas"/>
+          <w:color w:val="9C2D41"/>
+        </w:rPr>
+        <w:t xml:space="preserve">cached:false</w:t>
+      </w:r>
+      <w:r>
+        <w:t xml:space="preserve">, fresh Pounce), costed by the </w:t>
+      </w:r>
+      <w:r>
+        <w:rPr>
+          <w:rFonts w:ascii="Consolas" w:hAnsi="Consolas"/>
+          <w:color w:val="9C2D41"/>
+        </w:rPr>
+        <w:t xml:space="preserve">COST_EST</w:t>
+      </w:r>
+      <w:r>
+        <w:t xml:space="preserve"> constants (USD ballparks: search 0.07, mockup 0.07 [gpt-image-1 medium 1536x1024 ~6c], prowl 0.05, pounce 0.06). Clearly labelled an ESTIMATE, real spend is on the Google Cloud + OpenAI dashboards. NB Google scrapped the universal $200/month free credit, so searches are no longer free. (Search-results CSV export already existed via the ⬇ Export CSV button; past searches don't store their result lists, only criteria.)</w:t>
       </w:r>
     </w:p>
     <w:p>

</xml_diff>

<commit_message>
Cost meter: show per-search estimate on the results banner (scaled by areas); meter accrues real estimated $
Co-Authored-By: Claude Opus 4.8 <noreply@anthropic.com>
</commit_message>
<xml_diff>
--- a/DOCS.docx
+++ b/DOCS.docx
@@ -10885,7 +10885,26 @@
         <w:t xml:space="preserve">COST_EST</w:t>
       </w:r>
       <w:r>
-        <w:t xml:space="preserve"> constants (USD ballparks: search 0.07, mockup 0.07 [gpt-image-1 medium 1536x1024 ~6c], prowl 0.05, pounce 0.06). Clearly labelled an ESTIMATE, real spend is on the Google Cloud + OpenAI dashboards. NB Google scrapped the universal $200/month free credit, so searches are no longer free. (Search-results CSV export already existed via the ⬇ Export CSV button; past searches don't store their result lists, only criteria.)</w:t>
+        <w:t xml:space="preserve"> constants (USD ballparks: search 0.07, mockup 0.07 [gpt-image-1 medium 1536x1024 ~6c], prowl 0.05, pounce 0.06). Clearly labelled an ESTIMATE, real spend is on the Google Cloud + OpenAI dashboards. NB Google scrapped the universal $200/month free credit, so searches are no longer free. </w:t>
+      </w:r>
+      <w:r>
+        <w:rPr>
+          <w:b/>
+        </w:rPr>
+        <w:t xml:space="preserve">Per-search cost</w:t>
+      </w:r>
+      <w:r>
+        <w:t xml:space="preserve"> is also shown on the results banner ("💷 ~$X estimated for this search (N areas)"), scaled by how many areas the deep search queried; the meter now accrues actual estimated dollars (</w:t>
+      </w:r>
+      <w:r>
+        <w:rPr>
+          <w:rFonts w:ascii="Consolas" w:hAnsi="Consolas"/>
+          <w:color w:val="9C2D41"/>
+        </w:rPr>
+        <w:t xml:space="preserve">COST_EST.search</w:t>
+      </w:r>
+      <w:r>
+        <w:t xml:space="preserve"> is per area). (Search-results CSV export already existed via the ⬇ Export CSV button; past searches don't store their result lists, only criteria.)</w:t>
       </w:r>
     </w:p>
     <w:p>

</xml_diff>

<commit_message>
"Want more?" suggestions + 45-day search-results retention with date-range export
- Want-more panel under results: related search terms (curated) + nearby areas, one-click prefill (no auto-run)
- Banner lead count updates after Load more; clearer "that's everything" message points to the panel
- Each search's results saved on device for RESULT_RETENTION_DAYS (45, configurable for future per-tier)
- Recent searches: per-row CSV export + retention note; new Export dialog with date range + keyword/area filters
- Docs + memory + DOCS.docx updated

Co-Authored-By: Claude Opus 4.8 <noreply@anthropic.com>
</commit_message>
<xml_diff>
--- a/DOCS.docx
+++ b/DOCS.docx
@@ -10815,6 +10815,142 @@
           <w:b/>
         </w:rPr>
         <w:t xml:space="preserve">2026-06-20</w:t>
+      </w:r>
+    </w:p>
+    <w:p>
+      <w:pPr>
+        <w:numPr>
+          <w:ilvl w:val="0"/>
+          <w:numId w:val="1"/>
+        </w:numPr>
+      </w:pPr>
+      <w:r>
+        <w:rPr>
+          <w:b/>
+        </w:rPr>
+        <w:t xml:space="preserve">🔎 "Want more?" suggestions (new):</w:t>
+      </w:r>
+      <w:r>
+        <w:t xml:space="preserve"> below the results, a panel offers one-click ways to get more</w:t>
+      </w:r>
+    </w:p>
+    <w:p>
+      <w:r>
+        <w:t xml:space="preserve">leads, </w:t>
+      </w:r>
+      <w:r>
+        <w:rPr>
+          <w:b/>
+        </w:rPr>
+        <w:t xml:space="preserve">related search terms</w:t>
+      </w:r>
+      <w:r>
+        <w:t xml:space="preserve"> (curated per-trade list + generic fallback, client-side, no cost) and </w:t>
+      </w:r>
+      <w:r>
+        <w:rPr>
+          <w:b/>
+        </w:rPr>
+        <w:t xml:space="preserve">nearby areas</w:t>
+      </w:r>
+      <w:r>
+        <w:t xml:space="preserve"> (the towns this search expanded into). Clicking a chip pre-fills the search box and scrolls to the top (it does NOT auto-run, so you choose when to spend). Also: the banner's lead count now updates after Load more, and the "that's everything" message points you to the panel.</w:t>
+      </w:r>
+    </w:p>
+    <w:p>
+      <w:pPr>
+        <w:numPr>
+          <w:ilvl w:val="0"/>
+          <w:numId w:val="1"/>
+        </w:numPr>
+      </w:pPr>
+      <w:r>
+        <w:rPr>
+          <w:b/>
+        </w:rPr>
+        <w:t xml:space="preserve">💾 45-day search-results retention + export with date range (new):</w:t>
+      </w:r>
+      <w:r>
+        <w:t xml:space="preserve"> every search's results are now</w:t>
+      </w:r>
+    </w:p>
+    <w:p>
+      <w:r>
+        <w:t xml:space="preserve">saved on the device for </w:t>
+      </w:r>
+      <w:r>
+        <w:rPr>
+          <w:b/>
+        </w:rPr>
+        <w:t xml:space="preserve">`RESULT_RETENTION_DAYS` (45, configurable, Super Admin / future per-tier)</w:t>
+      </w:r>
+      <w:r>
+        <w:t xml:space="preserve">, then auto-deleted. Stored in </w:t>
+      </w:r>
+      <w:r>
+        <w:rPr>
+          <w:rFonts w:ascii="Consolas" w:hAnsi="Consolas"/>
+          <w:color w:val="9C2D41"/>
+        </w:rPr>
+        <w:t xml:space="preserve">aiwp_search_results</w:t>
+      </w:r>
+      <w:r>
+        <w:t xml:space="preserve"> keyed by a search id (slim business fields only), with quota-guarded writes (evicts oldest if full). The </w:t>
+      </w:r>
+      <w:r>
+        <w:rPr>
+          <w:b/>
+        </w:rPr>
+        <w:t xml:space="preserve">Recent searches</w:t>
+      </w:r>
+      <w:r>
+        <w:t xml:space="preserve"> table shows a per-row </w:t>
+      </w:r>
+      <w:r>
+        <w:rPr>
+          <w:b/>
+        </w:rPr>
+        <w:t xml:space="preserve">⬇ CSV</w:t>
+      </w:r>
+      <w:r>
+        <w:t xml:space="preserve"> (export that one search) and a retention note; expired rows show a dash. A new </w:t>
+      </w:r>
+      <w:r>
+        <w:rPr>
+          <w:b/>
+        </w:rPr>
+        <w:t xml:space="preserve">⬇ Export…</w:t>
+      </w:r>
+      <w:r>
+        <w:t xml:space="preserve"> dialog (</w:t>
+      </w:r>
+      <w:r>
+        <w:rPr>
+          <w:rFonts w:ascii="Consolas" w:hAnsi="Consolas"/>
+          <w:color w:val="9C2D41"/>
+        </w:rPr>
+        <w:t xml:space="preserve">#exp-modal</w:t>
+      </w:r>
+      <w:r>
+        <w:t xml:space="preserve">) exports across searches by </w:t>
+      </w:r>
+      <w:r>
+        <w:rPr>
+          <w:b/>
+        </w:rPr>
+        <w:t xml:space="preserve">date range</w:t>
+      </w:r>
+      <w:r>
+        <w:t xml:space="preserve"> (7/30/45 days or custom From/To) with optional </w:t>
+      </w:r>
+      <w:r>
+        <w:rPr>
+          <w:b/>
+        </w:rPr>
+        <w:t xml:space="preserve">keyword / area</w:t>
+      </w:r>
+      <w:r>
+        <w:t xml:space="preserve"> filters, combined into one CSV with source columns. (The live current-search ⬇ Export CSV button is unchanged.)</w:t>
       </w:r>
     </w:p>
     <w:p>

</xml_diff>

<commit_message>
Export: unify both buttons into one dialog with a "what to export" choice (this search vs date range)
The results-area Export button did an instant download instead of showing options; now both it and the
Recent-searches button open the same dialog, defaulting to the right scope.

Co-Authored-By: Claude Opus 4.8 <noreply@anthropic.com>
</commit_message>
<xml_diff>
--- a/DOCS.docx
+++ b/DOCS.docx
@@ -10913,16 +10913,25 @@
         <w:t xml:space="preserve">⬇ CSV</w:t>
       </w:r>
       <w:r>
-        <w:t xml:space="preserve"> (export that one search) and a retention note; expired rows show a dash. A new </w:t>
-      </w:r>
-      <w:r>
-        <w:rPr>
-          <w:b/>
-        </w:rPr>
-        <w:t xml:space="preserve">⬇ Export…</w:t>
-      </w:r>
-      <w:r>
-        <w:t xml:space="preserve"> dialog (</w:t>
+        <w:t xml:space="preserve"> (export that one search) and a retention note; expired rows show a dash. </w:t>
+      </w:r>
+      <w:r>
+        <w:rPr>
+          <w:b/>
+        </w:rPr>
+        <w:t xml:space="preserve">Both</w:t>
+      </w:r>
+      <w:r>
+        <w:t xml:space="preserve"> the results-area button and the Recent-searches button now open ONE </w:t>
+      </w:r>
+      <w:r>
+        <w:rPr>
+          <w:b/>
+        </w:rPr>
+        <w:t xml:space="preserve">⬇ Export… dialog</w:t>
+      </w:r>
+      <w:r>
+        <w:t xml:space="preserve"> (</w:t>
       </w:r>
       <w:r>
         <w:rPr>
@@ -10932,25 +10941,45 @@
         <w:t xml:space="preserve">#exp-modal</w:t>
       </w:r>
       <w:r>
-        <w:t xml:space="preserve">) exports across searches by </w:t>
-      </w:r>
-      <w:r>
-        <w:rPr>
-          <w:b/>
-        </w:rPr>
-        <w:t xml:space="preserve">date range</w:t>
-      </w:r>
-      <w:r>
-        <w:t xml:space="preserve"> (7/30/45 days or custom From/To) with optional </w:t>
-      </w:r>
-      <w:r>
-        <w:rPr>
-          <w:b/>
-        </w:rPr>
-        <w:t xml:space="preserve">keyword / area</w:t>
-      </w:r>
-      <w:r>
-        <w:t xml:space="preserve"> filters, combined into one CSV with source columns. (The live current-search ⬇ Export CSV button is unchanged.)</w:t>
+        <w:t xml:space="preserve">) with a "What to export" choice: </w:t>
+      </w:r>
+      <w:r>
+        <w:rPr>
+          <w:b/>
+        </w:rPr>
+        <w:t xml:space="preserve">This search</w:t>
+      </w:r>
+      <w:r>
+        <w:t xml:space="preserve"> (the live on-screen results, via </w:t>
+      </w:r>
+      <w:r>
+        <w:rPr>
+          <w:rFonts w:ascii="Consolas" w:hAnsi="Consolas"/>
+          <w:color w:val="9C2D41"/>
+        </w:rPr>
+        <w:t xml:space="preserve">exportSearchCsv</w:t>
+      </w:r>
+      <w:r>
+        <w:t xml:space="preserve">, includes status/prowled/messaged) or </w:t>
+      </w:r>
+      <w:r>
+        <w:rPr>
+          <w:b/>
+        </w:rPr>
+        <w:t xml:space="preserve">Saved searches by date range</w:t>
+      </w:r>
+      <w:r>
+        <w:t xml:space="preserve"> (7/30/45 days or custom From/To + optional keyword/area, combined into one CSV with source columns). </w:t>
+      </w:r>
+      <w:r>
+        <w:rPr>
+          <w:rFonts w:ascii="Consolas" w:hAnsi="Consolas"/>
+          <w:color w:val="9C2D41"/>
+        </w:rPr>
+        <w:t xml:space="preserve">openExport(scope)</w:t>
+      </w:r>
+      <w:r>
+        <w:t xml:space="preserve"> sets the default per button.</w:t>
       </w:r>
     </w:p>
     <w:p>

</xml_diff>

<commit_message>
Flag new vs already-seen search results (chip + count + "New only" filter)
Seen = in an earlier saved search, or already mockup'd/messaged/blocked (by place id). Helps when
related-term/area searches overlap.

Co-Authored-By: Claude Opus 4.8 <noreply@anthropic.com>
</commit_message>
<xml_diff>
--- a/DOCS.docx
+++ b/DOCS.docx
@@ -10815,6 +10815,65 @@
           <w:b/>
         </w:rPr>
         <w:t xml:space="preserve">2026-06-20</w:t>
+      </w:r>
+    </w:p>
+    <w:p>
+      <w:pPr>
+        <w:numPr>
+          <w:ilvl w:val="0"/>
+          <w:numId w:val="1"/>
+        </w:numPr>
+      </w:pPr>
+      <w:r>
+        <w:rPr>
+          <w:b/>
+        </w:rPr>
+        <w:t xml:space="preserve">✨ New vs already-seen results (new):</w:t>
+      </w:r>
+      <w:r>
+        <w:t xml:space="preserve"> each search card is flagged </w:t>
+      </w:r>
+      <w:r>
+        <w:rPr>
+          <w:b/>
+        </w:rPr>
+        <w:t xml:space="preserve">✨ New</w:t>
+      </w:r>
+      <w:r>
+        <w:t xml:space="preserve"> or </w:t>
+      </w:r>
+      <w:r>
+        <w:rPr>
+          <w:b/>
+        </w:rPr>
+        <w:t xml:space="preserve">Seen before</w:t>
+      </w:r>
+      <w:r>
+        <w:t xml:space="preserve">, and</w:t>
+      </w:r>
+    </w:p>
+    <w:p>
+      <w:r>
+        <w:t xml:space="preserve">the toolbar shows a count ("✨ N new · M already in your lists") plus a </w:t>
+      </w:r>
+      <w:r>
+        <w:rPr>
+          <w:b/>
+        </w:rPr>
+        <w:t xml:space="preserve">✨ New only</w:t>
+      </w:r>
+      <w:r>
+        <w:t xml:space="preserve"> toggle to hide the ones you already have. "Seen" = appeared in an earlier saved search (excluding the current one), or already mockup'd / messaged / blocked (</w:t>
+      </w:r>
+      <w:r>
+        <w:rPr>
+          <w:rFonts w:ascii="Consolas" w:hAnsi="Consolas"/>
+          <w:color w:val="9C2D41"/>
+        </w:rPr>
+        <w:t xml:space="preserve">seenBusinessIds</w:t>
+      </w:r>
+      <w:r>
+        <w:t xml:space="preserve">, by Google place id). Seen cards are dimmed.</w:t>
       </w:r>
     </w:p>
     <w:p>

</xml_diff>

<commit_message>
Docs + tracker: Clerk auth (env vars, dormant-flag activation steps); update memory
Co-Authored-By: Claude Opus 4.8 <noreply@anthropic.com>
</commit_message>
<xml_diff>
--- a/DOCS.docx
+++ b/DOCS.docx
@@ -7680,7 +7680,163 @@
           </w:tcPr>
           <w:p>
             <w:r>
-              <w:t xml:space="preserve">Login; cookie HMAC keyed by the password.</w:t>
+              <w:t xml:space="preserve">Legacy login; cookie HMAC keyed by the password. Stays live + as a fallback even after Clerk is on.</w:t>
+            </w:r>
+          </w:p>
+        </w:tc>
+      </w:tr>
+      <w:tr>
+        <w:tc>
+          <w:tcPr>
+            <w:tcW w:w="0" w:type="auto"/>
+          </w:tcPr>
+          <w:p>
+            <w:r>
+              <w:t xml:space="preserve">Auth (Clerk)</w:t>
+            </w:r>
+          </w:p>
+        </w:tc>
+        <w:tc>
+          <w:tcPr>
+            <w:tcW w:w="0" w:type="auto"/>
+          </w:tcPr>
+          <w:p>
+            <w:r>
+              <w:rPr>
+                <w:rFonts w:ascii="Consolas" w:hAnsi="Consolas"/>
+                <w:color w:val="9C2D41"/>
+              </w:rPr>
+              <w:t xml:space="preserve">CLERK_SECRET_KEY?</w:t>
+            </w:r>
+            <w:r>
+              <w:t xml:space="preserve">, </w:t>
+            </w:r>
+            <w:r>
+              <w:rPr>
+                <w:rFonts w:ascii="Consolas" w:hAnsi="Consolas"/>
+                <w:color w:val="9C2D41"/>
+              </w:rPr>
+              <w:t xml:space="preserve">ALLOWED_EMAILS?</w:t>
+            </w:r>
+            <w:r>
+              <w:t xml:space="preserve">, </w:t>
+            </w:r>
+            <w:r>
+              <w:rPr>
+                <w:rFonts w:ascii="Consolas" w:hAnsi="Consolas"/>
+                <w:color w:val="9C2D41"/>
+              </w:rPr>
+              <w:t xml:space="preserve">CLERK_ISSUER?</w:t>
+            </w:r>
+          </w:p>
+        </w:tc>
+        <w:tc>
+          <w:tcPr>
+            <w:tcW w:w="0" w:type="auto"/>
+          </w:tcPr>
+          <w:p>
+            <w:r>
+              <w:t xml:space="preserve">Clerk session auth (Phase 1 B). </w:t>
+            </w:r>
+            <w:r>
+              <w:rPr>
+                <w:rFonts w:ascii="Consolas" w:hAnsi="Consolas"/>
+                <w:color w:val="9C2D41"/>
+              </w:rPr>
+              <w:t xml:space="preserve">CLERK_SECRET_KEY</w:t>
+            </w:r>
+            <w:r>
+              <w:t xml:space="preserve"> present = the backend on-switch (</w:t>
+            </w:r>
+            <w:r>
+              <w:rPr>
+                <w:rFonts w:ascii="Consolas" w:hAnsi="Consolas"/>
+                <w:color w:val="9C2D41"/>
+              </w:rPr>
+              <w:t xml:space="preserve">api/clerk-session.js</w:t>
+            </w:r>
+            <w:r>
+              <w:t xml:space="preserve">); </w:t>
+            </w:r>
+            <w:r>
+              <w:rPr>
+                <w:rFonts w:ascii="Consolas" w:hAnsi="Consolas"/>
+                <w:color w:val="9C2D41"/>
+              </w:rPr>
+              <w:t xml:space="preserve">ALLOWED_EMAILS</w:t>
+            </w:r>
+            <w:r>
+              <w:t xml:space="preserve"> (comma list) = who may sign in (empty = nobody, safe default); </w:t>
+            </w:r>
+            <w:r>
+              <w:rPr>
+                <w:rFonts w:ascii="Consolas" w:hAnsi="Consolas"/>
+                <w:color w:val="9C2D41"/>
+              </w:rPr>
+              <w:t xml:space="preserve">CLERK_ISSUER</w:t>
+            </w:r>
+            <w:r>
+              <w:t xml:space="preserve"> defaults to the dev instance </w:t>
+            </w:r>
+            <w:r>
+              <w:rPr>
+                <w:rFonts w:ascii="Consolas" w:hAnsi="Consolas"/>
+                <w:color w:val="9C2D41"/>
+              </w:rPr>
+              <w:t xml:space="preserve">https://major-cod-60.clerk.accounts.dev</w:t>
+            </w:r>
+            <w:r>
+              <w:t xml:space="preserve">. The publishable key is public and lives in </w:t>
+            </w:r>
+            <w:r>
+              <w:rPr>
+                <w:rFonts w:ascii="Consolas" w:hAnsi="Consolas"/>
+                <w:color w:val="9C2D41"/>
+              </w:rPr>
+              <w:t xml:space="preserve">public/index.html</w:t>
+            </w:r>
+            <w:r>
+              <w:t xml:space="preserve"> (</w:t>
+            </w:r>
+            <w:r>
+              <w:rPr>
+                <w:rFonts w:ascii="Consolas" w:hAnsi="Consolas"/>
+                <w:color w:val="9C2D41"/>
+              </w:rPr>
+              <w:t xml:space="preserve">window.AIWP_CLERK</w:t>
+            </w:r>
+            <w:r>
+              <w:t xml:space="preserve">), gated by </w:t>
+            </w:r>
+            <w:r>
+              <w:rPr>
+                <w:rFonts w:ascii="Consolas" w:hAnsi="Consolas"/>
+                <w:color w:val="9C2D41"/>
+              </w:rPr>
+              <w:t xml:space="preserve">enabled</w:t>
+            </w:r>
+            <w:r>
+              <w:t xml:space="preserve">. Verified with zero-dep JWKS (</w:t>
+            </w:r>
+            <w:r>
+              <w:rPr>
+                <w:rFonts w:ascii="Consolas" w:hAnsi="Consolas"/>
+                <w:color w:val="9C2D41"/>
+              </w:rPr>
+              <w:t xml:space="preserve">lib/clerkauth.js</w:t>
+            </w:r>
+            <w:r>
+              <w:t xml:space="preserve">) then exchanged for the </w:t>
+            </w:r>
+            <w:r>
+              <w:rPr>
+                <w:rFonts w:ascii="Consolas" w:hAnsi="Consolas"/>
+                <w:color w:val="9C2D41"/>
+              </w:rPr>
+              <w:t xml:space="preserve">aiwp</w:t>
+            </w:r>
+            <w:r>
+              <w:t xml:space="preserve"> cookie, so other endpoints are unchanged.</w:t>
             </w:r>
           </w:p>
         </w:tc>

</xml_diff>

<commit_message>
Docs + memory: per-tier retention + longer search lists
Co-Authored-By: Claude Opus 4.8 <noreply@anthropic.com>
</commit_message>
<xml_diff>
--- a/DOCS.docx
+++ b/DOCS.docx
@@ -931,7 +931,52 @@
         <w:t xml:space="preserve">Deep paging + server-side filtering</w:t>
       </w:r>
       <w:r>
-        <w:t xml:space="preserve"> (scans ~60 results, not just top 10).</w:t>
+        <w:t xml:space="preserve"> (scans ~60 results per town, not just top 10).</w:t>
+      </w:r>
+    </w:p>
+    <w:p>
+      <w:pPr>
+        <w:numPr>
+          <w:ilvl w:val="0"/>
+          <w:numId w:val="1"/>
+        </w:numPr>
+      </w:pPr>
+      <w:r>
+        <w:rPr>
+          <w:b/>
+        </w:rPr>
+        <w:t xml:space="preserve">Max matches</w:t>
+      </w:r>
+      <w:r>
+        <w:t xml:space="preserve"> selector (10 / 20 / 50 / 100 / 150, default </w:t>
+      </w:r>
+      <w:r>
+        <w:rPr>
+          <w:b/>
+        </w:rPr>
+        <w:t xml:space="preserve">50</w:t>
+      </w:r>
+      <w:r>
+        <w:t xml:space="preserve">); server caps the target (</w:t>
+      </w:r>
+      <w:r>
+        <w:rPr>
+          <w:rFonts w:ascii="Consolas" w:hAnsi="Consolas"/>
+          <w:color w:val="9C2D41"/>
+        </w:rPr>
+        <w:t xml:space="preserve">want</w:t>
+      </w:r>
+      <w:r>
+        <w:t xml:space="preserve">) at </w:t>
+      </w:r>
+      <w:r>
+        <w:rPr>
+          <w:b/>
+        </w:rPr>
+        <w:t xml:space="preserve">150</w:t>
+      </w:r>
+      <w:r>
+        <w:t xml:space="preserve">.</w:t>
       </w:r>
     </w:p>
     <w:p>
@@ -953,7 +998,25 @@
     </w:p>
     <w:p>
       <w:r>
-        <w:t xml:space="preserve">nearest towns/suburbs and searches those too, so "Birmingham had 1" → "21 across nearby areas".</w:t>
+        <w:t xml:space="preserve">nearest towns/suburbs and searches those too, so "Birmingham had 1" → "21 across nearby areas". Expansion is </w:t>
+      </w:r>
+      <w:r>
+        <w:rPr>
+          <w:b/>
+        </w:rPr>
+        <w:t xml:space="preserve">demand-driven</w:t>
+      </w:r>
+      <w:r>
+        <w:t xml:space="preserve"> (up to </w:t>
+      </w:r>
+      <w:r>
+        <w:rPr>
+          <w:b/>
+        </w:rPr>
+        <w:t xml:space="preserve">15</w:t>
+      </w:r>
+      <w:r>
+        <w:t xml:space="preserve"> nearby areas) and stops the moment the target is met, so a bigger "Max matches" only digs more areas (and costs more) when it actually needs to. The search function runs up to 60s to allow these larger multi-area pulls.</w:t>
       </w:r>
     </w:p>
     <w:p>
@@ -11091,16 +11154,93 @@
     </w:p>
     <w:p>
       <w:r>
-        <w:t xml:space="preserve">saved on the device for </w:t>
-      </w:r>
-      <w:r>
-        <w:rPr>
-          <w:b/>
-        </w:rPr>
-        <w:t xml:space="preserve">`RESULT_RETENTION_DAYS` (45, configurable, Super Admin / future per-tier)</w:t>
-      </w:r>
-      <w:r>
-        <w:t xml:space="preserve">, then auto-deleted. Stored in </w:t>
+        <w:t xml:space="preserve">saved on the device for a </w:t>
+      </w:r>
+      <w:r>
+        <w:rPr>
+          <w:b/>
+        </w:rPr>
+        <w:t xml:space="preserve">per-tier retention window</w:t>
+      </w:r>
+      <w:r>
+        <w:t xml:space="preserve"> (</w:t>
+      </w:r>
+      <w:r>
+        <w:rPr>
+          <w:rFonts w:ascii="Consolas" w:hAnsi="Consolas"/>
+          <w:color w:val="9C2D41"/>
+        </w:rPr>
+        <w:t xml:space="preserve">RETENTION_BY_TIER</w:t>
+      </w:r>
+      <w:r>
+        <w:t xml:space="preserve">: Scout </w:t>
+      </w:r>
+      <w:r>
+        <w:rPr>
+          <w:b/>
+        </w:rPr>
+        <w:t xml:space="preserve">14</w:t>
+      </w:r>
+      <w:r>
+        <w:t xml:space="preserve"> / Hunter </w:t>
+      </w:r>
+      <w:r>
+        <w:rPr>
+          <w:b/>
+        </w:rPr>
+        <w:t xml:space="preserve">45</w:t>
+      </w:r>
+      <w:r>
+        <w:t xml:space="preserve"> / Apex </w:t>
+      </w:r>
+      <w:r>
+        <w:rPr>
+          <w:b/>
+        </w:rPr>
+        <w:t xml:space="preserve">120</w:t>
+      </w:r>
+      <w:r>
+        <w:t xml:space="preserve"> days), resolved by </w:t>
+      </w:r>
+      <w:r>
+        <w:rPr>
+          <w:rFonts w:ascii="Consolas" w:hAnsi="Consolas"/>
+          <w:color w:val="9C2D41"/>
+        </w:rPr>
+        <w:t xml:space="preserve">retentionDays()</w:t>
+      </w:r>
+      <w:r>
+        <w:t xml:space="preserve"> from the settings </w:t>
+      </w:r>
+      <w:r>
+        <w:rPr>
+          <w:rFonts w:ascii="Consolas" w:hAnsi="Consolas"/>
+          <w:color w:val="9C2D41"/>
+        </w:rPr>
+        <w:t xml:space="preserve">plan</w:t>
+      </w:r>
+      <w:r>
+        <w:t xml:space="preserve"> (owner defaults to </w:t>
+      </w:r>
+      <w:r>
+        <w:rPr>
+          <w:rFonts w:ascii="Consolas" w:hAnsi="Consolas"/>
+          <w:color w:val="9C2D41"/>
+        </w:rPr>
+        <w:t xml:space="preserve">apex</w:t>
+      </w:r>
+      <w:r>
+        <w:t xml:space="preserve">) with an optional </w:t>
+      </w:r>
+      <w:r>
+        <w:rPr>
+          <w:rFonts w:ascii="Consolas" w:hAnsi="Consolas"/>
+          <w:color w:val="9C2D41"/>
+        </w:rPr>
+        <w:t xml:space="preserve">retentionDays</w:t>
+      </w:r>
+      <w:r>
+        <w:t xml:space="preserve"> override (Super Admin). Then auto-deleted. Stored in </w:t>
       </w:r>
       <w:r>
         <w:rPr>

</xml_diff>

<commit_message>
Docs: add Multi-user SaaS section (Clerk/Stripe/emails/multi-tenant) + env vars; regenerate DOCS.docx
Co-Authored-By: Claude Opus 4.8 <noreply@anthropic.com>
</commit_message>
<xml_diff>
--- a/DOCS.docx
+++ b/DOCS.docx
@@ -4565,6 +4565,390 @@
     </w:p>
     <w:p>
       <w:pPr>
+        <w:pStyle w:val="Heading3"/>
+      </w:pPr>
+      <w:r>
+        <w:t xml:space="preserve">Multi-user SaaS (Phase 1, 2026-06-30)</w:t>
+      </w:r>
+    </w:p>
+    <w:p>
+      <w:r>
+        <w:t xml:space="preserve">Turning the operator tool into a sellable subscription. </w:t>
+      </w:r>
+      <w:r>
+        <w:rPr>
+          <w:b/>
+        </w:rPr>
+        <w:t xml:space="preserve">All of this is owner-safe: you (the owner) keep the exact same app and data; isolation/gating only affects future paying customers.</w:t>
+      </w:r>
+    </w:p>
+    <w:p>
+      <w:pPr>
+        <w:numPr>
+          <w:ilvl w:val="0"/>
+          <w:numId w:val="1"/>
+        </w:numPr>
+      </w:pPr>
+      <w:r>
+        <w:rPr>
+          <w:b/>
+        </w:rPr>
+        <w:t xml:space="preserve">Login = Clerk</w:t>
+      </w:r>
+      <w:r>
+        <w:t xml:space="preserve"> (Google + email). Front-end loads ClerkJS (gated by </w:t>
+      </w:r>
+      <w:r>
+        <w:rPr>
+          <w:rFonts w:ascii="Consolas" w:hAnsi="Consolas"/>
+          <w:color w:val="9C2D41"/>
+        </w:rPr>
+        <w:t xml:space="preserve">window.AIWP_CLERK.enabled</w:t>
+      </w:r>
+      <w:r>
+        <w:t xml:space="preserve">); the Clerk session is exchanged once for the existing </w:t>
+      </w:r>
+      <w:r>
+        <w:rPr>
+          <w:rFonts w:ascii="Consolas" w:hAnsi="Consolas"/>
+          <w:color w:val="9C2D41"/>
+        </w:rPr>
+        <w:t xml:space="preserve">aiwp</w:t>
+      </w:r>
+      <w:r>
+        <w:t xml:space="preserve"> cookie via </w:t>
+      </w:r>
+      <w:r>
+        <w:rPr>
+          <w:rFonts w:ascii="Consolas" w:hAnsi="Consolas"/>
+          <w:color w:val="9C2D41"/>
+        </w:rPr>
+        <w:t xml:space="preserve">api/clerk-session.js</w:t>
+      </w:r>
+      <w:r>
+        <w:t xml:space="preserve"> (so the ~16 protected endpoints are unchanged). Access is allow-listed by email (</w:t>
+      </w:r>
+      <w:r>
+        <w:rPr>
+          <w:rFonts w:ascii="Consolas" w:hAnsi="Consolas"/>
+          <w:color w:val="9C2D41"/>
+        </w:rPr>
+        <w:t xml:space="preserve">ALLOWED_EMAILS</w:t>
+      </w:r>
+      <w:r>
+        <w:t xml:space="preserve">) until public sign-ups open. See </w:t>
+      </w:r>
+      <w:r>
+        <w:rPr>
+          <w:rFonts w:ascii="Consolas" w:hAnsi="Consolas"/>
+          <w:color w:val="9C2D41"/>
+        </w:rPr>
+        <w:t xml:space="preserve">lib/clerkauth.js</w:t>
+      </w:r>
+      <w:r>
+        <w:t xml:space="preserve"> (zero-dep JWKS verify).</w:t>
+      </w:r>
+    </w:p>
+    <w:p>
+      <w:pPr>
+        <w:numPr>
+          <w:ilvl w:val="0"/>
+          <w:numId w:val="1"/>
+        </w:numPr>
+      </w:pPr>
+      <w:r>
+        <w:rPr>
+          <w:b/>
+        </w:rPr>
+        <w:t xml:space="preserve">Billing = Stripe</w:t>
+      </w:r>
+      <w:r>
+        <w:t xml:space="preserve"> (test/sandbox first). 3 products (Scout £29 / Hunter £59 / Apex £129 / month, GBP). </w:t>
+      </w:r>
+      <w:r>
+        <w:rPr>
+          <w:rFonts w:ascii="Consolas" w:hAnsi="Consolas"/>
+          <w:color w:val="9C2D41"/>
+        </w:rPr>
+        <w:t xml:space="preserve">api/stripe-checkout.js</w:t>
+      </w:r>
+      <w:r>
+        <w:t xml:space="preserve"> (pick a plan -&gt; hosted Checkout), </w:t>
+      </w:r>
+      <w:r>
+        <w:rPr>
+          <w:rFonts w:ascii="Consolas" w:hAnsi="Consolas"/>
+          <w:color w:val="9C2D41"/>
+        </w:rPr>
+        <w:t xml:space="preserve">api/stripe-confirm.js</w:t>
+      </w:r>
+      <w:r>
+        <w:t xml:space="preserve"> (post-redirect, records the plan in the Neon </w:t>
+      </w:r>
+      <w:r>
+        <w:rPr>
+          <w:rFonts w:ascii="Consolas" w:hAnsi="Consolas"/>
+          <w:color w:val="9C2D41"/>
+        </w:rPr>
+        <w:t xml:space="preserve">users</w:t>
+      </w:r>
+      <w:r>
+        <w:t xml:space="preserve"> table), </w:t>
+      </w:r>
+      <w:r>
+        <w:rPr>
+          <w:rFonts w:ascii="Consolas" w:hAnsi="Consolas"/>
+          <w:color w:val="9C2D41"/>
+        </w:rPr>
+        <w:t xml:space="preserve">api/stripe-portal.js</w:t>
+      </w:r>
+      <w:r>
+        <w:t xml:space="preserve"> (self-serve manage/cancel), </w:t>
+      </w:r>
+      <w:r>
+        <w:rPr>
+          <w:rFonts w:ascii="Consolas" w:hAnsi="Consolas"/>
+          <w:color w:val="9C2D41"/>
+        </w:rPr>
+        <w:t xml:space="preserve">api/stripe-webhook.js</w:t>
+      </w:r>
+      <w:r>
+        <w:t xml:space="preserve"> (renewals/cancels; verified by re-fetching from Stripe). </w:t>
+      </w:r>
+      <w:r>
+        <w:rPr>
+          <w:rFonts w:ascii="Consolas" w:hAnsi="Consolas"/>
+          <w:color w:val="9C2D41"/>
+        </w:rPr>
+        <w:t xml:space="preserve">lib/stripe.js</w:t>
+      </w:r>
+      <w:r>
+        <w:t xml:space="preserve"> = zero-dep Stripe REST. </w:t>
+      </w:r>
+      <w:r>
+        <w:rPr>
+          <w:b/>
+        </w:rPr>
+        <w:t xml:space="preserve">TODO (Stripe dashboard):</w:t>
+      </w:r>
+      <w:r>
+        <w:t xml:space="preserve"> activate the Customer Portal + add the webhook endpoint.</w:t>
+      </w:r>
+    </w:p>
+    <w:p>
+      <w:pPr>
+        <w:numPr>
+          <w:ilvl w:val="0"/>
+          <w:numId w:val="1"/>
+        </w:numPr>
+      </w:pPr>
+      <w:r>
+        <w:rPr>
+          <w:b/>
+        </w:rPr>
+        <w:t xml:space="preserve">New-subscriber emails</w:t>
+      </w:r>
+      <w:r>
+        <w:t xml:space="preserve"> (</w:t>
+      </w:r>
+      <w:r>
+        <w:rPr>
+          <w:rFonts w:ascii="Consolas" w:hAnsi="Consolas"/>
+          <w:color w:val="9C2D41"/>
+        </w:rPr>
+        <w:t xml:space="preserve">lib/email.js</w:t>
+      </w:r>
+      <w:r>
+        <w:t xml:space="preserve">): on subscription, a </w:t>
+      </w:r>
+      <w:r>
+        <w:rPr>
+          <w:b/>
+        </w:rPr>
+        <w:t xml:space="preserve">welcome</w:t>
+      </w:r>
+      <w:r>
+        <w:t xml:space="preserve"> email to the customer (login link, no password since Clerk handles sign-in) + a </w:t>
+      </w:r>
+      <w:r>
+        <w:rPr>
+          <w:b/>
+        </w:rPr>
+        <w:t xml:space="preserve">"new customer"</w:t>
+      </w:r>
+      <w:r>
+        <w:t xml:space="preserve"> notice to you, via SendGrid, from </w:t>
+      </w:r>
+      <w:r>
+        <w:rPr>
+          <w:rFonts w:ascii="Consolas" w:hAnsi="Consolas"/>
+          <w:color w:val="9C2D41"/>
+        </w:rPr>
+        <w:t xml:space="preserve">hello@sitepounce.com</w:t>
+      </w:r>
+      <w:r>
+        <w:t xml:space="preserve"> (domain-authenticated). Deduped via a </w:t>
+      </w:r>
+      <w:r>
+        <w:rPr>
+          <w:rFonts w:ascii="Consolas" w:hAnsi="Consolas"/>
+          <w:color w:val="9C2D41"/>
+        </w:rPr>
+        <w:t xml:space="preserve">welcomed</w:t>
+      </w:r>
+      <w:r>
+        <w:t xml:space="preserve"> flag. IMPORTANT pattern: the send is </w:t>
+      </w:r>
+      <w:r>
+        <w:rPr>
+          <w:b/>
+        </w:rPr>
+        <w:t xml:space="preserve">awaited</w:t>
+      </w:r>
+      <w:r>
+        <w:t xml:space="preserve"> before the HTTP response (Vercel freezes the function after responding, so fire-and-forget never sends).</w:t>
+      </w:r>
+    </w:p>
+    <w:p>
+      <w:pPr>
+        <w:numPr>
+          <w:ilvl w:val="0"/>
+          <w:numId w:val="1"/>
+        </w:numPr>
+      </w:pPr>
+      <w:r>
+        <w:rPr>
+          <w:b/>
+        </w:rPr>
+        <w:t xml:space="preserve">Multi-tenant data separation</w:t>
+      </w:r>
+      <w:r>
+        <w:t xml:space="preserve"> (</w:t>
+      </w:r>
+      <w:r>
+        <w:rPr>
+          <w:rFonts w:ascii="Consolas" w:hAnsi="Consolas"/>
+          <w:color w:val="9C2D41"/>
+        </w:rPr>
+        <w:t xml:space="preserve">lib/tenant.js</w:t>
+      </w:r>
+      <w:r>
+        <w:t xml:space="preserve">): every per-customer artifact is namespaced by the signed-in user. </w:t>
+      </w:r>
+      <w:r>
+        <w:rPr>
+          <w:b/>
+        </w:rPr>
+        <w:t xml:space="preserve">Owner = no prefix (unchanged); other customers get `u/&lt;hash&gt;/` blob paths and a `&lt;16hex&gt;--` slug marker.</w:t>
+      </w:r>
+      <w:r>
+        <w:t xml:space="preserve"> Mockup/site/dossier/note </w:t>
+      </w:r>
+      <w:r>
+        <w:rPr>
+          <w:b/>
+        </w:rPr>
+        <w:t xml:space="preserve">slugs</w:t>
+      </w:r>
+      <w:r>
+        <w:t xml:space="preserve"> carry the tenant (kept globally unique so the public </w:t>
+      </w:r>
+      <w:r>
+        <w:rPr>
+          <w:rFonts w:ascii="Consolas" w:hAnsi="Consolas"/>
+          <w:color w:val="9C2D41"/>
+        </w:rPr>
+        <w:t xml:space="preserve">/v/</w:t>
+      </w:r>
+      <w:r>
+        <w:t xml:space="preserve"> </w:t>
+      </w:r>
+      <w:r>
+        <w:rPr>
+          <w:rFonts w:ascii="Consolas" w:hAnsi="Consolas"/>
+          <w:color w:val="9C2D41"/>
+        </w:rPr>
+        <w:t xml:space="preserve">/s/</w:t>
+      </w:r>
+      <w:r>
+        <w:t xml:space="preserve"> links need no change); the list/dashboard/hot-leads views and the per-tenant </w:t>
+      </w:r>
+      <w:r>
+        <w:rPr>
+          <w:b/>
+        </w:rPr>
+        <w:t xml:space="preserve">usage quotas</w:t>
+      </w:r>
+      <w:r>
+        <w:t xml:space="preserve"> + </w:t>
+      </w:r>
+      <w:r>
+        <w:rPr>
+          <w:b/>
+        </w:rPr>
+        <w:t xml:space="preserve">call list</w:t>
+      </w:r>
+      <w:r>
+        <w:t xml:space="preserve"> filter by </w:t>
+      </w:r>
+      <w:r>
+        <w:rPr>
+          <w:rFonts w:ascii="Consolas" w:hAnsi="Consolas"/>
+          <w:color w:val="9C2D41"/>
+        </w:rPr>
+        <w:t xml:space="preserve">ownsSlug</w:t>
+      </w:r>
+      <w:r>
+        <w:t xml:space="preserve">/</w:t>
+      </w:r>
+      <w:r>
+        <w:rPr>
+          <w:rFonts w:ascii="Consolas" w:hAnsi="Consolas"/>
+          <w:color w:val="9C2D41"/>
+        </w:rPr>
+        <w:t xml:space="preserve">tenantPrefix</w:t>
+      </w:r>
+      <w:r>
+        <w:t xml:space="preserve">. So a customer only ever sees their own leads, mockups, sites and stats.</w:t>
+      </w:r>
+    </w:p>
+    <w:p>
+      <w:pPr>
+        <w:numPr>
+          <w:ilvl w:val="0"/>
+          <w:numId w:val="1"/>
+        </w:numPr>
+      </w:pPr>
+      <w:r>
+        <w:rPr>
+          <w:b/>
+        </w:rPr>
+        <w:t xml:space="preserve">Still pending:</w:t>
+      </w:r>
+      <w:r>
+        <w:t xml:space="preserve"> in-app </w:t>
+      </w:r>
+      <w:r>
+        <w:rPr>
+          <w:b/>
+        </w:rPr>
+        <w:t xml:space="preserve">Super Admin</w:t>
+      </w:r>
+      <w:r>
+        <w:t xml:space="preserve"> (see all customers + usage), per-tier </w:t>
+      </w:r>
+      <w:r>
+        <w:rPr>
+          <w:b/>
+        </w:rPr>
+        <w:t xml:space="preserve">feature gating + credits</w:t>
+      </w:r>
+      <w:r>
+        <w:t xml:space="preserve">, and UX polish (full-page sign-up instead of the Clerk popup, more top-nav items, mandatory first/last name).</w:t>
+      </w:r>
+    </w:p>
+    <w:p>
+      <w:pPr>
         <w:pStyle w:val="Heading2"/>
       </w:pPr>
       <w:r>
@@ -7744,6 +8128,214 @@
           <w:p>
             <w:r>
               <w:t xml:space="preserve">Legacy login; cookie HMAC keyed by the password. Stays live + as a fallback even after Clerk is on.</w:t>
+            </w:r>
+          </w:p>
+        </w:tc>
+      </w:tr>
+      <w:tr>
+        <w:tc>
+          <w:tcPr>
+            <w:tcW w:w="0" w:type="auto"/>
+          </w:tcPr>
+          <w:p>
+            <w:r>
+              <w:t xml:space="preserve">Billing (Stripe)</w:t>
+            </w:r>
+          </w:p>
+        </w:tc>
+        <w:tc>
+          <w:tcPr>
+            <w:tcW w:w="0" w:type="auto"/>
+          </w:tcPr>
+          <w:p>
+            <w:r>
+              <w:rPr>
+                <w:rFonts w:ascii="Consolas" w:hAnsi="Consolas"/>
+                <w:color w:val="9C2D41"/>
+              </w:rPr>
+              <w:t xml:space="preserve">STRIPE_SECRET_KEY?</w:t>
+            </w:r>
+            <w:r>
+              <w:t xml:space="preserve">, </w:t>
+            </w:r>
+            <w:r>
+              <w:rPr>
+                <w:rFonts w:ascii="Consolas" w:hAnsi="Consolas"/>
+                <w:color w:val="9C2D41"/>
+              </w:rPr>
+              <w:t xml:space="preserve">STRIPE_PRICE_SCOUT/HUNTER/APEX?</w:t>
+            </w:r>
+            <w:r>
+              <w:t xml:space="preserve">, </w:t>
+            </w:r>
+            <w:r>
+              <w:rPr>
+                <w:rFonts w:ascii="Consolas" w:hAnsi="Consolas"/>
+                <w:color w:val="9C2D41"/>
+              </w:rPr>
+              <w:t xml:space="preserve">APP_BASE_URL?</w:t>
+            </w:r>
+          </w:p>
+        </w:tc>
+        <w:tc>
+          <w:tcPr>
+            <w:tcW w:w="0" w:type="auto"/>
+          </w:tcPr>
+          <w:p>
+            <w:r>
+              <w:t xml:space="preserve">Subscriptions (Phase 1 C). Secret key present = checkout/portal/webhook turn on; the three price IDs map a plan to its Stripe price; </w:t>
+            </w:r>
+            <w:r>
+              <w:rPr>
+                <w:rFonts w:ascii="Consolas" w:hAnsi="Consolas"/>
+                <w:color w:val="9C2D41"/>
+              </w:rPr>
+              <w:t xml:space="preserve">APP_BASE_URL</w:t>
+            </w:r>
+            <w:r>
+              <w:t xml:space="preserve"> (default the request host) builds the success/cancel/return URLs.</w:t>
+            </w:r>
+          </w:p>
+        </w:tc>
+      </w:tr>
+      <w:tr>
+        <w:tc>
+          <w:tcPr>
+            <w:tcW w:w="0" w:type="auto"/>
+          </w:tcPr>
+          <w:p>
+            <w:r>
+              <w:t xml:space="preserve">Subscriber emails</w:t>
+            </w:r>
+          </w:p>
+        </w:tc>
+        <w:tc>
+          <w:tcPr>
+            <w:tcW w:w="0" w:type="auto"/>
+          </w:tcPr>
+          <w:p>
+            <w:r>
+              <w:rPr>
+                <w:rFonts w:ascii="Consolas" w:hAnsi="Consolas"/>
+                <w:color w:val="9C2D41"/>
+              </w:rPr>
+              <w:t xml:space="preserve">SITEPOUNCE_FROM_EMAIL?</w:t>
+            </w:r>
+          </w:p>
+        </w:tc>
+        <w:tc>
+          <w:tcPr>
+            <w:tcW w:w="0" w:type="auto"/>
+          </w:tcPr>
+          <w:p>
+            <w:r>
+              <w:t xml:space="preserve">The "from" for welcome/admin emails (</w:t>
+            </w:r>
+            <w:r>
+              <w:rPr>
+                <w:rFonts w:ascii="Consolas" w:hAnsi="Consolas"/>
+                <w:color w:val="9C2D41"/>
+              </w:rPr>
+              <w:t xml:space="preserve">hello@sitepounce.com</w:t>
+            </w:r>
+            <w:r>
+              <w:t xml:space="preserve">, domain-authenticated in SendGrid). If unset, falls back to the verified </w:t>
+            </w:r>
+            <w:r>
+              <w:rPr>
+                <w:rFonts w:ascii="Consolas" w:hAnsi="Consolas"/>
+                <w:color w:val="9C2D41"/>
+              </w:rPr>
+              <w:t xml:space="preserve">ERROR_EMAIL_FROM</w:t>
+            </w:r>
+            <w:r>
+              <w:t xml:space="preserve">, still branded "Site Pounce" + reply-to hello@. Admin recipient = </w:t>
+            </w:r>
+            <w:r>
+              <w:rPr>
+                <w:rFonts w:ascii="Consolas" w:hAnsi="Consolas"/>
+                <w:color w:val="9C2D41"/>
+              </w:rPr>
+              <w:t xml:space="preserve">LEAD_EMAIL_TO</w:t>
+            </w:r>
+            <w:r>
+              <w:t xml:space="preserve">/</w:t>
+            </w:r>
+            <w:r>
+              <w:rPr>
+                <w:rFonts w:ascii="Consolas" w:hAnsi="Consolas"/>
+                <w:color w:val="9C2D41"/>
+              </w:rPr>
+              <w:t xml:space="preserve">ERROR_EMAIL_TO</w:t>
+            </w:r>
+            <w:r>
+              <w:t xml:space="preserve">.</w:t>
+            </w:r>
+          </w:p>
+        </w:tc>
+      </w:tr>
+      <w:tr>
+        <w:tc>
+          <w:tcPr>
+            <w:tcW w:w="0" w:type="auto"/>
+          </w:tcPr>
+          <w:p>
+            <w:r>
+              <w:t xml:space="preserve">Multi-tenant</w:t>
+            </w:r>
+          </w:p>
+        </w:tc>
+        <w:tc>
+          <w:tcPr>
+            <w:tcW w:w="0" w:type="auto"/>
+          </w:tcPr>
+          <w:p>
+            <w:r>
+              <w:rPr>
+                <w:rFonts w:ascii="Consolas" w:hAnsi="Consolas"/>
+                <w:color w:val="9C2D41"/>
+              </w:rPr>
+              <w:t xml:space="preserve">OWNER_EMAIL?</w:t>
+            </w:r>
+          </w:p>
+        </w:tc>
+        <w:tc>
+          <w:tcPr>
+            <w:tcW w:w="0" w:type="auto"/>
+          </w:tcPr>
+          <w:p>
+            <w:r>
+              <w:t xml:space="preserve">The owner whose data stays at the legacy root namespace (defaults to </w:t>
+            </w:r>
+            <w:r>
+              <w:rPr>
+                <w:rFonts w:ascii="Consolas" w:hAnsi="Consolas"/>
+                <w:color w:val="9C2D41"/>
+              </w:rPr>
+              <w:t xml:space="preserve">ALLOWED_EMAILS[0]</w:t>
+            </w:r>
+            <w:r>
+              <w:t xml:space="preserve"> / ajay@aimpro.co.uk). Every other signed-in customer is isolated under </w:t>
+            </w:r>
+            <w:r>
+              <w:rPr>
+                <w:rFonts w:ascii="Consolas" w:hAnsi="Consolas"/>
+                <w:color w:val="9C2D41"/>
+              </w:rPr>
+              <w:t xml:space="preserve">u/&lt;hash&gt;/</w:t>
+            </w:r>
+            <w:r>
+              <w:t xml:space="preserve"> + a </w:t>
+            </w:r>
+            <w:r>
+              <w:rPr>
+                <w:rFonts w:ascii="Consolas" w:hAnsi="Consolas"/>
+                <w:color w:val="9C2D41"/>
+              </w:rPr>
+              <w:t xml:space="preserve">&lt;16hex&gt;--</w:t>
+            </w:r>
+            <w:r>
+              <w:t xml:space="preserve"> slug.</w:t>
             </w:r>
           </w:p>
         </w:tc>

</xml_diff>

<commit_message>
Docs: paywall gating + SIGNUP_OPEN + legal pages; regenerate DOCS.docx
Co-Authored-By: Claude Opus 4.8 <noreply@anthropic.com>
</commit_message>
<xml_diff>
--- a/DOCS.docx
+++ b/DOCS.docx
@@ -4820,6 +4820,214 @@
         <w:rPr>
           <w:b/>
         </w:rPr>
+        <w:t xml:space="preserve">Paywall gating</w:t>
+      </w:r>
+      <w:r>
+        <w:t xml:space="preserve"> (</w:t>
+      </w:r>
+      <w:r>
+        <w:rPr>
+          <w:rFonts w:ascii="Consolas" w:hAnsi="Consolas"/>
+          <w:color w:val="9C2D41"/>
+        </w:rPr>
+        <w:t xml:space="preserve">lib/access.js</w:t>
+      </w:r>
+      <w:r>
+        <w:t xml:space="preserve">): the Clerk cookie proves *who* you are; paid access is decided separately. The costly endpoints (</w:t>
+      </w:r>
+      <w:r>
+        <w:rPr>
+          <w:rFonts w:ascii="Consolas" w:hAnsi="Consolas"/>
+          <w:color w:val="9C2D41"/>
+        </w:rPr>
+        <w:t xml:space="preserve">search</w:t>
+      </w:r>
+      <w:r>
+        <w:t xml:space="preserve">, </w:t>
+      </w:r>
+      <w:r>
+        <w:rPr>
+          <w:rFonts w:ascii="Consolas" w:hAnsi="Consolas"/>
+          <w:color w:val="9C2D41"/>
+        </w:rPr>
+        <w:t xml:space="preserve">generate</w:t>
+      </w:r>
+      <w:r>
+        <w:t xml:space="preserve">, </w:t>
+      </w:r>
+      <w:r>
+        <w:rPr>
+          <w:rFonts w:ascii="Consolas" w:hAnsi="Consolas"/>
+          <w:color w:val="9C2D41"/>
+        </w:rPr>
+        <w:t xml:space="preserve">prowl</w:t>
+      </w:r>
+      <w:r>
+        <w:t xml:space="preserve">, </w:t>
+      </w:r>
+      <w:r>
+        <w:rPr>
+          <w:rFonts w:ascii="Consolas" w:hAnsi="Consolas"/>
+          <w:color w:val="9C2D41"/>
+        </w:rPr>
+        <w:t xml:space="preserve">pounce</w:t>
+      </w:r>
+      <w:r>
+        <w:t xml:space="preserve">, </w:t>
+      </w:r>
+      <w:r>
+        <w:rPr>
+          <w:rFonts w:ascii="Consolas" w:hAnsi="Consolas"/>
+          <w:color w:val="9C2D41"/>
+        </w:rPr>
+        <w:t xml:space="preserve">grammar</w:t>
+      </w:r>
+      <w:r>
+        <w:t xml:space="preserve">) call </w:t>
+      </w:r>
+      <w:r>
+        <w:rPr>
+          <w:rFonts w:ascii="Consolas" w:hAnsi="Consolas"/>
+          <w:color w:val="9C2D41"/>
+        </w:rPr>
+        <w:t xml:space="preserve">requirePaid</w:t>
+      </w:r>
+      <w:r>
+        <w:t xml:space="preserve"> and return </w:t>
+      </w:r>
+      <w:r>
+        <w:rPr>
+          <w:b/>
+        </w:rPr>
+        <w:t xml:space="preserve">402</w:t>
+      </w:r>
+      <w:r>
+        <w:t xml:space="preserve"> unless the user has an active/trialing subscription. </w:t>
+      </w:r>
+      <w:r>
+        <w:rPr>
+          <w:b/>
+        </w:rPr>
+        <w:t xml:space="preserve">Comped (free, no card): the owner, the legacy operator login, and any `ALLOWED_EMAILS`.</w:t>
+      </w:r>
+      <w:r>
+        <w:t xml:space="preserve"> The front-end reads </w:t>
+      </w:r>
+      <w:r>
+        <w:rPr>
+          <w:rFonts w:ascii="Consolas" w:hAnsi="Consolas"/>
+          <w:color w:val="9C2D41"/>
+        </w:rPr>
+        <w:t xml:space="preserve">api/me.js</w:t>
+      </w:r>
+      <w:r>
+        <w:t xml:space="preserve"> and shows the app (subscribers) or a </w:t>
+      </w:r>
+      <w:r>
+        <w:rPr>
+          <w:b/>
+        </w:rPr>
+        <w:t xml:space="preserve">paywall</w:t>
+      </w:r>
+      <w:r>
+        <w:t xml:space="preserve"> plan-picker (signed in, no plan yet). Fails closed.</w:t>
+      </w:r>
+    </w:p>
+    <w:p>
+      <w:pPr>
+        <w:numPr>
+          <w:ilvl w:val="0"/>
+          <w:numId w:val="1"/>
+        </w:numPr>
+      </w:pPr>
+      <w:r>
+        <w:rPr>
+          <w:b/>
+        </w:rPr>
+        <w:t xml:space="preserve">Open-signups switch</w:t>
+      </w:r>
+      <w:r>
+        <w:t xml:space="preserve"> (</w:t>
+      </w:r>
+      <w:r>
+        <w:rPr>
+          <w:rFonts w:ascii="Consolas" w:hAnsi="Consolas"/>
+          <w:color w:val="9C2D41"/>
+        </w:rPr>
+        <w:t xml:space="preserve">SIGNUP_OPEN</w:t>
+      </w:r>
+      <w:r>
+        <w:t xml:space="preserve">): </w:t>
+      </w:r>
+      <w:r>
+        <w:rPr>
+          <w:rFonts w:ascii="Consolas" w:hAnsi="Consolas"/>
+          <w:color w:val="9C2D41"/>
+        </w:rPr>
+        <w:t xml:space="preserve">clerk-session.js</w:t>
+      </w:r>
+      <w:r>
+        <w:t xml:space="preserve"> issues a cookie to allow-listed emails only by default (live app stays owner-only, unchanged). Set </w:t>
+      </w:r>
+      <w:r>
+        <w:rPr>
+          <w:rFonts w:ascii="Consolas" w:hAnsi="Consolas"/>
+          <w:color w:val="9C2D41"/>
+        </w:rPr>
+        <w:t xml:space="preserve">SIGNUP_OPEN=1</w:t>
+      </w:r>
+      <w:r>
+        <w:t xml:space="preserve"> to let anyone sign in; paid features stay gated by subscription. This is the "go public" flip, done alongside switching Stripe to live keys.</w:t>
+      </w:r>
+    </w:p>
+    <w:p>
+      <w:pPr>
+        <w:numPr>
+          <w:ilvl w:val="0"/>
+          <w:numId w:val="1"/>
+        </w:numPr>
+      </w:pPr>
+      <w:r>
+        <w:rPr>
+          <w:b/>
+        </w:rPr>
+        <w:t xml:space="preserve">Legal</w:t>
+      </w:r>
+      <w:r>
+        <w:t xml:space="preserve"> (</w:t>
+      </w:r>
+      <w:r>
+        <w:rPr>
+          <w:rFonts w:ascii="Consolas" w:hAnsi="Consolas"/>
+          <w:color w:val="9C2D41"/>
+        </w:rPr>
+        <w:t xml:space="preserve">public/terms.html</w:t>
+      </w:r>
+      <w:r>
+        <w:t xml:space="preserve">, </w:t>
+      </w:r>
+      <w:r>
+        <w:rPr>
+          <w:rFonts w:ascii="Consolas" w:hAnsi="Consolas"/>
+          <w:color w:val="9C2D41"/>
+        </w:rPr>
+        <w:t xml:space="preserve">public/privacy.html</w:t>
+      </w:r>
+      <w:r>
+        <w:t xml:space="preserve">): launch drafts (England &amp; Wales, named sub-processors, per-tier retention, cookies, ICO). Linked from the landing footer + a consent line on the pricing section and the paywall. Flagged for solicitor review before launch.</w:t>
+      </w:r>
+    </w:p>
+    <w:p>
+      <w:pPr>
+        <w:numPr>
+          <w:ilvl w:val="0"/>
+          <w:numId w:val="1"/>
+        </w:numPr>
+      </w:pPr>
+      <w:r>
+        <w:rPr>
+          <w:b/>
+        </w:rPr>
         <w:t xml:space="preserve">Multi-tenant data separation</w:t>
       </w:r>
       <w:r>
@@ -4926,7 +5134,26 @@
         <w:t xml:space="preserve">Still pending:</w:t>
       </w:r>
       <w:r>
-        <w:t xml:space="preserve"> in-app </w:t>
+        <w:t xml:space="preserve"> Stripe </w:t>
+      </w:r>
+      <w:r>
+        <w:rPr>
+          <w:b/>
+        </w:rPr>
+        <w:t xml:space="preserve">live keys</w:t>
+      </w:r>
+      <w:r>
+        <w:t xml:space="preserve"> + Customer Portal + webhook (dashboard steps); flip </w:t>
+      </w:r>
+      <w:r>
+        <w:rPr>
+          <w:rFonts w:ascii="Consolas" w:hAnsi="Consolas"/>
+          <w:color w:val="9C2D41"/>
+        </w:rPr>
+        <w:t xml:space="preserve">SIGNUP_OPEN=1</w:t>
+      </w:r>
+      <w:r>
+        <w:t xml:space="preserve">; in-app </w:t>
       </w:r>
       <w:r>
         <w:rPr>
@@ -4935,7 +5162,7 @@
         <w:t xml:space="preserve">Super Admin</w:t>
       </w:r>
       <w:r>
-        <w:t xml:space="preserve"> (see all customers + usage), per-tier </w:t>
+        <w:t xml:space="preserve"> (see all customers + usage); per-tier </w:t>
       </w:r>
       <w:r>
         <w:rPr>
@@ -4944,7 +5171,7 @@
         <w:t xml:space="preserve">feature gating + credits</w:t>
       </w:r>
       <w:r>
-        <w:t xml:space="preserve">, and UX polish (full-page sign-up instead of the Clerk popup, more top-nav items, mandatory first/last name).</w:t>
+        <w:t xml:space="preserve">; UX polish (full-page sign-up instead of the Clerk popup, more top-nav items, mandatory first/last name).</w:t>
       </w:r>
     </w:p>
     <w:p>
@@ -8336,6 +8563,82 @@
             </w:r>
             <w:r>
               <w:t xml:space="preserve"> slug.</w:t>
+            </w:r>
+          </w:p>
+        </w:tc>
+      </w:tr>
+      <w:tr>
+        <w:tc>
+          <w:tcPr>
+            <w:tcW w:w="0" w:type="auto"/>
+          </w:tcPr>
+          <w:p>
+            <w:r>
+              <w:t xml:space="preserve">Sign-ups</w:t>
+            </w:r>
+          </w:p>
+        </w:tc>
+        <w:tc>
+          <w:tcPr>
+            <w:tcW w:w="0" w:type="auto"/>
+          </w:tcPr>
+          <w:p>
+            <w:r>
+              <w:rPr>
+                <w:rFonts w:ascii="Consolas" w:hAnsi="Consolas"/>
+                <w:color w:val="9C2D41"/>
+              </w:rPr>
+              <w:t xml:space="preserve">SIGNUP_OPEN?</w:t>
+            </w:r>
+          </w:p>
+        </w:tc>
+        <w:tc>
+          <w:tcPr>
+            <w:tcW w:w="0" w:type="auto"/>
+          </w:tcPr>
+          <w:p>
+            <w:r>
+              <w:t xml:space="preserve">Unset/</w:t>
+            </w:r>
+            <w:r>
+              <w:rPr>
+                <w:rFonts w:ascii="Consolas" w:hAnsi="Consolas"/>
+                <w:color w:val="9C2D41"/>
+              </w:rPr>
+              <w:t xml:space="preserve">0</w:t>
+            </w:r>
+            <w:r>
+              <w:t xml:space="preserve"> = allow-list only can sign in (default, owner-only live app). </w:t>
+            </w:r>
+            <w:r>
+              <w:rPr>
+                <w:rFonts w:ascii="Consolas" w:hAnsi="Consolas"/>
+                <w:color w:val="9C2D41"/>
+              </w:rPr>
+              <w:t xml:space="preserve">1</w:t>
+            </w:r>
+            <w:r>
+              <w:t xml:space="preserve"> = anyone can sign in via Clerk; paid features still gated by an active subscription (</w:t>
+            </w:r>
+            <w:r>
+              <w:rPr>
+                <w:rFonts w:ascii="Consolas" w:hAnsi="Consolas"/>
+                <w:color w:val="9C2D41"/>
+              </w:rPr>
+              <w:t xml:space="preserve">lib/access.js</w:t>
+            </w:r>
+            <w:r>
+              <w:t xml:space="preserve">). Flip to </w:t>
+            </w:r>
+            <w:r>
+              <w:rPr>
+                <w:rFonts w:ascii="Consolas" w:hAnsi="Consolas"/>
+                <w:color w:val="9C2D41"/>
+              </w:rPr>
+              <w:t xml:space="preserve">1</w:t>
+            </w:r>
+            <w:r>
+              <w:t xml:space="preserve"> when going public with live Stripe.</w:t>
             </w:r>
           </w:p>
         </w:tc>

</xml_diff>

<commit_message>
Docs: Phase 3 done (webhook + portal live in test); www webhook gotcha; regenerate DOCS.docx
Co-Authored-By: Claude Opus 4.8 <noreply@anthropic.com>
</commit_message>
<xml_diff>
--- a/DOCS.docx
+++ b/DOCS.docx
@@ -4729,10 +4729,48 @@
         <w:rPr>
           <w:b/>
         </w:rPr>
-        <w:t xml:space="preserve">TODO (Stripe dashboard):</w:t>
-      </w:r>
-      <w:r>
-        <w:t xml:space="preserve"> activate the Customer Portal + add the webhook endpoint.</w:t>
+        <w:t xml:space="preserve">Customer Portal + webhook are LIVE in test mode</w:t>
+      </w:r>
+      <w:r>
+        <w:t xml:space="preserve"> (a "Manage billing" button in the top-right opens the portal for paying subscribers). </w:t>
+      </w:r>
+      <w:r>
+        <w:rPr>
+          <w:b/>
+        </w:rPr>
+        <w:t xml:space="preserve">GOTCHA:</w:t>
+      </w:r>
+      <w:r>
+        <w:t xml:space="preserve"> the webhook URL must be </w:t>
+      </w:r>
+      <w:r>
+        <w:rPr>
+          <w:rFonts w:ascii="Consolas" w:hAnsi="Consolas"/>
+          <w:color w:val="9C2D41"/>
+        </w:rPr>
+        <w:t xml:space="preserve">https://www.sitepounce.com/...</w:t>
+      </w:r>
+      <w:r>
+        <w:t xml:space="preserve"> (the </w:t>
+      </w:r>
+      <w:r>
+        <w:rPr>
+          <w:rFonts w:ascii="Consolas" w:hAnsi="Consolas"/>
+          <w:color w:val="9C2D41"/>
+        </w:rPr>
+        <w:t xml:space="preserve">www</w:t>
+      </w:r>
+      <w:r>
+        <w:t xml:space="preserve"> is canonical; the apex 308-redirects and Stripe does not follow redirects, so the apex URL silently fails every delivery). The webhook needs no signing secret (our handler re-fetches the object from Stripe to verify). </w:t>
+      </w:r>
+      <w:r>
+        <w:rPr>
+          <w:b/>
+        </w:rPr>
+        <w:t xml:space="preserve">TODO for live:</w:t>
+      </w:r>
+      <w:r>
+        <w:t xml:space="preserve"> recreate the webhook + portal config in Stripe live mode and paste live keys.</w:t>
       </w:r>
     </w:p>
     <w:p>
@@ -5143,7 +5181,17 @@
         <w:t xml:space="preserve">live keys</w:t>
       </w:r>
       <w:r>
-        <w:t xml:space="preserve"> + Customer Portal + webhook (dashboard steps); flip </w:t>
+        <w:t xml:space="preserve"> + recreate webhook/portal in live mode (use the </w:t>
+      </w:r>
+      <w:r>
+        <w:rPr>
+          <w:rFonts w:ascii="Consolas" w:hAnsi="Consolas"/>
+          <w:color w:val="9C2D41"/>
+        </w:rPr>
+        <w:t xml:space="preserve">www</w:t>
+      </w:r>
+      <w:r>
+        <w:t xml:space="preserve"> URL); flip </w:t>
       </w:r>
       <w:r>
         <w:rPr>

</xml_diff>

<commit_message>
Docs: Clerk production live + welcome page; update pending list; regenerate DOCS.docx
Co-Authored-By: Claude Opus 4.8 <noreply@anthropic.com>
</commit_message>
<xml_diff>
--- a/DOCS.docx
+++ b/DOCS.docx
@@ -4596,7 +4596,26 @@
         <w:t xml:space="preserve">Login = Clerk</w:t>
       </w:r>
       <w:r>
-        <w:t xml:space="preserve"> (Google + email). Front-end loads ClerkJS (gated by </w:t>
+        <w:t xml:space="preserve"> (</w:t>
+      </w:r>
+      <w:r>
+        <w:rPr>
+          <w:b/>
+        </w:rPr>
+        <w:t xml:space="preserve">production instance, live</w:t>
+      </w:r>
+      <w:r>
+        <w:t xml:space="preserve">, email + password; Google was disabled to skip the Google OAuth app). Front-end loads ClerkJS from </w:t>
+      </w:r>
+      <w:r>
+        <w:rPr>
+          <w:rFonts w:ascii="Consolas" w:hAnsi="Consolas"/>
+          <w:color w:val="9C2D41"/>
+        </w:rPr>
+        <w:t xml:space="preserve">clerk.sitepounce.com</w:t>
+      </w:r>
+      <w:r>
+        <w:t xml:space="preserve"> (gated by </w:t>
       </w:r>
       <w:r>
         <w:rPr>
@@ -4606,6 +4625,26 @@
         <w:t xml:space="preserve">window.AIWP_CLERK.enabled</w:t>
       </w:r>
       <w:r>
+        <w:t xml:space="preserve">, </w:t>
+      </w:r>
+      <w:r>
+        <w:rPr>
+          <w:rFonts w:ascii="Consolas" w:hAnsi="Consolas"/>
+          <w:color w:val="9C2D41"/>
+        </w:rPr>
+        <w:t xml:space="preserve">pk</w:t>
+      </w:r>
+      <w:r>
+        <w:t xml:space="preserve"> = </w:t>
+      </w:r>
+      <w:r>
+        <w:rPr>
+          <w:rFonts w:ascii="Consolas" w:hAnsi="Consolas"/>
+          <w:color w:val="9C2D41"/>
+        </w:rPr>
+        <w:t xml:space="preserve">pk_live_...</w:t>
+      </w:r>
+      <w:r>
         <w:t xml:space="preserve">); the Clerk session is exchanged once for the existing </w:t>
       </w:r>
       <w:r>
@@ -4626,17 +4665,17 @@
         <w:t xml:space="preserve">api/clerk-session.js</w:t>
       </w:r>
       <w:r>
-        <w:t xml:space="preserve"> (so the ~16 protected endpoints are unchanged). Access is allow-listed by email (</w:t>
-      </w:r>
-      <w:r>
-        <w:rPr>
-          <w:rFonts w:ascii="Consolas" w:hAnsi="Consolas"/>
-          <w:color w:val="9C2D41"/>
-        </w:rPr>
-        <w:t xml:space="preserve">ALLOWED_EMAILS</w:t>
-      </w:r>
-      <w:r>
-        <w:t xml:space="preserve">) until public sign-ups open. See </w:t>
+        <w:t xml:space="preserve"> (so the ~16 protected endpoints are unchanged). Backend verifies the session JWT against </w:t>
+      </w:r>
+      <w:r>
+        <w:rPr>
+          <w:rFonts w:ascii="Consolas" w:hAnsi="Consolas"/>
+          <w:color w:val="9C2D41"/>
+        </w:rPr>
+        <w:t xml:space="preserve">CLERK_ISSUER=https://clerk.sitepounce.com</w:t>
+      </w:r>
+      <w:r>
+        <w:t xml:space="preserve"> via zero-dep JWKS (</w:t>
       </w:r>
       <w:r>
         <w:rPr>
@@ -4646,7 +4685,26 @@
         <w:t xml:space="preserve">lib/clerkauth.js</w:t>
       </w:r>
       <w:r>
-        <w:t xml:space="preserve"> (zero-dep JWKS verify).</w:t>
+        <w:t xml:space="preserve">). Prod Clerk needed 5 CNAME DNS records in Cloudflare (clerk/accounts/clkmail + 2 DKIM, all DNS-only) which removed the "Development mode" badge. </w:t>
+      </w:r>
+      <w:r>
+        <w:rPr>
+          <w:b/>
+        </w:rPr>
+        <w:t xml:space="preserve">Note:</w:t>
+      </w:r>
+      <w:r>
+        <w:t xml:space="preserve"> Clerk's own verification emails send from the (brand-new) </w:t>
+      </w:r>
+      <w:r>
+        <w:rPr>
+          <w:rFonts w:ascii="Consolas" w:hAnsi="Consolas"/>
+          <w:color w:val="9C2D41"/>
+        </w:rPr>
+        <w:t xml:space="preserve">clerk.sitepounce.com</w:t>
+      </w:r>
+      <w:r>
+        <w:t xml:space="preserve"> domain, so they can land in spam on strict providers (Outlook) until the domain warms up, DNS/DKIM is correct, it is reputation.</w:t>
       </w:r>
     </w:p>
     <w:p>
@@ -5169,39 +5227,65 @@
         <w:rPr>
           <w:b/>
         </w:rPr>
+        <w:t xml:space="preserve">LIVE as of 2026-07-01:</w:t>
+      </w:r>
+      <w:r>
+        <w:t xml:space="preserve"> Stripe live keys + live products/prices/webhook/portal, </w:t>
+      </w:r>
+      <w:r>
+        <w:rPr>
+          <w:rFonts w:ascii="Consolas" w:hAnsi="Consolas"/>
+          <w:color w:val="9C2D41"/>
+        </w:rPr>
+        <w:t xml:space="preserve">SIGNUP_OPEN=1</w:t>
+      </w:r>
+      <w:r>
+        <w:t xml:space="preserve">, and </w:t>
+      </w:r>
+      <w:r>
+        <w:rPr>
+          <w:b/>
+        </w:rPr>
+        <w:t xml:space="preserve">Clerk production</w:t>
+      </w:r>
+      <w:r>
+        <w:t xml:space="preserve"> are all done. Proven with real end-to-end payments. A branded </w:t>
+      </w:r>
+      <w:r>
+        <w:rPr>
+          <w:b/>
+        </w:rPr>
+        <w:t xml:space="preserve">welcome page</w:t>
+      </w:r>
+      <w:r>
+        <w:t xml:space="preserve"> (</w:t>
+      </w:r>
+      <w:r>
+        <w:rPr>
+          <w:rFonts w:ascii="Consolas" w:hAnsi="Consolas"/>
+          <w:color w:val="9C2D41"/>
+        </w:rPr>
+        <w:t xml:space="preserve">#welcome</w:t>
+      </w:r>
+      <w:r>
+        <w:t xml:space="preserve">) shows after subscribing (replaced the alert popup).</w:t>
+      </w:r>
+    </w:p>
+    <w:p>
+      <w:pPr>
+        <w:numPr>
+          <w:ilvl w:val="0"/>
+          <w:numId w:val="1"/>
+        </w:numPr>
+      </w:pPr>
+      <w:r>
+        <w:rPr>
+          <w:b/>
+        </w:rPr>
         <w:t xml:space="preserve">Still pending:</w:t>
       </w:r>
       <w:r>
-        <w:t xml:space="preserve"> Stripe </w:t>
-      </w:r>
-      <w:r>
-        <w:rPr>
-          <w:b/>
-        </w:rPr>
-        <w:t xml:space="preserve">live keys</w:t>
-      </w:r>
-      <w:r>
-        <w:t xml:space="preserve"> + recreate webhook/portal in live mode (use the </w:t>
-      </w:r>
-      <w:r>
-        <w:rPr>
-          <w:rFonts w:ascii="Consolas" w:hAnsi="Consolas"/>
-          <w:color w:val="9C2D41"/>
-        </w:rPr>
-        <w:t xml:space="preserve">www</w:t>
-      </w:r>
-      <w:r>
-        <w:t xml:space="preserve"> URL); flip </w:t>
-      </w:r>
-      <w:r>
-        <w:rPr>
-          <w:rFonts w:ascii="Consolas" w:hAnsi="Consolas"/>
-          <w:color w:val="9C2D41"/>
-        </w:rPr>
-        <w:t xml:space="preserve">SIGNUP_OPEN=1</w:t>
-      </w:r>
-      <w:r>
-        <w:t xml:space="preserve">; in-app </w:t>
+        <w:t xml:space="preserve"> in-app </w:t>
       </w:r>
       <w:r>
         <w:rPr>
@@ -5219,7 +5303,43 @@
         <w:t xml:space="preserve">feature gating + credits</w:t>
       </w:r>
       <w:r>
-        <w:t xml:space="preserve">; UX polish (full-page sign-up instead of the Clerk popup, more top-nav items, mandatory first/last name).</w:t>
+        <w:t xml:space="preserve">; </w:t>
+      </w:r>
+      <w:r>
+        <w:rPr>
+          <w:b/>
+        </w:rPr>
+        <w:t xml:space="preserve">full-page sign-up</w:t>
+      </w:r>
+      <w:r>
+        <w:t xml:space="preserve"> (Clerk popup is dismissable, clicking the backdrop loses input); </w:t>
+      </w:r>
+      <w:r>
+        <w:rPr>
+          <w:b/>
+        </w:rPr>
+        <w:t xml:space="preserve">Upgrade / change-plan</w:t>
+      </w:r>
+      <w:r>
+        <w:t xml:space="preserve"> in the in-app Manage; </w:t>
+      </w:r>
+      <w:r>
+        <w:rPr>
+          <w:b/>
+        </w:rPr>
+        <w:t xml:space="preserve">redesign the paywall</w:t>
+      </w:r>
+      <w:r>
+        <w:t xml:space="preserve"> into proper pricing cards; </w:t>
+      </w:r>
+      <w:r>
+        <w:rPr>
+          <w:b/>
+        </w:rPr>
+        <w:t xml:space="preserve">remove "Secured by Clerk"</w:t>
+      </w:r>
+      <w:r>
+        <w:t xml:space="preserve"> (= Clerk Pro $25/mo); more top-nav items; mandatory first/last name.</w:t>
       </w:r>
     </w:p>
     <w:p>
@@ -8782,34 +8902,53 @@
               <w:t xml:space="preserve">CLERK_ISSUER</w:t>
             </w:r>
             <w:r>
-              <w:t xml:space="preserve"> defaults to the dev instance </w:t>
+              <w:t xml:space="preserve"> is </w:t>
+            </w:r>
+            <w:r>
+              <w:rPr>
+                <w:b/>
+              </w:rPr>
+              <w:t xml:space="preserve">now set to the production instance `https://clerk.sitepounce.com`</w:t>
+            </w:r>
+            <w:r>
+              <w:t xml:space="preserve"> (defaults to the old dev instance if unset). The publishable key is public and lives in </w:t>
             </w:r>
             <w:r>
               <w:rPr>
                 <w:rFonts w:ascii="Consolas" w:hAnsi="Consolas"/>
                 <w:color w:val="9C2D41"/>
               </w:rPr>
-              <w:t xml:space="preserve">https://major-cod-60.clerk.accounts.dev</w:t>
-            </w:r>
-            <w:r>
-              <w:t xml:space="preserve">. The publishable key is public and lives in </w:t>
+              <w:t xml:space="preserve">public/index.html</w:t>
+            </w:r>
+            <w:r>
+              <w:t xml:space="preserve"> (</w:t>
             </w:r>
             <w:r>
               <w:rPr>
                 <w:rFonts w:ascii="Consolas" w:hAnsi="Consolas"/>
                 <w:color w:val="9C2D41"/>
               </w:rPr>
-              <w:t xml:space="preserve">public/index.html</w:t>
-            </w:r>
-            <w:r>
-              <w:t xml:space="preserve"> (</w:t>
+              <w:t xml:space="preserve">window.AIWP_CLERK</w:t>
+            </w:r>
+            <w:r>
+              <w:t xml:space="preserve">, now </w:t>
             </w:r>
             <w:r>
               <w:rPr>
                 <w:rFonts w:ascii="Consolas" w:hAnsi="Consolas"/>
                 <w:color w:val="9C2D41"/>
               </w:rPr>
-              <w:t xml:space="preserve">window.AIWP_CLERK</w:t>
+              <w:t xml:space="preserve">pk_live_...</w:t>
+            </w:r>
+            <w:r>
+              <w:t xml:space="preserve"> + domain </w:t>
+            </w:r>
+            <w:r>
+              <w:rPr>
+                <w:rFonts w:ascii="Consolas" w:hAnsi="Consolas"/>
+                <w:color w:val="9C2D41"/>
+              </w:rPr>
+              <w:t xml:space="preserve">clerk.sitepounce.com</w:t>
             </w:r>
             <w:r>
               <w:t xml:space="preserve">), gated by </w:t>

</xml_diff>

<commit_message>
Docs: per-user caps (USER_LIMITS) + discount-code + free-teammate how-tos; regenerate DOCS.docx
Co-Authored-By: Claude Opus 4.8 <noreply@anthropic.com>
</commit_message>
<xml_diff>
--- a/DOCS.docx
+++ b/DOCS.docx
@@ -9181,6 +9181,82 @@
                 <w:color w:val="9C2D41"/>
               </w:rPr>
               <w:t xml:space="preserve">api/grammar.js</w:t>
+            </w:r>
+            <w:r>
+              <w:t xml:space="preserve">).</w:t>
+            </w:r>
+          </w:p>
+        </w:tc>
+      </w:tr>
+      <w:tr>
+        <w:tc>
+          <w:tcPr>
+            <w:tcW w:w="0" w:type="auto"/>
+          </w:tcPr>
+          <w:p>
+            <w:r>
+              <w:t xml:space="preserve">Per-user limits</w:t>
+            </w:r>
+          </w:p>
+        </w:tc>
+        <w:tc>
+          <w:tcPr>
+            <w:tcW w:w="0" w:type="auto"/>
+          </w:tcPr>
+          <w:p>
+            <w:r>
+              <w:rPr>
+                <w:rFonts w:ascii="Consolas" w:hAnsi="Consolas"/>
+                <w:color w:val="9C2D41"/>
+              </w:rPr>
+              <w:t xml:space="preserve">USER_LIMITS?</w:t>
+            </w:r>
+          </w:p>
+        </w:tc>
+        <w:tc>
+          <w:tcPr>
+            <w:tcW w:w="0" w:type="auto"/>
+          </w:tcPr>
+          <w:p>
+            <w:r>
+              <w:t xml:space="preserve">JSON keyed by lowercase email, e.g. </w:t>
+            </w:r>
+            <w:r>
+              <w:rPr>
+                <w:rFonts w:ascii="Consolas" w:hAnsi="Consolas"/>
+                <w:color w:val="9C2D41"/>
+              </w:rPr>
+              <w:t xml:space="preserve">{"mate@x.com":{"search":10,"generate":5,"prowl":5,"pounce":2}}</w:t>
+            </w:r>
+            <w:r>
+              <w:t xml:space="preserve">. Overrides the global </w:t>
+            </w:r>
+            <w:r>
+              <w:rPr>
+                <w:rFonts w:ascii="Consolas" w:hAnsi="Consolas"/>
+                <w:color w:val="9C2D41"/>
+              </w:rPr>
+              <w:t xml:space="preserve">LIMIT_*</w:t>
+            </w:r>
+            <w:r>
+              <w:t xml:space="preserve"> for that person only (kinds you omit fall back to the default). Lets you cap a free/comped teammate below your own limits (</w:t>
+            </w:r>
+            <w:r>
+              <w:rPr>
+                <w:rFonts w:ascii="Consolas" w:hAnsi="Consolas"/>
+                <w:color w:val="9C2D41"/>
+              </w:rPr>
+              <w:t xml:space="preserve">lib/ratelimit.js</w:t>
+            </w:r>
+            <w:r>
+              <w:t xml:space="preserve"> </w:t>
+            </w:r>
+            <w:r>
+              <w:rPr>
+                <w:rFonts w:ascii="Consolas" w:hAnsi="Consolas"/>
+                <w:color w:val="9C2D41"/>
+              </w:rPr>
+              <w:t xml:space="preserve">limitFor(kind,email)</w:t>
             </w:r>
             <w:r>
               <w:t xml:space="preserve">).</w:t>

</xml_diff>